<commit_message>
Update resume and site
Sync resume and site content for 4 Arrows role.

Clarify serverless portal ownership and FEMA platforms
Remove migration language, update job bullet specifics.

Update About and WorkExperience components to match resume wording.
</commit_message>
<xml_diff>
--- a/public/resume.docx
+++ b/public/resume.docx
@@ -1,6 +1,6 @@
 
 <file path=word/document.xml><?xml version="1.0" encoding="utf-8"?>
-<w:document xmlns:r="http://schemas.openxmlformats.org/officeDocument/2006/relationships" xmlns:wp="http://schemas.openxmlformats.org/drawingml/2006/wordprocessingDrawing" xmlns:w="http://schemas.openxmlformats.org/wordprocessingml/2006/main" xmlns:w10="urn:schemas-microsoft-com:office:word" xmlns:w14="http://schemas.microsoft.com/office/word/2010/wordml" xmlns:wps="http://schemas.microsoft.com/office/word/2010/wordprocessingShape" xmlns:wpg="http://schemas.microsoft.com/office/word/2010/wordprocessingGroup" xmlns:mc="http://schemas.openxmlformats.org/markup-compatibility/2006" xmlns:v="urn:schemas-microsoft-com:vml" xmlns:o="urn:schemas-microsoft-com:office:office" xmlns:m="http://schemas.openxmlformats.org/officeDocument/2006/math" mc:Ignorable="w14">
+<w:document xmlns:wpc="http://schemas.microsoft.com/office/word/2010/wordprocessingCanvas" xmlns:cx="http://schemas.microsoft.com/office/drawing/2014/chartex" xmlns:cx1="http://schemas.microsoft.com/office/drawing/2015/9/8/chartex" xmlns:cx2="http://schemas.microsoft.com/office/drawing/2015/10/21/chartex" xmlns:cx3="http://schemas.microsoft.com/office/drawing/2016/5/9/chartex" xmlns:cx4="http://schemas.microsoft.com/office/drawing/2016/5/10/chartex" xmlns:cx5="http://schemas.microsoft.com/office/drawing/2016/5/11/chartex" xmlns:cx6="http://schemas.microsoft.com/office/drawing/2016/5/12/chartex" xmlns:cx7="http://schemas.microsoft.com/office/drawing/2016/5/13/chartex" xmlns:cx8="http://schemas.microsoft.com/office/drawing/2016/5/14/chartex" xmlns:mc="http://schemas.openxmlformats.org/markup-compatibility/2006" xmlns:aink="http://schemas.microsoft.com/office/drawing/2016/ink" xmlns:am3d="http://schemas.microsoft.com/office/drawing/2017/model3d" xmlns:o="urn:schemas-microsoft-com:office:office" xmlns:oel="http://schemas.microsoft.com/office/2019/extlst" xmlns:r="http://schemas.openxmlformats.org/officeDocument/2006/relationships" xmlns:m="http://schemas.openxmlformats.org/officeDocument/2006/math" xmlns:v="urn:schemas-microsoft-com:vml" xmlns:wp14="http://schemas.microsoft.com/office/word/2010/wordprocessingDrawing" xmlns:wp="http://schemas.openxmlformats.org/drawingml/2006/wordprocessingDrawing" xmlns:w10="urn:schemas-microsoft-com:office:word" xmlns:w="http://schemas.openxmlformats.org/wordprocessingml/2006/main" xmlns:w14="http://schemas.microsoft.com/office/word/2010/wordml" xmlns:w15="http://schemas.microsoft.com/office/word/2012/wordml" xmlns:w16cex="http://schemas.microsoft.com/office/word/2018/wordml/cex" xmlns:w16cid="http://schemas.microsoft.com/office/word/2016/wordml/cid" xmlns:w16="http://schemas.microsoft.com/office/word/2018/wordml" xmlns:w16du="http://schemas.microsoft.com/office/word/2023/wordml/word16du" xmlns:w16sdtdh="http://schemas.microsoft.com/office/word/2020/wordml/sdtdatahash" xmlns:w16sdtfl="http://schemas.microsoft.com/office/word/2024/wordml/sdtformatlock" xmlns:w16se="http://schemas.microsoft.com/office/word/2015/wordml/symex" xmlns:wpg="http://schemas.microsoft.com/office/word/2010/wordprocessingGroup" xmlns:wpi="http://schemas.microsoft.com/office/word/2010/wordprocessingInk" xmlns:wne="http://schemas.microsoft.com/office/word/2006/wordml" xmlns:wps="http://schemas.microsoft.com/office/word/2010/wordprocessingShape" mc:Ignorable="w14 w15 w16se w16cid w16 w16cex w16sdtdh w16sdtfl w16du wp14">
   <w:body>
     <w:p>
       <w:pPr>
@@ -10,20 +10,12 @@
       </w:pPr>
       <w:r>
         <w:rPr>
-          <w:b w:val="1"/>
-          <w:bCs w:val="1"/>
-          <w:outline w:val="0"/>
-          <w:color w:val="1f4e79"/>
+          <w:b/>
+          <w:bCs/>
+          <w:color w:val="1F4E79"/>
           <w:sz w:val="44"/>
           <w:szCs w:val="44"/>
-          <w:u w:color="1f4e79"/>
-          <w:rtl w:val="0"/>
-          <w:lang w:val="en-US"/>
-          <w14:textFill>
-            <w14:solidFill>
-              <w14:srgbClr w14:val="1F4E79"/>
-            </w14:solidFill>
-          </w14:textFill>
+          <w:u w:color="1F4E79"/>
         </w:rPr>
         <w:t>Matthew Smith</w:t>
       </w:r>
@@ -33,19 +25,15 @@
         <w:pStyle w:val="Body"/>
         <w:spacing w:after="60"/>
         <w:jc w:val="center"/>
-      </w:pPr>
-      <w:r>
-        <w:rPr>
-          <w:outline w:val="0"/>
-          <w:color w:val="555555"/>
-          <w:u w:color="555555"/>
-          <w:rtl w:val="0"/>
-          <w:lang w:val="en-US"/>
-          <w14:textFill>
-            <w14:solidFill>
-              <w14:srgbClr w14:val="555555"/>
-            </w14:solidFill>
-          </w14:textFill>
+        <w:rPr>
+          <w:color w:val="555555"/>
+          <w:u w:color="555555"/>
+        </w:rPr>
+      </w:pPr>
+      <w:r>
+        <w:rPr>
+          <w:color w:val="555555"/>
+          <w:u w:color="555555"/>
         </w:rPr>
         <w:t>Senior Software Engineer | Federal &amp; Private Sector Experience</w:t>
       </w:r>
@@ -53,62 +41,89 @@
     <w:p>
       <w:pPr>
         <w:pStyle w:val="Body"/>
-        <w:spacing w:after="20"/>
+        <w:spacing w:after="60"/>
         <w:jc w:val="center"/>
-      </w:pPr>
-      <w:r>
-        <w:rPr>
-          <w:outline w:val="0"/>
-          <w:color w:val="555555"/>
-          <w:u w:color="555555"/>
-          <w:rtl w:val="0"/>
-          <w14:textFill>
-            <w14:solidFill>
-              <w14:srgbClr w14:val="555555"/>
-            </w14:solidFill>
-          </w14:textFill>
-        </w:rPr>
-        <w:t xml:space="preserve">msmith1392@gmail.com | </w:t>
-      </w:r>
-      <w:r>
-        <w:rPr>
-          <w:rStyle w:val="Hyperlink.0"/>
-        </w:rPr>
-        <w:fldChar w:fldCharType="begin" w:fldLock="0"/>
-      </w:r>
-      <w:r>
-        <w:rPr>
-          <w:rStyle w:val="Hyperlink.0"/>
-        </w:rPr>
-        <w:instrText xml:space="preserve"> HYPERLINK "https://www.linkedin.com/in/matthew-smith-22310b111/"</w:instrText>
-      </w:r>
-      <w:r>
-        <w:rPr>
-          <w:rStyle w:val="Hyperlink.0"/>
-        </w:rPr>
-        <w:fldChar w:fldCharType="separate" w:fldLock="0"/>
-      </w:r>
-      <w:r>
-        <w:rPr>
-          <w:rStyle w:val="Hyperlink.0"/>
-          <w:rtl w:val="0"/>
-          <w:lang w:val="en-US"/>
-        </w:rPr>
-        <w:t>linkedin.com/in/matthew-smith-22310b111</w:t>
-      </w:r>
-      <w:r>
-        <w:rPr/>
-        <w:fldChar w:fldCharType="end" w:fldLock="0"/>
-      </w:r>
+        <w:rPr>
+          <w:i/>
+          <w:iCs/>
+          <w:u w:val="single"/>
+        </w:rPr>
+      </w:pPr>
+      <w:hyperlink r:id="rId7" w:history="1">
+        <w:r>
+          <w:rPr>
+            <w:rStyle w:val="Hyperlink"/>
+          </w:rPr>
+          <w:t>msmith1392@gmail.com</w:t>
+        </w:r>
+      </w:hyperlink>
+      <w:r>
+        <w:rPr>
+          <w:color w:val="555555"/>
+          <w:u w:color="555555"/>
+        </w:rPr>
+        <w:t xml:space="preserve"> | </w:t>
+      </w:r>
+      <w:hyperlink r:id="rId8" w:history="1">
+        <w:r>
+          <w:rPr>
+            <w:rStyle w:val="Hyperlink"/>
+          </w:rPr>
+          <w:t>linkedin.com/in/matthew-smith-22310b111/</w:t>
+        </w:r>
+      </w:hyperlink>
+    </w:p>
+    <w:p>
+      <w:pPr>
+        <w:pStyle w:val="Body"/>
+        <w:spacing w:after="60"/>
+        <w:jc w:val="center"/>
+        <w:rPr>
+          <w:color w:val="555555"/>
+          <w:u w:color="555555"/>
+        </w:rPr>
+      </w:pPr>
+      <w:hyperlink r:id="rId9" w:history="1">
+        <w:r>
+          <w:rPr>
+            <w:rStyle w:val="Hyperlink"/>
+          </w:rPr>
+          <w:t>msmith1392.github.io</w:t>
+        </w:r>
+      </w:hyperlink>
+      <w:r>
+        <w:rPr>
+          <w:color w:val="555555"/>
+          <w:u w:color="555555"/>
+        </w:rPr>
+        <w:t xml:space="preserve"> | </w:t>
+      </w:r>
+      <w:hyperlink r:id="rId10" w:history="1">
+        <w:r>
+          <w:rPr>
+            <w:rStyle w:val="Hyperlink"/>
+          </w:rPr>
+          <w:t>github</w:t>
+        </w:r>
+        <w:r>
+          <w:rPr>
+            <w:rStyle w:val="Hyperlink"/>
+          </w:rPr>
+          <w:t>.com</w:t>
+        </w:r>
+        <w:r>
+          <w:rPr>
+            <w:rStyle w:val="Hyperlink"/>
+          </w:rPr>
+          <w:t>/msmith1392</w:t>
+        </w:r>
+      </w:hyperlink>
     </w:p>
     <w:p>
       <w:pPr>
         <w:pStyle w:val="Body"/>
         <w:pBdr>
-          <w:top w:val="nil"/>
-          <w:left w:val="nil"/>
-          <w:bottom w:val="single" w:color="1f4e79" w:sz="10" w:space="0" w:shadow="0" w:frame="0"/>
-          <w:right w:val="nil"/>
+          <w:bottom w:val="single" w:sz="10" w:space="0" w:color="1F4E79"/>
         </w:pBdr>
       </w:pPr>
     </w:p>
@@ -116,30 +131,19 @@
       <w:pPr>
         <w:pStyle w:val="Body"/>
         <w:pBdr>
-          <w:top w:val="nil"/>
-          <w:left w:val="nil"/>
-          <w:bottom w:val="single" w:color="1f4e79" w:sz="8" w:space="0" w:shadow="0" w:frame="0"/>
-          <w:right w:val="nil"/>
+          <w:bottom w:val="single" w:sz="8" w:space="0" w:color="1F4E79"/>
         </w:pBdr>
         <w:spacing w:before="200" w:after="60"/>
       </w:pPr>
       <w:r>
         <w:rPr>
           <w:rStyle w:val="None"/>
-          <w:b w:val="1"/>
-          <w:bCs w:val="1"/>
-          <w:outline w:val="0"/>
-          <w:color w:val="1f4e79"/>
+          <w:b/>
+          <w:bCs/>
+          <w:color w:val="1F4E79"/>
           <w:sz w:val="22"/>
           <w:szCs w:val="22"/>
-          <w:u w:color="1f4e79"/>
-          <w:rtl w:val="0"/>
-          <w:lang w:val="en-US"/>
-          <w14:textFill>
-            <w14:solidFill>
-              <w14:srgbClr w14:val="1F4E79"/>
-            </w14:solidFill>
-          </w14:textFill>
+          <w:u w:color="1F4E79"/>
         </w:rPr>
         <w:t>SUMMARY</w:t>
       </w:r>
@@ -152,16 +156,8 @@
       <w:r>
         <w:rPr>
           <w:rStyle w:val="None"/>
-          <w:outline w:val="0"/>
-          <w:color w:val="1a1a1a"/>
-          <w:u w:color="1a1a1a"/>
-          <w:rtl w:val="0"/>
-          <w:lang w:val="en-US"/>
-          <w14:textFill>
-            <w14:solidFill>
-              <w14:srgbClr w14:val="1A1A1A"/>
-            </w14:solidFill>
-          </w14:textFill>
+          <w:color w:val="1A1A1A"/>
+          <w:u w:color="1A1A1A"/>
         </w:rPr>
         <w:t>Senior Software Engineer specializing in building, modernizing and delivering secure, scalable enterprise systems across federal and private sectors. Experienced in Java (Spring Boot), C# (.NET), and Python (Django) and modern TypeScript frameworks, with deep involvement in mission-critical FEMA platforms including PrepToolkit and URT. Proven track record designing RESTful APIs, leading legacy modernization initiatives, delivering containerized services in production environments, and mentoring engineering teams. Strong focus on maintainability, performance, and clean architecture. Actively exploring LLM integration and Retrieval-Augmented Generation (RAG) architectures.</w:t>
       </w:r>
@@ -170,30 +166,20 @@
       <w:pPr>
         <w:pStyle w:val="Body"/>
         <w:pBdr>
-          <w:top w:val="nil"/>
-          <w:left w:val="nil"/>
-          <w:bottom w:val="single" w:color="1f4e79" w:sz="8" w:space="0" w:shadow="0" w:frame="0"/>
-          <w:right w:val="nil"/>
+          <w:bottom w:val="single" w:sz="8" w:space="0" w:color="1F4E79"/>
         </w:pBdr>
         <w:spacing w:before="200" w:after="60"/>
       </w:pPr>
       <w:r>
         <w:rPr>
           <w:rStyle w:val="None"/>
-          <w:b w:val="1"/>
-          <w:bCs w:val="1"/>
-          <w:outline w:val="0"/>
-          <w:color w:val="1f4e79"/>
+          <w:b/>
+          <w:bCs/>
+          <w:color w:val="1F4E79"/>
           <w:sz w:val="22"/>
           <w:szCs w:val="22"/>
-          <w:u w:color="1f4e79"/>
-          <w:rtl w:val="0"/>
+          <w:u w:color="1F4E79"/>
           <w:lang w:val="de-DE"/>
-          <w14:textFill>
-            <w14:solidFill>
-              <w14:srgbClr w14:val="1F4E79"/>
-            </w14:solidFill>
-          </w14:textFill>
         </w:rPr>
         <w:t>CORE EXPERTISE</w:t>
       </w:r>
@@ -206,34 +192,19 @@
       <w:r>
         <w:rPr>
           <w:rStyle w:val="None"/>
-          <w:b w:val="1"/>
-          <w:bCs w:val="1"/>
-          <w:outline w:val="0"/>
-          <w:color w:val="1a1a1a"/>
-          <w:u w:color="1a1a1a"/>
-          <w:rtl w:val="0"/>
+          <w:b/>
+          <w:bCs/>
+          <w:color w:val="1A1A1A"/>
+          <w:u w:color="1A1A1A"/>
           <w:lang w:val="de-DE"/>
-          <w14:textFill>
-            <w14:solidFill>
-              <w14:srgbClr w14:val="1A1A1A"/>
-            </w14:solidFill>
-          </w14:textFill>
         </w:rPr>
         <w:t xml:space="preserve">Backend: </w:t>
       </w:r>
       <w:r>
         <w:rPr>
           <w:rStyle w:val="None"/>
-          <w:outline w:val="0"/>
-          <w:color w:val="555555"/>
-          <w:u w:color="555555"/>
-          <w:rtl w:val="0"/>
-          <w:lang w:val="en-US"/>
-          <w14:textFill>
-            <w14:solidFill>
-              <w14:srgbClr w14:val="555555"/>
-            </w14:solidFill>
-          </w14:textFill>
+          <w:color w:val="555555"/>
+          <w:u w:color="555555"/>
         </w:rPr>
         <w:t>Java (Spring Boot), C# (.NET), Python (Django), REST APIs, MySQL, PostgreSQL, SQL Server, Flyway</w:t>
       </w:r>
@@ -246,34 +217,30 @@
       <w:r>
         <w:rPr>
           <w:rStyle w:val="None"/>
-          <w:b w:val="1"/>
-          <w:bCs w:val="1"/>
-          <w:outline w:val="0"/>
-          <w:color w:val="1a1a1a"/>
-          <w:u w:color="1a1a1a"/>
-          <w:rtl w:val="0"/>
+          <w:b/>
+          <w:bCs/>
+          <w:color w:val="1A1A1A"/>
+          <w:u w:color="1A1A1A"/>
           <w:lang w:val="fr-FR"/>
-          <w14:textFill>
-            <w14:solidFill>
-              <w14:srgbClr w14:val="1A1A1A"/>
-            </w14:solidFill>
-          </w14:textFill>
-        </w:rPr>
-        <w:t xml:space="preserve">Frontend: </w:t>
-      </w:r>
-      <w:r>
-        <w:rPr>
-          <w:rStyle w:val="None"/>
-          <w:outline w:val="0"/>
-          <w:color w:val="555555"/>
-          <w:u w:color="555555"/>
-          <w:rtl w:val="0"/>
-          <w:lang w:val="en-US"/>
-          <w14:textFill>
-            <w14:solidFill>
-              <w14:srgbClr w14:val="555555"/>
-            </w14:solidFill>
-          </w14:textFill>
+        </w:rPr>
+        <w:t>Frontend :</w:t>
+      </w:r>
+      <w:r>
+        <w:rPr>
+          <w:rStyle w:val="None"/>
+          <w:b/>
+          <w:bCs/>
+          <w:color w:val="1A1A1A"/>
+          <w:u w:color="1A1A1A"/>
+          <w:lang w:val="fr-FR"/>
+        </w:rPr>
+        <w:t xml:space="preserve"> </w:t>
+      </w:r>
+      <w:r>
+        <w:rPr>
+          <w:rStyle w:val="None"/>
+          <w:color w:val="555555"/>
+          <w:u w:color="555555"/>
         </w:rPr>
         <w:t>TypeScript, Svelte, React, Angular, GWT, Bootstrap, Tailwind</w:t>
       </w:r>
@@ -286,34 +253,19 @@
       <w:r>
         <w:rPr>
           <w:rStyle w:val="None"/>
-          <w:b w:val="1"/>
-          <w:bCs w:val="1"/>
-          <w:outline w:val="0"/>
-          <w:color w:val="1a1a1a"/>
-          <w:u w:color="1a1a1a"/>
-          <w:rtl w:val="0"/>
+          <w:b/>
+          <w:bCs/>
+          <w:color w:val="1A1A1A"/>
+          <w:u w:color="1A1A1A"/>
           <w:lang w:val="de-DE"/>
-          <w14:textFill>
-            <w14:solidFill>
-              <w14:srgbClr w14:val="1A1A1A"/>
-            </w14:solidFill>
-          </w14:textFill>
         </w:rPr>
         <w:t xml:space="preserve">System Design: </w:t>
       </w:r>
       <w:r>
         <w:rPr>
           <w:rStyle w:val="None"/>
-          <w:outline w:val="0"/>
-          <w:color w:val="555555"/>
-          <w:u w:color="555555"/>
-          <w:rtl w:val="0"/>
-          <w:lang w:val="en-US"/>
-          <w14:textFill>
-            <w14:solidFill>
-              <w14:srgbClr w14:val="555555"/>
-            </w14:solidFill>
-          </w14:textFill>
+          <w:color w:val="555555"/>
+          <w:u w:color="555555"/>
         </w:rPr>
         <w:t>Microservices, API-Driven Design, Event-Driven Patterns, Distributed Session Management, Layered Systems</w:t>
       </w:r>
@@ -326,34 +278,20 @@
       <w:r>
         <w:rPr>
           <w:rStyle w:val="None"/>
-          <w:b w:val="1"/>
-          <w:bCs w:val="1"/>
-          <w:outline w:val="0"/>
-          <w:color w:val="1a1a1a"/>
-          <w:u w:color="1a1a1a"/>
-          <w:rtl w:val="0"/>
+          <w:b/>
+          <w:bCs/>
+          <w:color w:val="1A1A1A"/>
+          <w:u w:color="1A1A1A"/>
           <w:lang w:val="nl-NL"/>
-          <w14:textFill>
-            <w14:solidFill>
-              <w14:srgbClr w14:val="1A1A1A"/>
-            </w14:solidFill>
-          </w14:textFill>
         </w:rPr>
         <w:t xml:space="preserve">DevOps &amp; Tools: </w:t>
       </w:r>
       <w:r>
         <w:rPr>
           <w:rStyle w:val="None"/>
-          <w:outline w:val="0"/>
-          <w:color w:val="555555"/>
-          <w:u w:color="555555"/>
-          <w:rtl w:val="0"/>
+          <w:color w:val="555555"/>
+          <w:u w:color="555555"/>
           <w:lang w:val="de-DE"/>
-          <w14:textFill>
-            <w14:solidFill>
-              <w14:srgbClr w14:val="555555"/>
-            </w14:solidFill>
-          </w14:textFill>
         </w:rPr>
         <w:t>Docker/Podman, Gradle, Maven, AWS (Lambda, S3), Git, Apache Tomcat</w:t>
       </w:r>
@@ -366,32 +304,18 @@
       <w:r>
         <w:rPr>
           <w:rStyle w:val="None"/>
-          <w:b w:val="1"/>
-          <w:bCs w:val="1"/>
-          <w:outline w:val="0"/>
-          <w:color w:val="1a1a1a"/>
-          <w:u w:color="1a1a1a"/>
-          <w:rtl w:val="0"/>
-          <w14:textFill>
-            <w14:solidFill>
-              <w14:srgbClr w14:val="1A1A1A"/>
-            </w14:solidFill>
-          </w14:textFill>
+          <w:b/>
+          <w:bCs/>
+          <w:color w:val="1A1A1A"/>
+          <w:u w:color="1A1A1A"/>
         </w:rPr>
         <w:t xml:space="preserve">Platforms: </w:t>
       </w:r>
       <w:r>
         <w:rPr>
           <w:rStyle w:val="None"/>
-          <w:outline w:val="0"/>
-          <w:color w:val="555555"/>
-          <w:u w:color="555555"/>
-          <w:rtl w:val="0"/>
-          <w14:textFill>
-            <w14:solidFill>
-              <w14:srgbClr w14:val="555555"/>
-            </w14:solidFill>
-          </w14:textFill>
+          <w:color w:val="555555"/>
+          <w:u w:color="555555"/>
         </w:rPr>
         <w:t>Liferay 7, Node.js, npm</w:t>
       </w:r>
@@ -400,30 +324,20 @@
       <w:pPr>
         <w:pStyle w:val="Body"/>
         <w:pBdr>
-          <w:top w:val="nil"/>
-          <w:left w:val="nil"/>
-          <w:bottom w:val="single" w:color="1f4e79" w:sz="8" w:space="0" w:shadow="0" w:frame="0"/>
-          <w:right w:val="nil"/>
+          <w:bottom w:val="single" w:sz="8" w:space="0" w:color="1F4E79"/>
         </w:pBdr>
         <w:spacing w:before="200" w:after="60"/>
       </w:pPr>
       <w:r>
         <w:rPr>
           <w:rStyle w:val="None"/>
-          <w:b w:val="1"/>
-          <w:bCs w:val="1"/>
-          <w:outline w:val="0"/>
-          <w:color w:val="1f4e79"/>
+          <w:b/>
+          <w:bCs/>
+          <w:color w:val="1F4E79"/>
           <w:sz w:val="22"/>
           <w:szCs w:val="22"/>
-          <w:u w:color="1f4e79"/>
-          <w:rtl w:val="0"/>
+          <w:u w:color="1F4E79"/>
           <w:lang w:val="de-DE"/>
-          <w14:textFill>
-            <w14:solidFill>
-              <w14:srgbClr w14:val="1F4E79"/>
-            </w14:solidFill>
-          </w14:textFill>
         </w:rPr>
         <w:t>PROFESSIONAL EXPERIENCE</w:t>
       </w:r>
@@ -439,271 +353,177 @@
       <w:r>
         <w:rPr>
           <w:rStyle w:val="None"/>
-          <w:b w:val="1"/>
-          <w:bCs w:val="1"/>
-          <w:outline w:val="0"/>
-          <w:color w:val="1a1a1a"/>
+          <w:b/>
+          <w:bCs/>
+          <w:color w:val="1A1A1A"/>
           <w:sz w:val="22"/>
           <w:szCs w:val="22"/>
-          <w:u w:color="1a1a1a"/>
-          <w:rtl w:val="0"/>
-          <w:lang w:val="en-US"/>
-          <w14:textFill>
-            <w14:solidFill>
-              <w14:srgbClr w14:val="1A1A1A"/>
-            </w14:solidFill>
-          </w14:textFill>
+          <w:u w:color="1A1A1A"/>
         </w:rPr>
         <w:t>Senior Software Engineer</w:t>
       </w:r>
       <w:r>
         <w:rPr>
           <w:rStyle w:val="None"/>
-          <w:outline w:val="0"/>
-          <w:color w:val="555555"/>
-          <w:u w:color="555555"/>
-          <w:rtl w:val="0"/>
-          <w14:textFill>
-            <w14:solidFill>
-              <w14:srgbClr w14:val="555555"/>
-            </w14:solidFill>
-          </w14:textFill>
+          <w:color w:val="555555"/>
+          <w:u w:color="555555"/>
         </w:rPr>
         <w:t xml:space="preserve"> | </w:t>
       </w:r>
       <w:r>
         <w:rPr>
           <w:rStyle w:val="None"/>
-          <w:b w:val="1"/>
-          <w:bCs w:val="1"/>
-          <w:outline w:val="0"/>
-          <w:color w:val="1f4e79"/>
-          <w:u w:color="1f4e79"/>
-          <w:rtl w:val="0"/>
-          <w:lang w:val="en-US"/>
-          <w14:textFill>
-            <w14:solidFill>
-              <w14:srgbClr w14:val="1F4E79"/>
-            </w14:solidFill>
-          </w14:textFill>
+          <w:b/>
+          <w:bCs/>
+          <w:color w:val="1F4E79"/>
+          <w:u w:color="1F4E79"/>
         </w:rPr>
         <w:t>4 Arrows Consulting, Inc.</w:t>
       </w:r>
       <w:r>
         <w:rPr>
           <w:rStyle w:val="None"/>
-          <w:outline w:val="0"/>
-          <w:color w:val="555555"/>
-          <w:u w:color="555555"/>
-          <w:rtl w:val="0"/>
-          <w14:textFill>
-            <w14:solidFill>
-              <w14:srgbClr w14:val="555555"/>
-            </w14:solidFill>
-          </w14:textFill>
-        </w:rPr>
-        <w:t xml:space="preserve"> • </w:t>
-      </w:r>
-      <w:r>
-        <w:rPr>
-          <w:rStyle w:val="None"/>
-          <w:outline w:val="0"/>
-          <w:color w:val="555555"/>
-          <w:u w:color="555555"/>
-          <w:rtl w:val="0"/>
-          <w:lang w:val="en-US"/>
-          <w14:textFill>
-            <w14:solidFill>
-              <w14:srgbClr w14:val="555555"/>
-            </w14:solidFill>
-          </w14:textFill>
-        </w:rPr>
-        <w:t xml:space="preserve">Somerset, KY (Remote) </w:t>
-      </w:r>
-      <w:r>
-        <w:rPr>
-          <w:rStyle w:val="None"/>
-          <w:outline w:val="0"/>
-          <w:color w:val="555555"/>
-          <w:u w:color="555555"/>
-          <w:rtl w:val="0"/>
-          <w14:textFill>
-            <w14:solidFill>
-              <w14:srgbClr w14:val="555555"/>
-            </w14:solidFill>
-          </w14:textFill>
-        </w:rPr>
-        <w:t xml:space="preserve">• </w:t>
-      </w:r>
-      <w:r>
-        <w:rPr>
-          <w:rStyle w:val="None"/>
-          <w:outline w:val="0"/>
-          <w:color w:val="555555"/>
-          <w:u w:color="555555"/>
-          <w:rtl w:val="0"/>
-          <w14:textFill>
-            <w14:solidFill>
-              <w14:srgbClr w14:val="555555"/>
-            </w14:solidFill>
-          </w14:textFill>
-        </w:rPr>
-        <w:t xml:space="preserve">2019 </w:t>
-      </w:r>
-      <w:r>
-        <w:rPr>
-          <w:rStyle w:val="None"/>
-          <w:outline w:val="0"/>
-          <w:color w:val="555555"/>
-          <w:u w:color="555555"/>
-          <w:rtl w:val="0"/>
-          <w14:textFill>
-            <w14:solidFill>
-              <w14:srgbClr w14:val="555555"/>
-            </w14:solidFill>
-          </w14:textFill>
-        </w:rPr>
-        <w:t xml:space="preserve">– </w:t>
-      </w:r>
-      <w:r>
-        <w:rPr>
-          <w:rStyle w:val="None"/>
-          <w:outline w:val="0"/>
-          <w:color w:val="555555"/>
-          <w:u w:color="555555"/>
-          <w:rtl w:val="0"/>
+          <w:color w:val="555555"/>
+          <w:u w:color="555555"/>
+        </w:rPr>
+        <w:t xml:space="preserve"> • Somerset, KY (Remote) • </w:t>
+      </w:r>
+      <w:r>
+        <w:rPr>
+          <w:rStyle w:val="None"/>
+          <w:color w:val="555555"/>
+          <w:u w:color="555555"/>
+        </w:rPr>
+        <w:t>03/</w:t>
+      </w:r>
+      <w:r>
+        <w:rPr>
+          <w:rStyle w:val="None"/>
+          <w:color w:val="555555"/>
+          <w:u w:color="555555"/>
+        </w:rPr>
+        <w:t xml:space="preserve">2019 – </w:t>
+      </w:r>
+      <w:r>
+        <w:rPr>
+          <w:rStyle w:val="None"/>
+          <w:color w:val="555555"/>
+          <w:u w:color="555555"/>
           <w:lang w:val="it-IT"/>
-          <w14:textFill>
-            <w14:solidFill>
-              <w14:srgbClr w14:val="555555"/>
-            </w14:solidFill>
-          </w14:textFill>
         </w:rPr>
         <w:t>Present</w:t>
       </w:r>
     </w:p>
     <w:p>
       <w:pPr>
-        <w:pStyle w:val="List Paragraph"/>
+        <w:pStyle w:val="ListParagraph"/>
         <w:numPr>
           <w:ilvl w:val="0"/>
           <w:numId w:val="2"/>
         </w:numPr>
         <w:spacing w:before="40" w:after="40"/>
-        <w:rPr>
-          <w:lang w:val="en-US"/>
-        </w:rPr>
-      </w:pPr>
-      <w:r>
-        <w:rPr>
-          <w:rStyle w:val="None"/>
-          <w:rtl w:val="0"/>
-          <w:lang w:val="en-US"/>
-        </w:rPr>
-        <w:t>Cross-Stack Feature Ownership: Delivered complex features across backend (Spring Boot/.NET), database, and frontend layers within FEMA preparedness platforms (PrepToolkit, URT), ensuring cohesive integration between APIs, data models, and user interfaces.</w:t>
-      </w:r>
-    </w:p>
-    <w:p>
-      <w:pPr>
-        <w:pStyle w:val="List Paragraph"/>
+      </w:pPr>
+      <w:r>
+        <w:rPr>
+          <w:rStyle w:val="None"/>
+        </w:rPr>
+        <w:t xml:space="preserve">Cross-Stack Feature Ownership: Delivered complex features across backend (Spring Boot/.NET), database, and frontend layers within FEMA preparedness platforms (PrepToolkit, </w:t>
+      </w:r>
+      <w:r>
+        <w:rPr>
+          <w:rStyle w:val="None"/>
+        </w:rPr>
+        <w:t>OneResponder, RTLT, IRIS</w:t>
+      </w:r>
+      <w:r>
+        <w:rPr>
+          <w:rStyle w:val="None"/>
+        </w:rPr>
+        <w:t>), ensuring cohesive integration between APIs, data models, and user interfaces.</w:t>
+      </w:r>
+    </w:p>
+    <w:p>
+      <w:pPr>
+        <w:pStyle w:val="ListParagraph"/>
         <w:numPr>
           <w:ilvl w:val="0"/>
           <w:numId w:val="2"/>
         </w:numPr>
         <w:spacing w:before="40" w:after="40"/>
-        <w:rPr>
-          <w:lang w:val="en-US"/>
-        </w:rPr>
-      </w:pPr>
-      <w:r>
-        <w:rPr>
-          <w:rStyle w:val="None"/>
-          <w:rtl w:val="0"/>
-          <w:lang w:val="en-US"/>
+      </w:pPr>
+      <w:r>
+        <w:rPr>
+          <w:rStyle w:val="None"/>
         </w:rPr>
         <w:t>System Architecture &amp; Presence: Spearheaded the implementation of a real-time presence tracking system for the Unified Reporting Tool (URT); independently designed and optimized distributed session logic (polling/timeouts) to ensure data integrity for concurrent federal users.</w:t>
       </w:r>
     </w:p>
     <w:p>
       <w:pPr>
-        <w:pStyle w:val="List Paragraph"/>
+        <w:pStyle w:val="ListParagraph"/>
         <w:numPr>
           <w:ilvl w:val="0"/>
           <w:numId w:val="2"/>
         </w:numPr>
         <w:spacing w:before="40" w:after="40"/>
-        <w:rPr>
-          <w:lang w:val="en-US"/>
-        </w:rPr>
-      </w:pPr>
-      <w:r>
-        <w:rPr>
-          <w:rStyle w:val="None"/>
-          <w:rtl w:val="0"/>
-          <w:lang w:val="en-US"/>
-        </w:rPr>
-        <w:t>Modernization &amp; Performance: Drove the strategic migration of legacy Liferay portlets to Svelte micro-frontends, resulting in measurable frontend performance improvements and a more maintainable codebase.</w:t>
-      </w:r>
-    </w:p>
-    <w:p>
-      <w:pPr>
-        <w:pStyle w:val="List Paragraph"/>
+      </w:pPr>
+      <w:r>
+        <w:t>Serverless Portal Ownership: Replaced legacy GWT portlets with a standalone serverless AWS application (S3</w:t>
+      </w:r>
+      <w:r>
+        <w:t>/</w:t>
+      </w:r>
+      <w:r>
+        <w:t>CloudFront</w:t>
+      </w:r>
+      <w:r>
+        <w:t xml:space="preserve"> </w:t>
+      </w:r>
+      <w:r>
+        <w:t>hosted Svelte frontend) serving as a unified access portal for FEMA preparedness platforms (PrepToolkit, OneResponder, RTLT, IRIS), organizing the component hierarchy (containers, forms, cards) and structuring the provider layer per application to keep each platform's data context cleanly separated.</w:t>
+      </w:r>
+    </w:p>
+    <w:p>
+      <w:pPr>
+        <w:pStyle w:val="ListParagraph"/>
         <w:numPr>
           <w:ilvl w:val="0"/>
           <w:numId w:val="2"/>
         </w:numPr>
         <w:spacing w:before="40" w:after="40"/>
-        <w:rPr>
-          <w:lang w:val="en-US"/>
-        </w:rPr>
-      </w:pPr>
-      <w:r>
-        <w:rPr>
-          <w:rStyle w:val="None"/>
-          <w:rtl w:val="0"/>
-          <w:lang w:val="en-US"/>
-        </w:rPr>
-        <w:t>Development Workflow Improvements: Introduced containerized development environments (Docker/Podman) and implemented Flyway-based database migrations to improve consistency across environments and reduce configuration drift. Regularly conduct peer code reviews to reinforce clean architecture and maintainable code practices.</w:t>
-      </w:r>
-    </w:p>
-    <w:p>
-      <w:pPr>
-        <w:pStyle w:val="List Paragraph"/>
+      </w:pPr>
+      <w:r>
+        <w:t>Development Workflow Improvements: Leveraged containerized development environments (Docker/Podman) and Flyway-based database migrations to improve consistency across environments and reduce configuration drift. Regularly conduct peer code reviews to reinforce clean architecture and maintainable code practices.</w:t>
+      </w:r>
+    </w:p>
+    <w:p>
+      <w:pPr>
+        <w:pStyle w:val="ListParagraph"/>
         <w:numPr>
           <w:ilvl w:val="0"/>
           <w:numId w:val="2"/>
         </w:numPr>
         <w:spacing w:before="40" w:after="40"/>
-        <w:rPr>
-          <w:lang w:val="en-US"/>
-        </w:rPr>
-      </w:pPr>
-      <w:r>
-        <w:rPr>
-          <w:rStyle w:val="None"/>
-          <w:rtl w:val="0"/>
-          <w:lang w:val="en-US"/>
+      </w:pPr>
+      <w:r>
+        <w:rPr>
+          <w:rStyle w:val="None"/>
         </w:rPr>
         <w:t>Stakeholder Alignment: Translate complex FEMA business requirements (THIRA/SPR, CPG, NIMS, UAWG) into scalable technical solutions, coordinating closely with project leads to ensure all features align with federal compliance and security standards.</w:t>
       </w:r>
     </w:p>
     <w:p>
       <w:pPr>
-        <w:pStyle w:val="List Paragraph"/>
+        <w:pStyle w:val="ListParagraph"/>
         <w:numPr>
           <w:ilvl w:val="0"/>
           <w:numId w:val="2"/>
         </w:numPr>
         <w:spacing w:before="40" w:after="40"/>
-        <w:rPr>
-          <w:lang w:val="en-US"/>
-        </w:rPr>
-      </w:pPr>
-      <w:r>
-        <w:rPr>
-          <w:rStyle w:val="None"/>
-          <w:rtl w:val="0"/>
-          <w:lang w:val="en-US"/>
+      </w:pPr>
+      <w:r>
+        <w:rPr>
+          <w:rStyle w:val="None"/>
         </w:rPr>
         <w:t>Operational Excellence: Automated enterprise reporting workflows (Docmosis/Apache POI), reducing processing time from hours to minutes and directly improving operational efficiency for national exercise programs.</w:t>
       </w:r>
@@ -716,38 +536,24 @@
       <w:r>
         <w:rPr>
           <w:rStyle w:val="None"/>
-          <w:b w:val="1"/>
-          <w:bCs w:val="1"/>
-          <w:outline w:val="0"/>
+          <w:b/>
+          <w:bCs/>
           <w:color w:val="555555"/>
           <w:sz w:val="19"/>
           <w:szCs w:val="19"/>
           <w:u w:color="555555"/>
-          <w:rtl w:val="0"/>
           <w:lang w:val="nl-NL"/>
-          <w14:textFill>
-            <w14:solidFill>
-              <w14:srgbClr w14:val="555555"/>
-            </w14:solidFill>
-          </w14:textFill>
         </w:rPr>
         <w:t xml:space="preserve">Tech Stack: </w:t>
       </w:r>
       <w:r>
         <w:rPr>
           <w:rStyle w:val="None"/>
-          <w:outline w:val="0"/>
           <w:color w:val="555555"/>
           <w:sz w:val="19"/>
           <w:szCs w:val="19"/>
           <w:u w:color="555555"/>
-          <w:rtl w:val="0"/>
           <w:lang w:val="nl-NL"/>
-          <w14:textFill>
-            <w14:solidFill>
-              <w14:srgbClr w14:val="555555"/>
-            </w14:solidFill>
-          </w14:textFill>
         </w:rPr>
         <w:t>Java, Spring Boot, Gradle, GWT, MySQL, Liferay 7, Apache HTTP Server, JavaScript/TypeScript, Svelte, React, Node.js, npm, AWS Lambda, Git, Podman, Docmosis, OpenCSV, Apache POI</w:t>
       </w:r>
@@ -763,207 +569,136 @@
       <w:r>
         <w:rPr>
           <w:rStyle w:val="None"/>
-          <w:b w:val="1"/>
-          <w:bCs w:val="1"/>
-          <w:outline w:val="0"/>
-          <w:color w:val="1a1a1a"/>
+          <w:b/>
+          <w:bCs/>
+          <w:color w:val="1A1A1A"/>
           <w:sz w:val="22"/>
           <w:szCs w:val="22"/>
-          <w:u w:color="1a1a1a"/>
-          <w:rtl w:val="0"/>
-          <w:lang w:val="en-US"/>
-          <w14:textFill>
-            <w14:solidFill>
-              <w14:srgbClr w14:val="1A1A1A"/>
-            </w14:solidFill>
-          </w14:textFill>
+          <w:u w:color="1A1A1A"/>
         </w:rPr>
         <w:t>Applications Developer</w:t>
       </w:r>
       <w:r>
         <w:rPr>
           <w:rStyle w:val="None"/>
-          <w:outline w:val="0"/>
-          <w:color w:val="555555"/>
-          <w:u w:color="555555"/>
-          <w:rtl w:val="0"/>
-          <w14:textFill>
-            <w14:solidFill>
-              <w14:srgbClr w14:val="555555"/>
-            </w14:solidFill>
-          </w14:textFill>
+          <w:color w:val="555555"/>
+          <w:u w:color="555555"/>
         </w:rPr>
         <w:t xml:space="preserve"> | </w:t>
       </w:r>
       <w:r>
         <w:rPr>
           <w:rStyle w:val="None"/>
-          <w:b w:val="1"/>
-          <w:bCs w:val="1"/>
-          <w:outline w:val="0"/>
-          <w:color w:val="1f4e79"/>
-          <w:u w:color="1f4e79"/>
-          <w:rtl w:val="0"/>
-          <w:lang w:val="en-US"/>
-          <w14:textFill>
-            <w14:solidFill>
-              <w14:srgbClr w14:val="1F4E79"/>
-            </w14:solidFill>
-          </w14:textFill>
+          <w:b/>
+          <w:bCs/>
+          <w:color w:val="1F4E79"/>
+          <w:u w:color="1F4E79"/>
         </w:rPr>
         <w:t>United Parcel Service (UPS)</w:t>
       </w:r>
       <w:r>
         <w:rPr>
           <w:rStyle w:val="None"/>
-          <w:outline w:val="0"/>
-          <w:color w:val="555555"/>
-          <w:u w:color="555555"/>
-          <w:rtl w:val="0"/>
-          <w14:textFill>
-            <w14:solidFill>
-              <w14:srgbClr w14:val="555555"/>
-            </w14:solidFill>
-          </w14:textFill>
+          <w:color w:val="555555"/>
+          <w:u w:color="555555"/>
         </w:rPr>
         <w:t xml:space="preserve"> • </w:t>
       </w:r>
       <w:r>
         <w:rPr>
           <w:rStyle w:val="None"/>
-          <w:outline w:val="0"/>
-          <w:color w:val="555555"/>
-          <w:u w:color="555555"/>
-          <w:rtl w:val="0"/>
+          <w:color w:val="555555"/>
+          <w:u w:color="555555"/>
           <w:lang w:val="da-DK"/>
-          <w14:textFill>
-            <w14:solidFill>
-              <w14:srgbClr w14:val="555555"/>
-            </w14:solidFill>
-          </w14:textFill>
         </w:rPr>
         <w:t xml:space="preserve">Louisville, KY </w:t>
       </w:r>
       <w:r>
         <w:rPr>
           <w:rStyle w:val="None"/>
-          <w:outline w:val="0"/>
-          <w:color w:val="555555"/>
-          <w:u w:color="555555"/>
-          <w:rtl w:val="0"/>
-          <w14:textFill>
-            <w14:solidFill>
-              <w14:srgbClr w14:val="555555"/>
-            </w14:solidFill>
-          </w14:textFill>
+          <w:color w:val="555555"/>
+          <w:u w:color="555555"/>
         </w:rPr>
         <w:t xml:space="preserve">• </w:t>
       </w:r>
       <w:r>
         <w:rPr>
           <w:rStyle w:val="None"/>
-          <w:outline w:val="0"/>
-          <w:color w:val="555555"/>
-          <w:u w:color="555555"/>
-          <w:rtl w:val="0"/>
-          <w14:textFill>
-            <w14:solidFill>
-              <w14:srgbClr w14:val="555555"/>
-            </w14:solidFill>
-          </w14:textFill>
-        </w:rPr>
-        <w:t xml:space="preserve">2017 </w:t>
-      </w:r>
-      <w:r>
-        <w:rPr>
-          <w:rStyle w:val="None"/>
-          <w:outline w:val="0"/>
-          <w:color w:val="555555"/>
-          <w:u w:color="555555"/>
-          <w:rtl w:val="0"/>
-          <w14:textFill>
-            <w14:solidFill>
-              <w14:srgbClr w14:val="555555"/>
-            </w14:solidFill>
-          </w14:textFill>
-        </w:rPr>
-        <w:t xml:space="preserve">– </w:t>
-      </w:r>
-      <w:r>
-        <w:rPr>
-          <w:rStyle w:val="None"/>
-          <w:outline w:val="0"/>
-          <w:color w:val="555555"/>
-          <w:u w:color="555555"/>
-          <w:rtl w:val="0"/>
-          <w14:textFill>
-            <w14:solidFill>
-              <w14:srgbClr w14:val="555555"/>
-            </w14:solidFill>
-          </w14:textFill>
+          <w:color w:val="555555"/>
+          <w:u w:color="555555"/>
+        </w:rPr>
+        <w:t>03/</w:t>
+      </w:r>
+      <w:r>
+        <w:rPr>
+          <w:rStyle w:val="None"/>
+          <w:color w:val="555555"/>
+          <w:u w:color="555555"/>
+        </w:rPr>
+        <w:t xml:space="preserve">2017 – </w:t>
+      </w:r>
+      <w:r>
+        <w:rPr>
+          <w:rStyle w:val="None"/>
+          <w:color w:val="555555"/>
+          <w:u w:color="555555"/>
+        </w:rPr>
+        <w:t>03/</w:t>
+      </w:r>
+      <w:r>
+        <w:rPr>
+          <w:rStyle w:val="None"/>
+          <w:color w:val="555555"/>
+          <w:u w:color="555555"/>
         </w:rPr>
         <w:t>2019</w:t>
       </w:r>
     </w:p>
     <w:p>
       <w:pPr>
-        <w:pStyle w:val="List Paragraph"/>
+        <w:pStyle w:val="ListParagraph"/>
         <w:numPr>
           <w:ilvl w:val="0"/>
           <w:numId w:val="4"/>
         </w:numPr>
         <w:spacing w:before="40" w:after="40"/>
-        <w:rPr>
-          <w:lang w:val="en-US"/>
-        </w:rPr>
-      </w:pPr>
-      <w:r>
-        <w:rPr>
-          <w:rStyle w:val="None"/>
-          <w:rtl w:val="0"/>
-          <w:lang w:val="en-US"/>
+      </w:pPr>
+      <w:r>
+        <w:rPr>
+          <w:rStyle w:val="None"/>
         </w:rPr>
         <w:t>Mission-Critical Reliability: Engineered backend logic and UI features for real-time transportation visibility systems, ensuring operational uptime in a 24/7 high-throughput production environment.</w:t>
       </w:r>
     </w:p>
     <w:p>
       <w:pPr>
-        <w:pStyle w:val="List Paragraph"/>
+        <w:pStyle w:val="ListParagraph"/>
         <w:numPr>
           <w:ilvl w:val="0"/>
           <w:numId w:val="4"/>
         </w:numPr>
         <w:spacing w:before="40" w:after="40"/>
-        <w:rPr>
-          <w:lang w:val="en-US"/>
-        </w:rPr>
-      </w:pPr>
-      <w:r>
-        <w:rPr>
-          <w:rStyle w:val="None"/>
-          <w:rtl w:val="0"/>
-          <w:lang w:val="en-US"/>
-        </w:rPr>
+      </w:pPr>
+      <w:r>
+        <w:rPr>
+          <w:rStyle w:val="None"/>
+        </w:rPr>
+        <w:lastRenderedPageBreak/>
         <w:t>Business Logic Abstraction: Architected complex decision-making flows by translating high-level business requirements into discrete rules for the Drools inference engine (BRMS), reducing manual intervention and decoupling policy from code.</w:t>
       </w:r>
     </w:p>
     <w:p>
       <w:pPr>
-        <w:pStyle w:val="List Paragraph"/>
+        <w:pStyle w:val="ListParagraph"/>
         <w:numPr>
           <w:ilvl w:val="0"/>
           <w:numId w:val="4"/>
         </w:numPr>
         <w:spacing w:before="40" w:after="40"/>
-        <w:rPr>
-          <w:lang w:val="en-US"/>
-        </w:rPr>
-      </w:pPr>
-      <w:r>
-        <w:rPr>
-          <w:rStyle w:val="None"/>
-          <w:rtl w:val="0"/>
-          <w:lang w:val="en-US"/>
+      </w:pPr>
+      <w:r>
+        <w:rPr>
+          <w:rStyle w:val="None"/>
         </w:rPr>
         <w:t>Performance Engineering: Conducted deep-dive bottleneck analysis and performance tuning (JMeter), identifying and resolving critical latency issues under peak traffic conditions.</w:t>
       </w:r>
@@ -976,38 +711,23 @@
       <w:r>
         <w:rPr>
           <w:rStyle w:val="None"/>
-          <w:b w:val="1"/>
-          <w:bCs w:val="1"/>
-          <w:outline w:val="0"/>
+          <w:b/>
+          <w:bCs/>
           <w:color w:val="555555"/>
           <w:sz w:val="19"/>
           <w:szCs w:val="19"/>
           <w:u w:color="555555"/>
-          <w:rtl w:val="0"/>
           <w:lang w:val="nl-NL"/>
-          <w14:textFill>
-            <w14:solidFill>
-              <w14:srgbClr w14:val="555555"/>
-            </w14:solidFill>
-          </w14:textFill>
         </w:rPr>
         <w:t xml:space="preserve">Tech Stack: </w:t>
       </w:r>
       <w:r>
         <w:rPr>
           <w:rStyle w:val="None"/>
-          <w:outline w:val="0"/>
           <w:color w:val="555555"/>
           <w:sz w:val="19"/>
           <w:szCs w:val="19"/>
           <w:u w:color="555555"/>
-          <w:rtl w:val="0"/>
-          <w:lang w:val="en-US"/>
-          <w14:textFill>
-            <w14:solidFill>
-              <w14:srgbClr w14:val="555555"/>
-            </w14:solidFill>
-          </w14:textFill>
         </w:rPr>
         <w:t>Java, Spring Framework, Maven/Gradle, Drools (BRMS), JMeter, Roadrunner, WebLogic, ActiveMQ, SQL Server, TFVC</w:t>
       </w:r>
@@ -1021,241 +741,136 @@
         <w:spacing w:before="160" w:after="30"/>
         <w:rPr>
           <w:rStyle w:val="None"/>
-          <w:outline w:val="0"/>
-          <w:color w:val="555555"/>
-          <w:u w:color="555555"/>
-          <w14:textFill>
-            <w14:solidFill>
-              <w14:srgbClr w14:val="555555"/>
-            </w14:solidFill>
-          </w14:textFill>
-        </w:rPr>
-      </w:pPr>
-      <w:r>
-        <w:rPr>
-          <w:rStyle w:val="None"/>
-          <w:b w:val="1"/>
-          <w:bCs w:val="1"/>
-          <w:outline w:val="0"/>
-          <w:color w:val="1a1a1a"/>
+          <w:color w:val="555555"/>
+          <w:u w:color="555555"/>
+        </w:rPr>
+      </w:pPr>
+      <w:r>
+        <w:rPr>
+          <w:rStyle w:val="None"/>
+          <w:b/>
+          <w:bCs/>
+          <w:color w:val="1A1A1A"/>
           <w:sz w:val="22"/>
           <w:szCs w:val="22"/>
-          <w:u w:color="1a1a1a"/>
-          <w:rtl w:val="0"/>
-          <w:lang w:val="en-US"/>
-          <w14:textFill>
-            <w14:solidFill>
-              <w14:srgbClr w14:val="1A1A1A"/>
-            </w14:solidFill>
-          </w14:textFill>
+          <w:u w:color="1A1A1A"/>
         </w:rPr>
         <w:t>Software Developer</w:t>
       </w:r>
       <w:r>
         <w:rPr>
           <w:rStyle w:val="None"/>
-          <w:outline w:val="0"/>
-          <w:color w:val="555555"/>
-          <w:u w:color="555555"/>
-          <w:rtl w:val="0"/>
-          <w14:textFill>
-            <w14:solidFill>
-              <w14:srgbClr w14:val="555555"/>
-            </w14:solidFill>
-          </w14:textFill>
+          <w:color w:val="555555"/>
+          <w:u w:color="555555"/>
         </w:rPr>
         <w:t xml:space="preserve"> | </w:t>
       </w:r>
       <w:r>
         <w:rPr>
           <w:rStyle w:val="None"/>
-          <w:b w:val="1"/>
-          <w:bCs w:val="1"/>
-          <w:outline w:val="0"/>
-          <w:color w:val="1f4e79"/>
-          <w:u w:color="1f4e79"/>
-          <w:rtl w:val="0"/>
-          <w:lang w:val="en-US"/>
-          <w14:textFill>
-            <w14:solidFill>
-              <w14:srgbClr w14:val="1F4E79"/>
-            </w14:solidFill>
-          </w14:textFill>
+          <w:b/>
+          <w:bCs/>
+          <w:color w:val="1F4E79"/>
+          <w:u w:color="1F4E79"/>
         </w:rPr>
         <w:t>Apax Software</w:t>
       </w:r>
       <w:r>
         <w:rPr>
           <w:rStyle w:val="None"/>
-          <w:outline w:val="0"/>
-          <w:color w:val="555555"/>
-          <w:u w:color="555555"/>
-          <w:rtl w:val="0"/>
-          <w14:textFill>
-            <w14:solidFill>
-              <w14:srgbClr w14:val="555555"/>
-            </w14:solidFill>
-          </w14:textFill>
-        </w:rPr>
-        <w:t xml:space="preserve"> • </w:t>
-      </w:r>
-      <w:r>
-        <w:rPr>
-          <w:rStyle w:val="None"/>
-          <w:outline w:val="0"/>
-          <w:color w:val="555555"/>
-          <w:u w:color="555555"/>
-          <w:rtl w:val="0"/>
-          <w:lang w:val="en-US"/>
-          <w14:textFill>
-            <w14:solidFill>
-              <w14:srgbClr w14:val="555555"/>
-            </w14:solidFill>
-          </w14:textFill>
-        </w:rPr>
-        <w:t xml:space="preserve">Lexington, KY </w:t>
-      </w:r>
-      <w:r>
-        <w:rPr>
-          <w:rStyle w:val="None"/>
-          <w:outline w:val="0"/>
-          <w:color w:val="555555"/>
-          <w:u w:color="555555"/>
-          <w:rtl w:val="0"/>
-          <w14:textFill>
-            <w14:solidFill>
-              <w14:srgbClr w14:val="555555"/>
-            </w14:solidFill>
-          </w14:textFill>
-        </w:rPr>
-        <w:t xml:space="preserve">• </w:t>
-      </w:r>
-      <w:r>
-        <w:rPr>
-          <w:rStyle w:val="None"/>
-          <w:outline w:val="0"/>
-          <w:color w:val="555555"/>
-          <w:u w:color="555555"/>
-          <w:rtl w:val="0"/>
-          <w14:textFill>
-            <w14:solidFill>
-              <w14:srgbClr w14:val="555555"/>
-            </w14:solidFill>
-          </w14:textFill>
-        </w:rPr>
-        <w:t xml:space="preserve">2016 </w:t>
-      </w:r>
-      <w:r>
-        <w:rPr>
-          <w:rStyle w:val="None"/>
-          <w:outline w:val="0"/>
-          <w:color w:val="555555"/>
-          <w:u w:color="555555"/>
-          <w:rtl w:val="0"/>
-          <w14:textFill>
-            <w14:solidFill>
-              <w14:srgbClr w14:val="555555"/>
-            </w14:solidFill>
-          </w14:textFill>
-        </w:rPr>
-        <w:t xml:space="preserve">– </w:t>
-      </w:r>
-      <w:r>
-        <w:rPr>
-          <w:rStyle w:val="None"/>
-          <w:outline w:val="0"/>
-          <w:color w:val="555555"/>
-          <w:u w:color="555555"/>
-          <w:rtl w:val="0"/>
-          <w14:textFill>
-            <w14:solidFill>
-              <w14:srgbClr w14:val="555555"/>
-            </w14:solidFill>
-          </w14:textFill>
+          <w:color w:val="555555"/>
+          <w:u w:color="555555"/>
+        </w:rPr>
+        <w:t xml:space="preserve"> • Lexington, KY • </w:t>
+      </w:r>
+      <w:r>
+        <w:rPr>
+          <w:rStyle w:val="None"/>
+          <w:color w:val="555555"/>
+          <w:u w:color="555555"/>
+        </w:rPr>
+        <w:t>03/</w:t>
+      </w:r>
+      <w:r>
+        <w:rPr>
+          <w:rStyle w:val="None"/>
+          <w:color w:val="555555"/>
+          <w:u w:color="555555"/>
+        </w:rPr>
+        <w:t xml:space="preserve">2016 – </w:t>
+      </w:r>
+      <w:r>
+        <w:rPr>
+          <w:rStyle w:val="None"/>
+          <w:color w:val="555555"/>
+          <w:u w:color="555555"/>
+        </w:rPr>
+        <w:t>03/</w:t>
+      </w:r>
+      <w:r>
+        <w:rPr>
+          <w:rStyle w:val="None"/>
+          <w:color w:val="555555"/>
+          <w:u w:color="555555"/>
         </w:rPr>
         <w:t>2017</w:t>
       </w:r>
     </w:p>
     <w:p>
       <w:pPr>
-        <w:pStyle w:val="List Paragraph"/>
+        <w:pStyle w:val="ListParagraph"/>
         <w:numPr>
           <w:ilvl w:val="0"/>
           <w:numId w:val="4"/>
         </w:numPr>
-        <w:rPr>
-          <w:lang w:val="en-US"/>
-        </w:rPr>
-      </w:pPr>
-      <w:r>
-        <w:rPr>
-          <w:rStyle w:val="None"/>
-          <w:rtl w:val="0"/>
-          <w:lang w:val="en-US"/>
+      </w:pPr>
+      <w:r>
+        <w:rPr>
+          <w:rStyle w:val="None"/>
         </w:rPr>
         <w:t>Technical Consultation: Partnered directly with stakeholders (</w:t>
       </w:r>
       <w:r>
         <w:rPr>
           <w:rStyle w:val="None"/>
-          <w:outline w:val="0"/>
-          <w:color w:val="1a1a1a"/>
-          <w:u w:color="1a1a1a"/>
-          <w:rtl w:val="0"/>
-          <w:lang w:val="en-US"/>
-          <w14:textFill>
-            <w14:solidFill>
-              <w14:srgbClr w14:val="1A1A1A"/>
-            </w14:solidFill>
-          </w14:textFill>
+          <w:color w:val="1A1A1A"/>
+          <w:u w:color="1A1A1A"/>
         </w:rPr>
         <w:t>Presbyterian Church (USA)</w:t>
       </w:r>
       <w:r>
         <w:rPr>
           <w:rStyle w:val="None"/>
-          <w:rtl w:val="0"/>
-          <w:lang w:val="en-US"/>
         </w:rPr>
         <w:t>, University of Kentucky) to translate vague business needs into production-ready technical specifications and RESTful architectures.</w:t>
       </w:r>
     </w:p>
     <w:p>
       <w:pPr>
-        <w:pStyle w:val="List Paragraph"/>
+        <w:pStyle w:val="ListParagraph"/>
         <w:numPr>
           <w:ilvl w:val="0"/>
           <w:numId w:val="4"/>
         </w:numPr>
-        <w:rPr>
-          <w:lang w:val="en-US"/>
-        </w:rPr>
-      </w:pPr>
-      <w:r>
-        <w:rPr>
-          <w:rStyle w:val="None"/>
-          <w:rtl w:val="0"/>
-          <w:lang w:val="en-US"/>
+      </w:pPr>
+      <w:r>
+        <w:rPr>
+          <w:rStyle w:val="None"/>
         </w:rPr>
         <w:t>Modular Architecture: Designed reusable backend components and modular UI features, significantly accelerating release cycles and ensuring scalable feature expansion across multiple client projects.</w:t>
       </w:r>
     </w:p>
     <w:p>
       <w:pPr>
-        <w:pStyle w:val="List Paragraph"/>
+        <w:pStyle w:val="ListParagraph"/>
         <w:numPr>
           <w:ilvl w:val="0"/>
           <w:numId w:val="4"/>
         </w:numPr>
-        <w:rPr>
-          <w:lang w:val="en-US"/>
-        </w:rPr>
-      </w:pPr>
-      <w:r>
-        <w:rPr>
-          <w:rStyle w:val="None"/>
-          <w:rtl w:val="0"/>
-          <w:lang w:val="en-US"/>
+      </w:pPr>
+      <w:r>
+        <w:rPr>
+          <w:rStyle w:val="None"/>
         </w:rPr>
         <w:t>Security &amp; Governance: Implemented robust server-side validation, authentication, and role-based access control (RBAC) for sensitive event registration and CMS workflows.</w:t>
       </w:r>
@@ -1268,38 +883,23 @@
       <w:r>
         <w:rPr>
           <w:rStyle w:val="None"/>
-          <w:b w:val="1"/>
-          <w:bCs w:val="1"/>
-          <w:outline w:val="0"/>
+          <w:b/>
+          <w:bCs/>
           <w:color w:val="555555"/>
           <w:sz w:val="19"/>
           <w:szCs w:val="19"/>
           <w:u w:color="555555"/>
-          <w:rtl w:val="0"/>
           <w:lang w:val="nl-NL"/>
-          <w14:textFill>
-            <w14:solidFill>
-              <w14:srgbClr w14:val="555555"/>
-            </w14:solidFill>
-          </w14:textFill>
         </w:rPr>
         <w:t xml:space="preserve">Tech Stack: </w:t>
       </w:r>
       <w:r>
         <w:rPr>
           <w:rStyle w:val="None"/>
-          <w:outline w:val="0"/>
           <w:color w:val="555555"/>
           <w:sz w:val="19"/>
           <w:szCs w:val="19"/>
           <w:u w:color="555555"/>
-          <w:rtl w:val="0"/>
-          <w:lang w:val="en-US"/>
-          <w14:textFill>
-            <w14:solidFill>
-              <w14:srgbClr w14:val="555555"/>
-            </w14:solidFill>
-          </w14:textFill>
         </w:rPr>
         <w:t>Python, Django, JavaScript (AngularJS, jQuery), PostgreSQL, Bootstrap, AWS, Git, PHP, Drupal</w:t>
       </w:r>
@@ -1313,199 +913,126 @@
         <w:spacing w:before="160" w:after="30"/>
         <w:rPr>
           <w:rStyle w:val="None"/>
-          <w:outline w:val="0"/>
-          <w:color w:val="555555"/>
-          <w:u w:color="555555"/>
-          <w14:textFill>
-            <w14:solidFill>
-              <w14:srgbClr w14:val="555555"/>
-            </w14:solidFill>
-          </w14:textFill>
-        </w:rPr>
-      </w:pPr>
-      <w:r>
-        <w:rPr>
-          <w:rStyle w:val="None"/>
-          <w:b w:val="1"/>
-          <w:bCs w:val="1"/>
-          <w:outline w:val="0"/>
-          <w:color w:val="1a1a1a"/>
+          <w:color w:val="555555"/>
+          <w:u w:color="555555"/>
+        </w:rPr>
+      </w:pPr>
+      <w:r>
+        <w:rPr>
+          <w:rStyle w:val="None"/>
+          <w:b/>
+          <w:bCs/>
+          <w:color w:val="1A1A1A"/>
           <w:sz w:val="22"/>
           <w:szCs w:val="22"/>
-          <w:u w:color="1a1a1a"/>
-          <w:rtl w:val="0"/>
-          <w:lang w:val="en-US"/>
-          <w14:textFill>
-            <w14:solidFill>
-              <w14:srgbClr w14:val="1A1A1A"/>
-            </w14:solidFill>
-          </w14:textFill>
+          <w:u w:color="1A1A1A"/>
         </w:rPr>
         <w:t>Programming Analyst</w:t>
       </w:r>
       <w:r>
         <w:rPr>
           <w:rStyle w:val="None"/>
-          <w:outline w:val="0"/>
-          <w:color w:val="555555"/>
-          <w:u w:color="555555"/>
-          <w:rtl w:val="0"/>
-          <w14:textFill>
-            <w14:solidFill>
-              <w14:srgbClr w14:val="555555"/>
-            </w14:solidFill>
-          </w14:textFill>
+          <w:color w:val="555555"/>
+          <w:u w:color="555555"/>
         </w:rPr>
         <w:t xml:space="preserve"> | </w:t>
       </w:r>
       <w:r>
         <w:rPr>
           <w:rStyle w:val="None"/>
-          <w:b w:val="1"/>
-          <w:bCs w:val="1"/>
-          <w:outline w:val="0"/>
-          <w:color w:val="1f4e79"/>
-          <w:u w:color="1f4e79"/>
-          <w:rtl w:val="0"/>
-          <w:lang w:val="en-US"/>
-          <w14:textFill>
-            <w14:solidFill>
-              <w14:srgbClr w14:val="1F4E79"/>
-            </w14:solidFill>
-          </w14:textFill>
+          <w:b/>
+          <w:bCs/>
+          <w:color w:val="1F4E79"/>
+          <w:u w:color="1F4E79"/>
         </w:rPr>
         <w:t>Knowledge Facilitations Group (KFG)</w:t>
       </w:r>
       <w:r>
         <w:rPr>
           <w:rStyle w:val="None"/>
-          <w:outline w:val="0"/>
-          <w:color w:val="555555"/>
-          <w:u w:color="555555"/>
-          <w:rtl w:val="0"/>
-          <w14:textFill>
-            <w14:solidFill>
-              <w14:srgbClr w14:val="555555"/>
-            </w14:solidFill>
-          </w14:textFill>
+          <w:color w:val="555555"/>
+          <w:u w:color="555555"/>
         </w:rPr>
         <w:t xml:space="preserve"> • </w:t>
       </w:r>
       <w:r>
         <w:rPr>
           <w:rStyle w:val="None"/>
-          <w:outline w:val="0"/>
-          <w:color w:val="555555"/>
-          <w:u w:color="555555"/>
-          <w:rtl w:val="0"/>
+          <w:color w:val="555555"/>
+          <w:u w:color="555555"/>
           <w:lang w:val="de-DE"/>
-          <w14:textFill>
-            <w14:solidFill>
-              <w14:srgbClr w14:val="555555"/>
-            </w14:solidFill>
-          </w14:textFill>
         </w:rPr>
         <w:t xml:space="preserve">Richmond, KY </w:t>
       </w:r>
       <w:r>
         <w:rPr>
           <w:rStyle w:val="None"/>
-          <w:outline w:val="0"/>
-          <w:color w:val="555555"/>
-          <w:u w:color="555555"/>
-          <w:rtl w:val="0"/>
-          <w14:textFill>
-            <w14:solidFill>
-              <w14:srgbClr w14:val="555555"/>
-            </w14:solidFill>
-          </w14:textFill>
+          <w:color w:val="555555"/>
+          <w:u w:color="555555"/>
         </w:rPr>
         <w:t xml:space="preserve">• </w:t>
       </w:r>
       <w:r>
         <w:rPr>
           <w:rStyle w:val="None"/>
-          <w:outline w:val="0"/>
-          <w:color w:val="555555"/>
-          <w:u w:color="555555"/>
-          <w:rtl w:val="0"/>
-          <w14:textFill>
-            <w14:solidFill>
-              <w14:srgbClr w14:val="555555"/>
-            </w14:solidFill>
-          </w14:textFill>
-        </w:rPr>
-        <w:t xml:space="preserve">2015 </w:t>
-      </w:r>
-      <w:r>
-        <w:rPr>
-          <w:rStyle w:val="None"/>
-          <w:outline w:val="0"/>
-          <w:color w:val="555555"/>
-          <w:u w:color="555555"/>
-          <w:rtl w:val="0"/>
-          <w14:textFill>
-            <w14:solidFill>
-              <w14:srgbClr w14:val="555555"/>
-            </w14:solidFill>
-          </w14:textFill>
-        </w:rPr>
-        <w:t xml:space="preserve">– </w:t>
-      </w:r>
-      <w:r>
-        <w:rPr>
-          <w:rStyle w:val="None"/>
-          <w:outline w:val="0"/>
-          <w:color w:val="555555"/>
-          <w:u w:color="555555"/>
-          <w:rtl w:val="0"/>
-          <w14:textFill>
-            <w14:solidFill>
-              <w14:srgbClr w14:val="555555"/>
-            </w14:solidFill>
-          </w14:textFill>
+          <w:color w:val="555555"/>
+          <w:u w:color="555555"/>
+        </w:rPr>
+        <w:t>03/</w:t>
+      </w:r>
+      <w:r>
+        <w:rPr>
+          <w:rStyle w:val="None"/>
+          <w:color w:val="555555"/>
+          <w:u w:color="555555"/>
+        </w:rPr>
+        <w:t xml:space="preserve">2015 – </w:t>
+      </w:r>
+      <w:r>
+        <w:rPr>
+          <w:rStyle w:val="None"/>
+          <w:color w:val="555555"/>
+          <w:u w:color="555555"/>
+        </w:rPr>
+        <w:t>03/</w:t>
+      </w:r>
+      <w:r>
+        <w:rPr>
+          <w:rStyle w:val="None"/>
+          <w:color w:val="555555"/>
+          <w:u w:color="555555"/>
         </w:rPr>
         <w:t>2016</w:t>
       </w:r>
     </w:p>
     <w:p>
       <w:pPr>
-        <w:pStyle w:val="List Paragraph"/>
+        <w:pStyle w:val="ListParagraph"/>
         <w:numPr>
           <w:ilvl w:val="0"/>
           <w:numId w:val="4"/>
         </w:numPr>
         <w:spacing w:before="40" w:after="40"/>
-        <w:rPr>
-          <w:lang w:val="en-US"/>
-        </w:rPr>
-      </w:pPr>
-      <w:r>
-        <w:rPr>
-          <w:rStyle w:val="None"/>
-          <w:rtl w:val="0"/>
-          <w:lang w:val="en-US"/>
+      </w:pPr>
+      <w:r>
+        <w:rPr>
+          <w:rStyle w:val="None"/>
         </w:rPr>
         <w:t>Data Pipeline Engineering: Developed Python-based transformation engines to validate and map disparate industry standards (X12, EDIFACT, XML, JSON), ensuring seamless data exchange across the EDITRACE platform.</w:t>
       </w:r>
     </w:p>
     <w:p>
       <w:pPr>
-        <w:pStyle w:val="List Paragraph"/>
+        <w:pStyle w:val="ListParagraph"/>
         <w:numPr>
           <w:ilvl w:val="0"/>
           <w:numId w:val="4"/>
         </w:numPr>
         <w:spacing w:before="40" w:after="40"/>
-        <w:rPr>
-          <w:lang w:val="en-US"/>
-        </w:rPr>
-      </w:pPr>
-      <w:r>
-        <w:rPr>
-          <w:rStyle w:val="None"/>
-          <w:rtl w:val="0"/>
-          <w:lang w:val="en-US"/>
+      </w:pPr>
+      <w:r>
+        <w:rPr>
+          <w:rStyle w:val="None"/>
         </w:rPr>
         <w:t>Operational Observability: Built real-time monitoring dashboards that provided immediate insight into automated data pipelines, reducing troubleshooting time for critical EDI processes.</w:t>
       </w:r>
@@ -1518,38 +1045,23 @@
       <w:r>
         <w:rPr>
           <w:rStyle w:val="None"/>
-          <w:b w:val="1"/>
-          <w:bCs w:val="1"/>
-          <w:outline w:val="0"/>
+          <w:b/>
+          <w:bCs/>
           <w:color w:val="555555"/>
           <w:sz w:val="19"/>
           <w:szCs w:val="19"/>
           <w:u w:color="555555"/>
-          <w:rtl w:val="0"/>
           <w:lang w:val="nl-NL"/>
-          <w14:textFill>
-            <w14:solidFill>
-              <w14:srgbClr w14:val="555555"/>
-            </w14:solidFill>
-          </w14:textFill>
         </w:rPr>
         <w:t xml:space="preserve">Tech Stack: </w:t>
       </w:r>
       <w:r>
         <w:rPr>
           <w:rStyle w:val="None"/>
-          <w:outline w:val="0"/>
           <w:color w:val="555555"/>
           <w:sz w:val="19"/>
           <w:szCs w:val="19"/>
           <w:u w:color="555555"/>
-          <w:rtl w:val="0"/>
-          <w:lang w:val="en-US"/>
-          <w14:textFill>
-            <w14:solidFill>
-              <w14:srgbClr w14:val="555555"/>
-            </w14:solidFill>
-          </w14:textFill>
         </w:rPr>
         <w:t>Python, EDI (X12, XML, EDIFACT, Tradacoms, JSON, IDoc), Bootstrap, Git</w:t>
       </w:r>
@@ -1558,30 +1070,19 @@
       <w:pPr>
         <w:pStyle w:val="Body"/>
         <w:pBdr>
-          <w:top w:val="nil"/>
-          <w:left w:val="nil"/>
-          <w:bottom w:val="single" w:color="1f4e79" w:sz="8" w:space="0" w:shadow="0" w:frame="0"/>
-          <w:right w:val="nil"/>
+          <w:bottom w:val="single" w:sz="8" w:space="0" w:color="1F4E79"/>
         </w:pBdr>
         <w:spacing w:before="200" w:after="60"/>
       </w:pPr>
       <w:r>
         <w:rPr>
           <w:rStyle w:val="None"/>
-          <w:b w:val="1"/>
-          <w:bCs w:val="1"/>
-          <w:outline w:val="0"/>
-          <w:color w:val="1f4e79"/>
+          <w:b/>
+          <w:bCs/>
+          <w:color w:val="1F4E79"/>
           <w:sz w:val="22"/>
           <w:szCs w:val="22"/>
-          <w:u w:color="1f4e79"/>
-          <w:rtl w:val="0"/>
-          <w:lang w:val="en-US"/>
-          <w14:textFill>
-            <w14:solidFill>
-              <w14:srgbClr w14:val="1F4E79"/>
-            </w14:solidFill>
-          </w14:textFill>
+          <w:u w:color="1F4E79"/>
         </w:rPr>
         <w:t>EDUCATION</w:t>
       </w:r>
@@ -1594,36 +1095,20 @@
       <w:r>
         <w:rPr>
           <w:rStyle w:val="None"/>
-          <w:b w:val="1"/>
-          <w:bCs w:val="1"/>
-          <w:outline w:val="0"/>
-          <w:color w:val="1a1a1a"/>
+          <w:b/>
+          <w:bCs/>
+          <w:color w:val="1A1A1A"/>
           <w:sz w:val="21"/>
           <w:szCs w:val="21"/>
-          <w:u w:color="1a1a1a"/>
-          <w:rtl w:val="0"/>
-          <w:lang w:val="en-US"/>
-          <w14:textFill>
-            <w14:solidFill>
-              <w14:srgbClr w14:val="1A1A1A"/>
-            </w14:solidFill>
-          </w14:textFill>
+          <w:u w:color="1A1A1A"/>
         </w:rPr>
         <w:t>B.S. in Computer Science, 2015</w:t>
       </w:r>
       <w:r>
         <w:rPr>
           <w:rStyle w:val="None"/>
-          <w:outline w:val="0"/>
-          <w:color w:val="555555"/>
-          <w:u w:color="555555"/>
-          <w:rtl w:val="0"/>
-          <w:lang w:val="en-US"/>
-          <w14:textFill>
-            <w14:solidFill>
-              <w14:srgbClr w14:val="555555"/>
-            </w14:solidFill>
-          </w14:textFill>
+          <w:color w:val="555555"/>
+          <w:u w:color="555555"/>
         </w:rPr>
         <w:t xml:space="preserve"> | Eastern Kentucky University, Richmond, KY</w:t>
       </w:r>
@@ -1636,77 +1121,100 @@
       <w:r>
         <w:rPr>
           <w:rStyle w:val="None"/>
-          <w:i w:val="1"/>
-          <w:iCs w:val="1"/>
-          <w:outline w:val="0"/>
-          <w:color w:val="555555"/>
-          <w:u w:color="555555"/>
-          <w:rtl w:val="0"/>
-          <w:lang w:val="en-US"/>
-          <w14:textFill>
-            <w14:solidFill>
-              <w14:srgbClr w14:val="555555"/>
-            </w14:solidFill>
-          </w14:textFill>
+          <w:i/>
+          <w:iCs/>
+          <w:color w:val="555555"/>
+          <w:u w:color="555555"/>
         </w:rPr>
         <w:t>Member, Upsilon Pi Epsilon Honors Society for the Computing and Information Disciplines</w:t>
       </w:r>
     </w:p>
     <w:sectPr>
-      <w:headerReference w:type="default" r:id="rId4"/>
-      <w:footerReference w:type="default" r:id="rId5"/>
-      <w:pgSz w:w="12240" w:h="15840" w:orient="portrait"/>
-      <w:pgMar w:top="1080" w:right="1080" w:bottom="1080" w:left="1080" w:header="708" w:footer="708"/>
-      <w:bidi w:val="0"/>
+      <w:headerReference w:type="default" r:id="rId11"/>
+      <w:footerReference w:type="default" r:id="rId12"/>
+      <w:pgSz w:w="12240" w:h="15840"/>
+      <w:pgMar w:top="1080" w:right="1080" w:bottom="1080" w:left="1080" w:header="708" w:footer="708" w:gutter="0"/>
+      <w:cols w:space="720"/>
     </w:sectPr>
   </w:body>
 </w:document>
 </file>
 
+<file path=word/endnotes.xml><?xml version="1.0" encoding="utf-8"?>
+<w:endnotes xmlns:wpc="http://schemas.microsoft.com/office/word/2010/wordprocessingCanvas" xmlns:cx="http://schemas.microsoft.com/office/drawing/2014/chartex" xmlns:cx1="http://schemas.microsoft.com/office/drawing/2015/9/8/chartex" xmlns:cx2="http://schemas.microsoft.com/office/drawing/2015/10/21/chartex" xmlns:cx3="http://schemas.microsoft.com/office/drawing/2016/5/9/chartex" xmlns:cx4="http://schemas.microsoft.com/office/drawing/2016/5/10/chartex" xmlns:cx5="http://schemas.microsoft.com/office/drawing/2016/5/11/chartex" xmlns:cx6="http://schemas.microsoft.com/office/drawing/2016/5/12/chartex" xmlns:cx7="http://schemas.microsoft.com/office/drawing/2016/5/13/chartex" xmlns:cx8="http://schemas.microsoft.com/office/drawing/2016/5/14/chartex" xmlns:mc="http://schemas.openxmlformats.org/markup-compatibility/2006" xmlns:aink="http://schemas.microsoft.com/office/drawing/2016/ink" xmlns:am3d="http://schemas.microsoft.com/office/drawing/2017/model3d" xmlns:o="urn:schemas-microsoft-com:office:office" xmlns:oel="http://schemas.microsoft.com/office/2019/extlst" xmlns:r="http://schemas.openxmlformats.org/officeDocument/2006/relationships" xmlns:m="http://schemas.openxmlformats.org/officeDocument/2006/math" xmlns:v="urn:schemas-microsoft-com:vml" xmlns:wp14="http://schemas.microsoft.com/office/word/2010/wordprocessingDrawing" xmlns:wp="http://schemas.openxmlformats.org/drawingml/2006/wordprocessingDrawing" xmlns:w10="urn:schemas-microsoft-com:office:word" xmlns:w="http://schemas.openxmlformats.org/wordprocessingml/2006/main" xmlns:w14="http://schemas.microsoft.com/office/word/2010/wordml" xmlns:w15="http://schemas.microsoft.com/office/word/2012/wordml" xmlns:w16cex="http://schemas.microsoft.com/office/word/2018/wordml/cex" xmlns:w16cid="http://schemas.microsoft.com/office/word/2016/wordml/cid" xmlns:w16="http://schemas.microsoft.com/office/word/2018/wordml" xmlns:w16du="http://schemas.microsoft.com/office/word/2023/wordml/word16du" xmlns:w16sdtdh="http://schemas.microsoft.com/office/word/2020/wordml/sdtdatahash" xmlns:w16sdtfl="http://schemas.microsoft.com/office/word/2024/wordml/sdtformatlock" xmlns:w16se="http://schemas.microsoft.com/office/word/2015/wordml/symex" xmlns:wpg="http://schemas.microsoft.com/office/word/2010/wordprocessingGroup" xmlns:wpi="http://schemas.microsoft.com/office/word/2010/wordprocessingInk" xmlns:wne="http://schemas.microsoft.com/office/word/2006/wordml" xmlns:wps="http://schemas.microsoft.com/office/word/2010/wordprocessingShape" mc:Ignorable="w14 w15 w16se w16cid w16 w16cex w16sdtdh w16sdtfl w16du wp14">
+  <w:endnote w:type="separator" w:id="-1">
+    <w:p>
+      <w:r>
+        <w:separator/>
+      </w:r>
+    </w:p>
+  </w:endnote>
+  <w:endnote w:type="continuationSeparator" w:id="0">
+    <w:p>
+      <w:r>
+        <w:continuationSeparator/>
+      </w:r>
+    </w:p>
+  </w:endnote>
+</w:endnotes>
+</file>
+
 <file path=word/footer1.xml><?xml version="1.0" encoding="utf-8"?>
-<w:ftr xmlns:r="http://schemas.openxmlformats.org/officeDocument/2006/relationships" xmlns:wp="http://schemas.openxmlformats.org/drawingml/2006/wordprocessingDrawing" xmlns:w="http://schemas.openxmlformats.org/wordprocessingml/2006/main" xmlns:w10="urn:schemas-microsoft-com:office:word" xmlns:w14="http://schemas.microsoft.com/office/word/2010/wordml" xmlns:wps="http://schemas.microsoft.com/office/word/2010/wordprocessingShape" xmlns:wpg="http://schemas.microsoft.com/office/word/2010/wordprocessingGroup" xmlns:mc="http://schemas.openxmlformats.org/markup-compatibility/2006" xmlns:v="urn:schemas-microsoft-com:vml" xmlns:o="urn:schemas-microsoft-com:office:office" xmlns:m="http://schemas.openxmlformats.org/officeDocument/2006/math" mc:Ignorable="w14">
+<w:ftr xmlns:wpc="http://schemas.microsoft.com/office/word/2010/wordprocessingCanvas" xmlns:cx="http://schemas.microsoft.com/office/drawing/2014/chartex" xmlns:cx1="http://schemas.microsoft.com/office/drawing/2015/9/8/chartex" xmlns:cx2="http://schemas.microsoft.com/office/drawing/2015/10/21/chartex" xmlns:cx3="http://schemas.microsoft.com/office/drawing/2016/5/9/chartex" xmlns:cx4="http://schemas.microsoft.com/office/drawing/2016/5/10/chartex" xmlns:cx5="http://schemas.microsoft.com/office/drawing/2016/5/11/chartex" xmlns:cx6="http://schemas.microsoft.com/office/drawing/2016/5/12/chartex" xmlns:cx7="http://schemas.microsoft.com/office/drawing/2016/5/13/chartex" xmlns:cx8="http://schemas.microsoft.com/office/drawing/2016/5/14/chartex" xmlns:mc="http://schemas.openxmlformats.org/markup-compatibility/2006" xmlns:aink="http://schemas.microsoft.com/office/drawing/2016/ink" xmlns:am3d="http://schemas.microsoft.com/office/drawing/2017/model3d" xmlns:o="urn:schemas-microsoft-com:office:office" xmlns:oel="http://schemas.microsoft.com/office/2019/extlst" xmlns:r="http://schemas.openxmlformats.org/officeDocument/2006/relationships" xmlns:m="http://schemas.openxmlformats.org/officeDocument/2006/math" xmlns:v="urn:schemas-microsoft-com:vml" xmlns:wp14="http://schemas.microsoft.com/office/word/2010/wordprocessingDrawing" xmlns:wp="http://schemas.openxmlformats.org/drawingml/2006/wordprocessingDrawing" xmlns:w10="urn:schemas-microsoft-com:office:word" xmlns:w="http://schemas.openxmlformats.org/wordprocessingml/2006/main" xmlns:w14="http://schemas.microsoft.com/office/word/2010/wordml" xmlns:w15="http://schemas.microsoft.com/office/word/2012/wordml" xmlns:w16cex="http://schemas.microsoft.com/office/word/2018/wordml/cex" xmlns:w16cid="http://schemas.microsoft.com/office/word/2016/wordml/cid" xmlns:w16="http://schemas.microsoft.com/office/word/2018/wordml" xmlns:w16du="http://schemas.microsoft.com/office/word/2023/wordml/word16du" xmlns:w16sdtdh="http://schemas.microsoft.com/office/word/2020/wordml/sdtdatahash" xmlns:w16sdtfl="http://schemas.microsoft.com/office/word/2024/wordml/sdtformatlock" xmlns:w16se="http://schemas.microsoft.com/office/word/2015/wordml/symex" xmlns:wpg="http://schemas.microsoft.com/office/word/2010/wordprocessingGroup" xmlns:wpi="http://schemas.microsoft.com/office/word/2010/wordprocessingInk" xmlns:wne="http://schemas.microsoft.com/office/word/2006/wordml" xmlns:wps="http://schemas.microsoft.com/office/word/2010/wordprocessingShape" mc:Ignorable="w14 w15 w16se w16cid w16 w16cex w16sdtdh w16sdtfl w16du wp14">
   <w:p>
     <w:pPr>
-      <w:pStyle w:val="Header &amp; Footer"/>
-      <w:bidi w:val="0"/>
+      <w:pStyle w:val="HeaderFooter"/>
     </w:pPr>
-    <w:r/>
   </w:p>
 </w:ftr>
 </file>
 
+<file path=word/footnotes.xml><?xml version="1.0" encoding="utf-8"?>
+<w:footnotes xmlns:wpc="http://schemas.microsoft.com/office/word/2010/wordprocessingCanvas" xmlns:cx="http://schemas.microsoft.com/office/drawing/2014/chartex" xmlns:cx1="http://schemas.microsoft.com/office/drawing/2015/9/8/chartex" xmlns:cx2="http://schemas.microsoft.com/office/drawing/2015/10/21/chartex" xmlns:cx3="http://schemas.microsoft.com/office/drawing/2016/5/9/chartex" xmlns:cx4="http://schemas.microsoft.com/office/drawing/2016/5/10/chartex" xmlns:cx5="http://schemas.microsoft.com/office/drawing/2016/5/11/chartex" xmlns:cx6="http://schemas.microsoft.com/office/drawing/2016/5/12/chartex" xmlns:cx7="http://schemas.microsoft.com/office/drawing/2016/5/13/chartex" xmlns:cx8="http://schemas.microsoft.com/office/drawing/2016/5/14/chartex" xmlns:mc="http://schemas.openxmlformats.org/markup-compatibility/2006" xmlns:aink="http://schemas.microsoft.com/office/drawing/2016/ink" xmlns:am3d="http://schemas.microsoft.com/office/drawing/2017/model3d" xmlns:o="urn:schemas-microsoft-com:office:office" xmlns:oel="http://schemas.microsoft.com/office/2019/extlst" xmlns:r="http://schemas.openxmlformats.org/officeDocument/2006/relationships" xmlns:m="http://schemas.openxmlformats.org/officeDocument/2006/math" xmlns:v="urn:schemas-microsoft-com:vml" xmlns:wp14="http://schemas.microsoft.com/office/word/2010/wordprocessingDrawing" xmlns:wp="http://schemas.openxmlformats.org/drawingml/2006/wordprocessingDrawing" xmlns:w10="urn:schemas-microsoft-com:office:word" xmlns:w="http://schemas.openxmlformats.org/wordprocessingml/2006/main" xmlns:w14="http://schemas.microsoft.com/office/word/2010/wordml" xmlns:w15="http://schemas.microsoft.com/office/word/2012/wordml" xmlns:w16cex="http://schemas.microsoft.com/office/word/2018/wordml/cex" xmlns:w16cid="http://schemas.microsoft.com/office/word/2016/wordml/cid" xmlns:w16="http://schemas.microsoft.com/office/word/2018/wordml" xmlns:w16du="http://schemas.microsoft.com/office/word/2023/wordml/word16du" xmlns:w16sdtdh="http://schemas.microsoft.com/office/word/2020/wordml/sdtdatahash" xmlns:w16sdtfl="http://schemas.microsoft.com/office/word/2024/wordml/sdtformatlock" xmlns:w16se="http://schemas.microsoft.com/office/word/2015/wordml/symex" xmlns:wpg="http://schemas.microsoft.com/office/word/2010/wordprocessingGroup" xmlns:wpi="http://schemas.microsoft.com/office/word/2010/wordprocessingInk" xmlns:wne="http://schemas.microsoft.com/office/word/2006/wordml" xmlns:wps="http://schemas.microsoft.com/office/word/2010/wordprocessingShape" mc:Ignorable="w14 w15 w16se w16cid w16 w16cex w16sdtdh w16sdtfl w16du wp14">
+  <w:footnote w:type="separator" w:id="-1">
+    <w:p>
+      <w:r>
+        <w:separator/>
+      </w:r>
+    </w:p>
+  </w:footnote>
+  <w:footnote w:type="continuationSeparator" w:id="0">
+    <w:p>
+      <w:r>
+        <w:continuationSeparator/>
+      </w:r>
+    </w:p>
+  </w:footnote>
+</w:footnotes>
+</file>
+
 <file path=word/header1.xml><?xml version="1.0" encoding="utf-8"?>
-<w:hdr xmlns:r="http://schemas.openxmlformats.org/officeDocument/2006/relationships" xmlns:wp="http://schemas.openxmlformats.org/drawingml/2006/wordprocessingDrawing" xmlns:w="http://schemas.openxmlformats.org/wordprocessingml/2006/main" xmlns:w10="urn:schemas-microsoft-com:office:word" xmlns:w14="http://schemas.microsoft.com/office/word/2010/wordml" xmlns:wps="http://schemas.microsoft.com/office/word/2010/wordprocessingShape" xmlns:wpg="http://schemas.microsoft.com/office/word/2010/wordprocessingGroup" xmlns:mc="http://schemas.openxmlformats.org/markup-compatibility/2006" xmlns:v="urn:schemas-microsoft-com:vml" xmlns:o="urn:schemas-microsoft-com:office:office" xmlns:m="http://schemas.openxmlformats.org/officeDocument/2006/math" mc:Ignorable="w14">
+<w:hdr xmlns:wpc="http://schemas.microsoft.com/office/word/2010/wordprocessingCanvas" xmlns:cx="http://schemas.microsoft.com/office/drawing/2014/chartex" xmlns:cx1="http://schemas.microsoft.com/office/drawing/2015/9/8/chartex" xmlns:cx2="http://schemas.microsoft.com/office/drawing/2015/10/21/chartex" xmlns:cx3="http://schemas.microsoft.com/office/drawing/2016/5/9/chartex" xmlns:cx4="http://schemas.microsoft.com/office/drawing/2016/5/10/chartex" xmlns:cx5="http://schemas.microsoft.com/office/drawing/2016/5/11/chartex" xmlns:cx6="http://schemas.microsoft.com/office/drawing/2016/5/12/chartex" xmlns:cx7="http://schemas.microsoft.com/office/drawing/2016/5/13/chartex" xmlns:cx8="http://schemas.microsoft.com/office/drawing/2016/5/14/chartex" xmlns:mc="http://schemas.openxmlformats.org/markup-compatibility/2006" xmlns:aink="http://schemas.microsoft.com/office/drawing/2016/ink" xmlns:am3d="http://schemas.microsoft.com/office/drawing/2017/model3d" xmlns:o="urn:schemas-microsoft-com:office:office" xmlns:oel="http://schemas.microsoft.com/office/2019/extlst" xmlns:r="http://schemas.openxmlformats.org/officeDocument/2006/relationships" xmlns:m="http://schemas.openxmlformats.org/officeDocument/2006/math" xmlns:v="urn:schemas-microsoft-com:vml" xmlns:wp14="http://schemas.microsoft.com/office/word/2010/wordprocessingDrawing" xmlns:wp="http://schemas.openxmlformats.org/drawingml/2006/wordprocessingDrawing" xmlns:w10="urn:schemas-microsoft-com:office:word" xmlns:w="http://schemas.openxmlformats.org/wordprocessingml/2006/main" xmlns:w14="http://schemas.microsoft.com/office/word/2010/wordml" xmlns:w15="http://schemas.microsoft.com/office/word/2012/wordml" xmlns:w16cex="http://schemas.microsoft.com/office/word/2018/wordml/cex" xmlns:w16cid="http://schemas.microsoft.com/office/word/2016/wordml/cid" xmlns:w16="http://schemas.microsoft.com/office/word/2018/wordml" xmlns:w16du="http://schemas.microsoft.com/office/word/2023/wordml/word16du" xmlns:w16sdtdh="http://schemas.microsoft.com/office/word/2020/wordml/sdtdatahash" xmlns:w16sdtfl="http://schemas.microsoft.com/office/word/2024/wordml/sdtformatlock" xmlns:w16se="http://schemas.microsoft.com/office/word/2015/wordml/symex" xmlns:wpg="http://schemas.microsoft.com/office/word/2010/wordprocessingGroup" xmlns:wpi="http://schemas.microsoft.com/office/word/2010/wordprocessingInk" xmlns:wne="http://schemas.microsoft.com/office/word/2006/wordml" xmlns:wps="http://schemas.microsoft.com/office/word/2010/wordprocessingShape" mc:Ignorable="w14 w15 w16se w16cid w16 w16cex w16sdtdh w16sdtfl w16du wp14">
   <w:p>
     <w:pPr>
-      <w:pStyle w:val="Header &amp; Footer"/>
-      <w:bidi w:val="0"/>
+      <w:pStyle w:val="HeaderFooter"/>
     </w:pPr>
-    <w:r/>
   </w:p>
 </w:hdr>
 </file>
 
 <file path=word/numbering.xml><?xml version="1.0" encoding="utf-8"?>
-<w:numbering xmlns:w="http://schemas.openxmlformats.org/wordprocessingml/2006/main" xmlns:wp="http://schemas.openxmlformats.org/drawingml/2006/wordprocessingDrawing" xmlns:w14="http://schemas.microsoft.com/office/word/2010/wordml" xmlns:r="http://schemas.openxmlformats.org/officeDocument/2006/relationships" xmlns:v="urn:schemas-microsoft-com:vml" xmlns:o="urn:schemas-microsoft-com:office:office">
-  <w:abstractNum w:abstractNumId="0">
+<w:numbering xmlns:wpc="http://schemas.microsoft.com/office/word/2010/wordprocessingCanvas" xmlns:cx="http://schemas.microsoft.com/office/drawing/2014/chartex" xmlns:cx1="http://schemas.microsoft.com/office/drawing/2015/9/8/chartex" xmlns:cx2="http://schemas.microsoft.com/office/drawing/2015/10/21/chartex" xmlns:cx3="http://schemas.microsoft.com/office/drawing/2016/5/9/chartex" xmlns:cx4="http://schemas.microsoft.com/office/drawing/2016/5/10/chartex" xmlns:cx5="http://schemas.microsoft.com/office/drawing/2016/5/11/chartex" xmlns:cx6="http://schemas.microsoft.com/office/drawing/2016/5/12/chartex" xmlns:cx7="http://schemas.microsoft.com/office/drawing/2016/5/13/chartex" xmlns:cx8="http://schemas.microsoft.com/office/drawing/2016/5/14/chartex" xmlns:mc="http://schemas.openxmlformats.org/markup-compatibility/2006" xmlns:aink="http://schemas.microsoft.com/office/drawing/2016/ink" xmlns:am3d="http://schemas.microsoft.com/office/drawing/2017/model3d" xmlns:o="urn:schemas-microsoft-com:office:office" xmlns:oel="http://schemas.microsoft.com/office/2019/extlst" xmlns:r="http://schemas.openxmlformats.org/officeDocument/2006/relationships" xmlns:m="http://schemas.openxmlformats.org/officeDocument/2006/math" xmlns:v="urn:schemas-microsoft-com:vml" xmlns:wp14="http://schemas.microsoft.com/office/word/2010/wordprocessingDrawing" xmlns:wp="http://schemas.openxmlformats.org/drawingml/2006/wordprocessingDrawing" xmlns:w10="urn:schemas-microsoft-com:office:word" xmlns:w="http://schemas.openxmlformats.org/wordprocessingml/2006/main" xmlns:w14="http://schemas.microsoft.com/office/word/2010/wordml" xmlns:w15="http://schemas.microsoft.com/office/word/2012/wordml" xmlns:w16cex="http://schemas.microsoft.com/office/word/2018/wordml/cex" xmlns:w16cid="http://schemas.microsoft.com/office/word/2016/wordml/cid" xmlns:w16="http://schemas.microsoft.com/office/word/2018/wordml" xmlns:w16du="http://schemas.microsoft.com/office/word/2023/wordml/word16du" xmlns:w16sdtdh="http://schemas.microsoft.com/office/word/2020/wordml/sdtdatahash" xmlns:w16sdtfl="http://schemas.microsoft.com/office/word/2024/wordml/sdtformatlock" xmlns:w16se="http://schemas.microsoft.com/office/word/2015/wordml/symex" xmlns:wpg="http://schemas.microsoft.com/office/word/2010/wordprocessingGroup" xmlns:wpi="http://schemas.microsoft.com/office/word/2010/wordprocessingInk" xmlns:wne="http://schemas.microsoft.com/office/word/2006/wordml" xmlns:wps="http://schemas.microsoft.com/office/word/2010/wordprocessingShape" mc:Ignorable="w14 w15 w16se w16cid w16 w16cex w16sdtdh w16sdtfl w16du wp14">
+  <w:abstractNum w:abstractNumId="0" w15:restartNumberingAfterBreak="0">
+    <w:nsid w:val="0BC368DF"/>
     <w:multiLevelType w:val="hybridMultilevel"/>
-    <w:numStyleLink w:val="Imported Style 1"/>
-  </w:abstractNum>
-  <w:abstractNum w:abstractNumId="1">
-    <w:multiLevelType w:val="hybridMultilevel"/>
-    <w:styleLink w:val="Imported Style 1"/>
-    <w:lvl w:ilvl="0">
+    <w:tmpl w:val="2176F9F4"/>
+    <w:styleLink w:val="ImportedStyle2"/>
+    <w:lvl w:ilvl="0" w:tplc="AFACCED2">
       <w:start w:val="1"/>
       <w:numFmt w:val="bullet"/>
-      <w:suff w:val="tab"/>
       <w:lvlText w:val="·"/>
       <w:lvlJc w:val="left"/>
       <w:pPr>
         <w:ind w:left="720" w:hanging="360"/>
       </w:pPr>
       <w:rPr>
-        <w:rFonts w:ascii="Symbol" w:cs="Symbol" w:hAnsi="Symbol" w:eastAsia="Symbol"/>
+        <w:rFonts w:ascii="Symbol" w:eastAsia="Symbol" w:hAnsi="Symbol" w:cs="Symbol"/>
         <w:b w:val="0"/>
         <w:bCs w:val="0"/>
         <w:i w:val="0"/>
@@ -1726,17 +1234,16 @@
         <w:vertAlign w:val="baseline"/>
       </w:rPr>
     </w:lvl>
-    <w:lvl w:ilvl="1">
+    <w:lvl w:ilvl="1" w:tplc="C922A8A0">
       <w:start w:val="1"/>
       <w:numFmt w:val="bullet"/>
-      <w:suff w:val="tab"/>
       <w:lvlText w:val="o"/>
       <w:lvlJc w:val="left"/>
       <w:pPr>
         <w:ind w:left="1440" w:hanging="360"/>
       </w:pPr>
       <w:rPr>
-        <w:rFonts w:ascii="Arial Unicode MS" w:cs="Arial Unicode MS" w:hAnsi="Arial Unicode MS" w:eastAsia="Arial Unicode MS"/>
+        <w:rFonts w:ascii="Arial Unicode MS" w:eastAsia="Arial Unicode MS" w:hAnsi="Arial Unicode MS" w:cs="Arial Unicode MS"/>
         <w:b w:val="0"/>
         <w:bCs w:val="0"/>
         <w:i w:val="0"/>
@@ -1756,17 +1263,16 @@
         <w:vertAlign w:val="baseline"/>
       </w:rPr>
     </w:lvl>
-    <w:lvl w:ilvl="2">
+    <w:lvl w:ilvl="2" w:tplc="AE4ADBAA">
       <w:start w:val="1"/>
       <w:numFmt w:val="bullet"/>
-      <w:suff w:val="tab"/>
       <w:lvlText w:val="▪"/>
       <w:lvlJc w:val="left"/>
       <w:pPr>
         <w:ind w:left="2160" w:hanging="360"/>
       </w:pPr>
       <w:rPr>
-        <w:rFonts w:ascii="Arial Unicode MS" w:cs="Arial Unicode MS" w:hAnsi="Arial Unicode MS" w:eastAsia="Arial Unicode MS"/>
+        <w:rFonts w:ascii="Arial Unicode MS" w:eastAsia="Arial Unicode MS" w:hAnsi="Arial Unicode MS" w:cs="Arial Unicode MS"/>
         <w:b w:val="0"/>
         <w:bCs w:val="0"/>
         <w:i w:val="0"/>
@@ -1786,17 +1292,16 @@
         <w:vertAlign w:val="baseline"/>
       </w:rPr>
     </w:lvl>
-    <w:lvl w:ilvl="3">
+    <w:lvl w:ilvl="3" w:tplc="8BB4F090">
       <w:start w:val="1"/>
       <w:numFmt w:val="bullet"/>
-      <w:suff w:val="tab"/>
       <w:lvlText w:val="·"/>
       <w:lvlJc w:val="left"/>
       <w:pPr>
         <w:ind w:left="2880" w:hanging="360"/>
       </w:pPr>
       <w:rPr>
-        <w:rFonts w:ascii="Symbol" w:cs="Symbol" w:hAnsi="Symbol" w:eastAsia="Symbol"/>
+        <w:rFonts w:ascii="Symbol" w:eastAsia="Symbol" w:hAnsi="Symbol" w:cs="Symbol"/>
         <w:b w:val="0"/>
         <w:bCs w:val="0"/>
         <w:i w:val="0"/>
@@ -1816,17 +1321,16 @@
         <w:vertAlign w:val="baseline"/>
       </w:rPr>
     </w:lvl>
-    <w:lvl w:ilvl="4">
+    <w:lvl w:ilvl="4" w:tplc="760C0DAA">
       <w:start w:val="1"/>
       <w:numFmt w:val="bullet"/>
-      <w:suff w:val="tab"/>
       <w:lvlText w:val="o"/>
       <w:lvlJc w:val="left"/>
       <w:pPr>
         <w:ind w:left="3600" w:hanging="360"/>
       </w:pPr>
       <w:rPr>
-        <w:rFonts w:ascii="Arial Unicode MS" w:cs="Arial Unicode MS" w:hAnsi="Arial Unicode MS" w:eastAsia="Arial Unicode MS"/>
+        <w:rFonts w:ascii="Arial Unicode MS" w:eastAsia="Arial Unicode MS" w:hAnsi="Arial Unicode MS" w:cs="Arial Unicode MS"/>
         <w:b w:val="0"/>
         <w:bCs w:val="0"/>
         <w:i w:val="0"/>
@@ -1846,17 +1350,16 @@
         <w:vertAlign w:val="baseline"/>
       </w:rPr>
     </w:lvl>
-    <w:lvl w:ilvl="5">
+    <w:lvl w:ilvl="5" w:tplc="A9BAF12A">
       <w:start w:val="1"/>
       <w:numFmt w:val="bullet"/>
-      <w:suff w:val="tab"/>
       <w:lvlText w:val="▪"/>
       <w:lvlJc w:val="left"/>
       <w:pPr>
         <w:ind w:left="4320" w:hanging="360"/>
       </w:pPr>
       <w:rPr>
-        <w:rFonts w:ascii="Arial Unicode MS" w:cs="Arial Unicode MS" w:hAnsi="Arial Unicode MS" w:eastAsia="Arial Unicode MS"/>
+        <w:rFonts w:ascii="Arial Unicode MS" w:eastAsia="Arial Unicode MS" w:hAnsi="Arial Unicode MS" w:cs="Arial Unicode MS"/>
         <w:b w:val="0"/>
         <w:bCs w:val="0"/>
         <w:i w:val="0"/>
@@ -1876,17 +1379,16 @@
         <w:vertAlign w:val="baseline"/>
       </w:rPr>
     </w:lvl>
-    <w:lvl w:ilvl="6">
+    <w:lvl w:ilvl="6" w:tplc="8BA4B20C">
       <w:start w:val="1"/>
       <w:numFmt w:val="bullet"/>
-      <w:suff w:val="tab"/>
       <w:lvlText w:val="·"/>
       <w:lvlJc w:val="left"/>
       <w:pPr>
         <w:ind w:left="5040" w:hanging="360"/>
       </w:pPr>
       <w:rPr>
-        <w:rFonts w:ascii="Symbol" w:cs="Symbol" w:hAnsi="Symbol" w:eastAsia="Symbol"/>
+        <w:rFonts w:ascii="Symbol" w:eastAsia="Symbol" w:hAnsi="Symbol" w:cs="Symbol"/>
         <w:b w:val="0"/>
         <w:bCs w:val="0"/>
         <w:i w:val="0"/>
@@ -1906,17 +1408,16 @@
         <w:vertAlign w:val="baseline"/>
       </w:rPr>
     </w:lvl>
-    <w:lvl w:ilvl="7">
+    <w:lvl w:ilvl="7" w:tplc="23E0C5A4">
       <w:start w:val="1"/>
       <w:numFmt w:val="bullet"/>
-      <w:suff w:val="tab"/>
       <w:lvlText w:val="o"/>
       <w:lvlJc w:val="left"/>
       <w:pPr>
         <w:ind w:left="5760" w:hanging="360"/>
       </w:pPr>
       <w:rPr>
-        <w:rFonts w:ascii="Arial Unicode MS" w:cs="Arial Unicode MS" w:hAnsi="Arial Unicode MS" w:eastAsia="Arial Unicode MS"/>
+        <w:rFonts w:ascii="Arial Unicode MS" w:eastAsia="Arial Unicode MS" w:hAnsi="Arial Unicode MS" w:cs="Arial Unicode MS"/>
         <w:b w:val="0"/>
         <w:bCs w:val="0"/>
         <w:i w:val="0"/>
@@ -1936,17 +1437,16 @@
         <w:vertAlign w:val="baseline"/>
       </w:rPr>
     </w:lvl>
-    <w:lvl w:ilvl="8">
+    <w:lvl w:ilvl="8" w:tplc="BE4AC868">
       <w:start w:val="1"/>
       <w:numFmt w:val="bullet"/>
-      <w:suff w:val="tab"/>
       <w:lvlText w:val="▪"/>
       <w:lvlJc w:val="left"/>
       <w:pPr>
         <w:ind w:left="6480" w:hanging="360"/>
       </w:pPr>
       <w:rPr>
-        <w:rFonts w:ascii="Arial Unicode MS" w:cs="Arial Unicode MS" w:hAnsi="Arial Unicode MS" w:eastAsia="Arial Unicode MS"/>
+        <w:rFonts w:ascii="Arial Unicode MS" w:eastAsia="Arial Unicode MS" w:hAnsi="Arial Unicode MS" w:cs="Arial Unicode MS"/>
         <w:b w:val="0"/>
         <w:bCs w:val="0"/>
         <w:i w:val="0"/>
@@ -1967,24 +1467,21 @@
       </w:rPr>
     </w:lvl>
   </w:abstractNum>
-  <w:abstractNum w:abstractNumId="2">
+  <w:abstractNum w:abstractNumId="1" w15:restartNumberingAfterBreak="0">
+    <w:nsid w:val="3B9461CE"/>
     <w:multiLevelType w:val="hybridMultilevel"/>
-    <w:numStyleLink w:val="Imported Style 2"/>
-  </w:abstractNum>
-  <w:abstractNum w:abstractNumId="3">
-    <w:multiLevelType w:val="hybridMultilevel"/>
-    <w:styleLink w:val="Imported Style 2"/>
-    <w:lvl w:ilvl="0">
+    <w:tmpl w:val="DD8CBD10"/>
+    <w:styleLink w:val="ImportedStyle1"/>
+    <w:lvl w:ilvl="0" w:tplc="B156A792">
       <w:start w:val="1"/>
       <w:numFmt w:val="bullet"/>
-      <w:suff w:val="tab"/>
       <w:lvlText w:val="·"/>
       <w:lvlJc w:val="left"/>
       <w:pPr>
         <w:ind w:left="720" w:hanging="360"/>
       </w:pPr>
       <w:rPr>
-        <w:rFonts w:ascii="Symbol" w:cs="Symbol" w:hAnsi="Symbol" w:eastAsia="Symbol"/>
+        <w:rFonts w:ascii="Symbol" w:eastAsia="Symbol" w:hAnsi="Symbol" w:cs="Symbol"/>
         <w:b w:val="0"/>
         <w:bCs w:val="0"/>
         <w:i w:val="0"/>
@@ -2004,17 +1501,16 @@
         <w:vertAlign w:val="baseline"/>
       </w:rPr>
     </w:lvl>
-    <w:lvl w:ilvl="1">
+    <w:lvl w:ilvl="1" w:tplc="37B477D8">
       <w:start w:val="1"/>
       <w:numFmt w:val="bullet"/>
-      <w:suff w:val="tab"/>
       <w:lvlText w:val="o"/>
       <w:lvlJc w:val="left"/>
       <w:pPr>
         <w:ind w:left="1440" w:hanging="360"/>
       </w:pPr>
       <w:rPr>
-        <w:rFonts w:ascii="Arial Unicode MS" w:cs="Arial Unicode MS" w:hAnsi="Arial Unicode MS" w:eastAsia="Arial Unicode MS"/>
+        <w:rFonts w:ascii="Arial Unicode MS" w:eastAsia="Arial Unicode MS" w:hAnsi="Arial Unicode MS" w:cs="Arial Unicode MS"/>
         <w:b w:val="0"/>
         <w:bCs w:val="0"/>
         <w:i w:val="0"/>
@@ -2034,17 +1530,16 @@
         <w:vertAlign w:val="baseline"/>
       </w:rPr>
     </w:lvl>
-    <w:lvl w:ilvl="2">
+    <w:lvl w:ilvl="2" w:tplc="FD3A4D4E">
       <w:start w:val="1"/>
       <w:numFmt w:val="bullet"/>
-      <w:suff w:val="tab"/>
       <w:lvlText w:val="▪"/>
       <w:lvlJc w:val="left"/>
       <w:pPr>
         <w:ind w:left="2160" w:hanging="360"/>
       </w:pPr>
       <w:rPr>
-        <w:rFonts w:ascii="Arial Unicode MS" w:cs="Arial Unicode MS" w:hAnsi="Arial Unicode MS" w:eastAsia="Arial Unicode MS"/>
+        <w:rFonts w:ascii="Arial Unicode MS" w:eastAsia="Arial Unicode MS" w:hAnsi="Arial Unicode MS" w:cs="Arial Unicode MS"/>
         <w:b w:val="0"/>
         <w:bCs w:val="0"/>
         <w:i w:val="0"/>
@@ -2064,17 +1559,16 @@
         <w:vertAlign w:val="baseline"/>
       </w:rPr>
     </w:lvl>
-    <w:lvl w:ilvl="3">
+    <w:lvl w:ilvl="3" w:tplc="F8D82B18">
       <w:start w:val="1"/>
       <w:numFmt w:val="bullet"/>
-      <w:suff w:val="tab"/>
       <w:lvlText w:val="·"/>
       <w:lvlJc w:val="left"/>
       <w:pPr>
         <w:ind w:left="2880" w:hanging="360"/>
       </w:pPr>
       <w:rPr>
-        <w:rFonts w:ascii="Symbol" w:cs="Symbol" w:hAnsi="Symbol" w:eastAsia="Symbol"/>
+        <w:rFonts w:ascii="Symbol" w:eastAsia="Symbol" w:hAnsi="Symbol" w:cs="Symbol"/>
         <w:b w:val="0"/>
         <w:bCs w:val="0"/>
         <w:i w:val="0"/>
@@ -2094,17 +1588,16 @@
         <w:vertAlign w:val="baseline"/>
       </w:rPr>
     </w:lvl>
-    <w:lvl w:ilvl="4">
+    <w:lvl w:ilvl="4" w:tplc="AD7ABC16">
       <w:start w:val="1"/>
       <w:numFmt w:val="bullet"/>
-      <w:suff w:val="tab"/>
       <w:lvlText w:val="o"/>
       <w:lvlJc w:val="left"/>
       <w:pPr>
         <w:ind w:left="3600" w:hanging="360"/>
       </w:pPr>
       <w:rPr>
-        <w:rFonts w:ascii="Arial Unicode MS" w:cs="Arial Unicode MS" w:hAnsi="Arial Unicode MS" w:eastAsia="Arial Unicode MS"/>
+        <w:rFonts w:ascii="Arial Unicode MS" w:eastAsia="Arial Unicode MS" w:hAnsi="Arial Unicode MS" w:cs="Arial Unicode MS"/>
         <w:b w:val="0"/>
         <w:bCs w:val="0"/>
         <w:i w:val="0"/>
@@ -2124,17 +1617,16 @@
         <w:vertAlign w:val="baseline"/>
       </w:rPr>
     </w:lvl>
-    <w:lvl w:ilvl="5">
+    <w:lvl w:ilvl="5" w:tplc="3C725554">
       <w:start w:val="1"/>
       <w:numFmt w:val="bullet"/>
-      <w:suff w:val="tab"/>
       <w:lvlText w:val="▪"/>
       <w:lvlJc w:val="left"/>
       <w:pPr>
         <w:ind w:left="4320" w:hanging="360"/>
       </w:pPr>
       <w:rPr>
-        <w:rFonts w:ascii="Arial Unicode MS" w:cs="Arial Unicode MS" w:hAnsi="Arial Unicode MS" w:eastAsia="Arial Unicode MS"/>
+        <w:rFonts w:ascii="Arial Unicode MS" w:eastAsia="Arial Unicode MS" w:hAnsi="Arial Unicode MS" w:cs="Arial Unicode MS"/>
         <w:b w:val="0"/>
         <w:bCs w:val="0"/>
         <w:i w:val="0"/>
@@ -2154,17 +1646,16 @@
         <w:vertAlign w:val="baseline"/>
       </w:rPr>
     </w:lvl>
-    <w:lvl w:ilvl="6">
+    <w:lvl w:ilvl="6" w:tplc="EA1A6E44">
       <w:start w:val="1"/>
       <w:numFmt w:val="bullet"/>
-      <w:suff w:val="tab"/>
       <w:lvlText w:val="·"/>
       <w:lvlJc w:val="left"/>
       <w:pPr>
         <w:ind w:left="5040" w:hanging="360"/>
       </w:pPr>
       <w:rPr>
-        <w:rFonts w:ascii="Symbol" w:cs="Symbol" w:hAnsi="Symbol" w:eastAsia="Symbol"/>
+        <w:rFonts w:ascii="Symbol" w:eastAsia="Symbol" w:hAnsi="Symbol" w:cs="Symbol"/>
         <w:b w:val="0"/>
         <w:bCs w:val="0"/>
         <w:i w:val="0"/>
@@ -2184,17 +1675,16 @@
         <w:vertAlign w:val="baseline"/>
       </w:rPr>
     </w:lvl>
-    <w:lvl w:ilvl="7">
+    <w:lvl w:ilvl="7" w:tplc="B45A7966">
       <w:start w:val="1"/>
       <w:numFmt w:val="bullet"/>
-      <w:suff w:val="tab"/>
       <w:lvlText w:val="o"/>
       <w:lvlJc w:val="left"/>
       <w:pPr>
         <w:ind w:left="5760" w:hanging="360"/>
       </w:pPr>
       <w:rPr>
-        <w:rFonts w:ascii="Arial Unicode MS" w:cs="Arial Unicode MS" w:hAnsi="Arial Unicode MS" w:eastAsia="Arial Unicode MS"/>
+        <w:rFonts w:ascii="Arial Unicode MS" w:eastAsia="Arial Unicode MS" w:hAnsi="Arial Unicode MS" w:cs="Arial Unicode MS"/>
         <w:b w:val="0"/>
         <w:bCs w:val="0"/>
         <w:i w:val="0"/>
@@ -2214,17 +1704,16 @@
         <w:vertAlign w:val="baseline"/>
       </w:rPr>
     </w:lvl>
-    <w:lvl w:ilvl="8">
+    <w:lvl w:ilvl="8" w:tplc="DEE0E466">
       <w:start w:val="1"/>
       <w:numFmt w:val="bullet"/>
-      <w:suff w:val="tab"/>
       <w:lvlText w:val="▪"/>
       <w:lvlJc w:val="left"/>
       <w:pPr>
         <w:ind w:left="6480" w:hanging="360"/>
       </w:pPr>
       <w:rPr>
-        <w:rFonts w:ascii="Arial Unicode MS" w:cs="Arial Unicode MS" w:hAnsi="Arial Unicode MS" w:eastAsia="Arial Unicode MS"/>
+        <w:rFonts w:ascii="Arial Unicode MS" w:eastAsia="Arial Unicode MS" w:hAnsi="Arial Unicode MS" w:cs="Arial Unicode MS"/>
         <w:b w:val="0"/>
         <w:bCs w:val="0"/>
         <w:i w:val="0"/>
@@ -2245,64 +1734,45 @@
       </w:rPr>
     </w:lvl>
   </w:abstractNum>
-  <w:num w:numId="1">
+  <w:abstractNum w:abstractNumId="2" w15:restartNumberingAfterBreak="0">
+    <w:nsid w:val="54047736"/>
+    <w:multiLevelType w:val="hybridMultilevel"/>
+    <w:tmpl w:val="DD8CBD10"/>
+    <w:numStyleLink w:val="ImportedStyle1"/>
+  </w:abstractNum>
+  <w:abstractNum w:abstractNumId="3" w15:restartNumberingAfterBreak="0">
+    <w:nsid w:val="7F1D5E04"/>
+    <w:multiLevelType w:val="hybridMultilevel"/>
+    <w:tmpl w:val="2176F9F4"/>
+    <w:numStyleLink w:val="ImportedStyle2"/>
+  </w:abstractNum>
+  <w:num w:numId="1" w16cid:durableId="622423928">
     <w:abstractNumId w:val="1"/>
   </w:num>
-  <w:num w:numId="2">
+  <w:num w:numId="2" w16cid:durableId="587351188">
+    <w:abstractNumId w:val="2"/>
+  </w:num>
+  <w:num w:numId="3" w16cid:durableId="530532291">
     <w:abstractNumId w:val="0"/>
   </w:num>
-  <w:num w:numId="3">
+  <w:num w:numId="4" w16cid:durableId="1705670961">
     <w:abstractNumId w:val="3"/>
-  </w:num>
-  <w:num w:numId="4">
-    <w:abstractNumId w:val="2"/>
   </w:num>
 </w:numbering>
 </file>
 
 <file path=word/styles.xml><?xml version="1.0" encoding="utf-8"?>
-<w:styles xmlns:w="http://schemas.openxmlformats.org/wordprocessingml/2006/main" xmlns:mc="http://schemas.openxmlformats.org/markup-compatibility/2006" xmlns:w14="http://schemas.microsoft.com/office/word/2010/wordml" mc:Ignorable="w14">
+<w:styles xmlns:mc="http://schemas.openxmlformats.org/markup-compatibility/2006" xmlns:r="http://schemas.openxmlformats.org/officeDocument/2006/relationships" xmlns:w="http://schemas.openxmlformats.org/wordprocessingml/2006/main" xmlns:w14="http://schemas.microsoft.com/office/word/2010/wordml" xmlns:w15="http://schemas.microsoft.com/office/word/2012/wordml" xmlns:w16cex="http://schemas.microsoft.com/office/word/2018/wordml/cex" xmlns:w16cid="http://schemas.microsoft.com/office/word/2016/wordml/cid" xmlns:w16="http://schemas.microsoft.com/office/word/2018/wordml" xmlns:w16du="http://schemas.microsoft.com/office/word/2023/wordml/word16du" xmlns:w16sdtdh="http://schemas.microsoft.com/office/word/2020/wordml/sdtdatahash" xmlns:w16sdtfl="http://schemas.microsoft.com/office/word/2024/wordml/sdtformatlock" xmlns:w16se="http://schemas.microsoft.com/office/word/2015/wordml/symex" mc:Ignorable="w14 w15 w16se w16cid w16 w16cex w16sdtdh w16sdtfl w16du">
   <w:docDefaults>
     <w:rPrDefault>
       <w:rPr>
-        <w:rFonts w:ascii="Times New Roman" w:cs="Times New Roman" w:hAnsi="Times New Roman" w:eastAsia="Arial Unicode MS"/>
-        <w:b w:val="0"/>
-        <w:bCs w:val="0"/>
-        <w:i w:val="0"/>
-        <w:iCs w:val="0"/>
-        <w:caps w:val="0"/>
-        <w:smallCaps w:val="0"/>
-        <w:strike w:val="0"/>
-        <w:dstrike w:val="0"/>
-        <w:outline w:val="0"/>
-        <w:emboss w:val="0"/>
-        <w:imprint w:val="0"/>
-        <w:vanish w:val="0"/>
-        <w:color w:val="auto"/>
-        <w:spacing w:val="0"/>
-        <w:w w:val="100"/>
-        <w:kern w:val="0"/>
-        <w:position w:val="0"/>
-        <w:sz w:val="20"/>
-        <w:szCs w:val="20"/>
-        <w:u w:val="none" w:color="auto"/>
+        <w:rFonts w:ascii="Times New Roman" w:eastAsia="Arial Unicode MS" w:hAnsi="Times New Roman" w:cs="Times New Roman"/>
         <w:bdr w:val="nil"/>
-        <w:vertAlign w:val="baseline"/>
-        <w:lang/>
+        <w:lang w:val="en-US" w:eastAsia="en-US" w:bidi="ar-SA"/>
       </w:rPr>
     </w:rPrDefault>
     <w:pPrDefault>
       <w:pPr>
-        <w:keepNext w:val="0"/>
-        <w:keepLines w:val="0"/>
-        <w:pageBreakBefore w:val="0"/>
-        <w:framePr w:anchorLock="0" w:w="0" w:h="0" w:vSpace="0" w:hSpace="0" w:xAlign="left" w:y="0" w:hRule="exact" w:vAnchor="margin"/>
-        <w:widowControl w:val="1"/>
-        <w:numPr>
-          <w:ilvl w:val="0"/>
-          <w:numId w:val="0"/>
-        </w:numPr>
-        <w:suppressLineNumbers w:val="0"/>
         <w:pBdr>
           <w:top w:val="nil"/>
           <w:left w:val="nil"/>
@@ -2311,28 +1781,420 @@
           <w:between w:val="nil"/>
           <w:bar w:val="nil"/>
         </w:pBdr>
-        <w:shd w:val="clear" w:color="auto" w:fill="auto"/>
-        <w:suppressAutoHyphens w:val="0"/>
-        <w:spacing w:before="0" w:beforeAutospacing="0" w:after="0" w:afterAutospacing="0" w:line="240" w:lineRule="auto"/>
-        <w:ind w:left="0" w:right="0" w:firstLine="0"/>
-        <w:jc w:val="left"/>
-        <w:outlineLvl w:val="9"/>
       </w:pPr>
     </w:pPrDefault>
   </w:docDefaults>
+  <w:latentStyles w:defLockedState="0" w:defUIPriority="99" w:defSemiHidden="0" w:defUnhideWhenUsed="0" w:defQFormat="0" w:count="376">
+    <w:lsdException w:name="Normal" w:uiPriority="0" w:qFormat="1"/>
+    <w:lsdException w:name="heading 1" w:uiPriority="9" w:qFormat="1"/>
+    <w:lsdException w:name="heading 2" w:semiHidden="1" w:uiPriority="9" w:unhideWhenUsed="1" w:qFormat="1"/>
+    <w:lsdException w:name="heading 3" w:semiHidden="1" w:uiPriority="9" w:unhideWhenUsed="1" w:qFormat="1"/>
+    <w:lsdException w:name="heading 4" w:semiHidden="1" w:uiPriority="9" w:unhideWhenUsed="1" w:qFormat="1"/>
+    <w:lsdException w:name="heading 5" w:semiHidden="1" w:uiPriority="9" w:unhideWhenUsed="1" w:qFormat="1"/>
+    <w:lsdException w:name="heading 6" w:semiHidden="1" w:uiPriority="9" w:unhideWhenUsed="1" w:qFormat="1"/>
+    <w:lsdException w:name="heading 7" w:semiHidden="1" w:uiPriority="9" w:unhideWhenUsed="1" w:qFormat="1"/>
+    <w:lsdException w:name="heading 8" w:semiHidden="1" w:uiPriority="9" w:unhideWhenUsed="1" w:qFormat="1"/>
+    <w:lsdException w:name="heading 9" w:semiHidden="1" w:uiPriority="9" w:unhideWhenUsed="1" w:qFormat="1"/>
+    <w:lsdException w:name="index 1" w:semiHidden="1" w:unhideWhenUsed="1"/>
+    <w:lsdException w:name="index 2" w:semiHidden="1" w:unhideWhenUsed="1"/>
+    <w:lsdException w:name="index 3" w:semiHidden="1" w:unhideWhenUsed="1"/>
+    <w:lsdException w:name="index 4" w:semiHidden="1" w:unhideWhenUsed="1"/>
+    <w:lsdException w:name="index 5" w:semiHidden="1" w:unhideWhenUsed="1"/>
+    <w:lsdException w:name="index 6" w:semiHidden="1" w:unhideWhenUsed="1"/>
+    <w:lsdException w:name="index 7" w:semiHidden="1" w:unhideWhenUsed="1"/>
+    <w:lsdException w:name="index 8" w:semiHidden="1" w:unhideWhenUsed="1"/>
+    <w:lsdException w:name="index 9" w:semiHidden="1" w:unhideWhenUsed="1"/>
+    <w:lsdException w:name="toc 1" w:semiHidden="1" w:uiPriority="39" w:unhideWhenUsed="1"/>
+    <w:lsdException w:name="toc 2" w:semiHidden="1" w:uiPriority="39" w:unhideWhenUsed="1"/>
+    <w:lsdException w:name="toc 3" w:semiHidden="1" w:uiPriority="39" w:unhideWhenUsed="1"/>
+    <w:lsdException w:name="toc 4" w:semiHidden="1" w:uiPriority="39" w:unhideWhenUsed="1"/>
+    <w:lsdException w:name="toc 5" w:semiHidden="1" w:uiPriority="39" w:unhideWhenUsed="1"/>
+    <w:lsdException w:name="toc 6" w:semiHidden="1" w:uiPriority="39" w:unhideWhenUsed="1"/>
+    <w:lsdException w:name="toc 7" w:semiHidden="1" w:uiPriority="39" w:unhideWhenUsed="1"/>
+    <w:lsdException w:name="toc 8" w:semiHidden="1" w:uiPriority="39" w:unhideWhenUsed="1"/>
+    <w:lsdException w:name="toc 9" w:semiHidden="1" w:uiPriority="39" w:unhideWhenUsed="1"/>
+    <w:lsdException w:name="Normal Indent" w:semiHidden="1" w:unhideWhenUsed="1"/>
+    <w:lsdException w:name="footnote text" w:semiHidden="1" w:unhideWhenUsed="1"/>
+    <w:lsdException w:name="annotation text" w:semiHidden="1" w:unhideWhenUsed="1"/>
+    <w:lsdException w:name="header" w:semiHidden="1" w:unhideWhenUsed="1"/>
+    <w:lsdException w:name="footer" w:semiHidden="1" w:unhideWhenUsed="1"/>
+    <w:lsdException w:name="index heading" w:semiHidden="1" w:unhideWhenUsed="1"/>
+    <w:lsdException w:name="caption" w:semiHidden="1" w:uiPriority="35" w:unhideWhenUsed="1" w:qFormat="1"/>
+    <w:lsdException w:name="table of figures" w:semiHidden="1" w:unhideWhenUsed="1"/>
+    <w:lsdException w:name="envelope address" w:semiHidden="1" w:unhideWhenUsed="1"/>
+    <w:lsdException w:name="envelope return" w:semiHidden="1" w:unhideWhenUsed="1"/>
+    <w:lsdException w:name="footnote reference" w:semiHidden="1" w:unhideWhenUsed="1"/>
+    <w:lsdException w:name="annotation reference" w:semiHidden="1" w:unhideWhenUsed="1"/>
+    <w:lsdException w:name="line number" w:semiHidden="1" w:unhideWhenUsed="1"/>
+    <w:lsdException w:name="page number" w:semiHidden="1" w:unhideWhenUsed="1"/>
+    <w:lsdException w:name="endnote reference" w:semiHidden="1" w:unhideWhenUsed="1"/>
+    <w:lsdException w:name="endnote text" w:semiHidden="1" w:unhideWhenUsed="1"/>
+    <w:lsdException w:name="table of authorities" w:semiHidden="1" w:unhideWhenUsed="1"/>
+    <w:lsdException w:name="macro" w:semiHidden="1" w:unhideWhenUsed="1"/>
+    <w:lsdException w:name="toa heading" w:semiHidden="1" w:unhideWhenUsed="1"/>
+    <w:lsdException w:name="List" w:semiHidden="1" w:unhideWhenUsed="1"/>
+    <w:lsdException w:name="List Bullet" w:semiHidden="1" w:unhideWhenUsed="1"/>
+    <w:lsdException w:name="List Number" w:semiHidden="1" w:unhideWhenUsed="1"/>
+    <w:lsdException w:name="List 2" w:semiHidden="1" w:unhideWhenUsed="1"/>
+    <w:lsdException w:name="List 3" w:semiHidden="1" w:unhideWhenUsed="1"/>
+    <w:lsdException w:name="List 4" w:semiHidden="1" w:unhideWhenUsed="1"/>
+    <w:lsdException w:name="List 5" w:semiHidden="1" w:unhideWhenUsed="1"/>
+    <w:lsdException w:name="List Bullet 2" w:semiHidden="1" w:unhideWhenUsed="1"/>
+    <w:lsdException w:name="List Bullet 3" w:semiHidden="1" w:unhideWhenUsed="1"/>
+    <w:lsdException w:name="List Bullet 4" w:semiHidden="1" w:unhideWhenUsed="1"/>
+    <w:lsdException w:name="List Bullet 5" w:semiHidden="1" w:unhideWhenUsed="1"/>
+    <w:lsdException w:name="List Number 2" w:semiHidden="1" w:unhideWhenUsed="1"/>
+    <w:lsdException w:name="List Number 3" w:semiHidden="1" w:unhideWhenUsed="1"/>
+    <w:lsdException w:name="List Number 4" w:semiHidden="1" w:unhideWhenUsed="1"/>
+    <w:lsdException w:name="List Number 5" w:semiHidden="1" w:unhideWhenUsed="1"/>
+    <w:lsdException w:name="Title" w:uiPriority="10" w:qFormat="1"/>
+    <w:lsdException w:name="Closing" w:semiHidden="1" w:unhideWhenUsed="1"/>
+    <w:lsdException w:name="Signature" w:semiHidden="1" w:unhideWhenUsed="1"/>
+    <w:lsdException w:name="Default Paragraph Font" w:semiHidden="1" w:uiPriority="1" w:unhideWhenUsed="1"/>
+    <w:lsdException w:name="Body Text" w:semiHidden="1" w:unhideWhenUsed="1"/>
+    <w:lsdException w:name="Body Text Indent" w:semiHidden="1" w:unhideWhenUsed="1"/>
+    <w:lsdException w:name="List Continue" w:semiHidden="1" w:unhideWhenUsed="1"/>
+    <w:lsdException w:name="List Continue 2" w:semiHidden="1" w:unhideWhenUsed="1"/>
+    <w:lsdException w:name="List Continue 3" w:semiHidden="1" w:unhideWhenUsed="1"/>
+    <w:lsdException w:name="List Continue 4" w:semiHidden="1" w:unhideWhenUsed="1"/>
+    <w:lsdException w:name="List Continue 5" w:semiHidden="1" w:unhideWhenUsed="1"/>
+    <w:lsdException w:name="Message Header" w:semiHidden="1" w:unhideWhenUsed="1"/>
+    <w:lsdException w:name="Subtitle" w:uiPriority="11" w:qFormat="1"/>
+    <w:lsdException w:name="Salutation" w:semiHidden="1" w:unhideWhenUsed="1"/>
+    <w:lsdException w:name="Date" w:semiHidden="1" w:unhideWhenUsed="1"/>
+    <w:lsdException w:name="Body Text First Indent" w:semiHidden="1" w:unhideWhenUsed="1"/>
+    <w:lsdException w:name="Body Text First Indent 2" w:semiHidden="1" w:unhideWhenUsed="1"/>
+    <w:lsdException w:name="Note Heading" w:semiHidden="1" w:unhideWhenUsed="1"/>
+    <w:lsdException w:name="Body Text 2" w:semiHidden="1" w:unhideWhenUsed="1"/>
+    <w:lsdException w:name="Body Text 3" w:semiHidden="1" w:unhideWhenUsed="1"/>
+    <w:lsdException w:name="Body Text Indent 2" w:semiHidden="1" w:unhideWhenUsed="1"/>
+    <w:lsdException w:name="Body Text Indent 3" w:semiHidden="1" w:unhideWhenUsed="1"/>
+    <w:lsdException w:name="Block Text" w:semiHidden="1" w:unhideWhenUsed="1"/>
+    <w:lsdException w:name="Hyperlink" w:semiHidden="1" w:unhideWhenUsed="1"/>
+    <w:lsdException w:name="FollowedHyperlink" w:semiHidden="1" w:unhideWhenUsed="1"/>
+    <w:lsdException w:name="Strong" w:uiPriority="22" w:qFormat="1"/>
+    <w:lsdException w:name="Emphasis" w:uiPriority="20" w:qFormat="1"/>
+    <w:lsdException w:name="Document Map" w:semiHidden="1" w:unhideWhenUsed="1"/>
+    <w:lsdException w:name="Plain Text" w:semiHidden="1" w:unhideWhenUsed="1"/>
+    <w:lsdException w:name="E-mail Signature" w:semiHidden="1" w:unhideWhenUsed="1"/>
+    <w:lsdException w:name="HTML Top of Form" w:semiHidden="1" w:unhideWhenUsed="1"/>
+    <w:lsdException w:name="HTML Bottom of Form" w:semiHidden="1" w:unhideWhenUsed="1"/>
+    <w:lsdException w:name="Normal (Web)" w:semiHidden="1" w:unhideWhenUsed="1"/>
+    <w:lsdException w:name="HTML Acronym" w:semiHidden="1" w:unhideWhenUsed="1"/>
+    <w:lsdException w:name="HTML Address" w:semiHidden="1" w:unhideWhenUsed="1"/>
+    <w:lsdException w:name="HTML Cite" w:semiHidden="1" w:unhideWhenUsed="1"/>
+    <w:lsdException w:name="HTML Code" w:semiHidden="1" w:unhideWhenUsed="1"/>
+    <w:lsdException w:name="HTML Definition" w:semiHidden="1" w:unhideWhenUsed="1"/>
+    <w:lsdException w:name="HTML Keyboard" w:semiHidden="1" w:unhideWhenUsed="1"/>
+    <w:lsdException w:name="HTML Preformatted" w:semiHidden="1" w:unhideWhenUsed="1"/>
+    <w:lsdException w:name="HTML Sample" w:semiHidden="1" w:unhideWhenUsed="1"/>
+    <w:lsdException w:name="HTML Typewriter" w:semiHidden="1" w:unhideWhenUsed="1"/>
+    <w:lsdException w:name="HTML Variable" w:semiHidden="1" w:unhideWhenUsed="1"/>
+    <w:lsdException w:name="Normal Table" w:semiHidden="1" w:unhideWhenUsed="1"/>
+    <w:lsdException w:name="annotation subject" w:semiHidden="1" w:unhideWhenUsed="1"/>
+    <w:lsdException w:name="No List" w:semiHidden="1" w:unhideWhenUsed="1"/>
+    <w:lsdException w:name="Outline List 1" w:semiHidden="1" w:unhideWhenUsed="1"/>
+    <w:lsdException w:name="Outline List 2" w:semiHidden="1" w:unhideWhenUsed="1"/>
+    <w:lsdException w:name="Outline List 3" w:semiHidden="1" w:unhideWhenUsed="1"/>
+    <w:lsdException w:name="Table Simple 1" w:semiHidden="1" w:unhideWhenUsed="1"/>
+    <w:lsdException w:name="Table Simple 2" w:semiHidden="1" w:unhideWhenUsed="1"/>
+    <w:lsdException w:name="Table Simple 3" w:semiHidden="1" w:unhideWhenUsed="1"/>
+    <w:lsdException w:name="Table Classic 1" w:semiHidden="1" w:unhideWhenUsed="1"/>
+    <w:lsdException w:name="Table Classic 2" w:semiHidden="1" w:unhideWhenUsed="1"/>
+    <w:lsdException w:name="Table Classic 3" w:semiHidden="1" w:unhideWhenUsed="1"/>
+    <w:lsdException w:name="Table Classic 4" w:semiHidden="1" w:unhideWhenUsed="1"/>
+    <w:lsdException w:name="Table Colorful 1" w:semiHidden="1" w:unhideWhenUsed="1"/>
+    <w:lsdException w:name="Table Colorful 2" w:semiHidden="1" w:unhideWhenUsed="1"/>
+    <w:lsdException w:name="Table Colorful 3" w:semiHidden="1" w:unhideWhenUsed="1"/>
+    <w:lsdException w:name="Table Columns 1" w:semiHidden="1" w:unhideWhenUsed="1"/>
+    <w:lsdException w:name="Table Columns 2" w:semiHidden="1" w:unhideWhenUsed="1"/>
+    <w:lsdException w:name="Table Columns 3" w:semiHidden="1" w:unhideWhenUsed="1"/>
+    <w:lsdException w:name="Table Columns 4" w:semiHidden="1" w:unhideWhenUsed="1"/>
+    <w:lsdException w:name="Table Columns 5" w:semiHidden="1" w:unhideWhenUsed="1"/>
+    <w:lsdException w:name="Table Grid 1" w:semiHidden="1" w:unhideWhenUsed="1"/>
+    <w:lsdException w:name="Table Grid 2" w:semiHidden="1" w:unhideWhenUsed="1"/>
+    <w:lsdException w:name="Table Grid 3" w:semiHidden="1" w:unhideWhenUsed="1"/>
+    <w:lsdException w:name="Table Grid 4" w:semiHidden="1" w:unhideWhenUsed="1"/>
+    <w:lsdException w:name="Table Grid 5" w:semiHidden="1" w:unhideWhenUsed="1"/>
+    <w:lsdException w:name="Table Grid 6" w:semiHidden="1" w:unhideWhenUsed="1"/>
+    <w:lsdException w:name="Table Grid 7" w:semiHidden="1" w:unhideWhenUsed="1"/>
+    <w:lsdException w:name="Table Grid 8" w:semiHidden="1" w:unhideWhenUsed="1"/>
+    <w:lsdException w:name="Table List 1" w:semiHidden="1" w:unhideWhenUsed="1"/>
+    <w:lsdException w:name="Table List 2" w:semiHidden="1" w:unhideWhenUsed="1"/>
+    <w:lsdException w:name="Table List 3" w:semiHidden="1" w:unhideWhenUsed="1"/>
+    <w:lsdException w:name="Table List 4" w:semiHidden="1" w:unhideWhenUsed="1"/>
+    <w:lsdException w:name="Table List 5" w:semiHidden="1" w:unhideWhenUsed="1"/>
+    <w:lsdException w:name="Table List 6" w:semiHidden="1" w:unhideWhenUsed="1"/>
+    <w:lsdException w:name="Table List 7" w:semiHidden="1" w:unhideWhenUsed="1"/>
+    <w:lsdException w:name="Table List 8" w:semiHidden="1" w:unhideWhenUsed="1"/>
+    <w:lsdException w:name="Table 3D effects 1" w:semiHidden="1" w:unhideWhenUsed="1"/>
+    <w:lsdException w:name="Table 3D effects 2" w:semiHidden="1" w:unhideWhenUsed="1"/>
+    <w:lsdException w:name="Table 3D effects 3" w:semiHidden="1" w:unhideWhenUsed="1"/>
+    <w:lsdException w:name="Table Contemporary" w:semiHidden="1" w:unhideWhenUsed="1"/>
+    <w:lsdException w:name="Table Elegant" w:semiHidden="1" w:unhideWhenUsed="1"/>
+    <w:lsdException w:name="Table Professional" w:semiHidden="1" w:unhideWhenUsed="1"/>
+    <w:lsdException w:name="Table Subtle 1" w:semiHidden="1" w:unhideWhenUsed="1"/>
+    <w:lsdException w:name="Table Subtle 2" w:semiHidden="1" w:unhideWhenUsed="1"/>
+    <w:lsdException w:name="Table Web 1" w:semiHidden="1" w:unhideWhenUsed="1"/>
+    <w:lsdException w:name="Table Web 2" w:semiHidden="1" w:unhideWhenUsed="1"/>
+    <w:lsdException w:name="Table Web 3" w:semiHidden="1" w:unhideWhenUsed="1"/>
+    <w:lsdException w:name="Balloon Text" w:semiHidden="1" w:unhideWhenUsed="1"/>
+    <w:lsdException w:name="Table Grid" w:uiPriority="39"/>
+    <w:lsdException w:name="Table Theme" w:semiHidden="1" w:unhideWhenUsed="1"/>
+    <w:lsdException w:name="Placeholder Text" w:semiHidden="1"/>
+    <w:lsdException w:name="No Spacing" w:uiPriority="1" w:qFormat="1"/>
+    <w:lsdException w:name="Light Shading" w:uiPriority="60"/>
+    <w:lsdException w:name="Light List" w:uiPriority="61"/>
+    <w:lsdException w:name="Light Grid" w:uiPriority="62"/>
+    <w:lsdException w:name="Medium Shading 1" w:uiPriority="63"/>
+    <w:lsdException w:name="Medium Shading 2" w:uiPriority="64"/>
+    <w:lsdException w:name="Medium List 1" w:uiPriority="65"/>
+    <w:lsdException w:name="Medium List 2" w:uiPriority="66"/>
+    <w:lsdException w:name="Medium Grid 1" w:uiPriority="67"/>
+    <w:lsdException w:name="Medium Grid 2" w:uiPriority="68"/>
+    <w:lsdException w:name="Medium Grid 3" w:uiPriority="69"/>
+    <w:lsdException w:name="Dark List" w:uiPriority="70"/>
+    <w:lsdException w:name="Colorful Shading" w:uiPriority="71"/>
+    <w:lsdException w:name="Colorful List" w:uiPriority="72"/>
+    <w:lsdException w:name="Colorful Grid" w:uiPriority="73"/>
+    <w:lsdException w:name="Light Shading Accent 1" w:uiPriority="60"/>
+    <w:lsdException w:name="Light List Accent 1" w:uiPriority="61"/>
+    <w:lsdException w:name="Light Grid Accent 1" w:uiPriority="62"/>
+    <w:lsdException w:name="Medium Shading 1 Accent 1" w:uiPriority="63"/>
+    <w:lsdException w:name="Medium Shading 2 Accent 1" w:uiPriority="64"/>
+    <w:lsdException w:name="Medium List 1 Accent 1" w:uiPriority="65"/>
+    <w:lsdException w:name="Revision" w:semiHidden="1"/>
+    <w:lsdException w:name="List Paragraph" w:uiPriority="34" w:qFormat="1"/>
+    <w:lsdException w:name="Quote" w:uiPriority="29" w:qFormat="1"/>
+    <w:lsdException w:name="Intense Quote" w:uiPriority="30" w:qFormat="1"/>
+    <w:lsdException w:name="Medium List 2 Accent 1" w:uiPriority="66"/>
+    <w:lsdException w:name="Medium Grid 1 Accent 1" w:uiPriority="67"/>
+    <w:lsdException w:name="Medium Grid 2 Accent 1" w:uiPriority="68"/>
+    <w:lsdException w:name="Medium Grid 3 Accent 1" w:uiPriority="69"/>
+    <w:lsdException w:name="Dark List Accent 1" w:uiPriority="70"/>
+    <w:lsdException w:name="Colorful Shading Accent 1" w:uiPriority="71"/>
+    <w:lsdException w:name="Colorful List Accent 1" w:uiPriority="72"/>
+    <w:lsdException w:name="Colorful Grid Accent 1" w:uiPriority="73"/>
+    <w:lsdException w:name="Light Shading Accent 2" w:uiPriority="60"/>
+    <w:lsdException w:name="Light List Accent 2" w:uiPriority="61"/>
+    <w:lsdException w:name="Light Grid Accent 2" w:uiPriority="62"/>
+    <w:lsdException w:name="Medium Shading 1 Accent 2" w:uiPriority="63"/>
+    <w:lsdException w:name="Medium Shading 2 Accent 2" w:uiPriority="64"/>
+    <w:lsdException w:name="Medium List 1 Accent 2" w:uiPriority="65"/>
+    <w:lsdException w:name="Medium List 2 Accent 2" w:uiPriority="66"/>
+    <w:lsdException w:name="Medium Grid 1 Accent 2" w:uiPriority="67"/>
+    <w:lsdException w:name="Medium Grid 2 Accent 2" w:uiPriority="68"/>
+    <w:lsdException w:name="Medium Grid 3 Accent 2" w:uiPriority="69"/>
+    <w:lsdException w:name="Dark List Accent 2" w:uiPriority="70"/>
+    <w:lsdException w:name="Colorful Shading Accent 2" w:uiPriority="71"/>
+    <w:lsdException w:name="Colorful List Accent 2" w:uiPriority="72"/>
+    <w:lsdException w:name="Colorful Grid Accent 2" w:uiPriority="73"/>
+    <w:lsdException w:name="Light Shading Accent 3" w:uiPriority="60"/>
+    <w:lsdException w:name="Light List Accent 3" w:uiPriority="61"/>
+    <w:lsdException w:name="Light Grid Accent 3" w:uiPriority="62"/>
+    <w:lsdException w:name="Medium Shading 1 Accent 3" w:uiPriority="63"/>
+    <w:lsdException w:name="Medium Shading 2 Accent 3" w:uiPriority="64"/>
+    <w:lsdException w:name="Medium List 1 Accent 3" w:uiPriority="65"/>
+    <w:lsdException w:name="Medium List 2 Accent 3" w:uiPriority="66"/>
+    <w:lsdException w:name="Medium Grid 1 Accent 3" w:uiPriority="67"/>
+    <w:lsdException w:name="Medium Grid 2 Accent 3" w:uiPriority="68"/>
+    <w:lsdException w:name="Medium Grid 3 Accent 3" w:uiPriority="69"/>
+    <w:lsdException w:name="Dark List Accent 3" w:uiPriority="70"/>
+    <w:lsdException w:name="Colorful Shading Accent 3" w:uiPriority="71"/>
+    <w:lsdException w:name="Colorful List Accent 3" w:uiPriority="72"/>
+    <w:lsdException w:name="Colorful Grid Accent 3" w:uiPriority="73"/>
+    <w:lsdException w:name="Light Shading Accent 4" w:uiPriority="60"/>
+    <w:lsdException w:name="Light List Accent 4" w:uiPriority="61"/>
+    <w:lsdException w:name="Light Grid Accent 4" w:uiPriority="62"/>
+    <w:lsdException w:name="Medium Shading 1 Accent 4" w:uiPriority="63"/>
+    <w:lsdException w:name="Medium Shading 2 Accent 4" w:uiPriority="64"/>
+    <w:lsdException w:name="Medium List 1 Accent 4" w:uiPriority="65"/>
+    <w:lsdException w:name="Medium List 2 Accent 4" w:uiPriority="66"/>
+    <w:lsdException w:name="Medium Grid 1 Accent 4" w:uiPriority="67"/>
+    <w:lsdException w:name="Medium Grid 2 Accent 4" w:uiPriority="68"/>
+    <w:lsdException w:name="Medium Grid 3 Accent 4" w:uiPriority="69"/>
+    <w:lsdException w:name="Dark List Accent 4" w:uiPriority="70"/>
+    <w:lsdException w:name="Colorful Shading Accent 4" w:uiPriority="71"/>
+    <w:lsdException w:name="Colorful List Accent 4" w:uiPriority="72"/>
+    <w:lsdException w:name="Colorful Grid Accent 4" w:uiPriority="73"/>
+    <w:lsdException w:name="Light Shading Accent 5" w:uiPriority="60"/>
+    <w:lsdException w:name="Light List Accent 5" w:uiPriority="61"/>
+    <w:lsdException w:name="Light Grid Accent 5" w:uiPriority="62"/>
+    <w:lsdException w:name="Medium Shading 1 Accent 5" w:uiPriority="63"/>
+    <w:lsdException w:name="Medium Shading 2 Accent 5" w:uiPriority="64"/>
+    <w:lsdException w:name="Medium List 1 Accent 5" w:uiPriority="65"/>
+    <w:lsdException w:name="Medium List 2 Accent 5" w:uiPriority="66"/>
+    <w:lsdException w:name="Medium Grid 1 Accent 5" w:uiPriority="67"/>
+    <w:lsdException w:name="Medium Grid 2 Accent 5" w:uiPriority="68"/>
+    <w:lsdException w:name="Medium Grid 3 Accent 5" w:uiPriority="69"/>
+    <w:lsdException w:name="Dark List Accent 5" w:uiPriority="70"/>
+    <w:lsdException w:name="Colorful Shading Accent 5" w:uiPriority="71"/>
+    <w:lsdException w:name="Colorful List Accent 5" w:uiPriority="72"/>
+    <w:lsdException w:name="Colorful Grid Accent 5" w:uiPriority="73"/>
+    <w:lsdException w:name="Light Shading Accent 6" w:uiPriority="60"/>
+    <w:lsdException w:name="Light List Accent 6" w:uiPriority="61"/>
+    <w:lsdException w:name="Light Grid Accent 6" w:uiPriority="62"/>
+    <w:lsdException w:name="Medium Shading 1 Accent 6" w:uiPriority="63"/>
+    <w:lsdException w:name="Medium Shading 2 Accent 6" w:uiPriority="64"/>
+    <w:lsdException w:name="Medium List 1 Accent 6" w:uiPriority="65"/>
+    <w:lsdException w:name="Medium List 2 Accent 6" w:uiPriority="66"/>
+    <w:lsdException w:name="Medium Grid 1 Accent 6" w:uiPriority="67"/>
+    <w:lsdException w:name="Medium Grid 2 Accent 6" w:uiPriority="68"/>
+    <w:lsdException w:name="Medium Grid 3 Accent 6" w:uiPriority="69"/>
+    <w:lsdException w:name="Dark List Accent 6" w:uiPriority="70"/>
+    <w:lsdException w:name="Colorful Shading Accent 6" w:uiPriority="71"/>
+    <w:lsdException w:name="Colorful List Accent 6" w:uiPriority="72"/>
+    <w:lsdException w:name="Colorful Grid Accent 6" w:uiPriority="73"/>
+    <w:lsdException w:name="Subtle Emphasis" w:uiPriority="19" w:qFormat="1"/>
+    <w:lsdException w:name="Intense Emphasis" w:uiPriority="21" w:qFormat="1"/>
+    <w:lsdException w:name="Subtle Reference" w:uiPriority="31" w:qFormat="1"/>
+    <w:lsdException w:name="Intense Reference" w:uiPriority="32" w:qFormat="1"/>
+    <w:lsdException w:name="Book Title" w:uiPriority="33" w:qFormat="1"/>
+    <w:lsdException w:name="Bibliography" w:semiHidden="1" w:uiPriority="37" w:unhideWhenUsed="1"/>
+    <w:lsdException w:name="TOC Heading" w:semiHidden="1" w:uiPriority="39" w:unhideWhenUsed="1" w:qFormat="1"/>
+    <w:lsdException w:name="Plain Table 1" w:uiPriority="41"/>
+    <w:lsdException w:name="Plain Table 2" w:uiPriority="42"/>
+    <w:lsdException w:name="Plain Table 3" w:uiPriority="43"/>
+    <w:lsdException w:name="Plain Table 4" w:uiPriority="44"/>
+    <w:lsdException w:name="Plain Table 5" w:uiPriority="45"/>
+    <w:lsdException w:name="Grid Table Light" w:uiPriority="40"/>
+    <w:lsdException w:name="Grid Table 1 Light" w:uiPriority="46"/>
+    <w:lsdException w:name="Grid Table 2" w:uiPriority="47"/>
+    <w:lsdException w:name="Grid Table 3" w:uiPriority="48"/>
+    <w:lsdException w:name="Grid Table 4" w:uiPriority="49"/>
+    <w:lsdException w:name="Grid Table 5 Dark" w:uiPriority="50"/>
+    <w:lsdException w:name="Grid Table 6 Colorful" w:uiPriority="51"/>
+    <w:lsdException w:name="Grid Table 7 Colorful" w:uiPriority="52"/>
+    <w:lsdException w:name="Grid Table 1 Light Accent 1" w:uiPriority="46"/>
+    <w:lsdException w:name="Grid Table 2 Accent 1" w:uiPriority="47"/>
+    <w:lsdException w:name="Grid Table 3 Accent 1" w:uiPriority="48"/>
+    <w:lsdException w:name="Grid Table 4 Accent 1" w:uiPriority="49"/>
+    <w:lsdException w:name="Grid Table 5 Dark Accent 1" w:uiPriority="50"/>
+    <w:lsdException w:name="Grid Table 6 Colorful Accent 1" w:uiPriority="51"/>
+    <w:lsdException w:name="Grid Table 7 Colorful Accent 1" w:uiPriority="52"/>
+    <w:lsdException w:name="Grid Table 1 Light Accent 2" w:uiPriority="46"/>
+    <w:lsdException w:name="Grid Table 2 Accent 2" w:uiPriority="47"/>
+    <w:lsdException w:name="Grid Table 3 Accent 2" w:uiPriority="48"/>
+    <w:lsdException w:name="Grid Table 4 Accent 2" w:uiPriority="49"/>
+    <w:lsdException w:name="Grid Table 5 Dark Accent 2" w:uiPriority="50"/>
+    <w:lsdException w:name="Grid Table 6 Colorful Accent 2" w:uiPriority="51"/>
+    <w:lsdException w:name="Grid Table 7 Colorful Accent 2" w:uiPriority="52"/>
+    <w:lsdException w:name="Grid Table 1 Light Accent 3" w:uiPriority="46"/>
+    <w:lsdException w:name="Grid Table 2 Accent 3" w:uiPriority="47"/>
+    <w:lsdException w:name="Grid Table 3 Accent 3" w:uiPriority="48"/>
+    <w:lsdException w:name="Grid Table 4 Accent 3" w:uiPriority="49"/>
+    <w:lsdException w:name="Grid Table 5 Dark Accent 3" w:uiPriority="50"/>
+    <w:lsdException w:name="Grid Table 6 Colorful Accent 3" w:uiPriority="51"/>
+    <w:lsdException w:name="Grid Table 7 Colorful Accent 3" w:uiPriority="52"/>
+    <w:lsdException w:name="Grid Table 1 Light Accent 4" w:uiPriority="46"/>
+    <w:lsdException w:name="Grid Table 2 Accent 4" w:uiPriority="47"/>
+    <w:lsdException w:name="Grid Table 3 Accent 4" w:uiPriority="48"/>
+    <w:lsdException w:name="Grid Table 4 Accent 4" w:uiPriority="49"/>
+    <w:lsdException w:name="Grid Table 5 Dark Accent 4" w:uiPriority="50"/>
+    <w:lsdException w:name="Grid Table 6 Colorful Accent 4" w:uiPriority="51"/>
+    <w:lsdException w:name="Grid Table 7 Colorful Accent 4" w:uiPriority="52"/>
+    <w:lsdException w:name="Grid Table 1 Light Accent 5" w:uiPriority="46"/>
+    <w:lsdException w:name="Grid Table 2 Accent 5" w:uiPriority="47"/>
+    <w:lsdException w:name="Grid Table 3 Accent 5" w:uiPriority="48"/>
+    <w:lsdException w:name="Grid Table 4 Accent 5" w:uiPriority="49"/>
+    <w:lsdException w:name="Grid Table 5 Dark Accent 5" w:uiPriority="50"/>
+    <w:lsdException w:name="Grid Table 6 Colorful Accent 5" w:uiPriority="51"/>
+    <w:lsdException w:name="Grid Table 7 Colorful Accent 5" w:uiPriority="52"/>
+    <w:lsdException w:name="Grid Table 1 Light Accent 6" w:uiPriority="46"/>
+    <w:lsdException w:name="Grid Table 2 Accent 6" w:uiPriority="47"/>
+    <w:lsdException w:name="Grid Table 3 Accent 6" w:uiPriority="48"/>
+    <w:lsdException w:name="Grid Table 4 Accent 6" w:uiPriority="49"/>
+    <w:lsdException w:name="Grid Table 5 Dark Accent 6" w:uiPriority="50"/>
+    <w:lsdException w:name="Grid Table 6 Colorful Accent 6" w:uiPriority="51"/>
+    <w:lsdException w:name="Grid Table 7 Colorful Accent 6" w:uiPriority="52"/>
+    <w:lsdException w:name="List Table 1 Light" w:uiPriority="46"/>
+    <w:lsdException w:name="List Table 2" w:uiPriority="47"/>
+    <w:lsdException w:name="List Table 3" w:uiPriority="48"/>
+    <w:lsdException w:name="List Table 4" w:uiPriority="49"/>
+    <w:lsdException w:name="List Table 5 Dark" w:uiPriority="50"/>
+    <w:lsdException w:name="List Table 6 Colorful" w:uiPriority="51"/>
+    <w:lsdException w:name="List Table 7 Colorful" w:uiPriority="52"/>
+    <w:lsdException w:name="List Table 1 Light Accent 1" w:uiPriority="46"/>
+    <w:lsdException w:name="List Table 2 Accent 1" w:uiPriority="47"/>
+    <w:lsdException w:name="List Table 3 Accent 1" w:uiPriority="48"/>
+    <w:lsdException w:name="List Table 4 Accent 1" w:uiPriority="49"/>
+    <w:lsdException w:name="List Table 5 Dark Accent 1" w:uiPriority="50"/>
+    <w:lsdException w:name="List Table 6 Colorful Accent 1" w:uiPriority="51"/>
+    <w:lsdException w:name="List Table 7 Colorful Accent 1" w:uiPriority="52"/>
+    <w:lsdException w:name="List Table 1 Light Accent 2" w:uiPriority="46"/>
+    <w:lsdException w:name="List Table 2 Accent 2" w:uiPriority="47"/>
+    <w:lsdException w:name="List Table 3 Accent 2" w:uiPriority="48"/>
+    <w:lsdException w:name="List Table 4 Accent 2" w:uiPriority="49"/>
+    <w:lsdException w:name="List Table 5 Dark Accent 2" w:uiPriority="50"/>
+    <w:lsdException w:name="List Table 6 Colorful Accent 2" w:uiPriority="51"/>
+    <w:lsdException w:name="List Table 7 Colorful Accent 2" w:uiPriority="52"/>
+    <w:lsdException w:name="List Table 1 Light Accent 3" w:uiPriority="46"/>
+    <w:lsdException w:name="List Table 2 Accent 3" w:uiPriority="47"/>
+    <w:lsdException w:name="List Table 3 Accent 3" w:uiPriority="48"/>
+    <w:lsdException w:name="List Table 4 Accent 3" w:uiPriority="49"/>
+    <w:lsdException w:name="List Table 5 Dark Accent 3" w:uiPriority="50"/>
+    <w:lsdException w:name="List Table 6 Colorful Accent 3" w:uiPriority="51"/>
+    <w:lsdException w:name="List Table 7 Colorful Accent 3" w:uiPriority="52"/>
+    <w:lsdException w:name="List Table 1 Light Accent 4" w:uiPriority="46"/>
+    <w:lsdException w:name="List Table 2 Accent 4" w:uiPriority="47"/>
+    <w:lsdException w:name="List Table 3 Accent 4" w:uiPriority="48"/>
+    <w:lsdException w:name="List Table 4 Accent 4" w:uiPriority="49"/>
+    <w:lsdException w:name="List Table 5 Dark Accent 4" w:uiPriority="50"/>
+    <w:lsdException w:name="List Table 6 Colorful Accent 4" w:uiPriority="51"/>
+    <w:lsdException w:name="List Table 7 Colorful Accent 4" w:uiPriority="52"/>
+    <w:lsdException w:name="List Table 1 Light Accent 5" w:uiPriority="46"/>
+    <w:lsdException w:name="List Table 2 Accent 5" w:uiPriority="47"/>
+    <w:lsdException w:name="List Table 3 Accent 5" w:uiPriority="48"/>
+    <w:lsdException w:name="List Table 4 Accent 5" w:uiPriority="49"/>
+    <w:lsdException w:name="List Table 5 Dark Accent 5" w:uiPriority="50"/>
+    <w:lsdException w:name="List Table 6 Colorful Accent 5" w:uiPriority="51"/>
+    <w:lsdException w:name="List Table 7 Colorful Accent 5" w:uiPriority="52"/>
+    <w:lsdException w:name="List Table 1 Light Accent 6" w:uiPriority="46"/>
+    <w:lsdException w:name="List Table 2 Accent 6" w:uiPriority="47"/>
+    <w:lsdException w:name="List Table 3 Accent 6" w:uiPriority="48"/>
+    <w:lsdException w:name="List Table 4 Accent 6" w:uiPriority="49"/>
+    <w:lsdException w:name="List Table 5 Dark Accent 6" w:uiPriority="50"/>
+    <w:lsdException w:name="List Table 6 Colorful Accent 6" w:uiPriority="51"/>
+    <w:lsdException w:name="List Table 7 Colorful Accent 6" w:uiPriority="52"/>
+    <w:lsdException w:name="Mention" w:semiHidden="1" w:unhideWhenUsed="1"/>
+    <w:lsdException w:name="Smart Hyperlink" w:semiHidden="1" w:unhideWhenUsed="1"/>
+    <w:lsdException w:name="Hashtag" w:semiHidden="1" w:unhideWhenUsed="1"/>
+    <w:lsdException w:name="Unresolved Mention" w:semiHidden="1" w:unhideWhenUsed="1"/>
+    <w:lsdException w:name="Smart Link" w:semiHidden="1" w:unhideWhenUsed="1"/>
+  </w:latentStyles>
   <w:style w:type="paragraph" w:default="1" w:styleId="Normal">
     <w:name w:val="Normal"/>
-    <w:next w:val="Normal"/>
-    <w:pPr/>
+    <w:qFormat/>
     <w:rPr>
       <w:sz w:val="24"/>
       <w:szCs w:val="24"/>
-      <w:lang w:val="en-US" w:eastAsia="en-US" w:bidi="ar-SA"/>
     </w:rPr>
   </w:style>
-  <w:style w:type="character" w:default="1" w:styleId="Default Paragraph Font">
+  <w:style w:type="character" w:default="1" w:styleId="DefaultParagraphFont">
     <w:name w:val="Default Paragraph Font"/>
-    <w:next w:val="Default Paragraph Font"/>
+    <w:uiPriority w:val="1"/>
+    <w:unhideWhenUsed/>
+  </w:style>
+  <w:style w:type="table" w:default="1" w:styleId="TableNormal">
+    <w:name w:val="Normal Table"/>
+    <w:uiPriority w:val="99"/>
+    <w:semiHidden/>
+    <w:unhideWhenUsed/>
+    <w:tblPr>
+      <w:tblInd w:w="0" w:type="dxa"/>
+      <w:tblCellMar>
+        <w:top w:w="0" w:type="dxa"/>
+        <w:left w:w="108" w:type="dxa"/>
+        <w:bottom w:w="0" w:type="dxa"/>
+        <w:right w:w="108" w:type="dxa"/>
+      </w:tblCellMar>
+    </w:tblPr>
+  </w:style>
+  <w:style w:type="numbering" w:default="1" w:styleId="NoList">
+    <w:name w:val="No List"/>
+    <w:uiPriority w:val="99"/>
+    <w:semiHidden/>
+    <w:unhideWhenUsed/>
   </w:style>
   <w:style w:type="character" w:styleId="Hyperlink">
     <w:name w:val="Hyperlink"/>
@@ -2340,192 +2202,59 @@
       <w:u w:val="single"/>
     </w:rPr>
   </w:style>
-  <w:style w:type="table" w:default="1" w:styleId="Table Normal">
-    <w:name w:val="Table Normal"/>
-    <w:next w:val="Table Normal"/>
-    <w:pPr/>
-    <w:tblPr>
-      <w:tblInd w:w="0" w:type="dxa"/>
-    </w:tblPr>
-    <w:trPr/>
-    <w:tcPr/>
-    <w:tblStylePr w:type="firstRow"/>
-    <w:tblStylePr w:type="lastRow"/>
-    <w:tblStylePr w:type="firstCol"/>
-    <w:tblStylePr w:type="lastCol"/>
-    <w:tblStylePr w:type="band1Vert"/>
-    <w:tblStylePr w:type="band2Vert"/>
-    <w:tblStylePr w:type="band1Horz"/>
-    <w:tblStylePr w:type="band2Horz"/>
-    <w:tblStylePr w:type="neCell"/>
-    <w:tblStylePr w:type="nwCell"/>
-    <w:tblStylePr w:type="seCell"/>
-    <w:tblStylePr w:type="swCell"/>
-  </w:style>
-  <w:style w:type="numbering" w:default="1" w:styleId="No List">
-    <w:name w:val="No List"/>
-    <w:next w:val="No List"/>
-    <w:pPr/>
-  </w:style>
-  <w:style w:type="paragraph" w:styleId="Header &amp; Footer">
+  <w:style w:type="paragraph" w:customStyle="1" w:styleId="HeaderFooter">
     <w:name w:val="Header &amp; Footer"/>
-    <w:next w:val="Header &amp; Footer"/>
     <w:pPr>
-      <w:keepNext w:val="0"/>
-      <w:keepLines w:val="0"/>
-      <w:pageBreakBefore w:val="0"/>
-      <w:widowControl w:val="1"/>
-      <w:shd w:val="clear" w:color="auto" w:fill="auto"/>
       <w:tabs>
         <w:tab w:val="right" w:pos="9020"/>
       </w:tabs>
-      <w:suppressAutoHyphens w:val="0"/>
-      <w:bidi w:val="0"/>
-      <w:spacing w:before="0" w:after="0" w:line="240" w:lineRule="auto"/>
-      <w:ind w:left="0" w:right="0" w:firstLine="0"/>
-      <w:jc w:val="left"/>
-      <w:outlineLvl w:val="9"/>
     </w:pPr>
     <w:rPr>
-      <w:rFonts w:ascii="Helvetica Neue" w:cs="Arial Unicode MS" w:hAnsi="Helvetica Neue" w:eastAsia="Arial Unicode MS"/>
-      <w:b w:val="0"/>
-      <w:bCs w:val="0"/>
-      <w:i w:val="0"/>
-      <w:iCs w:val="0"/>
-      <w:caps w:val="0"/>
-      <w:smallCaps w:val="0"/>
-      <w:strike w:val="0"/>
-      <w:dstrike w:val="0"/>
-      <w:outline w:val="0"/>
+      <w:rFonts w:ascii="Helvetica Neue" w:hAnsi="Helvetica Neue" w:cs="Arial Unicode MS"/>
       <w:color w:val="000000"/>
-      <w:spacing w:val="0"/>
-      <w:kern w:val="0"/>
-      <w:position w:val="0"/>
       <w:sz w:val="24"/>
       <w:szCs w:val="24"/>
-      <w:u w:val="none"/>
-      <w:shd w:val="nil" w:color="auto" w:fill="auto"/>
-      <w:vertAlign w:val="baseline"/>
-      <w14:textOutline>
+      <w14:textOutline w14:w="0" w14:cap="flat" w14:cmpd="sng" w14:algn="ctr">
         <w14:noFill/>
+        <w14:prstDash w14:val="solid"/>
+        <w14:bevel/>
       </w14:textOutline>
-      <w14:textFill>
-        <w14:solidFill>
-          <w14:srgbClr w14:val="000000"/>
-        </w14:solidFill>
-      </w14:textFill>
     </w:rPr>
   </w:style>
-  <w:style w:type="paragraph" w:styleId="Body">
+  <w:style w:type="paragraph" w:customStyle="1" w:styleId="Body">
     <w:name w:val="Body"/>
-    <w:next w:val="Body"/>
-    <w:pPr>
-      <w:keepNext w:val="0"/>
-      <w:keepLines w:val="0"/>
-      <w:pageBreakBefore w:val="0"/>
-      <w:widowControl w:val="1"/>
-      <w:shd w:val="clear" w:color="auto" w:fill="auto"/>
-      <w:suppressAutoHyphens w:val="0"/>
-      <w:bidi w:val="0"/>
-      <w:spacing w:before="0" w:after="0" w:line="240" w:lineRule="auto"/>
-      <w:ind w:left="0" w:right="0" w:firstLine="0"/>
-      <w:jc w:val="left"/>
-      <w:outlineLvl w:val="9"/>
-    </w:pPr>
     <w:rPr>
-      <w:rFonts w:ascii="Arial" w:cs="Arial Unicode MS" w:hAnsi="Arial" w:eastAsia="Arial Unicode MS"/>
-      <w:b w:val="0"/>
-      <w:bCs w:val="0"/>
-      <w:i w:val="0"/>
-      <w:iCs w:val="0"/>
-      <w:caps w:val="0"/>
-      <w:smallCaps w:val="0"/>
-      <w:strike w:val="0"/>
-      <w:dstrike w:val="0"/>
-      <w:outline w:val="0"/>
+      <w:rFonts w:ascii="Arial" w:hAnsi="Arial" w:cs="Arial Unicode MS"/>
       <w:color w:val="000000"/>
-      <w:spacing w:val="0"/>
-      <w:kern w:val="0"/>
-      <w:position w:val="0"/>
-      <w:sz w:val="20"/>
-      <w:szCs w:val="20"/>
-      <w:u w:val="none" w:color="000000"/>
-      <w:shd w:val="nil" w:color="auto" w:fill="auto"/>
-      <w:vertAlign w:val="baseline"/>
-      <w:lang w:val="en-US"/>
-      <w14:textOutline>
+      <w:u w:color="000000"/>
+      <w14:textOutline w14:w="0" w14:cap="flat" w14:cmpd="sng" w14:algn="ctr">
         <w14:noFill/>
+        <w14:prstDash w14:val="solid"/>
+        <w14:bevel/>
       </w14:textOutline>
-      <w14:textFill>
-        <w14:solidFill>
-          <w14:srgbClr w14:val="000000"/>
-        </w14:solidFill>
-      </w14:textFill>
     </w:rPr>
   </w:style>
-  <w:style w:type="character" w:styleId="None">
+  <w:style w:type="character" w:customStyle="1" w:styleId="None">
     <w:name w:val="None"/>
   </w:style>
-  <w:style w:type="character" w:styleId="Hyperlink.0">
+  <w:style w:type="character" w:customStyle="1" w:styleId="Hyperlink0">
     <w:name w:val="Hyperlink.0"/>
     <w:basedOn w:val="None"/>
-    <w:next w:val="Hyperlink.0"/>
     <w:rPr>
       <w:outline w:val="0"/>
-      <w:color w:val="0563c1"/>
-      <w:u w:val="single" w:color="0563c1"/>
-      <w14:textFill>
-        <w14:solidFill>
-          <w14:srgbClr w14:val="0563C1"/>
-        </w14:solidFill>
-      </w14:textFill>
+      <w:color w:val="0563C1"/>
+      <w:u w:val="single" w:color="0563C1"/>
     </w:rPr>
   </w:style>
-  <w:style w:type="paragraph" w:styleId="List Paragraph">
+  <w:style w:type="paragraph" w:styleId="ListParagraph">
     <w:name w:val="List Paragraph"/>
-    <w:next w:val="List Paragraph"/>
-    <w:pPr>
-      <w:keepNext w:val="0"/>
-      <w:keepLines w:val="0"/>
-      <w:pageBreakBefore w:val="0"/>
-      <w:widowControl w:val="1"/>
-      <w:shd w:val="clear" w:color="auto" w:fill="auto"/>
-      <w:suppressAutoHyphens w:val="0"/>
-      <w:bidi w:val="0"/>
-      <w:spacing w:before="0" w:after="0" w:line="240" w:lineRule="auto"/>
-      <w:ind w:left="0" w:right="0" w:firstLine="0"/>
-      <w:jc w:val="left"/>
-      <w:outlineLvl w:val="9"/>
-    </w:pPr>
     <w:rPr>
-      <w:rFonts w:ascii="Arial" w:cs="Arial Unicode MS" w:hAnsi="Arial" w:eastAsia="Arial Unicode MS"/>
-      <w:b w:val="0"/>
-      <w:bCs w:val="0"/>
-      <w:i w:val="0"/>
-      <w:iCs w:val="0"/>
-      <w:caps w:val="0"/>
-      <w:smallCaps w:val="0"/>
-      <w:strike w:val="0"/>
-      <w:dstrike w:val="0"/>
-      <w:outline w:val="0"/>
+      <w:rFonts w:ascii="Arial" w:hAnsi="Arial" w:cs="Arial Unicode MS"/>
       <w:color w:val="000000"/>
-      <w:spacing w:val="0"/>
-      <w:kern w:val="0"/>
-      <w:position w:val="0"/>
-      <w:sz w:val="20"/>
-      <w:szCs w:val="20"/>
-      <w:u w:val="none" w:color="000000"/>
-      <w:shd w:val="nil" w:color="auto" w:fill="auto"/>
-      <w:vertAlign w:val="baseline"/>
-      <w:lang w:val="en-US"/>
-      <w14:textFill>
-        <w14:solidFill>
-          <w14:srgbClr w14:val="000000"/>
-        </w14:solidFill>
-      </w14:textFill>
+      <w:u w:color="000000"/>
     </w:rPr>
   </w:style>
-  <w:style w:type="numbering" w:styleId="Imported Style 1">
+  <w:style w:type="numbering" w:customStyle="1" w:styleId="ImportedStyle1">
     <w:name w:val="Imported Style 1"/>
     <w:pPr>
       <w:numPr>
@@ -2533,7 +2262,7 @@
       </w:numPr>
     </w:pPr>
   </w:style>
-  <w:style w:type="numbering" w:styleId="Imported Style 2">
+  <w:style w:type="numbering" w:customStyle="1" w:styleId="ImportedStyle2">
     <w:name w:val="Imported Style 2"/>
     <w:pPr>
       <w:numPr>
@@ -2541,11 +2270,58 @@
       </w:numPr>
     </w:pPr>
   </w:style>
+  <w:style w:type="character" w:styleId="UnresolvedMention">
+    <w:name w:val="Unresolved Mention"/>
+    <w:basedOn w:val="DefaultParagraphFont"/>
+    <w:uiPriority w:val="99"/>
+    <w:semiHidden/>
+    <w:unhideWhenUsed/>
+    <w:rsid w:val="003E5B00"/>
+    <w:rPr>
+      <w:color w:val="605E5C"/>
+      <w:shd w:val="clear" w:color="auto" w:fill="E1DFDD"/>
+    </w:rPr>
+  </w:style>
+  <w:style w:type="character" w:styleId="FollowedHyperlink">
+    <w:name w:val="FollowedHyperlink"/>
+    <w:basedOn w:val="DefaultParagraphFont"/>
+    <w:uiPriority w:val="99"/>
+    <w:semiHidden/>
+    <w:unhideWhenUsed/>
+    <w:rsid w:val="00EE18CB"/>
+    <w:rPr>
+      <w:color w:val="FF00FF" w:themeColor="followedHyperlink"/>
+      <w:u w:val="single"/>
+    </w:rPr>
+  </w:style>
+  <w:style w:type="character" w:styleId="SubtleEmphasis">
+    <w:name w:val="Subtle Emphasis"/>
+    <w:basedOn w:val="DefaultParagraphFont"/>
+    <w:uiPriority w:val="19"/>
+    <w:qFormat/>
+    <w:rsid w:val="00391711"/>
+    <w:rPr>
+      <w:i/>
+      <w:iCs/>
+      <w:color w:val="404040" w:themeColor="text1" w:themeTint="BF"/>
+    </w:rPr>
+  </w:style>
+  <w:style w:type="character" w:styleId="Emphasis">
+    <w:name w:val="Emphasis"/>
+    <w:basedOn w:val="DefaultParagraphFont"/>
+    <w:uiPriority w:val="20"/>
+    <w:qFormat/>
+    <w:rsid w:val="00391711"/>
+    <w:rPr>
+      <w:i/>
+      <w:iCs/>
+    </w:rPr>
+  </w:style>
 </w:styles>
 </file>
 
 <file path=word/theme/theme1.xml><?xml version="1.0" encoding="utf-8"?>
-<a:theme xmlns:a="http://schemas.openxmlformats.org/drawingml/2006/main" xmlns:r="http://schemas.openxmlformats.org/officeDocument/2006/relationships" name="Office Theme">
+<a:theme xmlns:a="http://schemas.openxmlformats.org/drawingml/2006/main" name="Office Theme">
   <a:themeElements>
     <a:clrScheme name="Office Theme">
       <a:dk1>
@@ -2747,7 +2523,7 @@
         <a:effectLst/>
         <a:sp3d/>
       </a:spPr>
-      <a:bodyPr rot="0" spcFirstLastPara="1" vertOverflow="overflow" horzOverflow="overflow" vert="horz" wrap="square" lIns="45719" tIns="45719" rIns="45719" bIns="45719" numCol="1" spcCol="38100" rtlCol="0" anchor="ctr" upright="0">
+      <a:bodyPr rot="0" spcFirstLastPara="1" vertOverflow="overflow" horzOverflow="overflow" vert="horz" wrap="square" lIns="45719" tIns="45719" rIns="45719" bIns="45719" numCol="1" spcCol="38100" rtlCol="0" anchor="ctr">
         <a:spAutoFit/>
       </a:bodyPr>
       <a:lstStyle>
@@ -2766,7 +2542,7 @@
           <a:buFontTx/>
           <a:buNone/>
           <a:tabLst/>
-          <a:defRPr b="0" baseline="0" cap="none" i="0" spc="0" strike="noStrike" sz="1800" u="none" kumimoji="0" normalizeH="0">
+          <a:defRPr kumimoji="0" sz="1800" b="0" i="0" u="none" strike="noStrike" cap="none" spc="0" normalizeH="0" baseline="0">
             <a:ln>
               <a:noFill/>
             </a:ln>
@@ -2796,7 +2572,7 @@
           <a:buFontTx/>
           <a:buNone/>
           <a:tabLst/>
-          <a:defRPr b="0" baseline="0" cap="none" i="0" spc="0" strike="noStrike" sz="1800" u="none" kumimoji="0" normalizeH="0">
+          <a:defRPr kumimoji="0" sz="1800" b="0" i="0" u="none" strike="noStrike" cap="none" spc="0" normalizeH="0" baseline="0">
             <a:ln>
               <a:noFill/>
             </a:ln>
@@ -2822,7 +2598,7 @@
           <a:buFontTx/>
           <a:buNone/>
           <a:tabLst/>
-          <a:defRPr b="0" baseline="0" cap="none" i="0" spc="0" strike="noStrike" sz="1800" u="none" kumimoji="0" normalizeH="0">
+          <a:defRPr kumimoji="0" sz="1800" b="0" i="0" u="none" strike="noStrike" cap="none" spc="0" normalizeH="0" baseline="0">
             <a:ln>
               <a:noFill/>
             </a:ln>
@@ -2848,7 +2624,7 @@
           <a:buFontTx/>
           <a:buNone/>
           <a:tabLst/>
-          <a:defRPr b="0" baseline="0" cap="none" i="0" spc="0" strike="noStrike" sz="1800" u="none" kumimoji="0" normalizeH="0">
+          <a:defRPr kumimoji="0" sz="1800" b="0" i="0" u="none" strike="noStrike" cap="none" spc="0" normalizeH="0" baseline="0">
             <a:ln>
               <a:noFill/>
             </a:ln>
@@ -2874,7 +2650,7 @@
           <a:buFontTx/>
           <a:buNone/>
           <a:tabLst/>
-          <a:defRPr b="0" baseline="0" cap="none" i="0" spc="0" strike="noStrike" sz="1800" u="none" kumimoji="0" normalizeH="0">
+          <a:defRPr kumimoji="0" sz="1800" b="0" i="0" u="none" strike="noStrike" cap="none" spc="0" normalizeH="0" baseline="0">
             <a:ln>
               <a:noFill/>
             </a:ln>
@@ -2900,7 +2676,7 @@
           <a:buFontTx/>
           <a:buNone/>
           <a:tabLst/>
-          <a:defRPr b="0" baseline="0" cap="none" i="0" spc="0" strike="noStrike" sz="1800" u="none" kumimoji="0" normalizeH="0">
+          <a:defRPr kumimoji="0" sz="1800" b="0" i="0" u="none" strike="noStrike" cap="none" spc="0" normalizeH="0" baseline="0">
             <a:ln>
               <a:noFill/>
             </a:ln>
@@ -2926,7 +2702,7 @@
           <a:buFontTx/>
           <a:buNone/>
           <a:tabLst/>
-          <a:defRPr b="0" baseline="0" cap="none" i="0" spc="0" strike="noStrike" sz="1800" u="none" kumimoji="0" normalizeH="0">
+          <a:defRPr kumimoji="0" sz="1800" b="0" i="0" u="none" strike="noStrike" cap="none" spc="0" normalizeH="0" baseline="0">
             <a:ln>
               <a:noFill/>
             </a:ln>
@@ -2952,7 +2728,7 @@
           <a:buFontTx/>
           <a:buNone/>
           <a:tabLst/>
-          <a:defRPr b="0" baseline="0" cap="none" i="0" spc="0" strike="noStrike" sz="1800" u="none" kumimoji="0" normalizeH="0">
+          <a:defRPr kumimoji="0" sz="1800" b="0" i="0" u="none" strike="noStrike" cap="none" spc="0" normalizeH="0" baseline="0">
             <a:ln>
               <a:noFill/>
             </a:ln>
@@ -2978,7 +2754,7 @@
           <a:buFontTx/>
           <a:buNone/>
           <a:tabLst/>
-          <a:defRPr b="0" baseline="0" cap="none" i="0" spc="0" strike="noStrike" sz="1800" u="none" kumimoji="0" normalizeH="0">
+          <a:defRPr kumimoji="0" sz="1800" b="0" i="0" u="none" strike="noStrike" cap="none" spc="0" normalizeH="0" baseline="0">
             <a:ln>
               <a:noFill/>
             </a:ln>
@@ -3004,7 +2780,7 @@
           <a:buFontTx/>
           <a:buNone/>
           <a:tabLst/>
-          <a:defRPr b="0" baseline="0" cap="none" i="0" spc="0" strike="noStrike" sz="1800" u="none" kumimoji="0" normalizeH="0">
+          <a:defRPr kumimoji="0" sz="1800" b="0" i="0" u="none" strike="noStrike" cap="none" spc="0" normalizeH="0" baseline="0">
             <a:ln>
               <a:noFill/>
             </a:ln>
@@ -3017,9 +2793,15 @@
         </a:lvl9pPr>
       </a:lstStyle>
       <a:style>
-        <a:lnRef idx="0"/>
-        <a:fillRef idx="0"/>
-        <a:effectRef idx="0"/>
+        <a:lnRef idx="0">
+          <a:scrgbClr r="0" g="0" b="0"/>
+        </a:lnRef>
+        <a:fillRef idx="0">
+          <a:scrgbClr r="0" g="0" b="0"/>
+        </a:fillRef>
+        <a:effectRef idx="0">
+          <a:scrgbClr r="0" g="0" b="0"/>
+        </a:effectRef>
         <a:fontRef idx="none"/>
       </a:style>
     </a:spDef>
@@ -3036,7 +2818,7 @@
         <a:effectLst/>
         <a:sp3d/>
       </a:spPr>
-      <a:bodyPr rot="0" spcFirstLastPara="1" vertOverflow="overflow" horzOverflow="overflow" vert="horz" wrap="square" lIns="91439" tIns="45719" rIns="91439" bIns="45719" numCol="1" spcCol="38100" rtlCol="0" anchor="t" upright="0">
+      <a:bodyPr rot="0" spcFirstLastPara="1" vertOverflow="overflow" horzOverflow="overflow" vert="horz" wrap="square" lIns="91439" tIns="45719" rIns="91439" bIns="45719" numCol="1" spcCol="38100" rtlCol="0" anchor="t">
         <a:noAutofit/>
       </a:bodyPr>
       <a:lstStyle>
@@ -3055,7 +2837,7 @@
           <a:buFontTx/>
           <a:buNone/>
           <a:tabLst/>
-          <a:defRPr b="0" baseline="0" cap="none" i="0" spc="0" strike="noStrike" sz="1800" u="none" kumimoji="0" normalizeH="0">
+          <a:defRPr kumimoji="0" sz="1800" b="0" i="0" u="none" strike="noStrike" cap="none" spc="0" normalizeH="0" baseline="0">
             <a:ln>
               <a:noFill/>
             </a:ln>
@@ -3081,7 +2863,7 @@
           <a:buFontTx/>
           <a:buNone/>
           <a:tabLst/>
-          <a:defRPr b="0" baseline="0" cap="none" i="0" spc="0" strike="noStrike" sz="1800" u="none" kumimoji="0" normalizeH="0">
+          <a:defRPr kumimoji="0" sz="1800" b="0" i="0" u="none" strike="noStrike" cap="none" spc="0" normalizeH="0" baseline="0">
             <a:ln>
               <a:noFill/>
             </a:ln>
@@ -3107,7 +2889,7 @@
           <a:buFontTx/>
           <a:buNone/>
           <a:tabLst/>
-          <a:defRPr b="0" baseline="0" cap="none" i="0" spc="0" strike="noStrike" sz="1800" u="none" kumimoji="0" normalizeH="0">
+          <a:defRPr kumimoji="0" sz="1800" b="0" i="0" u="none" strike="noStrike" cap="none" spc="0" normalizeH="0" baseline="0">
             <a:ln>
               <a:noFill/>
             </a:ln>
@@ -3133,7 +2915,7 @@
           <a:buFontTx/>
           <a:buNone/>
           <a:tabLst/>
-          <a:defRPr b="0" baseline="0" cap="none" i="0" spc="0" strike="noStrike" sz="1800" u="none" kumimoji="0" normalizeH="0">
+          <a:defRPr kumimoji="0" sz="1800" b="0" i="0" u="none" strike="noStrike" cap="none" spc="0" normalizeH="0" baseline="0">
             <a:ln>
               <a:noFill/>
             </a:ln>
@@ -3159,7 +2941,7 @@
           <a:buFontTx/>
           <a:buNone/>
           <a:tabLst/>
-          <a:defRPr b="0" baseline="0" cap="none" i="0" spc="0" strike="noStrike" sz="1800" u="none" kumimoji="0" normalizeH="0">
+          <a:defRPr kumimoji="0" sz="1800" b="0" i="0" u="none" strike="noStrike" cap="none" spc="0" normalizeH="0" baseline="0">
             <a:ln>
               <a:noFill/>
             </a:ln>
@@ -3185,7 +2967,7 @@
           <a:buFontTx/>
           <a:buNone/>
           <a:tabLst/>
-          <a:defRPr b="0" baseline="0" cap="none" i="0" spc="0" strike="noStrike" sz="1800" u="none" kumimoji="0" normalizeH="0">
+          <a:defRPr kumimoji="0" sz="1800" b="0" i="0" u="none" strike="noStrike" cap="none" spc="0" normalizeH="0" baseline="0">
             <a:ln>
               <a:noFill/>
             </a:ln>
@@ -3211,7 +2993,7 @@
           <a:buFontTx/>
           <a:buNone/>
           <a:tabLst/>
-          <a:defRPr b="0" baseline="0" cap="none" i="0" spc="0" strike="noStrike" sz="1800" u="none" kumimoji="0" normalizeH="0">
+          <a:defRPr kumimoji="0" sz="1800" b="0" i="0" u="none" strike="noStrike" cap="none" spc="0" normalizeH="0" baseline="0">
             <a:ln>
               <a:noFill/>
             </a:ln>
@@ -3237,7 +3019,7 @@
           <a:buFontTx/>
           <a:buNone/>
           <a:tabLst/>
-          <a:defRPr b="0" baseline="0" cap="none" i="0" spc="0" strike="noStrike" sz="1800" u="none" kumimoji="0" normalizeH="0">
+          <a:defRPr kumimoji="0" sz="1800" b="0" i="0" u="none" strike="noStrike" cap="none" spc="0" normalizeH="0" baseline="0">
             <a:ln>
               <a:noFill/>
             </a:ln>
@@ -3263,7 +3045,7 @@
           <a:buFontTx/>
           <a:buNone/>
           <a:tabLst/>
-          <a:defRPr b="0" baseline="0" cap="none" i="0" spc="0" strike="noStrike" sz="1800" u="none" kumimoji="0" normalizeH="0">
+          <a:defRPr kumimoji="0" sz="1800" b="0" i="0" u="none" strike="noStrike" cap="none" spc="0" normalizeH="0" baseline="0">
             <a:ln>
               <a:noFill/>
             </a:ln>
@@ -3289,7 +3071,7 @@
           <a:buFontTx/>
           <a:buNone/>
           <a:tabLst/>
-          <a:defRPr b="0" baseline="0" cap="none" i="0" spc="0" strike="noStrike" sz="1800" u="none" kumimoji="0" normalizeH="0">
+          <a:defRPr kumimoji="0" sz="1800" b="0" i="0" u="none" strike="noStrike" cap="none" spc="0" normalizeH="0" baseline="0">
             <a:ln>
               <a:noFill/>
             </a:ln>
@@ -3302,9 +3084,15 @@
         </a:lvl9pPr>
       </a:lstStyle>
       <a:style>
-        <a:lnRef idx="0"/>
-        <a:fillRef idx="0"/>
-        <a:effectRef idx="0"/>
+        <a:lnRef idx="0">
+          <a:scrgbClr r="0" g="0" b="0"/>
+        </a:lnRef>
+        <a:fillRef idx="0">
+          <a:scrgbClr r="0" g="0" b="0"/>
+        </a:fillRef>
+        <a:effectRef idx="0">
+          <a:scrgbClr r="0" g="0" b="0"/>
+        </a:effectRef>
         <a:fontRef idx="none"/>
       </a:style>
     </a:lnDef>
@@ -3318,7 +3106,7 @@
         <a:effectLst/>
         <a:sp3d/>
       </a:spPr>
-      <a:bodyPr rot="0" spcFirstLastPara="1" vertOverflow="overflow" horzOverflow="overflow" vert="horz" wrap="square" lIns="45719" tIns="45719" rIns="45719" bIns="45719" numCol="1" spcCol="38100" rtlCol="0" anchor="t" upright="0">
+      <a:bodyPr rot="0" spcFirstLastPara="1" vertOverflow="overflow" horzOverflow="overflow" vert="horz" wrap="square" lIns="45719" tIns="45719" rIns="45719" bIns="45719" numCol="1" spcCol="38100" rtlCol="0" anchor="t">
         <a:spAutoFit/>
       </a:bodyPr>
       <a:lstStyle>
@@ -3337,7 +3125,7 @@
           <a:buFontTx/>
           <a:buNone/>
           <a:tabLst/>
-          <a:defRPr b="0" baseline="0" cap="none" i="0" spc="0" strike="noStrike" sz="1800" u="none" kumimoji="0" normalizeH="0">
+          <a:defRPr kumimoji="0" sz="1800" b="0" i="0" u="none" strike="noStrike" cap="none" spc="0" normalizeH="0" baseline="0">
             <a:ln>
               <a:noFill/>
             </a:ln>
@@ -3367,7 +3155,7 @@
           <a:buFontTx/>
           <a:buNone/>
           <a:tabLst/>
-          <a:defRPr b="0" baseline="0" cap="none" i="0" spc="0" strike="noStrike" sz="1800" u="none" kumimoji="0" normalizeH="0">
+          <a:defRPr kumimoji="0" sz="1800" b="0" i="0" u="none" strike="noStrike" cap="none" spc="0" normalizeH="0" baseline="0">
             <a:ln>
               <a:noFill/>
             </a:ln>
@@ -3393,7 +3181,7 @@
           <a:buFontTx/>
           <a:buNone/>
           <a:tabLst/>
-          <a:defRPr b="0" baseline="0" cap="none" i="0" spc="0" strike="noStrike" sz="1800" u="none" kumimoji="0" normalizeH="0">
+          <a:defRPr kumimoji="0" sz="1800" b="0" i="0" u="none" strike="noStrike" cap="none" spc="0" normalizeH="0" baseline="0">
             <a:ln>
               <a:noFill/>
             </a:ln>
@@ -3419,7 +3207,7 @@
           <a:buFontTx/>
           <a:buNone/>
           <a:tabLst/>
-          <a:defRPr b="0" baseline="0" cap="none" i="0" spc="0" strike="noStrike" sz="1800" u="none" kumimoji="0" normalizeH="0">
+          <a:defRPr kumimoji="0" sz="1800" b="0" i="0" u="none" strike="noStrike" cap="none" spc="0" normalizeH="0" baseline="0">
             <a:ln>
               <a:noFill/>
             </a:ln>
@@ -3445,7 +3233,7 @@
           <a:buFontTx/>
           <a:buNone/>
           <a:tabLst/>
-          <a:defRPr b="0" baseline="0" cap="none" i="0" spc="0" strike="noStrike" sz="1800" u="none" kumimoji="0" normalizeH="0">
+          <a:defRPr kumimoji="0" sz="1800" b="0" i="0" u="none" strike="noStrike" cap="none" spc="0" normalizeH="0" baseline="0">
             <a:ln>
               <a:noFill/>
             </a:ln>
@@ -3471,7 +3259,7 @@
           <a:buFontTx/>
           <a:buNone/>
           <a:tabLst/>
-          <a:defRPr b="0" baseline="0" cap="none" i="0" spc="0" strike="noStrike" sz="1800" u="none" kumimoji="0" normalizeH="0">
+          <a:defRPr kumimoji="0" sz="1800" b="0" i="0" u="none" strike="noStrike" cap="none" spc="0" normalizeH="0" baseline="0">
             <a:ln>
               <a:noFill/>
             </a:ln>
@@ -3497,7 +3285,7 @@
           <a:buFontTx/>
           <a:buNone/>
           <a:tabLst/>
-          <a:defRPr b="0" baseline="0" cap="none" i="0" spc="0" strike="noStrike" sz="1800" u="none" kumimoji="0" normalizeH="0">
+          <a:defRPr kumimoji="0" sz="1800" b="0" i="0" u="none" strike="noStrike" cap="none" spc="0" normalizeH="0" baseline="0">
             <a:ln>
               <a:noFill/>
             </a:ln>
@@ -3523,7 +3311,7 @@
           <a:buFontTx/>
           <a:buNone/>
           <a:tabLst/>
-          <a:defRPr b="0" baseline="0" cap="none" i="0" spc="0" strike="noStrike" sz="1800" u="none" kumimoji="0" normalizeH="0">
+          <a:defRPr kumimoji="0" sz="1800" b="0" i="0" u="none" strike="noStrike" cap="none" spc="0" normalizeH="0" baseline="0">
             <a:ln>
               <a:noFill/>
             </a:ln>
@@ -3549,7 +3337,7 @@
           <a:buFontTx/>
           <a:buNone/>
           <a:tabLst/>
-          <a:defRPr b="0" baseline="0" cap="none" i="0" spc="0" strike="noStrike" sz="1800" u="none" kumimoji="0" normalizeH="0">
+          <a:defRPr kumimoji="0" sz="1800" b="0" i="0" u="none" strike="noStrike" cap="none" spc="0" normalizeH="0" baseline="0">
             <a:ln>
               <a:noFill/>
             </a:ln>
@@ -3575,7 +3363,7 @@
           <a:buFontTx/>
           <a:buNone/>
           <a:tabLst/>
-          <a:defRPr b="0" baseline="0" cap="none" i="0" spc="0" strike="noStrike" sz="1800" u="none" kumimoji="0" normalizeH="0">
+          <a:defRPr kumimoji="0" sz="1800" b="0" i="0" u="none" strike="noStrike" cap="none" spc="0" normalizeH="0" baseline="0">
             <a:ln>
               <a:noFill/>
             </a:ln>
@@ -3588,12 +3376,19 @@
         </a:lvl9pPr>
       </a:lstStyle>
       <a:style>
-        <a:lnRef idx="0"/>
-        <a:fillRef idx="0"/>
-        <a:effectRef idx="0"/>
+        <a:lnRef idx="0">
+          <a:scrgbClr r="0" g="0" b="0"/>
+        </a:lnRef>
+        <a:fillRef idx="0">
+          <a:scrgbClr r="0" g="0" b="0"/>
+        </a:fillRef>
+        <a:effectRef idx="0">
+          <a:scrgbClr r="0" g="0" b="0"/>
+        </a:effectRef>
         <a:fontRef idx="none"/>
       </a:style>
     </a:txDef>
   </a:objectDefaults>
+  <a:extraClrSchemeLst/>
 </a:theme>
 </file>
</xml_diff>

<commit_message>
refactor: Bootstrap to Tailwind, single-page scroll
- Replace Bootstrap, React Router, Framer Motion with Tailwind CSS v4
- Collapse multi-page routing into single-page scroll with anchor nav
- Add Hero section with photo, stat strip, and CTAs
- Redesign all sections with consistent Tailwind styling
- Add mobile hamburger menu with IntersectionObserver active nav tracking
- Replace Bootstrap accordion/cards with React-controlled components
- Add FadeInSection with Tailwind opacity/translate transitions
- Replace Bootstrap Icons with inline SVGs in Footer
- Add constants.ts for CAREER_START, FEDERAL_START, COMPANY_COUNT
- Add .prettierrc and .vscode/settings.json for format-on-save
- Update meta tags, favicon, and OG image
- Update README to reflect current stack
</commit_message>
<xml_diff>
--- a/public/resume.docx
+++ b/public/resume.docx
@@ -1,6 +1,6 @@
 
 <file path=word/document.xml><?xml version="1.0" encoding="utf-8"?>
-<w:document xmlns:r="http://schemas.openxmlformats.org/officeDocument/2006/relationships" xmlns:wp="http://schemas.openxmlformats.org/drawingml/2006/wordprocessingDrawing" xmlns:w="http://schemas.openxmlformats.org/wordprocessingml/2006/main" xmlns:w10="urn:schemas-microsoft-com:office:word" xmlns:w14="http://schemas.microsoft.com/office/word/2010/wordml" xmlns:wps="http://schemas.microsoft.com/office/word/2010/wordprocessingShape" xmlns:wpg="http://schemas.microsoft.com/office/word/2010/wordprocessingGroup" xmlns:mc="http://schemas.openxmlformats.org/markup-compatibility/2006" xmlns:v="urn:schemas-microsoft-com:vml" xmlns:o="urn:schemas-microsoft-com:office:office" xmlns:m="http://schemas.openxmlformats.org/officeDocument/2006/math" mc:Ignorable="w14">
+<w:document xmlns:wpc="http://schemas.microsoft.com/office/word/2010/wordprocessingCanvas" xmlns:cx="http://schemas.microsoft.com/office/drawing/2014/chartex" xmlns:cx1="http://schemas.microsoft.com/office/drawing/2015/9/8/chartex" xmlns:cx2="http://schemas.microsoft.com/office/drawing/2015/10/21/chartex" xmlns:cx3="http://schemas.microsoft.com/office/drawing/2016/5/9/chartex" xmlns:cx4="http://schemas.microsoft.com/office/drawing/2016/5/10/chartex" xmlns:cx5="http://schemas.microsoft.com/office/drawing/2016/5/11/chartex" xmlns:cx6="http://schemas.microsoft.com/office/drawing/2016/5/12/chartex" xmlns:cx7="http://schemas.microsoft.com/office/drawing/2016/5/13/chartex" xmlns:cx8="http://schemas.microsoft.com/office/drawing/2016/5/14/chartex" xmlns:mc="http://schemas.openxmlformats.org/markup-compatibility/2006" xmlns:aink="http://schemas.microsoft.com/office/drawing/2016/ink" xmlns:am3d="http://schemas.microsoft.com/office/drawing/2017/model3d" xmlns:o="urn:schemas-microsoft-com:office:office" xmlns:oel="http://schemas.microsoft.com/office/2019/extlst" xmlns:r="http://schemas.openxmlformats.org/officeDocument/2006/relationships" xmlns:m="http://schemas.openxmlformats.org/officeDocument/2006/math" xmlns:v="urn:schemas-microsoft-com:vml" xmlns:wp14="http://schemas.microsoft.com/office/word/2010/wordprocessingDrawing" xmlns:wp="http://schemas.openxmlformats.org/drawingml/2006/wordprocessingDrawing" xmlns:w10="urn:schemas-microsoft-com:office:word" xmlns:w="http://schemas.openxmlformats.org/wordprocessingml/2006/main" xmlns:w14="http://schemas.microsoft.com/office/word/2010/wordml" xmlns:w15="http://schemas.microsoft.com/office/word/2012/wordml" xmlns:w16cex="http://schemas.microsoft.com/office/word/2018/wordml/cex" xmlns:w16cid="http://schemas.microsoft.com/office/word/2016/wordml/cid" xmlns:w16="http://schemas.microsoft.com/office/word/2018/wordml" xmlns:w16du="http://schemas.microsoft.com/office/word/2023/wordml/word16du" xmlns:w16sdtdh="http://schemas.microsoft.com/office/word/2020/wordml/sdtdatahash" xmlns:w16sdtfl="http://schemas.microsoft.com/office/word/2024/wordml/sdtformatlock" xmlns:w16se="http://schemas.microsoft.com/office/word/2015/wordml/symex" xmlns:wpg="http://schemas.microsoft.com/office/word/2010/wordprocessingGroup" xmlns:wpi="http://schemas.microsoft.com/office/word/2010/wordprocessingInk" xmlns:wne="http://schemas.microsoft.com/office/word/2006/wordml" xmlns:wps="http://schemas.microsoft.com/office/word/2010/wordprocessingShape" mc:Ignorable="w14 w15 w16se w16cid w16 w16cex w16sdtdh w16sdtfl w16du wp14">
   <w:body>
     <w:p>
       <w:pPr>
@@ -10,20 +10,12 @@
       </w:pPr>
       <w:r>
         <w:rPr>
-          <w:b w:val="1"/>
-          <w:bCs w:val="1"/>
-          <w:outline w:val="0"/>
-          <w:color w:val="1f4e79"/>
+          <w:b/>
+          <w:bCs/>
+          <w:color w:val="1F4E79"/>
           <w:sz w:val="44"/>
           <w:szCs w:val="44"/>
-          <w:u w:color="1f4e79"/>
-          <w:rtl w:val="0"/>
-          <w:lang w:val="en-US"/>
-          <w14:textFill>
-            <w14:solidFill>
-              <w14:srgbClr w14:val="1F4E79"/>
-            </w14:solidFill>
-          </w14:textFill>
+          <w:u w:color="1F4E79"/>
         </w:rPr>
         <w:t>Matthew Smith</w:t>
       </w:r>
@@ -36,16 +28,8 @@
       </w:pPr>
       <w:r>
         <w:rPr>
-          <w:outline w:val="0"/>
-          <w:color w:val="555555"/>
-          <w:u w:color="555555"/>
-          <w:rtl w:val="0"/>
-          <w:lang w:val="en-US"/>
-          <w14:textFill>
-            <w14:solidFill>
-              <w14:srgbClr w14:val="555555"/>
-            </w14:solidFill>
-          </w14:textFill>
+          <w:color w:val="555555"/>
+          <w:u w:color="555555"/>
         </w:rPr>
         <w:t>Senior Software Engineer | Federal &amp; Private Sector Experience</w:t>
       </w:r>
@@ -58,57 +42,39 @@
       </w:pPr>
       <w:r>
         <w:rPr>
-          <w:outline w:val="0"/>
-          <w:color w:val="555555"/>
-          <w:u w:color="555555"/>
-          <w:rtl w:val="0"/>
-          <w14:textFill>
-            <w14:solidFill>
-              <w14:srgbClr w14:val="555555"/>
-            </w14:solidFill>
-          </w14:textFill>
+          <w:color w:val="555555"/>
+          <w:u w:color="555555"/>
         </w:rPr>
         <w:t xml:space="preserve">msmith1392@gmail.com | </w:t>
       </w:r>
-      <w:r>
-        <w:rPr>
-          <w:rStyle w:val="Hyperlink.0"/>
-        </w:rPr>
-        <w:fldChar w:fldCharType="begin" w:fldLock="0"/>
-      </w:r>
-      <w:r>
-        <w:rPr>
-          <w:rStyle w:val="Hyperlink.0"/>
-        </w:rPr>
-        <w:instrText xml:space="preserve"> HYPERLINK "https://www.linkedin.com/in/matthew-smith-22310b111/"</w:instrText>
-      </w:r>
-      <w:r>
-        <w:rPr>
-          <w:rStyle w:val="Hyperlink.0"/>
-        </w:rPr>
-        <w:fldChar w:fldCharType="separate" w:fldLock="0"/>
-      </w:r>
-      <w:r>
-        <w:rPr>
-          <w:rStyle w:val="Hyperlink.0"/>
-          <w:rtl w:val="0"/>
-          <w:lang w:val="en-US"/>
-        </w:rPr>
-        <w:t>linkedin.com/in/matthew-smith-22310b111</w:t>
-      </w:r>
-      <w:r>
-        <w:rPr/>
-        <w:fldChar w:fldCharType="end" w:fldLock="0"/>
-      </w:r>
+      <w:hyperlink r:id="rId7" w:history="1">
+        <w:r>
+          <w:rPr>
+            <w:rStyle w:val="Hyperlink0"/>
+          </w:rPr>
+          <w:t>linkedin.com/in/matthew-smith-22310b111</w:t>
+        </w:r>
+      </w:hyperlink>
+      <w:r>
+        <w:t xml:space="preserve"> </w:t>
+      </w:r>
+      <w:r>
+        <w:t xml:space="preserve">| </w:t>
+      </w:r>
+      <w:hyperlink r:id="rId8" w:history="1">
+        <w:r>
+          <w:rPr>
+            <w:rStyle w:val="Hyperlink0"/>
+          </w:rPr>
+          <w:t>msmith1392.github.io</w:t>
+        </w:r>
+      </w:hyperlink>
     </w:p>
     <w:p>
       <w:pPr>
         <w:pStyle w:val="Body"/>
         <w:pBdr>
-          <w:top w:val="nil"/>
-          <w:left w:val="nil"/>
-          <w:bottom w:val="single" w:color="1f4e79" w:sz="10" w:space="0" w:shadow="0" w:frame="0"/>
-          <w:right w:val="nil"/>
+          <w:bottom w:val="single" w:sz="10" w:space="0" w:color="1F4E79"/>
         </w:pBdr>
       </w:pPr>
     </w:p>
@@ -116,30 +82,19 @@
       <w:pPr>
         <w:pStyle w:val="Body"/>
         <w:pBdr>
-          <w:top w:val="nil"/>
-          <w:left w:val="nil"/>
-          <w:bottom w:val="single" w:color="1f4e79" w:sz="8" w:space="0" w:shadow="0" w:frame="0"/>
-          <w:right w:val="nil"/>
+          <w:bottom w:val="single" w:sz="8" w:space="0" w:color="1F4E79"/>
         </w:pBdr>
         <w:spacing w:before="200" w:after="60"/>
       </w:pPr>
       <w:r>
         <w:rPr>
           <w:rStyle w:val="None"/>
-          <w:b w:val="1"/>
-          <w:bCs w:val="1"/>
-          <w:outline w:val="0"/>
-          <w:color w:val="1f4e79"/>
+          <w:b/>
+          <w:bCs/>
+          <w:color w:val="1F4E79"/>
           <w:sz w:val="22"/>
           <w:szCs w:val="22"/>
-          <w:u w:color="1f4e79"/>
-          <w:rtl w:val="0"/>
-          <w:lang w:val="en-US"/>
-          <w14:textFill>
-            <w14:solidFill>
-              <w14:srgbClr w14:val="1F4E79"/>
-            </w14:solidFill>
-          </w14:textFill>
+          <w:u w:color="1F4E79"/>
         </w:rPr>
         <w:t>SUMMARY</w:t>
       </w:r>
@@ -152,48 +107,30 @@
       <w:r>
         <w:rPr>
           <w:rStyle w:val="None"/>
-          <w:outline w:val="0"/>
-          <w:color w:val="1a1a1a"/>
-          <w:u w:color="1a1a1a"/>
-          <w:rtl w:val="0"/>
-          <w:lang w:val="en-US"/>
-          <w14:textFill>
-            <w14:solidFill>
-              <w14:srgbClr w14:val="1A1A1A"/>
-            </w14:solidFill>
-          </w14:textFill>
-        </w:rPr>
-        <w:t>Senior Software Engineer specializing in building, modernizing and delivering secure, scalable enterprise systems across federal and private sectors. Experienced in Java (Spring Boot), C# (.NET), and Python (Django) and modern TypeScript frameworks, with deep involvement in mission-critical FEMA platforms including PrepToolkit and URT. Proven track record designing RESTful APIs, leading legacy modernization initiatives, delivering containerized services in production environments, and mentoring engineering teams. Strong focus on maintainability, performance, and clean architecture. Actively exploring LLM integration and Retrieval-Augmented Generation (RAG) architectures.</w:t>
+          <w:color w:val="1A1A1A"/>
+          <w:u w:color="1A1A1A"/>
+        </w:rPr>
+        <w:t>Senior Software Engineer specializing in building, modernizing and delivering secure, scalable enterprise systems across federal and private sectors. Experienced in Java (Spring Boot), C# (.NET), and Python (Django) and modern TypeScript frameworks, with deep involvement in mission-critical FEMA platforms including PrepToolkit and URT. Proven track record designing RESTful APIs, leading legacy modernization initiatives, delivering containerized services in production environments, and mentoring engineering teams. Strong focus on maintainability, performance, and clean architecture.</w:t>
       </w:r>
     </w:p>
     <w:p>
       <w:pPr>
         <w:pStyle w:val="Body"/>
         <w:pBdr>
-          <w:top w:val="nil"/>
-          <w:left w:val="nil"/>
-          <w:bottom w:val="single" w:color="1f4e79" w:sz="8" w:space="0" w:shadow="0" w:frame="0"/>
-          <w:right w:val="nil"/>
+          <w:bottom w:val="single" w:sz="8" w:space="0" w:color="1F4E79"/>
         </w:pBdr>
         <w:spacing w:before="200" w:after="60"/>
       </w:pPr>
       <w:r>
         <w:rPr>
           <w:rStyle w:val="None"/>
-          <w:b w:val="1"/>
-          <w:bCs w:val="1"/>
-          <w:outline w:val="0"/>
-          <w:color w:val="1f4e79"/>
+          <w:b/>
+          <w:bCs/>
+          <w:color w:val="1F4E79"/>
           <w:sz w:val="22"/>
           <w:szCs w:val="22"/>
-          <w:u w:color="1f4e79"/>
-          <w:rtl w:val="0"/>
+          <w:u w:color="1F4E79"/>
           <w:lang w:val="de-DE"/>
-          <w14:textFill>
-            <w14:solidFill>
-              <w14:srgbClr w14:val="1F4E79"/>
-            </w14:solidFill>
-          </w14:textFill>
         </w:rPr>
         <w:t>CORE EXPERTISE</w:t>
       </w:r>
@@ -206,34 +143,19 @@
       <w:r>
         <w:rPr>
           <w:rStyle w:val="None"/>
-          <w:b w:val="1"/>
-          <w:bCs w:val="1"/>
-          <w:outline w:val="0"/>
-          <w:color w:val="1a1a1a"/>
-          <w:u w:color="1a1a1a"/>
-          <w:rtl w:val="0"/>
+          <w:b/>
+          <w:bCs/>
+          <w:color w:val="1A1A1A"/>
+          <w:u w:color="1A1A1A"/>
           <w:lang w:val="de-DE"/>
-          <w14:textFill>
-            <w14:solidFill>
-              <w14:srgbClr w14:val="1A1A1A"/>
-            </w14:solidFill>
-          </w14:textFill>
         </w:rPr>
         <w:t xml:space="preserve">Backend: </w:t>
       </w:r>
       <w:r>
         <w:rPr>
           <w:rStyle w:val="None"/>
-          <w:outline w:val="0"/>
-          <w:color w:val="555555"/>
-          <w:u w:color="555555"/>
-          <w:rtl w:val="0"/>
-          <w:lang w:val="en-US"/>
-          <w14:textFill>
-            <w14:solidFill>
-              <w14:srgbClr w14:val="555555"/>
-            </w14:solidFill>
-          </w14:textFill>
+          <w:color w:val="555555"/>
+          <w:u w:color="555555"/>
         </w:rPr>
         <w:t>Java (Spring Boot), C# (.NET), Python (Django), REST APIs, MySQL, PostgreSQL, SQL Server, Flyway</w:t>
       </w:r>
@@ -246,34 +168,19 @@
       <w:r>
         <w:rPr>
           <w:rStyle w:val="None"/>
-          <w:b w:val="1"/>
-          <w:bCs w:val="1"/>
-          <w:outline w:val="0"/>
-          <w:color w:val="1a1a1a"/>
-          <w:u w:color="1a1a1a"/>
-          <w:rtl w:val="0"/>
+          <w:b/>
+          <w:bCs/>
+          <w:color w:val="1A1A1A"/>
+          <w:u w:color="1A1A1A"/>
           <w:lang w:val="fr-FR"/>
-          <w14:textFill>
-            <w14:solidFill>
-              <w14:srgbClr w14:val="1A1A1A"/>
-            </w14:solidFill>
-          </w14:textFill>
         </w:rPr>
         <w:t xml:space="preserve">Frontend: </w:t>
       </w:r>
       <w:r>
         <w:rPr>
           <w:rStyle w:val="None"/>
-          <w:outline w:val="0"/>
-          <w:color w:val="555555"/>
-          <w:u w:color="555555"/>
-          <w:rtl w:val="0"/>
-          <w:lang w:val="en-US"/>
-          <w14:textFill>
-            <w14:solidFill>
-              <w14:srgbClr w14:val="555555"/>
-            </w14:solidFill>
-          </w14:textFill>
+          <w:color w:val="555555"/>
+          <w:u w:color="555555"/>
         </w:rPr>
         <w:t>TypeScript, Svelte, React, Angular, GWT, Bootstrap, Tailwind</w:t>
       </w:r>
@@ -286,34 +193,19 @@
       <w:r>
         <w:rPr>
           <w:rStyle w:val="None"/>
-          <w:b w:val="1"/>
-          <w:bCs w:val="1"/>
-          <w:outline w:val="0"/>
-          <w:color w:val="1a1a1a"/>
-          <w:u w:color="1a1a1a"/>
-          <w:rtl w:val="0"/>
+          <w:b/>
+          <w:bCs/>
+          <w:color w:val="1A1A1A"/>
+          <w:u w:color="1A1A1A"/>
           <w:lang w:val="de-DE"/>
-          <w14:textFill>
-            <w14:solidFill>
-              <w14:srgbClr w14:val="1A1A1A"/>
-            </w14:solidFill>
-          </w14:textFill>
         </w:rPr>
         <w:t xml:space="preserve">System Design: </w:t>
       </w:r>
       <w:r>
         <w:rPr>
           <w:rStyle w:val="None"/>
-          <w:outline w:val="0"/>
-          <w:color w:val="555555"/>
-          <w:u w:color="555555"/>
-          <w:rtl w:val="0"/>
-          <w:lang w:val="en-US"/>
-          <w14:textFill>
-            <w14:solidFill>
-              <w14:srgbClr w14:val="555555"/>
-            </w14:solidFill>
-          </w14:textFill>
+          <w:color w:val="555555"/>
+          <w:u w:color="555555"/>
         </w:rPr>
         <w:t>Microservices, API-Driven Design, Event-Driven Patterns, Distributed Session Management, Layered Systems</w:t>
       </w:r>
@@ -326,34 +218,20 @@
       <w:r>
         <w:rPr>
           <w:rStyle w:val="None"/>
-          <w:b w:val="1"/>
-          <w:bCs w:val="1"/>
-          <w:outline w:val="0"/>
-          <w:color w:val="1a1a1a"/>
-          <w:u w:color="1a1a1a"/>
-          <w:rtl w:val="0"/>
+          <w:b/>
+          <w:bCs/>
+          <w:color w:val="1A1A1A"/>
+          <w:u w:color="1A1A1A"/>
           <w:lang w:val="nl-NL"/>
-          <w14:textFill>
-            <w14:solidFill>
-              <w14:srgbClr w14:val="1A1A1A"/>
-            </w14:solidFill>
-          </w14:textFill>
         </w:rPr>
         <w:t xml:space="preserve">DevOps &amp; Tools: </w:t>
       </w:r>
       <w:r>
         <w:rPr>
           <w:rStyle w:val="None"/>
-          <w:outline w:val="0"/>
-          <w:color w:val="555555"/>
-          <w:u w:color="555555"/>
-          <w:rtl w:val="0"/>
+          <w:color w:val="555555"/>
+          <w:u w:color="555555"/>
           <w:lang w:val="de-DE"/>
-          <w14:textFill>
-            <w14:solidFill>
-              <w14:srgbClr w14:val="555555"/>
-            </w14:solidFill>
-          </w14:textFill>
         </w:rPr>
         <w:t>Docker/Podman, Gradle, Maven, AWS (Lambda, S3), Git, Apache Tomcat</w:t>
       </w:r>
@@ -366,64 +244,48 @@
       <w:r>
         <w:rPr>
           <w:rStyle w:val="None"/>
-          <w:b w:val="1"/>
-          <w:bCs w:val="1"/>
-          <w:outline w:val="0"/>
-          <w:color w:val="1a1a1a"/>
-          <w:u w:color="1a1a1a"/>
-          <w:rtl w:val="0"/>
-          <w14:textFill>
-            <w14:solidFill>
-              <w14:srgbClr w14:val="1A1A1A"/>
-            </w14:solidFill>
-          </w14:textFill>
+          <w:b/>
+          <w:bCs/>
+          <w:color w:val="1A1A1A"/>
+          <w:u w:color="1A1A1A"/>
         </w:rPr>
         <w:t xml:space="preserve">Platforms: </w:t>
       </w:r>
       <w:r>
         <w:rPr>
           <w:rStyle w:val="None"/>
-          <w:outline w:val="0"/>
-          <w:color w:val="555555"/>
-          <w:u w:color="555555"/>
-          <w:rtl w:val="0"/>
-          <w14:textFill>
-            <w14:solidFill>
-              <w14:srgbClr w14:val="555555"/>
-            </w14:solidFill>
-          </w14:textFill>
+          <w:color w:val="555555"/>
+          <w:u w:color="555555"/>
         </w:rPr>
         <w:t>Liferay 7, Node.js, npm</w:t>
+      </w:r>
+      <w:r>
+        <w:rPr>
+          <w:rStyle w:val="None"/>
+          <w:color w:val="555555"/>
+          <w:u w:color="555555"/>
+        </w:rPr>
+        <w:t>, Cloudflare Workers &amp; Pages</w:t>
       </w:r>
     </w:p>
     <w:p>
       <w:pPr>
         <w:pStyle w:val="Body"/>
         <w:pBdr>
-          <w:top w:val="nil"/>
-          <w:left w:val="nil"/>
-          <w:bottom w:val="single" w:color="1f4e79" w:sz="8" w:space="0" w:shadow="0" w:frame="0"/>
-          <w:right w:val="nil"/>
+          <w:bottom w:val="single" w:sz="8" w:space="0" w:color="1F4E79"/>
         </w:pBdr>
         <w:spacing w:before="200" w:after="60"/>
       </w:pPr>
       <w:r>
         <w:rPr>
           <w:rStyle w:val="None"/>
-          <w:b w:val="1"/>
-          <w:bCs w:val="1"/>
-          <w:outline w:val="0"/>
-          <w:color w:val="1f4e79"/>
+          <w:b/>
+          <w:bCs/>
+          <w:color w:val="1F4E79"/>
           <w:sz w:val="22"/>
           <w:szCs w:val="22"/>
-          <w:u w:color="1f4e79"/>
-          <w:rtl w:val="0"/>
+          <w:u w:color="1F4E79"/>
           <w:lang w:val="de-DE"/>
-          <w14:textFill>
-            <w14:solidFill>
-              <w14:srgbClr w14:val="1F4E79"/>
-            </w14:solidFill>
-          </w14:textFill>
         </w:rPr>
         <w:t>PROFESSIONAL EXPERIENCE</w:t>
       </w:r>
@@ -439,273 +301,173 @@
       <w:r>
         <w:rPr>
           <w:rStyle w:val="None"/>
-          <w:b w:val="1"/>
-          <w:bCs w:val="1"/>
-          <w:outline w:val="0"/>
-          <w:color w:val="1a1a1a"/>
+          <w:b/>
+          <w:bCs/>
+          <w:color w:val="1A1A1A"/>
           <w:sz w:val="22"/>
           <w:szCs w:val="22"/>
-          <w:u w:color="1a1a1a"/>
-          <w:rtl w:val="0"/>
-          <w:lang w:val="en-US"/>
-          <w14:textFill>
-            <w14:solidFill>
-              <w14:srgbClr w14:val="1A1A1A"/>
-            </w14:solidFill>
-          </w14:textFill>
+          <w:u w:color="1A1A1A"/>
         </w:rPr>
         <w:t>Senior Software Engineer</w:t>
       </w:r>
       <w:r>
         <w:rPr>
           <w:rStyle w:val="None"/>
-          <w:outline w:val="0"/>
-          <w:color w:val="555555"/>
-          <w:u w:color="555555"/>
-          <w:rtl w:val="0"/>
-          <w14:textFill>
-            <w14:solidFill>
-              <w14:srgbClr w14:val="555555"/>
-            </w14:solidFill>
-          </w14:textFill>
+          <w:color w:val="555555"/>
+          <w:u w:color="555555"/>
         </w:rPr>
         <w:t xml:space="preserve"> | </w:t>
       </w:r>
       <w:r>
         <w:rPr>
           <w:rStyle w:val="None"/>
-          <w:b w:val="1"/>
-          <w:bCs w:val="1"/>
-          <w:outline w:val="0"/>
-          <w:color w:val="1f4e79"/>
-          <w:u w:color="1f4e79"/>
-          <w:rtl w:val="0"/>
-          <w:lang w:val="en-US"/>
-          <w14:textFill>
-            <w14:solidFill>
-              <w14:srgbClr w14:val="1F4E79"/>
-            </w14:solidFill>
-          </w14:textFill>
+          <w:b/>
+          <w:bCs/>
+          <w:color w:val="1F4E79"/>
+          <w:u w:color="1F4E79"/>
         </w:rPr>
         <w:t>4 Arrows Consulting, Inc.</w:t>
       </w:r>
       <w:r>
         <w:rPr>
           <w:rStyle w:val="None"/>
-          <w:outline w:val="0"/>
-          <w:color w:val="555555"/>
-          <w:u w:color="555555"/>
-          <w:rtl w:val="0"/>
-          <w14:textFill>
-            <w14:solidFill>
-              <w14:srgbClr w14:val="555555"/>
-            </w14:solidFill>
-          </w14:textFill>
-        </w:rPr>
-        <w:t xml:space="preserve"> • </w:t>
-      </w:r>
-      <w:r>
-        <w:rPr>
-          <w:rStyle w:val="None"/>
-          <w:outline w:val="0"/>
-          <w:color w:val="555555"/>
-          <w:u w:color="555555"/>
-          <w:rtl w:val="0"/>
-          <w:lang w:val="en-US"/>
-          <w14:textFill>
-            <w14:solidFill>
-              <w14:srgbClr w14:val="555555"/>
-            </w14:solidFill>
-          </w14:textFill>
-        </w:rPr>
-        <w:t xml:space="preserve">Somerset, KY (Remote) </w:t>
-      </w:r>
-      <w:r>
-        <w:rPr>
-          <w:rStyle w:val="None"/>
-          <w:outline w:val="0"/>
-          <w:color w:val="555555"/>
-          <w:u w:color="555555"/>
-          <w:rtl w:val="0"/>
-          <w14:textFill>
-            <w14:solidFill>
-              <w14:srgbClr w14:val="555555"/>
-            </w14:solidFill>
-          </w14:textFill>
-        </w:rPr>
-        <w:t xml:space="preserve">• </w:t>
-      </w:r>
-      <w:r>
-        <w:rPr>
-          <w:rStyle w:val="None"/>
-          <w:outline w:val="0"/>
-          <w:color w:val="555555"/>
-          <w:u w:color="555555"/>
-          <w:rtl w:val="0"/>
-          <w14:textFill>
-            <w14:solidFill>
-              <w14:srgbClr w14:val="555555"/>
-            </w14:solidFill>
-          </w14:textFill>
-        </w:rPr>
-        <w:t xml:space="preserve">2019 </w:t>
-      </w:r>
-      <w:r>
-        <w:rPr>
-          <w:rStyle w:val="None"/>
-          <w:outline w:val="0"/>
-          <w:color w:val="555555"/>
-          <w:u w:color="555555"/>
-          <w:rtl w:val="0"/>
-          <w14:textFill>
-            <w14:solidFill>
-              <w14:srgbClr w14:val="555555"/>
-            </w14:solidFill>
-          </w14:textFill>
-        </w:rPr>
-        <w:t xml:space="preserve">– </w:t>
-      </w:r>
-      <w:r>
-        <w:rPr>
-          <w:rStyle w:val="None"/>
-          <w:outline w:val="0"/>
-          <w:color w:val="555555"/>
-          <w:u w:color="555555"/>
-          <w:rtl w:val="0"/>
+          <w:color w:val="555555"/>
+          <w:u w:color="555555"/>
+        </w:rPr>
+        <w:t xml:space="preserve"> • Somerset, KY (Remote) • 2019 – </w:t>
+      </w:r>
+      <w:r>
+        <w:rPr>
+          <w:rStyle w:val="None"/>
+          <w:color w:val="555555"/>
+          <w:u w:color="555555"/>
           <w:lang w:val="it-IT"/>
-          <w14:textFill>
-            <w14:solidFill>
-              <w14:srgbClr w14:val="555555"/>
-            </w14:solidFill>
-          </w14:textFill>
         </w:rPr>
         <w:t>Present</w:t>
       </w:r>
     </w:p>
     <w:p>
       <w:pPr>
-        <w:pStyle w:val="List Paragraph"/>
+        <w:pStyle w:val="ListParagraph"/>
         <w:numPr>
           <w:ilvl w:val="0"/>
           <w:numId w:val="2"/>
         </w:numPr>
         <w:spacing w:before="40" w:after="40"/>
-        <w:rPr>
-          <w:lang w:val="en-US"/>
-        </w:rPr>
-      </w:pPr>
-      <w:r>
-        <w:rPr>
-          <w:rStyle w:val="None"/>
-          <w:rtl w:val="0"/>
-          <w:lang w:val="en-US"/>
-        </w:rPr>
-        <w:t>Cross-Stack Feature Ownership: Delivered complex features across backend (Spring Boot/.NET), database, and frontend layers within FEMA preparedness platforms (PrepToolkit, URT), ensuring cohesive integration between APIs, data models, and user interfaces.</w:t>
-      </w:r>
-    </w:p>
-    <w:p>
-      <w:pPr>
-        <w:pStyle w:val="List Paragraph"/>
+      </w:pPr>
+      <w:r>
+        <w:rPr>
+          <w:rFonts w:cs="Arial"/>
+        </w:rPr>
+        <w:t>Serverless Platform Architecture: Designed and delivered the Svelte frontend for a TypeScript monorepo of AWS serverless applications (Lambda, API Gateway, CloudFront, ElastiCache, RDS) serving as a unified access portal for FEMA platforms including PrepToolkit, RTLT, RIS, and OneResponder.</w:t>
+      </w:r>
+    </w:p>
+    <w:p>
+      <w:pPr>
+        <w:pStyle w:val="ListParagraph"/>
         <w:numPr>
           <w:ilvl w:val="0"/>
           <w:numId w:val="2"/>
         </w:numPr>
         <w:spacing w:before="40" w:after="40"/>
-        <w:rPr>
-          <w:lang w:val="en-US"/>
-        </w:rPr>
-      </w:pPr>
-      <w:r>
-        <w:rPr>
-          <w:rStyle w:val="None"/>
-          <w:rtl w:val="0"/>
-          <w:lang w:val="en-US"/>
-        </w:rPr>
-        <w:t>System Architecture &amp; Presence: Spearheaded the implementation of a real-time presence tracking system for the Unified Reporting Tool (URT); independently designed and optimized distributed session logic (polling/timeouts) to ensure data integrity for concurrent federal users.</w:t>
-      </w:r>
-    </w:p>
-    <w:p>
-      <w:pPr>
-        <w:pStyle w:val="List Paragraph"/>
+      </w:pPr>
+      <w:r>
+        <w:rPr>
+          <w:rFonts w:cs="Arial"/>
+        </w:rPr>
+        <w:t>System Architecture &amp; Presence: Spearheaded the implementation of a real-time presence tracking system for the Unified Reporting Tool (URT). Independently designed and optimized distributed session logic (polling/timeouts) to ensure data integrity for concurrent federal users.</w:t>
+      </w:r>
+    </w:p>
+    <w:p>
+      <w:pPr>
+        <w:pStyle w:val="ListParagraph"/>
         <w:numPr>
           <w:ilvl w:val="0"/>
           <w:numId w:val="2"/>
         </w:numPr>
         <w:spacing w:before="40" w:after="40"/>
-        <w:rPr>
-          <w:lang w:val="en-US"/>
-        </w:rPr>
-      </w:pPr>
-      <w:r>
-        <w:rPr>
-          <w:rStyle w:val="None"/>
-          <w:rtl w:val="0"/>
-          <w:lang w:val="en-US"/>
-        </w:rPr>
-        <w:t>Modernization &amp; Performance: Drove the strategic migration of legacy Liferay portlets to Svelte micro-frontends, resulting in measurable frontend performance improvements and a more maintainable codebase.</w:t>
-      </w:r>
-    </w:p>
-    <w:p>
-      <w:pPr>
-        <w:pStyle w:val="List Paragraph"/>
+      </w:pPr>
+      <w:r>
+        <w:rPr>
+          <w:rFonts w:cs="Arial"/>
+        </w:rPr>
+        <w:t>Cross-Stack Feature Ownership: Delivered complex features across backend (Spring Boot/.NET), database, and frontend layers within FEMA preparedness platforms (PrepToolkit, URT), ensuring cohesive integration between APIs, data models, and user interfaces.</w:t>
+      </w:r>
+    </w:p>
+    <w:p>
+      <w:pPr>
+        <w:pStyle w:val="ListParagraph"/>
         <w:numPr>
           <w:ilvl w:val="0"/>
           <w:numId w:val="2"/>
         </w:numPr>
         <w:spacing w:before="40" w:after="40"/>
-        <w:rPr>
-          <w:lang w:val="en-US"/>
-        </w:rPr>
-      </w:pPr>
-      <w:r>
-        <w:rPr>
-          <w:rStyle w:val="None"/>
-          <w:rtl w:val="0"/>
-          <w:lang w:val="en-US"/>
-        </w:rPr>
-        <w:t>Development Workflow Improvements: Introduced containerized development environments (Docker/Podman) and implemented Flyway-based database migrations to improve consistency across environments and reduce configuration drift. Regularly conduct peer code reviews to reinforce clean architecture and maintainable code practices.</w:t>
-      </w:r>
-    </w:p>
-    <w:p>
-      <w:pPr>
-        <w:pStyle w:val="List Paragraph"/>
+      </w:pPr>
+      <w:r>
+        <w:rPr>
+          <w:rFonts w:cs="Arial"/>
+        </w:rPr>
+        <w:t>Operational Excellence: Automated enterprise reporting workflows (Docmosis/Apache POI), reducing processing time from hours to minutes and directly improving operational efficiency for national exercise programs.</w:t>
+      </w:r>
+    </w:p>
+    <w:p>
+      <w:pPr>
+        <w:pStyle w:val="ListParagraph"/>
         <w:numPr>
           <w:ilvl w:val="0"/>
           <w:numId w:val="2"/>
         </w:numPr>
         <w:spacing w:before="40" w:after="40"/>
-        <w:rPr>
-          <w:lang w:val="en-US"/>
-        </w:rPr>
-      </w:pPr>
-      <w:r>
-        <w:rPr>
-          <w:rStyle w:val="None"/>
-          <w:rtl w:val="0"/>
-          <w:lang w:val="en-US"/>
-        </w:rPr>
-        <w:t>Stakeholder Alignment: Translate complex FEMA business requirements (THIRA/SPR, CPG, NIMS, UAWG) into scalable technical solutions, coordinating closely with project leads to ensure all features align with federal compliance and security standards.</w:t>
-      </w:r>
-    </w:p>
-    <w:p>
-      <w:pPr>
-        <w:pStyle w:val="List Paragraph"/>
+      </w:pPr>
+      <w:r>
+        <w:rPr>
+          <w:rFonts w:cs="Arial"/>
+        </w:rPr>
+        <w:t xml:space="preserve">Stakeholder Alignment: Translates complex FEMA business requirements (THIRA/SPR, CPG, NIMS, UAWG) into scalable technical solutions, </w:t>
+      </w:r>
+      <w:r>
+        <w:rPr>
+          <w:rFonts w:cs="Arial"/>
+        </w:rPr>
+        <w:t>coordinating closely with project leads to ensure all deliverables meet federal compliance and security standards.</w:t>
+      </w:r>
+    </w:p>
+    <w:p>
+      <w:pPr>
+        <w:pStyle w:val="ListParagraph"/>
         <w:numPr>
           <w:ilvl w:val="0"/>
           <w:numId w:val="2"/>
         </w:numPr>
         <w:spacing w:before="40" w:after="40"/>
-        <w:rPr>
-          <w:lang w:val="en-US"/>
-        </w:rPr>
-      </w:pPr>
-      <w:r>
-        <w:rPr>
-          <w:rStyle w:val="None"/>
-          <w:rtl w:val="0"/>
-          <w:lang w:val="en-US"/>
-        </w:rPr>
-        <w:t>Operational Excellence: Automated enterprise reporting workflows (Docmosis/Apache POI), reducing processing time from hours to minutes and directly improving operational efficiency for national exercise programs.</w:t>
+      </w:pPr>
+      <w:r>
+        <w:rPr>
+          <w:rFonts w:cs="Arial"/>
+        </w:rPr>
+        <w:t xml:space="preserve">Development Workflow: </w:t>
+      </w:r>
+      <w:r>
+        <w:rPr>
+          <w:rFonts w:cs="Arial"/>
+        </w:rPr>
+        <w:t>Consistently utilizes containerized environments (Docker/Podman) and Flyway-based database migrations across projects, including scripted Podman-based Liferay container management to streamline local development and module redeployment. Conducts peer code reviews to reinforce clean architecture and maintainable code practices.</w:t>
+      </w:r>
+    </w:p>
+    <w:p>
+      <w:pPr>
+        <w:pStyle w:val="ListParagraph"/>
+        <w:numPr>
+          <w:ilvl w:val="0"/>
+          <w:numId w:val="2"/>
+        </w:numPr>
+        <w:spacing w:before="40" w:after="40"/>
+      </w:pPr>
+      <w:r>
+        <w:rPr>
+          <w:rFonts w:cs="Arial"/>
+        </w:rPr>
+        <w:t>Developer Experience: Standardized editor configurations across VS Code, IntelliJ, and Visual Studio to enforce consistent code formatting team-wide, eliminating noise commits caused by style-only changes.</w:t>
       </w:r>
     </w:p>
     <w:p>
@@ -716,40 +478,57 @@
       <w:r>
         <w:rPr>
           <w:rStyle w:val="None"/>
-          <w:b w:val="1"/>
-          <w:bCs w:val="1"/>
-          <w:outline w:val="0"/>
+          <w:b/>
+          <w:bCs/>
           <w:color w:val="555555"/>
           <w:sz w:val="19"/>
           <w:szCs w:val="19"/>
           <w:u w:color="555555"/>
-          <w:rtl w:val="0"/>
           <w:lang w:val="nl-NL"/>
-          <w14:textFill>
-            <w14:solidFill>
-              <w14:srgbClr w14:val="555555"/>
-            </w14:solidFill>
-          </w14:textFill>
         </w:rPr>
         <w:t xml:space="preserve">Tech Stack: </w:t>
       </w:r>
       <w:r>
         <w:rPr>
           <w:rStyle w:val="None"/>
-          <w:outline w:val="0"/>
           <w:color w:val="555555"/>
           <w:sz w:val="19"/>
           <w:szCs w:val="19"/>
           <w:u w:color="555555"/>
-          <w:rtl w:val="0"/>
           <w:lang w:val="nl-NL"/>
-          <w14:textFill>
-            <w14:solidFill>
-              <w14:srgbClr w14:val="555555"/>
-            </w14:solidFill>
-          </w14:textFill>
         </w:rPr>
         <w:t>Java, Spring Boot, Gradle, GWT, MySQL, Liferay 7, Apache HTTP Server, JavaScript/TypeScript, Svelte, React, Node.js, npm, AWS Lambda, Git, Podman, Docmosis, OpenCSV, Apache POI</w:t>
+      </w:r>
+    </w:p>
+    <w:p>
+      <w:pPr>
+        <w:rPr>
+          <w:rStyle w:val="None"/>
+          <w:rFonts w:ascii="Arial" w:hAnsi="Arial" w:cs="Arial Unicode MS"/>
+          <w:b/>
+          <w:bCs/>
+          <w:color w:val="1A1A1A"/>
+          <w:sz w:val="22"/>
+          <w:szCs w:val="22"/>
+          <w:u w:color="1A1A1A"/>
+          <w14:textOutline w14:w="0" w14:cap="flat" w14:cmpd="sng" w14:algn="ctr">
+            <w14:noFill/>
+            <w14:prstDash w14:val="solid"/>
+            <w14:bevel/>
+          </w14:textOutline>
+        </w:rPr>
+      </w:pPr>
+      <w:r>
+        <w:rPr>
+          <w:rStyle w:val="None"/>
+          <w:b/>
+          <w:bCs/>
+          <w:color w:val="1A1A1A"/>
+          <w:sz w:val="22"/>
+          <w:szCs w:val="22"/>
+          <w:u w:color="1A1A1A"/>
+        </w:rPr>
+        <w:br w:type="page"/>
       </w:r>
     </w:p>
     <w:p>
@@ -763,207 +542,104 @@
       <w:r>
         <w:rPr>
           <w:rStyle w:val="None"/>
-          <w:b w:val="1"/>
-          <w:bCs w:val="1"/>
-          <w:outline w:val="0"/>
-          <w:color w:val="1a1a1a"/>
+          <w:b/>
+          <w:bCs/>
+          <w:color w:val="1A1A1A"/>
           <w:sz w:val="22"/>
           <w:szCs w:val="22"/>
-          <w:u w:color="1a1a1a"/>
-          <w:rtl w:val="0"/>
-          <w:lang w:val="en-US"/>
-          <w14:textFill>
-            <w14:solidFill>
-              <w14:srgbClr w14:val="1A1A1A"/>
-            </w14:solidFill>
-          </w14:textFill>
-        </w:rPr>
+          <w:u w:color="1A1A1A"/>
+        </w:rPr>
+        <w:lastRenderedPageBreak/>
         <w:t>Applications Developer</w:t>
       </w:r>
       <w:r>
         <w:rPr>
           <w:rStyle w:val="None"/>
-          <w:outline w:val="0"/>
-          <w:color w:val="555555"/>
-          <w:u w:color="555555"/>
-          <w:rtl w:val="0"/>
-          <w14:textFill>
-            <w14:solidFill>
-              <w14:srgbClr w14:val="555555"/>
-            </w14:solidFill>
-          </w14:textFill>
+          <w:color w:val="555555"/>
+          <w:u w:color="555555"/>
         </w:rPr>
         <w:t xml:space="preserve"> | </w:t>
       </w:r>
       <w:r>
         <w:rPr>
           <w:rStyle w:val="None"/>
-          <w:b w:val="1"/>
-          <w:bCs w:val="1"/>
-          <w:outline w:val="0"/>
-          <w:color w:val="1f4e79"/>
-          <w:u w:color="1f4e79"/>
-          <w:rtl w:val="0"/>
-          <w:lang w:val="en-US"/>
-          <w14:textFill>
-            <w14:solidFill>
-              <w14:srgbClr w14:val="1F4E79"/>
-            </w14:solidFill>
-          </w14:textFill>
+          <w:b/>
+          <w:bCs/>
+          <w:color w:val="1F4E79"/>
+          <w:u w:color="1F4E79"/>
         </w:rPr>
         <w:t>United Parcel Service (UPS)</w:t>
       </w:r>
       <w:r>
         <w:rPr>
           <w:rStyle w:val="None"/>
-          <w:outline w:val="0"/>
-          <w:color w:val="555555"/>
-          <w:u w:color="555555"/>
-          <w:rtl w:val="0"/>
-          <w14:textFill>
-            <w14:solidFill>
-              <w14:srgbClr w14:val="555555"/>
-            </w14:solidFill>
-          </w14:textFill>
+          <w:color w:val="555555"/>
+          <w:u w:color="555555"/>
         </w:rPr>
         <w:t xml:space="preserve"> • </w:t>
       </w:r>
       <w:r>
         <w:rPr>
           <w:rStyle w:val="None"/>
-          <w:outline w:val="0"/>
-          <w:color w:val="555555"/>
-          <w:u w:color="555555"/>
-          <w:rtl w:val="0"/>
+          <w:color w:val="555555"/>
+          <w:u w:color="555555"/>
           <w:lang w:val="da-DK"/>
-          <w14:textFill>
-            <w14:solidFill>
-              <w14:srgbClr w14:val="555555"/>
-            </w14:solidFill>
-          </w14:textFill>
         </w:rPr>
         <w:t xml:space="preserve">Louisville, KY </w:t>
       </w:r>
       <w:r>
         <w:rPr>
           <w:rStyle w:val="None"/>
-          <w:outline w:val="0"/>
-          <w:color w:val="555555"/>
-          <w:u w:color="555555"/>
-          <w:rtl w:val="0"/>
-          <w14:textFill>
-            <w14:solidFill>
-              <w14:srgbClr w14:val="555555"/>
-            </w14:solidFill>
-          </w14:textFill>
-        </w:rPr>
-        <w:t xml:space="preserve">• </w:t>
-      </w:r>
-      <w:r>
-        <w:rPr>
-          <w:rStyle w:val="None"/>
-          <w:outline w:val="0"/>
-          <w:color w:val="555555"/>
-          <w:u w:color="555555"/>
-          <w:rtl w:val="0"/>
-          <w14:textFill>
-            <w14:solidFill>
-              <w14:srgbClr w14:val="555555"/>
-            </w14:solidFill>
-          </w14:textFill>
-        </w:rPr>
-        <w:t xml:space="preserve">2017 </w:t>
-      </w:r>
-      <w:r>
-        <w:rPr>
-          <w:rStyle w:val="None"/>
-          <w:outline w:val="0"/>
-          <w:color w:val="555555"/>
-          <w:u w:color="555555"/>
-          <w:rtl w:val="0"/>
-          <w14:textFill>
-            <w14:solidFill>
-              <w14:srgbClr w14:val="555555"/>
-            </w14:solidFill>
-          </w14:textFill>
-        </w:rPr>
-        <w:t xml:space="preserve">– </w:t>
-      </w:r>
-      <w:r>
-        <w:rPr>
-          <w:rStyle w:val="None"/>
-          <w:outline w:val="0"/>
-          <w:color w:val="555555"/>
-          <w:u w:color="555555"/>
-          <w:rtl w:val="0"/>
-          <w14:textFill>
-            <w14:solidFill>
-              <w14:srgbClr w14:val="555555"/>
-            </w14:solidFill>
-          </w14:textFill>
-        </w:rPr>
-        <w:t>2019</w:t>
-      </w:r>
-    </w:p>
-    <w:p>
-      <w:pPr>
-        <w:pStyle w:val="List Paragraph"/>
+          <w:color w:val="555555"/>
+          <w:u w:color="555555"/>
+        </w:rPr>
+        <w:t>• 2017 – 2019</w:t>
+      </w:r>
+    </w:p>
+    <w:p>
+      <w:pPr>
+        <w:pStyle w:val="ListParagraph"/>
         <w:numPr>
           <w:ilvl w:val="0"/>
           <w:numId w:val="4"/>
         </w:numPr>
         <w:spacing w:before="40" w:after="40"/>
-        <w:rPr>
-          <w:lang w:val="en-US"/>
-        </w:rPr>
-      </w:pPr>
-      <w:r>
-        <w:rPr>
-          <w:rStyle w:val="None"/>
-          <w:rtl w:val="0"/>
-          <w:lang w:val="en-US"/>
+      </w:pPr>
+      <w:r>
+        <w:rPr>
+          <w:rStyle w:val="None"/>
         </w:rPr>
         <w:t>Mission-Critical Reliability: Engineered backend logic and UI features for real-time transportation visibility systems, ensuring operational uptime in a 24/7 high-throughput production environment.</w:t>
       </w:r>
     </w:p>
     <w:p>
       <w:pPr>
-        <w:pStyle w:val="List Paragraph"/>
+        <w:pStyle w:val="ListParagraph"/>
         <w:numPr>
           <w:ilvl w:val="0"/>
           <w:numId w:val="4"/>
         </w:numPr>
         <w:spacing w:before="40" w:after="40"/>
-        <w:rPr>
-          <w:lang w:val="en-US"/>
-        </w:rPr>
-      </w:pPr>
-      <w:r>
-        <w:rPr>
-          <w:rStyle w:val="None"/>
-          <w:rtl w:val="0"/>
-          <w:lang w:val="en-US"/>
+      </w:pPr>
+      <w:r>
+        <w:rPr>
+          <w:rStyle w:val="None"/>
         </w:rPr>
         <w:t>Business Logic Abstraction: Architected complex decision-making flows by translating high-level business requirements into discrete rules for the Drools inference engine (BRMS), reducing manual intervention and decoupling policy from code.</w:t>
       </w:r>
     </w:p>
     <w:p>
       <w:pPr>
-        <w:pStyle w:val="List Paragraph"/>
+        <w:pStyle w:val="ListParagraph"/>
         <w:numPr>
           <w:ilvl w:val="0"/>
           <w:numId w:val="4"/>
         </w:numPr>
         <w:spacing w:before="40" w:after="40"/>
-        <w:rPr>
-          <w:lang w:val="en-US"/>
-        </w:rPr>
-      </w:pPr>
-      <w:r>
-        <w:rPr>
-          <w:rStyle w:val="None"/>
-          <w:rtl w:val="0"/>
-          <w:lang w:val="en-US"/>
+      </w:pPr>
+      <w:r>
+        <w:rPr>
+          <w:rStyle w:val="None"/>
         </w:rPr>
         <w:t>Performance Engineering: Conducted deep-dive bottleneck analysis and performance tuning (JMeter), identifying and resolving critical latency issues under peak traffic conditions.</w:t>
       </w:r>
@@ -976,38 +652,23 @@
       <w:r>
         <w:rPr>
           <w:rStyle w:val="None"/>
-          <w:b w:val="1"/>
-          <w:bCs w:val="1"/>
-          <w:outline w:val="0"/>
+          <w:b/>
+          <w:bCs/>
           <w:color w:val="555555"/>
           <w:sz w:val="19"/>
           <w:szCs w:val="19"/>
           <w:u w:color="555555"/>
-          <w:rtl w:val="0"/>
           <w:lang w:val="nl-NL"/>
-          <w14:textFill>
-            <w14:solidFill>
-              <w14:srgbClr w14:val="555555"/>
-            </w14:solidFill>
-          </w14:textFill>
         </w:rPr>
         <w:t xml:space="preserve">Tech Stack: </w:t>
       </w:r>
       <w:r>
         <w:rPr>
           <w:rStyle w:val="None"/>
-          <w:outline w:val="0"/>
           <w:color w:val="555555"/>
           <w:sz w:val="19"/>
           <w:szCs w:val="19"/>
           <w:u w:color="555555"/>
-          <w:rtl w:val="0"/>
-          <w:lang w:val="en-US"/>
-          <w14:textFill>
-            <w14:solidFill>
-              <w14:srgbClr w14:val="555555"/>
-            </w14:solidFill>
-          </w14:textFill>
         </w:rPr>
         <w:t>Java, Spring Framework, Maven/Gradle, Drools (BRMS), JMeter, Roadrunner, WebLogic, ActiveMQ, SQL Server, TFVC</w:t>
       </w:r>
@@ -1021,242 +682,82 @@
         <w:spacing w:before="160" w:after="30"/>
         <w:rPr>
           <w:rStyle w:val="None"/>
-          <w:outline w:val="0"/>
-          <w:color w:val="555555"/>
-          <w:u w:color="555555"/>
-          <w14:textFill>
-            <w14:solidFill>
-              <w14:srgbClr w14:val="555555"/>
-            </w14:solidFill>
-          </w14:textFill>
-        </w:rPr>
-      </w:pPr>
-      <w:r>
-        <w:rPr>
-          <w:rStyle w:val="None"/>
-          <w:b w:val="1"/>
-          <w:bCs w:val="1"/>
-          <w:outline w:val="0"/>
-          <w:color w:val="1a1a1a"/>
+          <w:color w:val="555555"/>
+          <w:u w:color="555555"/>
+        </w:rPr>
+      </w:pPr>
+      <w:r>
+        <w:rPr>
+          <w:rStyle w:val="None"/>
+          <w:b/>
+          <w:bCs/>
+          <w:color w:val="1A1A1A"/>
           <w:sz w:val="22"/>
           <w:szCs w:val="22"/>
-          <w:u w:color="1a1a1a"/>
-          <w:rtl w:val="0"/>
-          <w:lang w:val="en-US"/>
-          <w14:textFill>
-            <w14:solidFill>
-              <w14:srgbClr w14:val="1A1A1A"/>
-            </w14:solidFill>
-          </w14:textFill>
+          <w:u w:color="1A1A1A"/>
         </w:rPr>
         <w:t>Software Developer</w:t>
       </w:r>
       <w:r>
         <w:rPr>
           <w:rStyle w:val="None"/>
-          <w:outline w:val="0"/>
-          <w:color w:val="555555"/>
-          <w:u w:color="555555"/>
-          <w:rtl w:val="0"/>
-          <w14:textFill>
-            <w14:solidFill>
-              <w14:srgbClr w14:val="555555"/>
-            </w14:solidFill>
-          </w14:textFill>
+          <w:color w:val="555555"/>
+          <w:u w:color="555555"/>
         </w:rPr>
         <w:t xml:space="preserve"> | </w:t>
       </w:r>
       <w:r>
         <w:rPr>
           <w:rStyle w:val="None"/>
-          <w:b w:val="1"/>
-          <w:bCs w:val="1"/>
-          <w:outline w:val="0"/>
-          <w:color w:val="1f4e79"/>
-          <w:u w:color="1f4e79"/>
-          <w:rtl w:val="0"/>
-          <w:lang w:val="en-US"/>
-          <w14:textFill>
-            <w14:solidFill>
-              <w14:srgbClr w14:val="1F4E79"/>
-            </w14:solidFill>
-          </w14:textFill>
+          <w:b/>
+          <w:bCs/>
+          <w:color w:val="1F4E79"/>
+          <w:u w:color="1F4E79"/>
         </w:rPr>
         <w:t>Apax Software</w:t>
       </w:r>
       <w:r>
         <w:rPr>
           <w:rStyle w:val="None"/>
-          <w:outline w:val="0"/>
-          <w:color w:val="555555"/>
-          <w:u w:color="555555"/>
-          <w:rtl w:val="0"/>
-          <w14:textFill>
-            <w14:solidFill>
-              <w14:srgbClr w14:val="555555"/>
-            </w14:solidFill>
-          </w14:textFill>
-        </w:rPr>
-        <w:t xml:space="preserve"> • </w:t>
-      </w:r>
-      <w:r>
-        <w:rPr>
-          <w:rStyle w:val="None"/>
-          <w:outline w:val="0"/>
-          <w:color w:val="555555"/>
-          <w:u w:color="555555"/>
-          <w:rtl w:val="0"/>
-          <w:lang w:val="en-US"/>
-          <w14:textFill>
-            <w14:solidFill>
-              <w14:srgbClr w14:val="555555"/>
-            </w14:solidFill>
-          </w14:textFill>
-        </w:rPr>
-        <w:t xml:space="preserve">Lexington, KY </w:t>
-      </w:r>
-      <w:r>
-        <w:rPr>
-          <w:rStyle w:val="None"/>
-          <w:outline w:val="0"/>
-          <w:color w:val="555555"/>
-          <w:u w:color="555555"/>
-          <w:rtl w:val="0"/>
-          <w14:textFill>
-            <w14:solidFill>
-              <w14:srgbClr w14:val="555555"/>
-            </w14:solidFill>
-          </w14:textFill>
-        </w:rPr>
-        <w:t xml:space="preserve">• </w:t>
-      </w:r>
-      <w:r>
-        <w:rPr>
-          <w:rStyle w:val="None"/>
-          <w:outline w:val="0"/>
-          <w:color w:val="555555"/>
-          <w:u w:color="555555"/>
-          <w:rtl w:val="0"/>
-          <w14:textFill>
-            <w14:solidFill>
-              <w14:srgbClr w14:val="555555"/>
-            </w14:solidFill>
-          </w14:textFill>
-        </w:rPr>
-        <w:t xml:space="preserve">2016 </w:t>
-      </w:r>
-      <w:r>
-        <w:rPr>
-          <w:rStyle w:val="None"/>
-          <w:outline w:val="0"/>
-          <w:color w:val="555555"/>
-          <w:u w:color="555555"/>
-          <w:rtl w:val="0"/>
-          <w14:textFill>
-            <w14:solidFill>
-              <w14:srgbClr w14:val="555555"/>
-            </w14:solidFill>
-          </w14:textFill>
-        </w:rPr>
-        <w:t xml:space="preserve">– </w:t>
-      </w:r>
-      <w:r>
-        <w:rPr>
-          <w:rStyle w:val="None"/>
-          <w:outline w:val="0"/>
-          <w:color w:val="555555"/>
-          <w:u w:color="555555"/>
-          <w:rtl w:val="0"/>
-          <w14:textFill>
-            <w14:solidFill>
-              <w14:srgbClr w14:val="555555"/>
-            </w14:solidFill>
-          </w14:textFill>
-        </w:rPr>
-        <w:t>2017</w:t>
-      </w:r>
-    </w:p>
-    <w:p>
-      <w:pPr>
-        <w:pStyle w:val="List Paragraph"/>
+          <w:color w:val="555555"/>
+          <w:u w:color="555555"/>
+        </w:rPr>
+        <w:t xml:space="preserve"> • Lexington, KY • 2016 – 2017</w:t>
+      </w:r>
+    </w:p>
+    <w:p>
+      <w:pPr>
+        <w:pStyle w:val="ListParagraph"/>
         <w:numPr>
           <w:ilvl w:val="0"/>
           <w:numId w:val="4"/>
         </w:numPr>
-        <w:rPr>
-          <w:lang w:val="en-US"/>
-        </w:rPr>
-      </w:pPr>
-      <w:r>
-        <w:rPr>
-          <w:rStyle w:val="None"/>
-          <w:rtl w:val="0"/>
-          <w:lang w:val="en-US"/>
-        </w:rPr>
-        <w:t>Technical Consultation: Partnered directly with stakeholders (</w:t>
-      </w:r>
-      <w:r>
-        <w:rPr>
-          <w:rStyle w:val="None"/>
-          <w:outline w:val="0"/>
-          <w:color w:val="1a1a1a"/>
-          <w:u w:color="1a1a1a"/>
-          <w:rtl w:val="0"/>
-          <w:lang w:val="en-US"/>
-          <w14:textFill>
-            <w14:solidFill>
-              <w14:srgbClr w14:val="1A1A1A"/>
-            </w14:solidFill>
-          </w14:textFill>
-        </w:rPr>
-        <w:t>Presbyterian Church (USA)</w:t>
-      </w:r>
-      <w:r>
-        <w:rPr>
-          <w:rStyle w:val="None"/>
-          <w:rtl w:val="0"/>
-          <w:lang w:val="en-US"/>
-        </w:rPr>
-        <w:t>, University of Kentucky) to translate vague business needs into production-ready technical specifications and RESTful architectures.</w:t>
-      </w:r>
-    </w:p>
-    <w:p>
-      <w:pPr>
-        <w:pStyle w:val="List Paragraph"/>
+      </w:pPr>
+      <w:r>
+        <w:t>Modular Architecture: Designed reusable backend components and modular UI features, significantly accelerating release cycles and ensuring scalable feature expansion across multiple client projects.</w:t>
+      </w:r>
+    </w:p>
+    <w:p>
+      <w:pPr>
+        <w:pStyle w:val="ListParagraph"/>
         <w:numPr>
           <w:ilvl w:val="0"/>
           <w:numId w:val="4"/>
         </w:numPr>
-        <w:rPr>
-          <w:lang w:val="en-US"/>
-        </w:rPr>
-      </w:pPr>
-      <w:r>
-        <w:rPr>
-          <w:rStyle w:val="None"/>
-          <w:rtl w:val="0"/>
-          <w:lang w:val="en-US"/>
-        </w:rPr>
-        <w:t>Modular Architecture: Designed reusable backend components and modular UI features, significantly accelerating release cycles and ensuring scalable feature expansion across multiple client projects.</w:t>
-      </w:r>
-    </w:p>
-    <w:p>
-      <w:pPr>
-        <w:pStyle w:val="List Paragraph"/>
+      </w:pPr>
+      <w:r>
+        <w:t>Technical Consultation: Partnered directly with stakeholders (Presbyterian Church (USA), University of Kentucky) to translate vague business needs into production-ready technical specifications and RESTful architectures.</w:t>
+      </w:r>
+    </w:p>
+    <w:p>
+      <w:pPr>
+        <w:pStyle w:val="ListParagraph"/>
         <w:numPr>
           <w:ilvl w:val="0"/>
           <w:numId w:val="4"/>
         </w:numPr>
-        <w:rPr>
-          <w:lang w:val="en-US"/>
-        </w:rPr>
-      </w:pPr>
-      <w:r>
-        <w:rPr>
-          <w:rStyle w:val="None"/>
-          <w:rtl w:val="0"/>
-          <w:lang w:val="en-US"/>
-        </w:rPr>
+      </w:pPr>
+      <w:r>
         <w:t>Security &amp; Governance: Implemented robust server-side validation, authentication, and role-based access control (RBAC) for sensitive event registration and CMS workflows.</w:t>
       </w:r>
     </w:p>
@@ -1268,38 +769,23 @@
       <w:r>
         <w:rPr>
           <w:rStyle w:val="None"/>
-          <w:b w:val="1"/>
-          <w:bCs w:val="1"/>
-          <w:outline w:val="0"/>
+          <w:b/>
+          <w:bCs/>
           <w:color w:val="555555"/>
           <w:sz w:val="19"/>
           <w:szCs w:val="19"/>
           <w:u w:color="555555"/>
-          <w:rtl w:val="0"/>
           <w:lang w:val="nl-NL"/>
-          <w14:textFill>
-            <w14:solidFill>
-              <w14:srgbClr w14:val="555555"/>
-            </w14:solidFill>
-          </w14:textFill>
         </w:rPr>
         <w:t xml:space="preserve">Tech Stack: </w:t>
       </w:r>
       <w:r>
         <w:rPr>
           <w:rStyle w:val="None"/>
-          <w:outline w:val="0"/>
           <w:color w:val="555555"/>
           <w:sz w:val="19"/>
           <w:szCs w:val="19"/>
           <w:u w:color="555555"/>
-          <w:rtl w:val="0"/>
-          <w:lang w:val="en-US"/>
-          <w14:textFill>
-            <w14:solidFill>
-              <w14:srgbClr w14:val="555555"/>
-            </w14:solidFill>
-          </w14:textFill>
         </w:rPr>
         <w:t>Python, Django, JavaScript (AngularJS, jQuery), PostgreSQL, Bootstrap, AWS, Git, PHP, Drupal</w:t>
       </w:r>
@@ -1313,199 +799,94 @@
         <w:spacing w:before="160" w:after="30"/>
         <w:rPr>
           <w:rStyle w:val="None"/>
-          <w:outline w:val="0"/>
-          <w:color w:val="555555"/>
-          <w:u w:color="555555"/>
-          <w14:textFill>
-            <w14:solidFill>
-              <w14:srgbClr w14:val="555555"/>
-            </w14:solidFill>
-          </w14:textFill>
-        </w:rPr>
-      </w:pPr>
-      <w:r>
-        <w:rPr>
-          <w:rStyle w:val="None"/>
-          <w:b w:val="1"/>
-          <w:bCs w:val="1"/>
-          <w:outline w:val="0"/>
-          <w:color w:val="1a1a1a"/>
+          <w:color w:val="555555"/>
+          <w:u w:color="555555"/>
+        </w:rPr>
+      </w:pPr>
+      <w:r>
+        <w:rPr>
+          <w:rStyle w:val="None"/>
+          <w:b/>
+          <w:bCs/>
+          <w:color w:val="1A1A1A"/>
           <w:sz w:val="22"/>
           <w:szCs w:val="22"/>
-          <w:u w:color="1a1a1a"/>
-          <w:rtl w:val="0"/>
-          <w:lang w:val="en-US"/>
-          <w14:textFill>
-            <w14:solidFill>
-              <w14:srgbClr w14:val="1A1A1A"/>
-            </w14:solidFill>
-          </w14:textFill>
+          <w:u w:color="1A1A1A"/>
         </w:rPr>
         <w:t>Programming Analyst</w:t>
       </w:r>
       <w:r>
         <w:rPr>
           <w:rStyle w:val="None"/>
-          <w:outline w:val="0"/>
-          <w:color w:val="555555"/>
-          <w:u w:color="555555"/>
-          <w:rtl w:val="0"/>
-          <w14:textFill>
-            <w14:solidFill>
-              <w14:srgbClr w14:val="555555"/>
-            </w14:solidFill>
-          </w14:textFill>
+          <w:color w:val="555555"/>
+          <w:u w:color="555555"/>
         </w:rPr>
         <w:t xml:space="preserve"> | </w:t>
       </w:r>
       <w:r>
         <w:rPr>
           <w:rStyle w:val="None"/>
-          <w:b w:val="1"/>
-          <w:bCs w:val="1"/>
-          <w:outline w:val="0"/>
-          <w:color w:val="1f4e79"/>
-          <w:u w:color="1f4e79"/>
-          <w:rtl w:val="0"/>
-          <w:lang w:val="en-US"/>
-          <w14:textFill>
-            <w14:solidFill>
-              <w14:srgbClr w14:val="1F4E79"/>
-            </w14:solidFill>
-          </w14:textFill>
+          <w:b/>
+          <w:bCs/>
+          <w:color w:val="1F4E79"/>
+          <w:u w:color="1F4E79"/>
         </w:rPr>
         <w:t>Knowledge Facilitations Group (KFG)</w:t>
       </w:r>
       <w:r>
         <w:rPr>
           <w:rStyle w:val="None"/>
-          <w:outline w:val="0"/>
-          <w:color w:val="555555"/>
-          <w:u w:color="555555"/>
-          <w:rtl w:val="0"/>
-          <w14:textFill>
-            <w14:solidFill>
-              <w14:srgbClr w14:val="555555"/>
-            </w14:solidFill>
-          </w14:textFill>
+          <w:color w:val="555555"/>
+          <w:u w:color="555555"/>
         </w:rPr>
         <w:t xml:space="preserve"> • </w:t>
       </w:r>
       <w:r>
         <w:rPr>
           <w:rStyle w:val="None"/>
-          <w:outline w:val="0"/>
-          <w:color w:val="555555"/>
-          <w:u w:color="555555"/>
-          <w:rtl w:val="0"/>
+          <w:color w:val="555555"/>
+          <w:u w:color="555555"/>
           <w:lang w:val="de-DE"/>
-          <w14:textFill>
-            <w14:solidFill>
-              <w14:srgbClr w14:val="555555"/>
-            </w14:solidFill>
-          </w14:textFill>
         </w:rPr>
         <w:t xml:space="preserve">Richmond, KY </w:t>
       </w:r>
       <w:r>
         <w:rPr>
           <w:rStyle w:val="None"/>
-          <w:outline w:val="0"/>
-          <w:color w:val="555555"/>
-          <w:u w:color="555555"/>
-          <w:rtl w:val="0"/>
-          <w14:textFill>
-            <w14:solidFill>
-              <w14:srgbClr w14:val="555555"/>
-            </w14:solidFill>
-          </w14:textFill>
-        </w:rPr>
-        <w:t xml:space="preserve">• </w:t>
-      </w:r>
-      <w:r>
-        <w:rPr>
-          <w:rStyle w:val="None"/>
-          <w:outline w:val="0"/>
-          <w:color w:val="555555"/>
-          <w:u w:color="555555"/>
-          <w:rtl w:val="0"/>
-          <w14:textFill>
-            <w14:solidFill>
-              <w14:srgbClr w14:val="555555"/>
-            </w14:solidFill>
-          </w14:textFill>
-        </w:rPr>
-        <w:t xml:space="preserve">2015 </w:t>
-      </w:r>
-      <w:r>
-        <w:rPr>
-          <w:rStyle w:val="None"/>
-          <w:outline w:val="0"/>
-          <w:color w:val="555555"/>
-          <w:u w:color="555555"/>
-          <w:rtl w:val="0"/>
-          <w14:textFill>
-            <w14:solidFill>
-              <w14:srgbClr w14:val="555555"/>
-            </w14:solidFill>
-          </w14:textFill>
-        </w:rPr>
-        <w:t xml:space="preserve">– </w:t>
-      </w:r>
-      <w:r>
-        <w:rPr>
-          <w:rStyle w:val="None"/>
-          <w:outline w:val="0"/>
-          <w:color w:val="555555"/>
-          <w:u w:color="555555"/>
-          <w:rtl w:val="0"/>
-          <w14:textFill>
-            <w14:solidFill>
-              <w14:srgbClr w14:val="555555"/>
-            </w14:solidFill>
-          </w14:textFill>
-        </w:rPr>
-        <w:t>2016</w:t>
-      </w:r>
-    </w:p>
-    <w:p>
-      <w:pPr>
-        <w:pStyle w:val="List Paragraph"/>
+          <w:color w:val="555555"/>
+          <w:u w:color="555555"/>
+        </w:rPr>
+        <w:t>• 2015 – 2016</w:t>
+      </w:r>
+    </w:p>
+    <w:p>
+      <w:pPr>
+        <w:pStyle w:val="ListParagraph"/>
         <w:numPr>
           <w:ilvl w:val="0"/>
           <w:numId w:val="4"/>
         </w:numPr>
         <w:spacing w:before="40" w:after="40"/>
-        <w:rPr>
-          <w:lang w:val="en-US"/>
-        </w:rPr>
-      </w:pPr>
-      <w:r>
-        <w:rPr>
-          <w:rStyle w:val="None"/>
-          <w:rtl w:val="0"/>
-          <w:lang w:val="en-US"/>
+      </w:pPr>
+      <w:r>
+        <w:rPr>
+          <w:rStyle w:val="None"/>
         </w:rPr>
         <w:t>Data Pipeline Engineering: Developed Python-based transformation engines to validate and map disparate industry standards (X12, EDIFACT, XML, JSON), ensuring seamless data exchange across the EDITRACE platform.</w:t>
       </w:r>
     </w:p>
     <w:p>
       <w:pPr>
-        <w:pStyle w:val="List Paragraph"/>
+        <w:pStyle w:val="ListParagraph"/>
         <w:numPr>
           <w:ilvl w:val="0"/>
           <w:numId w:val="4"/>
         </w:numPr>
         <w:spacing w:before="40" w:after="40"/>
-        <w:rPr>
-          <w:lang w:val="en-US"/>
-        </w:rPr>
-      </w:pPr>
-      <w:r>
-        <w:rPr>
-          <w:rStyle w:val="None"/>
-          <w:rtl w:val="0"/>
-          <w:lang w:val="en-US"/>
+      </w:pPr>
+      <w:r>
+        <w:rPr>
+          <w:rStyle w:val="None"/>
         </w:rPr>
         <w:t>Operational Observability: Built real-time monitoring dashboards that provided immediate insight into automated data pipelines, reducing troubleshooting time for critical EDI processes.</w:t>
       </w:r>
@@ -1514,42 +895,34 @@
       <w:pPr>
         <w:pStyle w:val="Body"/>
         <w:spacing w:before="60" w:after="40"/>
-      </w:pPr>
-      <w:r>
-        <w:rPr>
-          <w:rStyle w:val="None"/>
-          <w:b w:val="1"/>
-          <w:bCs w:val="1"/>
-          <w:outline w:val="0"/>
+        <w:rPr>
+          <w:rStyle w:val="None"/>
           <w:color w:val="555555"/>
           <w:sz w:val="19"/>
           <w:szCs w:val="19"/>
           <w:u w:color="555555"/>
-          <w:rtl w:val="0"/>
-          <w:lang w:val="nl-NL"/>
-          <w14:textFill>
-            <w14:solidFill>
-              <w14:srgbClr w14:val="555555"/>
-            </w14:solidFill>
-          </w14:textFill>
-        </w:rPr>
-        <w:t xml:space="preserve">Tech Stack: </w:t>
-      </w:r>
-      <w:r>
-        <w:rPr>
-          <w:rStyle w:val="None"/>
-          <w:outline w:val="0"/>
+        </w:rPr>
+      </w:pPr>
+      <w:r>
+        <w:rPr>
+          <w:rStyle w:val="None"/>
+          <w:b/>
+          <w:bCs/>
           <w:color w:val="555555"/>
           <w:sz w:val="19"/>
           <w:szCs w:val="19"/>
           <w:u w:color="555555"/>
-          <w:rtl w:val="0"/>
-          <w:lang w:val="en-US"/>
-          <w14:textFill>
-            <w14:solidFill>
-              <w14:srgbClr w14:val="555555"/>
-            </w14:solidFill>
-          </w14:textFill>
+          <w:lang w:val="nl-NL"/>
+        </w:rPr>
+        <w:t xml:space="preserve">Tech Stack: </w:t>
+      </w:r>
+      <w:r>
+        <w:rPr>
+          <w:rStyle w:val="None"/>
+          <w:color w:val="555555"/>
+          <w:sz w:val="19"/>
+          <w:szCs w:val="19"/>
+          <w:u w:color="555555"/>
         </w:rPr>
         <w:t>Python, EDI (X12, XML, EDIFACT, Tradacoms, JSON, IDoc), Bootstrap, Git</w:t>
       </w:r>
@@ -1558,30 +931,227 @@
       <w:pPr>
         <w:pStyle w:val="Body"/>
         <w:pBdr>
-          <w:top w:val="nil"/>
-          <w:left w:val="nil"/>
-          <w:bottom w:val="single" w:color="1f4e79" w:sz="8" w:space="0" w:shadow="0" w:frame="0"/>
-          <w:right w:val="nil"/>
+          <w:bottom w:val="single" w:sz="8" w:space="0" w:color="1F4E79"/>
         </w:pBdr>
         <w:spacing w:before="200" w:after="60"/>
       </w:pPr>
       <w:r>
         <w:rPr>
           <w:rStyle w:val="None"/>
-          <w:b w:val="1"/>
-          <w:bCs w:val="1"/>
-          <w:outline w:val="0"/>
-          <w:color w:val="1f4e79"/>
+          <w:b/>
+          <w:bCs/>
+          <w:color w:val="1F4E79"/>
           <w:sz w:val="22"/>
           <w:szCs w:val="22"/>
-          <w:u w:color="1f4e79"/>
-          <w:rtl w:val="0"/>
-          <w:lang w:val="en-US"/>
-          <w14:textFill>
-            <w14:solidFill>
-              <w14:srgbClr w14:val="1F4E79"/>
-            </w14:solidFill>
-          </w14:textFill>
+          <w:u w:color="1F4E79"/>
+          <w:lang w:val="de-DE"/>
+        </w:rPr>
+        <w:t>PROJECTS</w:t>
+      </w:r>
+    </w:p>
+    <w:p>
+      <w:pPr>
+        <w:pStyle w:val="Body"/>
+        <w:tabs>
+          <w:tab w:val="right" w:pos="9360"/>
+        </w:tabs>
+        <w:spacing w:before="160" w:after="30"/>
+      </w:pPr>
+      <w:r>
+        <w:rPr>
+          <w:rStyle w:val="None"/>
+          <w:b/>
+          <w:bCs/>
+          <w:color w:val="1A1A1A"/>
+          <w:sz w:val="22"/>
+          <w:szCs w:val="22"/>
+          <w:u w:color="1A1A1A"/>
+        </w:rPr>
+        <w:t>RAG Document Q&amp;A Demo</w:t>
+      </w:r>
+      <w:r>
+        <w:rPr>
+          <w:rStyle w:val="None"/>
+          <w:color w:val="555555"/>
+          <w:u w:color="555555"/>
+        </w:rPr>
+        <w:t xml:space="preserve"> • </w:t>
+      </w:r>
+      <w:r>
+        <w:rPr>
+          <w:rStyle w:val="None"/>
+          <w:color w:val="555555"/>
+          <w:u w:color="555555"/>
+        </w:rPr>
+        <w:t>https://github.com/msmith1392/rag-demo</w:t>
+      </w:r>
+    </w:p>
+    <w:p>
+      <w:pPr>
+        <w:pStyle w:val="ListParagraph"/>
+        <w:numPr>
+          <w:ilvl w:val="0"/>
+          <w:numId w:val="2"/>
+        </w:numPr>
+        <w:spacing w:before="40" w:after="40"/>
+        <w:rPr>
+          <w:rFonts w:cs="Arial"/>
+        </w:rPr>
+      </w:pPr>
+      <w:r>
+        <w:rPr>
+          <w:rFonts w:cs="Arial"/>
+        </w:rPr>
+        <w:t>Locally-running offline RAG system for document Q&amp;A using sentence-transformers for embeddings and FAISS for vector search</w:t>
+      </w:r>
+      <w:r>
+        <w:rPr>
+          <w:rFonts w:cs="Arial"/>
+        </w:rPr>
+        <w:t>.</w:t>
+      </w:r>
+    </w:p>
+    <w:p>
+      <w:pPr>
+        <w:pStyle w:val="Body"/>
+        <w:spacing w:before="60" w:after="40"/>
+      </w:pPr>
+      <w:r>
+        <w:rPr>
+          <w:rStyle w:val="None"/>
+          <w:b/>
+          <w:bCs/>
+          <w:color w:val="555555"/>
+          <w:sz w:val="19"/>
+          <w:szCs w:val="19"/>
+          <w:u w:color="555555"/>
+          <w:lang w:val="nl-NL"/>
+        </w:rPr>
+        <w:t xml:space="preserve">Tech Stack: </w:t>
+      </w:r>
+      <w:r>
+        <w:rPr>
+          <w:rStyle w:val="None"/>
+          <w:color w:val="555555"/>
+          <w:sz w:val="19"/>
+          <w:szCs w:val="19"/>
+          <w:u w:color="555555"/>
+          <w:lang w:val="nl-NL"/>
+        </w:rPr>
+        <w:t>Python, LangChain, FAISS, Mistral 7b</w:t>
+      </w:r>
+    </w:p>
+    <w:p>
+      <w:pPr>
+        <w:pStyle w:val="Body"/>
+        <w:tabs>
+          <w:tab w:val="right" w:pos="9360"/>
+        </w:tabs>
+        <w:spacing w:before="160" w:after="30"/>
+      </w:pPr>
+      <w:r>
+        <w:rPr>
+          <w:rStyle w:val="None"/>
+          <w:b/>
+          <w:bCs/>
+          <w:color w:val="1A1A1A"/>
+          <w:sz w:val="22"/>
+          <w:szCs w:val="22"/>
+          <w:u w:color="1A1A1A"/>
+        </w:rPr>
+        <w:t xml:space="preserve">Personal Portfolio Site </w:t>
+      </w:r>
+      <w:r>
+        <w:rPr>
+          <w:rStyle w:val="None"/>
+          <w:color w:val="555555"/>
+          <w:u w:color="555555"/>
+        </w:rPr>
+        <w:t>•</w:t>
+      </w:r>
+      <w:r>
+        <w:rPr>
+          <w:rStyle w:val="None"/>
+          <w:color w:val="555555"/>
+          <w:u w:color="555555"/>
+        </w:rPr>
+        <w:t xml:space="preserve"> </w:t>
+      </w:r>
+      <w:r>
+        <w:rPr>
+          <w:rStyle w:val="None"/>
+          <w:color w:val="555555"/>
+          <w:u w:color="555555"/>
+        </w:rPr>
+        <w:t>https://github.com/msmith1392/msmith1392.github.io</w:t>
+      </w:r>
+    </w:p>
+    <w:p>
+      <w:pPr>
+        <w:pStyle w:val="ListParagraph"/>
+        <w:numPr>
+          <w:ilvl w:val="0"/>
+          <w:numId w:val="2"/>
+        </w:numPr>
+        <w:spacing w:before="40" w:after="40"/>
+        <w:rPr>
+          <w:rFonts w:cs="Arial"/>
+        </w:rPr>
+      </w:pPr>
+      <w:r>
+        <w:rPr>
+          <w:rFonts w:cs="Arial"/>
+        </w:rPr>
+        <w:t>Production-deployed single-page portfolio hosted on GitHub Pages.</w:t>
+      </w:r>
+    </w:p>
+    <w:p>
+      <w:pPr>
+        <w:pStyle w:val="Body"/>
+        <w:spacing w:before="60" w:after="40"/>
+      </w:pPr>
+      <w:r>
+        <w:rPr>
+          <w:rStyle w:val="None"/>
+          <w:b/>
+          <w:bCs/>
+          <w:color w:val="555555"/>
+          <w:sz w:val="19"/>
+          <w:szCs w:val="19"/>
+          <w:u w:color="555555"/>
+          <w:lang w:val="nl-NL"/>
+        </w:rPr>
+        <w:t xml:space="preserve">Tech Stack: </w:t>
+      </w:r>
+      <w:r>
+        <w:rPr>
+          <w:rStyle w:val="None"/>
+          <w:color w:val="555555"/>
+          <w:sz w:val="19"/>
+          <w:szCs w:val="19"/>
+          <w:u w:color="555555"/>
+          <w:lang w:val="nl-NL"/>
+        </w:rPr>
+        <w:t>React, TypeScript, Tailwind, Vite</w:t>
+      </w:r>
+    </w:p>
+    <w:p>
+      <w:pPr>
+        <w:pStyle w:val="Body"/>
+        <w:pBdr>
+          <w:bottom w:val="single" w:sz="8" w:space="0" w:color="1F4E79"/>
+        </w:pBdr>
+        <w:spacing w:before="200" w:after="60"/>
+      </w:pPr>
+      <w:r>
+        <w:rPr>
+          <w:rStyle w:val="None"/>
+          <w:b/>
+          <w:bCs/>
+          <w:color w:val="1F4E79"/>
+          <w:sz w:val="22"/>
+          <w:szCs w:val="22"/>
+          <w:u w:color="1F4E79"/>
         </w:rPr>
         <w:t>EDUCATION</w:t>
       </w:r>
@@ -1594,36 +1164,20 @@
       <w:r>
         <w:rPr>
           <w:rStyle w:val="None"/>
-          <w:b w:val="1"/>
-          <w:bCs w:val="1"/>
-          <w:outline w:val="0"/>
-          <w:color w:val="1a1a1a"/>
+          <w:b/>
+          <w:bCs/>
+          <w:color w:val="1A1A1A"/>
           <w:sz w:val="21"/>
           <w:szCs w:val="21"/>
-          <w:u w:color="1a1a1a"/>
-          <w:rtl w:val="0"/>
-          <w:lang w:val="en-US"/>
-          <w14:textFill>
-            <w14:solidFill>
-              <w14:srgbClr w14:val="1A1A1A"/>
-            </w14:solidFill>
-          </w14:textFill>
+          <w:u w:color="1A1A1A"/>
         </w:rPr>
         <w:t>B.S. in Computer Science, 2015</w:t>
       </w:r>
       <w:r>
         <w:rPr>
           <w:rStyle w:val="None"/>
-          <w:outline w:val="0"/>
-          <w:color w:val="555555"/>
-          <w:u w:color="555555"/>
-          <w:rtl w:val="0"/>
-          <w:lang w:val="en-US"/>
-          <w14:textFill>
-            <w14:solidFill>
-              <w14:srgbClr w14:val="555555"/>
-            </w14:solidFill>
-          </w14:textFill>
+          <w:color w:val="555555"/>
+          <w:u w:color="555555"/>
         </w:rPr>
         <w:t xml:space="preserve"> | Eastern Kentucky University, Richmond, KY</w:t>
       </w:r>
@@ -1632,81 +1186,110 @@
       <w:pPr>
         <w:pStyle w:val="Body"/>
         <w:spacing w:after="80"/>
-      </w:pPr>
-      <w:r>
-        <w:rPr>
-          <w:rStyle w:val="None"/>
-          <w:i w:val="1"/>
-          <w:iCs w:val="1"/>
-          <w:outline w:val="0"/>
-          <w:color w:val="555555"/>
-          <w:u w:color="555555"/>
-          <w:rtl w:val="0"/>
-          <w:lang w:val="en-US"/>
-          <w14:textFill>
-            <w14:solidFill>
-              <w14:srgbClr w14:val="555555"/>
-            </w14:solidFill>
-          </w14:textFill>
+        <w:rPr>
+          <w:i/>
+          <w:iCs/>
+          <w:color w:val="555555"/>
+          <w:u w:color="555555"/>
+        </w:rPr>
+      </w:pPr>
+      <w:r>
+        <w:rPr>
+          <w:rStyle w:val="None"/>
+          <w:i/>
+          <w:iCs/>
+          <w:color w:val="555555"/>
+          <w:u w:color="555555"/>
         </w:rPr>
         <w:t>Member, Upsilon Pi Epsilon Honors Society for the Computing and Information Disciplines</w:t>
       </w:r>
     </w:p>
     <w:sectPr>
-      <w:headerReference w:type="default" r:id="rId4"/>
-      <w:footerReference w:type="default" r:id="rId5"/>
-      <w:pgSz w:w="12240" w:h="15840" w:orient="portrait"/>
-      <w:pgMar w:top="1080" w:right="1080" w:bottom="1080" w:left="1080" w:header="708" w:footer="708"/>
-      <w:bidi w:val="0"/>
+      <w:headerReference w:type="default" r:id="rId9"/>
+      <w:footerReference w:type="default" r:id="rId10"/>
+      <w:pgSz w:w="12240" w:h="15840"/>
+      <w:pgMar w:top="1080" w:right="1080" w:bottom="1080" w:left="1080" w:header="708" w:footer="708" w:gutter="0"/>
+      <w:cols w:space="720"/>
     </w:sectPr>
   </w:body>
 </w:document>
 </file>
 
+<file path=word/endnotes.xml><?xml version="1.0" encoding="utf-8"?>
+<w:endnotes xmlns:wpc="http://schemas.microsoft.com/office/word/2010/wordprocessingCanvas" xmlns:cx="http://schemas.microsoft.com/office/drawing/2014/chartex" xmlns:cx1="http://schemas.microsoft.com/office/drawing/2015/9/8/chartex" xmlns:cx2="http://schemas.microsoft.com/office/drawing/2015/10/21/chartex" xmlns:cx3="http://schemas.microsoft.com/office/drawing/2016/5/9/chartex" xmlns:cx4="http://schemas.microsoft.com/office/drawing/2016/5/10/chartex" xmlns:cx5="http://schemas.microsoft.com/office/drawing/2016/5/11/chartex" xmlns:cx6="http://schemas.microsoft.com/office/drawing/2016/5/12/chartex" xmlns:cx7="http://schemas.microsoft.com/office/drawing/2016/5/13/chartex" xmlns:cx8="http://schemas.microsoft.com/office/drawing/2016/5/14/chartex" xmlns:mc="http://schemas.openxmlformats.org/markup-compatibility/2006" xmlns:aink="http://schemas.microsoft.com/office/drawing/2016/ink" xmlns:am3d="http://schemas.microsoft.com/office/drawing/2017/model3d" xmlns:o="urn:schemas-microsoft-com:office:office" xmlns:oel="http://schemas.microsoft.com/office/2019/extlst" xmlns:r="http://schemas.openxmlformats.org/officeDocument/2006/relationships" xmlns:m="http://schemas.openxmlformats.org/officeDocument/2006/math" xmlns:v="urn:schemas-microsoft-com:vml" xmlns:wp14="http://schemas.microsoft.com/office/word/2010/wordprocessingDrawing" xmlns:wp="http://schemas.openxmlformats.org/drawingml/2006/wordprocessingDrawing" xmlns:w10="urn:schemas-microsoft-com:office:word" xmlns:w="http://schemas.openxmlformats.org/wordprocessingml/2006/main" xmlns:w14="http://schemas.microsoft.com/office/word/2010/wordml" xmlns:w15="http://schemas.microsoft.com/office/word/2012/wordml" xmlns:w16cex="http://schemas.microsoft.com/office/word/2018/wordml/cex" xmlns:w16cid="http://schemas.microsoft.com/office/word/2016/wordml/cid" xmlns:w16="http://schemas.microsoft.com/office/word/2018/wordml" xmlns:w16du="http://schemas.microsoft.com/office/word/2023/wordml/word16du" xmlns:w16sdtdh="http://schemas.microsoft.com/office/word/2020/wordml/sdtdatahash" xmlns:w16sdtfl="http://schemas.microsoft.com/office/word/2024/wordml/sdtformatlock" xmlns:w16se="http://schemas.microsoft.com/office/word/2015/wordml/symex" xmlns:wpg="http://schemas.microsoft.com/office/word/2010/wordprocessingGroup" xmlns:wpi="http://schemas.microsoft.com/office/word/2010/wordprocessingInk" xmlns:wne="http://schemas.microsoft.com/office/word/2006/wordml" xmlns:wps="http://schemas.microsoft.com/office/word/2010/wordprocessingShape" mc:Ignorable="w14 w15 w16se w16cid w16 w16cex w16sdtdh w16sdtfl w16du wp14">
+  <w:endnote w:type="separator" w:id="-1">
+    <w:p>
+      <w:r>
+        <w:separator/>
+      </w:r>
+    </w:p>
+  </w:endnote>
+  <w:endnote w:type="continuationSeparator" w:id="0">
+    <w:p>
+      <w:r>
+        <w:continuationSeparator/>
+      </w:r>
+    </w:p>
+  </w:endnote>
+</w:endnotes>
+</file>
+
 <file path=word/footer1.xml><?xml version="1.0" encoding="utf-8"?>
-<w:ftr xmlns:r="http://schemas.openxmlformats.org/officeDocument/2006/relationships" xmlns:wp="http://schemas.openxmlformats.org/drawingml/2006/wordprocessingDrawing" xmlns:w="http://schemas.openxmlformats.org/wordprocessingml/2006/main" xmlns:w10="urn:schemas-microsoft-com:office:word" xmlns:w14="http://schemas.microsoft.com/office/word/2010/wordml" xmlns:wps="http://schemas.microsoft.com/office/word/2010/wordprocessingShape" xmlns:wpg="http://schemas.microsoft.com/office/word/2010/wordprocessingGroup" xmlns:mc="http://schemas.openxmlformats.org/markup-compatibility/2006" xmlns:v="urn:schemas-microsoft-com:vml" xmlns:o="urn:schemas-microsoft-com:office:office" xmlns:m="http://schemas.openxmlformats.org/officeDocument/2006/math" mc:Ignorable="w14">
+<w:ftr xmlns:wpc="http://schemas.microsoft.com/office/word/2010/wordprocessingCanvas" xmlns:cx="http://schemas.microsoft.com/office/drawing/2014/chartex" xmlns:cx1="http://schemas.microsoft.com/office/drawing/2015/9/8/chartex" xmlns:cx2="http://schemas.microsoft.com/office/drawing/2015/10/21/chartex" xmlns:cx3="http://schemas.microsoft.com/office/drawing/2016/5/9/chartex" xmlns:cx4="http://schemas.microsoft.com/office/drawing/2016/5/10/chartex" xmlns:cx5="http://schemas.microsoft.com/office/drawing/2016/5/11/chartex" xmlns:cx6="http://schemas.microsoft.com/office/drawing/2016/5/12/chartex" xmlns:cx7="http://schemas.microsoft.com/office/drawing/2016/5/13/chartex" xmlns:cx8="http://schemas.microsoft.com/office/drawing/2016/5/14/chartex" xmlns:mc="http://schemas.openxmlformats.org/markup-compatibility/2006" xmlns:aink="http://schemas.microsoft.com/office/drawing/2016/ink" xmlns:am3d="http://schemas.microsoft.com/office/drawing/2017/model3d" xmlns:o="urn:schemas-microsoft-com:office:office" xmlns:oel="http://schemas.microsoft.com/office/2019/extlst" xmlns:r="http://schemas.openxmlformats.org/officeDocument/2006/relationships" xmlns:m="http://schemas.openxmlformats.org/officeDocument/2006/math" xmlns:v="urn:schemas-microsoft-com:vml" xmlns:wp14="http://schemas.microsoft.com/office/word/2010/wordprocessingDrawing" xmlns:wp="http://schemas.openxmlformats.org/drawingml/2006/wordprocessingDrawing" xmlns:w10="urn:schemas-microsoft-com:office:word" xmlns:w="http://schemas.openxmlformats.org/wordprocessingml/2006/main" xmlns:w14="http://schemas.microsoft.com/office/word/2010/wordml" xmlns:w15="http://schemas.microsoft.com/office/word/2012/wordml" xmlns:w16cex="http://schemas.microsoft.com/office/word/2018/wordml/cex" xmlns:w16cid="http://schemas.microsoft.com/office/word/2016/wordml/cid" xmlns:w16="http://schemas.microsoft.com/office/word/2018/wordml" xmlns:w16du="http://schemas.microsoft.com/office/word/2023/wordml/word16du" xmlns:w16sdtdh="http://schemas.microsoft.com/office/word/2020/wordml/sdtdatahash" xmlns:w16sdtfl="http://schemas.microsoft.com/office/word/2024/wordml/sdtformatlock" xmlns:w16se="http://schemas.microsoft.com/office/word/2015/wordml/symex" xmlns:wpg="http://schemas.microsoft.com/office/word/2010/wordprocessingGroup" xmlns:wpi="http://schemas.microsoft.com/office/word/2010/wordprocessingInk" xmlns:wne="http://schemas.microsoft.com/office/word/2006/wordml" xmlns:wps="http://schemas.microsoft.com/office/word/2010/wordprocessingShape" mc:Ignorable="w14 w15 w16se w16cid w16 w16cex w16sdtdh w16sdtfl w16du wp14">
   <w:p>
     <w:pPr>
-      <w:pStyle w:val="Header &amp; Footer"/>
-      <w:bidi w:val="0"/>
+      <w:pStyle w:val="HeaderFooter"/>
     </w:pPr>
-    <w:r/>
   </w:p>
 </w:ftr>
 </file>
 
+<file path=word/footnotes.xml><?xml version="1.0" encoding="utf-8"?>
+<w:footnotes xmlns:wpc="http://schemas.microsoft.com/office/word/2010/wordprocessingCanvas" xmlns:cx="http://schemas.microsoft.com/office/drawing/2014/chartex" xmlns:cx1="http://schemas.microsoft.com/office/drawing/2015/9/8/chartex" xmlns:cx2="http://schemas.microsoft.com/office/drawing/2015/10/21/chartex" xmlns:cx3="http://schemas.microsoft.com/office/drawing/2016/5/9/chartex" xmlns:cx4="http://schemas.microsoft.com/office/drawing/2016/5/10/chartex" xmlns:cx5="http://schemas.microsoft.com/office/drawing/2016/5/11/chartex" xmlns:cx6="http://schemas.microsoft.com/office/drawing/2016/5/12/chartex" xmlns:cx7="http://schemas.microsoft.com/office/drawing/2016/5/13/chartex" xmlns:cx8="http://schemas.microsoft.com/office/drawing/2016/5/14/chartex" xmlns:mc="http://schemas.openxmlformats.org/markup-compatibility/2006" xmlns:aink="http://schemas.microsoft.com/office/drawing/2016/ink" xmlns:am3d="http://schemas.microsoft.com/office/drawing/2017/model3d" xmlns:o="urn:schemas-microsoft-com:office:office" xmlns:oel="http://schemas.microsoft.com/office/2019/extlst" xmlns:r="http://schemas.openxmlformats.org/officeDocument/2006/relationships" xmlns:m="http://schemas.openxmlformats.org/officeDocument/2006/math" xmlns:v="urn:schemas-microsoft-com:vml" xmlns:wp14="http://schemas.microsoft.com/office/word/2010/wordprocessingDrawing" xmlns:wp="http://schemas.openxmlformats.org/drawingml/2006/wordprocessingDrawing" xmlns:w10="urn:schemas-microsoft-com:office:word" xmlns:w="http://schemas.openxmlformats.org/wordprocessingml/2006/main" xmlns:w14="http://schemas.microsoft.com/office/word/2010/wordml" xmlns:w15="http://schemas.microsoft.com/office/word/2012/wordml" xmlns:w16cex="http://schemas.microsoft.com/office/word/2018/wordml/cex" xmlns:w16cid="http://schemas.microsoft.com/office/word/2016/wordml/cid" xmlns:w16="http://schemas.microsoft.com/office/word/2018/wordml" xmlns:w16du="http://schemas.microsoft.com/office/word/2023/wordml/word16du" xmlns:w16sdtdh="http://schemas.microsoft.com/office/word/2020/wordml/sdtdatahash" xmlns:w16sdtfl="http://schemas.microsoft.com/office/word/2024/wordml/sdtformatlock" xmlns:w16se="http://schemas.microsoft.com/office/word/2015/wordml/symex" xmlns:wpg="http://schemas.microsoft.com/office/word/2010/wordprocessingGroup" xmlns:wpi="http://schemas.microsoft.com/office/word/2010/wordprocessingInk" xmlns:wne="http://schemas.microsoft.com/office/word/2006/wordml" xmlns:wps="http://schemas.microsoft.com/office/word/2010/wordprocessingShape" mc:Ignorable="w14 w15 w16se w16cid w16 w16cex w16sdtdh w16sdtfl w16du wp14">
+  <w:footnote w:type="separator" w:id="-1">
+    <w:p>
+      <w:r>
+        <w:separator/>
+      </w:r>
+    </w:p>
+  </w:footnote>
+  <w:footnote w:type="continuationSeparator" w:id="0">
+    <w:p>
+      <w:r>
+        <w:continuationSeparator/>
+      </w:r>
+    </w:p>
+  </w:footnote>
+</w:footnotes>
+</file>
+
 <file path=word/header1.xml><?xml version="1.0" encoding="utf-8"?>
-<w:hdr xmlns:r="http://schemas.openxmlformats.org/officeDocument/2006/relationships" xmlns:wp="http://schemas.openxmlformats.org/drawingml/2006/wordprocessingDrawing" xmlns:w="http://schemas.openxmlformats.org/wordprocessingml/2006/main" xmlns:w10="urn:schemas-microsoft-com:office:word" xmlns:w14="http://schemas.microsoft.com/office/word/2010/wordml" xmlns:wps="http://schemas.microsoft.com/office/word/2010/wordprocessingShape" xmlns:wpg="http://schemas.microsoft.com/office/word/2010/wordprocessingGroup" xmlns:mc="http://schemas.openxmlformats.org/markup-compatibility/2006" xmlns:v="urn:schemas-microsoft-com:vml" xmlns:o="urn:schemas-microsoft-com:office:office" xmlns:m="http://schemas.openxmlformats.org/officeDocument/2006/math" mc:Ignorable="w14">
+<w:hdr xmlns:wpc="http://schemas.microsoft.com/office/word/2010/wordprocessingCanvas" xmlns:cx="http://schemas.microsoft.com/office/drawing/2014/chartex" xmlns:cx1="http://schemas.microsoft.com/office/drawing/2015/9/8/chartex" xmlns:cx2="http://schemas.microsoft.com/office/drawing/2015/10/21/chartex" xmlns:cx3="http://schemas.microsoft.com/office/drawing/2016/5/9/chartex" xmlns:cx4="http://schemas.microsoft.com/office/drawing/2016/5/10/chartex" xmlns:cx5="http://schemas.microsoft.com/office/drawing/2016/5/11/chartex" xmlns:cx6="http://schemas.microsoft.com/office/drawing/2016/5/12/chartex" xmlns:cx7="http://schemas.microsoft.com/office/drawing/2016/5/13/chartex" xmlns:cx8="http://schemas.microsoft.com/office/drawing/2016/5/14/chartex" xmlns:mc="http://schemas.openxmlformats.org/markup-compatibility/2006" xmlns:aink="http://schemas.microsoft.com/office/drawing/2016/ink" xmlns:am3d="http://schemas.microsoft.com/office/drawing/2017/model3d" xmlns:o="urn:schemas-microsoft-com:office:office" xmlns:oel="http://schemas.microsoft.com/office/2019/extlst" xmlns:r="http://schemas.openxmlformats.org/officeDocument/2006/relationships" xmlns:m="http://schemas.openxmlformats.org/officeDocument/2006/math" xmlns:v="urn:schemas-microsoft-com:vml" xmlns:wp14="http://schemas.microsoft.com/office/word/2010/wordprocessingDrawing" xmlns:wp="http://schemas.openxmlformats.org/drawingml/2006/wordprocessingDrawing" xmlns:w10="urn:schemas-microsoft-com:office:word" xmlns:w="http://schemas.openxmlformats.org/wordprocessingml/2006/main" xmlns:w14="http://schemas.microsoft.com/office/word/2010/wordml" xmlns:w15="http://schemas.microsoft.com/office/word/2012/wordml" xmlns:w16cex="http://schemas.microsoft.com/office/word/2018/wordml/cex" xmlns:w16cid="http://schemas.microsoft.com/office/word/2016/wordml/cid" xmlns:w16="http://schemas.microsoft.com/office/word/2018/wordml" xmlns:w16du="http://schemas.microsoft.com/office/word/2023/wordml/word16du" xmlns:w16sdtdh="http://schemas.microsoft.com/office/word/2020/wordml/sdtdatahash" xmlns:w16sdtfl="http://schemas.microsoft.com/office/word/2024/wordml/sdtformatlock" xmlns:w16se="http://schemas.microsoft.com/office/word/2015/wordml/symex" xmlns:wpg="http://schemas.microsoft.com/office/word/2010/wordprocessingGroup" xmlns:wpi="http://schemas.microsoft.com/office/word/2010/wordprocessingInk" xmlns:wne="http://schemas.microsoft.com/office/word/2006/wordml" xmlns:wps="http://schemas.microsoft.com/office/word/2010/wordprocessingShape" mc:Ignorable="w14 w15 w16se w16cid w16 w16cex w16sdtdh w16sdtfl w16du wp14">
   <w:p>
     <w:pPr>
-      <w:pStyle w:val="Header &amp; Footer"/>
-      <w:bidi w:val="0"/>
+      <w:pStyle w:val="HeaderFooter"/>
     </w:pPr>
-    <w:r/>
   </w:p>
 </w:hdr>
 </file>
 
 <file path=word/numbering.xml><?xml version="1.0" encoding="utf-8"?>
-<w:numbering xmlns:w="http://schemas.openxmlformats.org/wordprocessingml/2006/main" xmlns:wp="http://schemas.openxmlformats.org/drawingml/2006/wordprocessingDrawing" xmlns:w14="http://schemas.microsoft.com/office/word/2010/wordml" xmlns:r="http://schemas.openxmlformats.org/officeDocument/2006/relationships" xmlns:v="urn:schemas-microsoft-com:vml" xmlns:o="urn:schemas-microsoft-com:office:office">
-  <w:abstractNum w:abstractNumId="0">
+<w:numbering xmlns:wpc="http://schemas.microsoft.com/office/word/2010/wordprocessingCanvas" xmlns:cx="http://schemas.microsoft.com/office/drawing/2014/chartex" xmlns:cx1="http://schemas.microsoft.com/office/drawing/2015/9/8/chartex" xmlns:cx2="http://schemas.microsoft.com/office/drawing/2015/10/21/chartex" xmlns:cx3="http://schemas.microsoft.com/office/drawing/2016/5/9/chartex" xmlns:cx4="http://schemas.microsoft.com/office/drawing/2016/5/10/chartex" xmlns:cx5="http://schemas.microsoft.com/office/drawing/2016/5/11/chartex" xmlns:cx6="http://schemas.microsoft.com/office/drawing/2016/5/12/chartex" xmlns:cx7="http://schemas.microsoft.com/office/drawing/2016/5/13/chartex" xmlns:cx8="http://schemas.microsoft.com/office/drawing/2016/5/14/chartex" xmlns:mc="http://schemas.openxmlformats.org/markup-compatibility/2006" xmlns:aink="http://schemas.microsoft.com/office/drawing/2016/ink" xmlns:am3d="http://schemas.microsoft.com/office/drawing/2017/model3d" xmlns:o="urn:schemas-microsoft-com:office:office" xmlns:oel="http://schemas.microsoft.com/office/2019/extlst" xmlns:r="http://schemas.openxmlformats.org/officeDocument/2006/relationships" xmlns:m="http://schemas.openxmlformats.org/officeDocument/2006/math" xmlns:v="urn:schemas-microsoft-com:vml" xmlns:wp14="http://schemas.microsoft.com/office/word/2010/wordprocessingDrawing" xmlns:wp="http://schemas.openxmlformats.org/drawingml/2006/wordprocessingDrawing" xmlns:w10="urn:schemas-microsoft-com:office:word" xmlns:w="http://schemas.openxmlformats.org/wordprocessingml/2006/main" xmlns:w14="http://schemas.microsoft.com/office/word/2010/wordml" xmlns:w15="http://schemas.microsoft.com/office/word/2012/wordml" xmlns:w16cex="http://schemas.microsoft.com/office/word/2018/wordml/cex" xmlns:w16cid="http://schemas.microsoft.com/office/word/2016/wordml/cid" xmlns:w16="http://schemas.microsoft.com/office/word/2018/wordml" xmlns:w16du="http://schemas.microsoft.com/office/word/2023/wordml/word16du" xmlns:w16sdtdh="http://schemas.microsoft.com/office/word/2020/wordml/sdtdatahash" xmlns:w16sdtfl="http://schemas.microsoft.com/office/word/2024/wordml/sdtformatlock" xmlns:w16se="http://schemas.microsoft.com/office/word/2015/wordml/symex" xmlns:wpg="http://schemas.microsoft.com/office/word/2010/wordprocessingGroup" xmlns:wpi="http://schemas.microsoft.com/office/word/2010/wordprocessingInk" xmlns:wne="http://schemas.microsoft.com/office/word/2006/wordml" xmlns:wps="http://schemas.microsoft.com/office/word/2010/wordprocessingShape" mc:Ignorable="w14 w15 w16se w16cid w16 w16cex w16sdtdh w16sdtfl w16du wp14">
+  <w:abstractNum w:abstractNumId="0" w15:restartNumberingAfterBreak="0">
+    <w:nsid w:val="254D3B05"/>
     <w:multiLevelType w:val="hybridMultilevel"/>
-    <w:numStyleLink w:val="Imported Style 1"/>
-  </w:abstractNum>
-  <w:abstractNum w:abstractNumId="1">
-    <w:multiLevelType w:val="hybridMultilevel"/>
-    <w:styleLink w:val="Imported Style 1"/>
-    <w:lvl w:ilvl="0">
+    <w:tmpl w:val="C360BDCC"/>
+    <w:styleLink w:val="ImportedStyle1"/>
+    <w:lvl w:ilvl="0" w:tplc="D08C0A22">
       <w:start w:val="1"/>
       <w:numFmt w:val="bullet"/>
-      <w:suff w:val="tab"/>
       <w:lvlText w:val="·"/>
       <w:lvlJc w:val="left"/>
       <w:pPr>
         <w:ind w:left="720" w:hanging="360"/>
       </w:pPr>
       <w:rPr>
-        <w:rFonts w:ascii="Symbol" w:cs="Symbol" w:hAnsi="Symbol" w:eastAsia="Symbol"/>
+        <w:rFonts w:ascii="Symbol" w:eastAsia="Symbol" w:hAnsi="Symbol" w:cs="Symbol"/>
         <w:b w:val="0"/>
         <w:bCs w:val="0"/>
         <w:i w:val="0"/>
@@ -1726,17 +1309,16 @@
         <w:vertAlign w:val="baseline"/>
       </w:rPr>
     </w:lvl>
-    <w:lvl w:ilvl="1">
+    <w:lvl w:ilvl="1" w:tplc="3530BD36">
       <w:start w:val="1"/>
       <w:numFmt w:val="bullet"/>
-      <w:suff w:val="tab"/>
       <w:lvlText w:val="o"/>
       <w:lvlJc w:val="left"/>
       <w:pPr>
         <w:ind w:left="1440" w:hanging="360"/>
       </w:pPr>
       <w:rPr>
-        <w:rFonts w:ascii="Arial Unicode MS" w:cs="Arial Unicode MS" w:hAnsi="Arial Unicode MS" w:eastAsia="Arial Unicode MS"/>
+        <w:rFonts w:ascii="Arial Unicode MS" w:eastAsia="Arial Unicode MS" w:hAnsi="Arial Unicode MS" w:cs="Arial Unicode MS"/>
         <w:b w:val="0"/>
         <w:bCs w:val="0"/>
         <w:i w:val="0"/>
@@ -1756,17 +1338,16 @@
         <w:vertAlign w:val="baseline"/>
       </w:rPr>
     </w:lvl>
-    <w:lvl w:ilvl="2">
+    <w:lvl w:ilvl="2" w:tplc="373C6C7E">
       <w:start w:val="1"/>
       <w:numFmt w:val="bullet"/>
-      <w:suff w:val="tab"/>
       <w:lvlText w:val="▪"/>
       <w:lvlJc w:val="left"/>
       <w:pPr>
         <w:ind w:left="2160" w:hanging="360"/>
       </w:pPr>
       <w:rPr>
-        <w:rFonts w:ascii="Arial Unicode MS" w:cs="Arial Unicode MS" w:hAnsi="Arial Unicode MS" w:eastAsia="Arial Unicode MS"/>
+        <w:rFonts w:ascii="Arial Unicode MS" w:eastAsia="Arial Unicode MS" w:hAnsi="Arial Unicode MS" w:cs="Arial Unicode MS"/>
         <w:b w:val="0"/>
         <w:bCs w:val="0"/>
         <w:i w:val="0"/>
@@ -1786,17 +1367,16 @@
         <w:vertAlign w:val="baseline"/>
       </w:rPr>
     </w:lvl>
-    <w:lvl w:ilvl="3">
+    <w:lvl w:ilvl="3" w:tplc="8A2E8AFE">
       <w:start w:val="1"/>
       <w:numFmt w:val="bullet"/>
-      <w:suff w:val="tab"/>
       <w:lvlText w:val="·"/>
       <w:lvlJc w:val="left"/>
       <w:pPr>
         <w:ind w:left="2880" w:hanging="360"/>
       </w:pPr>
       <w:rPr>
-        <w:rFonts w:ascii="Symbol" w:cs="Symbol" w:hAnsi="Symbol" w:eastAsia="Symbol"/>
+        <w:rFonts w:ascii="Symbol" w:eastAsia="Symbol" w:hAnsi="Symbol" w:cs="Symbol"/>
         <w:b w:val="0"/>
         <w:bCs w:val="0"/>
         <w:i w:val="0"/>
@@ -1816,17 +1396,16 @@
         <w:vertAlign w:val="baseline"/>
       </w:rPr>
     </w:lvl>
-    <w:lvl w:ilvl="4">
+    <w:lvl w:ilvl="4" w:tplc="B212E2CA">
       <w:start w:val="1"/>
       <w:numFmt w:val="bullet"/>
-      <w:suff w:val="tab"/>
       <w:lvlText w:val="o"/>
       <w:lvlJc w:val="left"/>
       <w:pPr>
         <w:ind w:left="3600" w:hanging="360"/>
       </w:pPr>
       <w:rPr>
-        <w:rFonts w:ascii="Arial Unicode MS" w:cs="Arial Unicode MS" w:hAnsi="Arial Unicode MS" w:eastAsia="Arial Unicode MS"/>
+        <w:rFonts w:ascii="Arial Unicode MS" w:eastAsia="Arial Unicode MS" w:hAnsi="Arial Unicode MS" w:cs="Arial Unicode MS"/>
         <w:b w:val="0"/>
         <w:bCs w:val="0"/>
         <w:i w:val="0"/>
@@ -1846,17 +1425,16 @@
         <w:vertAlign w:val="baseline"/>
       </w:rPr>
     </w:lvl>
-    <w:lvl w:ilvl="5">
+    <w:lvl w:ilvl="5" w:tplc="1B6EA68C">
       <w:start w:val="1"/>
       <w:numFmt w:val="bullet"/>
-      <w:suff w:val="tab"/>
       <w:lvlText w:val="▪"/>
       <w:lvlJc w:val="left"/>
       <w:pPr>
         <w:ind w:left="4320" w:hanging="360"/>
       </w:pPr>
       <w:rPr>
-        <w:rFonts w:ascii="Arial Unicode MS" w:cs="Arial Unicode MS" w:hAnsi="Arial Unicode MS" w:eastAsia="Arial Unicode MS"/>
+        <w:rFonts w:ascii="Arial Unicode MS" w:eastAsia="Arial Unicode MS" w:hAnsi="Arial Unicode MS" w:cs="Arial Unicode MS"/>
         <w:b w:val="0"/>
         <w:bCs w:val="0"/>
         <w:i w:val="0"/>
@@ -1876,17 +1454,16 @@
         <w:vertAlign w:val="baseline"/>
       </w:rPr>
     </w:lvl>
-    <w:lvl w:ilvl="6">
+    <w:lvl w:ilvl="6" w:tplc="F82E8428">
       <w:start w:val="1"/>
       <w:numFmt w:val="bullet"/>
-      <w:suff w:val="tab"/>
       <w:lvlText w:val="·"/>
       <w:lvlJc w:val="left"/>
       <w:pPr>
         <w:ind w:left="5040" w:hanging="360"/>
       </w:pPr>
       <w:rPr>
-        <w:rFonts w:ascii="Symbol" w:cs="Symbol" w:hAnsi="Symbol" w:eastAsia="Symbol"/>
+        <w:rFonts w:ascii="Symbol" w:eastAsia="Symbol" w:hAnsi="Symbol" w:cs="Symbol"/>
         <w:b w:val="0"/>
         <w:bCs w:val="0"/>
         <w:i w:val="0"/>
@@ -1906,17 +1483,16 @@
         <w:vertAlign w:val="baseline"/>
       </w:rPr>
     </w:lvl>
-    <w:lvl w:ilvl="7">
+    <w:lvl w:ilvl="7" w:tplc="91504F04">
       <w:start w:val="1"/>
       <w:numFmt w:val="bullet"/>
-      <w:suff w:val="tab"/>
       <w:lvlText w:val="o"/>
       <w:lvlJc w:val="left"/>
       <w:pPr>
         <w:ind w:left="5760" w:hanging="360"/>
       </w:pPr>
       <w:rPr>
-        <w:rFonts w:ascii="Arial Unicode MS" w:cs="Arial Unicode MS" w:hAnsi="Arial Unicode MS" w:eastAsia="Arial Unicode MS"/>
+        <w:rFonts w:ascii="Arial Unicode MS" w:eastAsia="Arial Unicode MS" w:hAnsi="Arial Unicode MS" w:cs="Arial Unicode MS"/>
         <w:b w:val="0"/>
         <w:bCs w:val="0"/>
         <w:i w:val="0"/>
@@ -1936,17 +1512,16 @@
         <w:vertAlign w:val="baseline"/>
       </w:rPr>
     </w:lvl>
-    <w:lvl w:ilvl="8">
+    <w:lvl w:ilvl="8" w:tplc="E30CF98A">
       <w:start w:val="1"/>
       <w:numFmt w:val="bullet"/>
-      <w:suff w:val="tab"/>
       <w:lvlText w:val="▪"/>
       <w:lvlJc w:val="left"/>
       <w:pPr>
         <w:ind w:left="6480" w:hanging="360"/>
       </w:pPr>
       <w:rPr>
-        <w:rFonts w:ascii="Arial Unicode MS" w:cs="Arial Unicode MS" w:hAnsi="Arial Unicode MS" w:eastAsia="Arial Unicode MS"/>
+        <w:rFonts w:ascii="Arial Unicode MS" w:eastAsia="Arial Unicode MS" w:hAnsi="Arial Unicode MS" w:cs="Arial Unicode MS"/>
         <w:b w:val="0"/>
         <w:bCs w:val="0"/>
         <w:i w:val="0"/>
@@ -1967,24 +1542,21 @@
       </w:rPr>
     </w:lvl>
   </w:abstractNum>
-  <w:abstractNum w:abstractNumId="2">
+  <w:abstractNum w:abstractNumId="1" w15:restartNumberingAfterBreak="0">
+    <w:nsid w:val="4EBA73C1"/>
     <w:multiLevelType w:val="hybridMultilevel"/>
-    <w:numStyleLink w:val="Imported Style 2"/>
-  </w:abstractNum>
-  <w:abstractNum w:abstractNumId="3">
-    <w:multiLevelType w:val="hybridMultilevel"/>
-    <w:styleLink w:val="Imported Style 2"/>
-    <w:lvl w:ilvl="0">
+    <w:tmpl w:val="FE5EFFFC"/>
+    <w:styleLink w:val="ImportedStyle2"/>
+    <w:lvl w:ilvl="0" w:tplc="06786B64">
       <w:start w:val="1"/>
       <w:numFmt w:val="bullet"/>
-      <w:suff w:val="tab"/>
       <w:lvlText w:val="·"/>
       <w:lvlJc w:val="left"/>
       <w:pPr>
         <w:ind w:left="720" w:hanging="360"/>
       </w:pPr>
       <w:rPr>
-        <w:rFonts w:ascii="Symbol" w:cs="Symbol" w:hAnsi="Symbol" w:eastAsia="Symbol"/>
+        <w:rFonts w:ascii="Symbol" w:eastAsia="Symbol" w:hAnsi="Symbol" w:cs="Symbol"/>
         <w:b w:val="0"/>
         <w:bCs w:val="0"/>
         <w:i w:val="0"/>
@@ -2004,17 +1576,16 @@
         <w:vertAlign w:val="baseline"/>
       </w:rPr>
     </w:lvl>
-    <w:lvl w:ilvl="1">
+    <w:lvl w:ilvl="1" w:tplc="37485708">
       <w:start w:val="1"/>
       <w:numFmt w:val="bullet"/>
-      <w:suff w:val="tab"/>
       <w:lvlText w:val="o"/>
       <w:lvlJc w:val="left"/>
       <w:pPr>
         <w:ind w:left="1440" w:hanging="360"/>
       </w:pPr>
       <w:rPr>
-        <w:rFonts w:ascii="Arial Unicode MS" w:cs="Arial Unicode MS" w:hAnsi="Arial Unicode MS" w:eastAsia="Arial Unicode MS"/>
+        <w:rFonts w:ascii="Arial Unicode MS" w:eastAsia="Arial Unicode MS" w:hAnsi="Arial Unicode MS" w:cs="Arial Unicode MS"/>
         <w:b w:val="0"/>
         <w:bCs w:val="0"/>
         <w:i w:val="0"/>
@@ -2034,17 +1605,16 @@
         <w:vertAlign w:val="baseline"/>
       </w:rPr>
     </w:lvl>
-    <w:lvl w:ilvl="2">
+    <w:lvl w:ilvl="2" w:tplc="55C619D6">
       <w:start w:val="1"/>
       <w:numFmt w:val="bullet"/>
-      <w:suff w:val="tab"/>
       <w:lvlText w:val="▪"/>
       <w:lvlJc w:val="left"/>
       <w:pPr>
         <w:ind w:left="2160" w:hanging="360"/>
       </w:pPr>
       <w:rPr>
-        <w:rFonts w:ascii="Arial Unicode MS" w:cs="Arial Unicode MS" w:hAnsi="Arial Unicode MS" w:eastAsia="Arial Unicode MS"/>
+        <w:rFonts w:ascii="Arial Unicode MS" w:eastAsia="Arial Unicode MS" w:hAnsi="Arial Unicode MS" w:cs="Arial Unicode MS"/>
         <w:b w:val="0"/>
         <w:bCs w:val="0"/>
         <w:i w:val="0"/>
@@ -2064,17 +1634,16 @@
         <w:vertAlign w:val="baseline"/>
       </w:rPr>
     </w:lvl>
-    <w:lvl w:ilvl="3">
+    <w:lvl w:ilvl="3" w:tplc="67D275FA">
       <w:start w:val="1"/>
       <w:numFmt w:val="bullet"/>
-      <w:suff w:val="tab"/>
       <w:lvlText w:val="·"/>
       <w:lvlJc w:val="left"/>
       <w:pPr>
         <w:ind w:left="2880" w:hanging="360"/>
       </w:pPr>
       <w:rPr>
-        <w:rFonts w:ascii="Symbol" w:cs="Symbol" w:hAnsi="Symbol" w:eastAsia="Symbol"/>
+        <w:rFonts w:ascii="Symbol" w:eastAsia="Symbol" w:hAnsi="Symbol" w:cs="Symbol"/>
         <w:b w:val="0"/>
         <w:bCs w:val="0"/>
         <w:i w:val="0"/>
@@ -2094,17 +1663,16 @@
         <w:vertAlign w:val="baseline"/>
       </w:rPr>
     </w:lvl>
-    <w:lvl w:ilvl="4">
+    <w:lvl w:ilvl="4" w:tplc="7B24A88E">
       <w:start w:val="1"/>
       <w:numFmt w:val="bullet"/>
-      <w:suff w:val="tab"/>
       <w:lvlText w:val="o"/>
       <w:lvlJc w:val="left"/>
       <w:pPr>
         <w:ind w:left="3600" w:hanging="360"/>
       </w:pPr>
       <w:rPr>
-        <w:rFonts w:ascii="Arial Unicode MS" w:cs="Arial Unicode MS" w:hAnsi="Arial Unicode MS" w:eastAsia="Arial Unicode MS"/>
+        <w:rFonts w:ascii="Arial Unicode MS" w:eastAsia="Arial Unicode MS" w:hAnsi="Arial Unicode MS" w:cs="Arial Unicode MS"/>
         <w:b w:val="0"/>
         <w:bCs w:val="0"/>
         <w:i w:val="0"/>
@@ -2124,17 +1692,16 @@
         <w:vertAlign w:val="baseline"/>
       </w:rPr>
     </w:lvl>
-    <w:lvl w:ilvl="5">
+    <w:lvl w:ilvl="5" w:tplc="D28E4CCE">
       <w:start w:val="1"/>
       <w:numFmt w:val="bullet"/>
-      <w:suff w:val="tab"/>
       <w:lvlText w:val="▪"/>
       <w:lvlJc w:val="left"/>
       <w:pPr>
         <w:ind w:left="4320" w:hanging="360"/>
       </w:pPr>
       <w:rPr>
-        <w:rFonts w:ascii="Arial Unicode MS" w:cs="Arial Unicode MS" w:hAnsi="Arial Unicode MS" w:eastAsia="Arial Unicode MS"/>
+        <w:rFonts w:ascii="Arial Unicode MS" w:eastAsia="Arial Unicode MS" w:hAnsi="Arial Unicode MS" w:cs="Arial Unicode MS"/>
         <w:b w:val="0"/>
         <w:bCs w:val="0"/>
         <w:i w:val="0"/>
@@ -2154,17 +1721,16 @@
         <w:vertAlign w:val="baseline"/>
       </w:rPr>
     </w:lvl>
-    <w:lvl w:ilvl="6">
+    <w:lvl w:ilvl="6" w:tplc="DB28147C">
       <w:start w:val="1"/>
       <w:numFmt w:val="bullet"/>
-      <w:suff w:val="tab"/>
       <w:lvlText w:val="·"/>
       <w:lvlJc w:val="left"/>
       <w:pPr>
         <w:ind w:left="5040" w:hanging="360"/>
       </w:pPr>
       <w:rPr>
-        <w:rFonts w:ascii="Symbol" w:cs="Symbol" w:hAnsi="Symbol" w:eastAsia="Symbol"/>
+        <w:rFonts w:ascii="Symbol" w:eastAsia="Symbol" w:hAnsi="Symbol" w:cs="Symbol"/>
         <w:b w:val="0"/>
         <w:bCs w:val="0"/>
         <w:i w:val="0"/>
@@ -2184,17 +1750,16 @@
         <w:vertAlign w:val="baseline"/>
       </w:rPr>
     </w:lvl>
-    <w:lvl w:ilvl="7">
+    <w:lvl w:ilvl="7" w:tplc="23827800">
       <w:start w:val="1"/>
       <w:numFmt w:val="bullet"/>
-      <w:suff w:val="tab"/>
       <w:lvlText w:val="o"/>
       <w:lvlJc w:val="left"/>
       <w:pPr>
         <w:ind w:left="5760" w:hanging="360"/>
       </w:pPr>
       <w:rPr>
-        <w:rFonts w:ascii="Arial Unicode MS" w:cs="Arial Unicode MS" w:hAnsi="Arial Unicode MS" w:eastAsia="Arial Unicode MS"/>
+        <w:rFonts w:ascii="Arial Unicode MS" w:eastAsia="Arial Unicode MS" w:hAnsi="Arial Unicode MS" w:cs="Arial Unicode MS"/>
         <w:b w:val="0"/>
         <w:bCs w:val="0"/>
         <w:i w:val="0"/>
@@ -2214,17 +1779,16 @@
         <w:vertAlign w:val="baseline"/>
       </w:rPr>
     </w:lvl>
-    <w:lvl w:ilvl="8">
+    <w:lvl w:ilvl="8" w:tplc="0CBC09C0">
       <w:start w:val="1"/>
       <w:numFmt w:val="bullet"/>
-      <w:suff w:val="tab"/>
       <w:lvlText w:val="▪"/>
       <w:lvlJc w:val="left"/>
       <w:pPr>
         <w:ind w:left="6480" w:hanging="360"/>
       </w:pPr>
       <w:rPr>
-        <w:rFonts w:ascii="Arial Unicode MS" w:cs="Arial Unicode MS" w:hAnsi="Arial Unicode MS" w:eastAsia="Arial Unicode MS"/>
+        <w:rFonts w:ascii="Arial Unicode MS" w:eastAsia="Arial Unicode MS" w:hAnsi="Arial Unicode MS" w:cs="Arial Unicode MS"/>
         <w:b w:val="0"/>
         <w:bCs w:val="0"/>
         <w:i w:val="0"/>
@@ -2245,64 +1809,197 @@
       </w:rPr>
     </w:lvl>
   </w:abstractNum>
-  <w:num w:numId="1">
+  <w:abstractNum w:abstractNumId="2" w15:restartNumberingAfterBreak="0">
+    <w:nsid w:val="563B4A91"/>
+    <w:multiLevelType w:val="multilevel"/>
+    <w:tmpl w:val="BE84763E"/>
+    <w:lvl w:ilvl="0">
+      <w:start w:val="1"/>
+      <w:numFmt w:val="bullet"/>
+      <w:lvlText w:val=""/>
+      <w:lvlJc w:val="left"/>
+      <w:pPr>
+        <w:tabs>
+          <w:tab w:val="num" w:pos="720"/>
+        </w:tabs>
+        <w:ind w:left="720" w:hanging="360"/>
+      </w:pPr>
+      <w:rPr>
+        <w:rFonts w:ascii="Symbol" w:hAnsi="Symbol" w:hint="default"/>
+        <w:sz w:val="20"/>
+      </w:rPr>
+    </w:lvl>
+    <w:lvl w:ilvl="1" w:tentative="1">
+      <w:start w:val="1"/>
+      <w:numFmt w:val="bullet"/>
+      <w:lvlText w:val="o"/>
+      <w:lvlJc w:val="left"/>
+      <w:pPr>
+        <w:tabs>
+          <w:tab w:val="num" w:pos="1440"/>
+        </w:tabs>
+        <w:ind w:left="1440" w:hanging="360"/>
+      </w:pPr>
+      <w:rPr>
+        <w:rFonts w:ascii="Courier New" w:hAnsi="Courier New" w:hint="default"/>
+        <w:sz w:val="20"/>
+      </w:rPr>
+    </w:lvl>
+    <w:lvl w:ilvl="2" w:tentative="1">
+      <w:start w:val="1"/>
+      <w:numFmt w:val="bullet"/>
+      <w:lvlText w:val=""/>
+      <w:lvlJc w:val="left"/>
+      <w:pPr>
+        <w:tabs>
+          <w:tab w:val="num" w:pos="2160"/>
+        </w:tabs>
+        <w:ind w:left="2160" w:hanging="360"/>
+      </w:pPr>
+      <w:rPr>
+        <w:rFonts w:ascii="Wingdings" w:hAnsi="Wingdings" w:hint="default"/>
+        <w:sz w:val="20"/>
+      </w:rPr>
+    </w:lvl>
+    <w:lvl w:ilvl="3" w:tentative="1">
+      <w:start w:val="1"/>
+      <w:numFmt w:val="bullet"/>
+      <w:lvlText w:val=""/>
+      <w:lvlJc w:val="left"/>
+      <w:pPr>
+        <w:tabs>
+          <w:tab w:val="num" w:pos="2880"/>
+        </w:tabs>
+        <w:ind w:left="2880" w:hanging="360"/>
+      </w:pPr>
+      <w:rPr>
+        <w:rFonts w:ascii="Wingdings" w:hAnsi="Wingdings" w:hint="default"/>
+        <w:sz w:val="20"/>
+      </w:rPr>
+    </w:lvl>
+    <w:lvl w:ilvl="4" w:tentative="1">
+      <w:start w:val="1"/>
+      <w:numFmt w:val="bullet"/>
+      <w:lvlText w:val=""/>
+      <w:lvlJc w:val="left"/>
+      <w:pPr>
+        <w:tabs>
+          <w:tab w:val="num" w:pos="3600"/>
+        </w:tabs>
+        <w:ind w:left="3600" w:hanging="360"/>
+      </w:pPr>
+      <w:rPr>
+        <w:rFonts w:ascii="Wingdings" w:hAnsi="Wingdings" w:hint="default"/>
+        <w:sz w:val="20"/>
+      </w:rPr>
+    </w:lvl>
+    <w:lvl w:ilvl="5" w:tentative="1">
+      <w:start w:val="1"/>
+      <w:numFmt w:val="bullet"/>
+      <w:lvlText w:val=""/>
+      <w:lvlJc w:val="left"/>
+      <w:pPr>
+        <w:tabs>
+          <w:tab w:val="num" w:pos="4320"/>
+        </w:tabs>
+        <w:ind w:left="4320" w:hanging="360"/>
+      </w:pPr>
+      <w:rPr>
+        <w:rFonts w:ascii="Wingdings" w:hAnsi="Wingdings" w:hint="default"/>
+        <w:sz w:val="20"/>
+      </w:rPr>
+    </w:lvl>
+    <w:lvl w:ilvl="6" w:tentative="1">
+      <w:start w:val="1"/>
+      <w:numFmt w:val="bullet"/>
+      <w:lvlText w:val=""/>
+      <w:lvlJc w:val="left"/>
+      <w:pPr>
+        <w:tabs>
+          <w:tab w:val="num" w:pos="5040"/>
+        </w:tabs>
+        <w:ind w:left="5040" w:hanging="360"/>
+      </w:pPr>
+      <w:rPr>
+        <w:rFonts w:ascii="Wingdings" w:hAnsi="Wingdings" w:hint="default"/>
+        <w:sz w:val="20"/>
+      </w:rPr>
+    </w:lvl>
+    <w:lvl w:ilvl="7" w:tentative="1">
+      <w:start w:val="1"/>
+      <w:numFmt w:val="bullet"/>
+      <w:lvlText w:val=""/>
+      <w:lvlJc w:val="left"/>
+      <w:pPr>
+        <w:tabs>
+          <w:tab w:val="num" w:pos="5760"/>
+        </w:tabs>
+        <w:ind w:left="5760" w:hanging="360"/>
+      </w:pPr>
+      <w:rPr>
+        <w:rFonts w:ascii="Wingdings" w:hAnsi="Wingdings" w:hint="default"/>
+        <w:sz w:val="20"/>
+      </w:rPr>
+    </w:lvl>
+    <w:lvl w:ilvl="8" w:tentative="1">
+      <w:start w:val="1"/>
+      <w:numFmt w:val="bullet"/>
+      <w:lvlText w:val=""/>
+      <w:lvlJc w:val="left"/>
+      <w:pPr>
+        <w:tabs>
+          <w:tab w:val="num" w:pos="6480"/>
+        </w:tabs>
+        <w:ind w:left="6480" w:hanging="360"/>
+      </w:pPr>
+      <w:rPr>
+        <w:rFonts w:ascii="Wingdings" w:hAnsi="Wingdings" w:hint="default"/>
+        <w:sz w:val="20"/>
+      </w:rPr>
+    </w:lvl>
+  </w:abstractNum>
+  <w:abstractNum w:abstractNumId="3" w15:restartNumberingAfterBreak="0">
+    <w:nsid w:val="59D763ED"/>
+    <w:multiLevelType w:val="hybridMultilevel"/>
+    <w:tmpl w:val="C360BDCC"/>
+    <w:numStyleLink w:val="ImportedStyle1"/>
+  </w:abstractNum>
+  <w:abstractNum w:abstractNumId="4" w15:restartNumberingAfterBreak="0">
+    <w:nsid w:val="661C07F8"/>
+    <w:multiLevelType w:val="hybridMultilevel"/>
+    <w:tmpl w:val="FE5EFFFC"/>
+    <w:numStyleLink w:val="ImportedStyle2"/>
+  </w:abstractNum>
+  <w:num w:numId="1" w16cid:durableId="287515309">
+    <w:abstractNumId w:val="0"/>
+  </w:num>
+  <w:num w:numId="2" w16cid:durableId="1609003185">
+    <w:abstractNumId w:val="3"/>
+  </w:num>
+  <w:num w:numId="3" w16cid:durableId="1576741720">
     <w:abstractNumId w:val="1"/>
   </w:num>
-  <w:num w:numId="2">
-    <w:abstractNumId w:val="0"/>
+  <w:num w:numId="4" w16cid:durableId="2037078847">
+    <w:abstractNumId w:val="4"/>
   </w:num>
-  <w:num w:numId="3">
-    <w:abstractNumId w:val="3"/>
-  </w:num>
-  <w:num w:numId="4">
+  <w:num w:numId="5" w16cid:durableId="1579826068">
     <w:abstractNumId w:val="2"/>
   </w:num>
 </w:numbering>
 </file>
 
 <file path=word/styles.xml><?xml version="1.0" encoding="utf-8"?>
-<w:styles xmlns:w="http://schemas.openxmlformats.org/wordprocessingml/2006/main" xmlns:mc="http://schemas.openxmlformats.org/markup-compatibility/2006" xmlns:w14="http://schemas.microsoft.com/office/word/2010/wordml" mc:Ignorable="w14">
+<w:styles xmlns:mc="http://schemas.openxmlformats.org/markup-compatibility/2006" xmlns:r="http://schemas.openxmlformats.org/officeDocument/2006/relationships" xmlns:w="http://schemas.openxmlformats.org/wordprocessingml/2006/main" xmlns:w14="http://schemas.microsoft.com/office/word/2010/wordml" xmlns:w15="http://schemas.microsoft.com/office/word/2012/wordml" xmlns:w16cex="http://schemas.microsoft.com/office/word/2018/wordml/cex" xmlns:w16cid="http://schemas.microsoft.com/office/word/2016/wordml/cid" xmlns:w16="http://schemas.microsoft.com/office/word/2018/wordml" xmlns:w16du="http://schemas.microsoft.com/office/word/2023/wordml/word16du" xmlns:w16sdtdh="http://schemas.microsoft.com/office/word/2020/wordml/sdtdatahash" xmlns:w16sdtfl="http://schemas.microsoft.com/office/word/2024/wordml/sdtformatlock" xmlns:w16se="http://schemas.microsoft.com/office/word/2015/wordml/symex" mc:Ignorable="w14 w15 w16se w16cid w16 w16cex w16sdtdh w16sdtfl w16du">
   <w:docDefaults>
     <w:rPrDefault>
       <w:rPr>
-        <w:rFonts w:ascii="Times New Roman" w:cs="Times New Roman" w:hAnsi="Times New Roman" w:eastAsia="Arial Unicode MS"/>
-        <w:b w:val="0"/>
-        <w:bCs w:val="0"/>
-        <w:i w:val="0"/>
-        <w:iCs w:val="0"/>
-        <w:caps w:val="0"/>
-        <w:smallCaps w:val="0"/>
-        <w:strike w:val="0"/>
-        <w:dstrike w:val="0"/>
-        <w:outline w:val="0"/>
-        <w:emboss w:val="0"/>
-        <w:imprint w:val="0"/>
-        <w:vanish w:val="0"/>
-        <w:color w:val="auto"/>
-        <w:spacing w:val="0"/>
-        <w:w w:val="100"/>
-        <w:kern w:val="0"/>
-        <w:position w:val="0"/>
-        <w:sz w:val="20"/>
-        <w:szCs w:val="20"/>
-        <w:u w:val="none" w:color="auto"/>
+        <w:rFonts w:ascii="Times New Roman" w:eastAsia="Arial Unicode MS" w:hAnsi="Times New Roman" w:cs="Times New Roman"/>
         <w:bdr w:val="nil"/>
-        <w:vertAlign w:val="baseline"/>
-        <w:lang/>
+        <w:lang w:val="en-US" w:eastAsia="en-US" w:bidi="ar-SA"/>
       </w:rPr>
     </w:rPrDefault>
     <w:pPrDefault>
       <w:pPr>
-        <w:keepNext w:val="0"/>
-        <w:keepLines w:val="0"/>
-        <w:pageBreakBefore w:val="0"/>
-        <w:framePr w:anchorLock="0" w:w="0" w:h="0" w:vSpace="0" w:hSpace="0" w:xAlign="left" w:y="0" w:hRule="exact" w:vAnchor="margin"/>
-        <w:widowControl w:val="1"/>
-        <w:numPr>
-          <w:ilvl w:val="0"/>
-          <w:numId w:val="0"/>
-        </w:numPr>
-        <w:suppressLineNumbers w:val="0"/>
         <w:pBdr>
           <w:top w:val="nil"/>
           <w:left w:val="nil"/>
@@ -2311,28 +2008,420 @@
           <w:between w:val="nil"/>
           <w:bar w:val="nil"/>
         </w:pBdr>
-        <w:shd w:val="clear" w:color="auto" w:fill="auto"/>
-        <w:suppressAutoHyphens w:val="0"/>
-        <w:spacing w:before="0" w:beforeAutospacing="0" w:after="0" w:afterAutospacing="0" w:line="240" w:lineRule="auto"/>
-        <w:ind w:left="0" w:right="0" w:firstLine="0"/>
-        <w:jc w:val="left"/>
-        <w:outlineLvl w:val="9"/>
       </w:pPr>
     </w:pPrDefault>
   </w:docDefaults>
+  <w:latentStyles w:defLockedState="0" w:defUIPriority="99" w:defSemiHidden="0" w:defUnhideWhenUsed="0" w:defQFormat="0" w:count="376">
+    <w:lsdException w:name="Normal" w:uiPriority="0" w:qFormat="1"/>
+    <w:lsdException w:name="heading 1" w:uiPriority="9" w:qFormat="1"/>
+    <w:lsdException w:name="heading 2" w:semiHidden="1" w:uiPriority="9" w:unhideWhenUsed="1" w:qFormat="1"/>
+    <w:lsdException w:name="heading 3" w:semiHidden="1" w:uiPriority="9" w:unhideWhenUsed="1" w:qFormat="1"/>
+    <w:lsdException w:name="heading 4" w:semiHidden="1" w:uiPriority="9" w:unhideWhenUsed="1" w:qFormat="1"/>
+    <w:lsdException w:name="heading 5" w:semiHidden="1" w:uiPriority="9" w:unhideWhenUsed="1" w:qFormat="1"/>
+    <w:lsdException w:name="heading 6" w:semiHidden="1" w:uiPriority="9" w:unhideWhenUsed="1" w:qFormat="1"/>
+    <w:lsdException w:name="heading 7" w:semiHidden="1" w:uiPriority="9" w:unhideWhenUsed="1" w:qFormat="1"/>
+    <w:lsdException w:name="heading 8" w:semiHidden="1" w:uiPriority="9" w:unhideWhenUsed="1" w:qFormat="1"/>
+    <w:lsdException w:name="heading 9" w:semiHidden="1" w:uiPriority="9" w:unhideWhenUsed="1" w:qFormat="1"/>
+    <w:lsdException w:name="index 1" w:semiHidden="1" w:unhideWhenUsed="1"/>
+    <w:lsdException w:name="index 2" w:semiHidden="1" w:unhideWhenUsed="1"/>
+    <w:lsdException w:name="index 3" w:semiHidden="1" w:unhideWhenUsed="1"/>
+    <w:lsdException w:name="index 4" w:semiHidden="1" w:unhideWhenUsed="1"/>
+    <w:lsdException w:name="index 5" w:semiHidden="1" w:unhideWhenUsed="1"/>
+    <w:lsdException w:name="index 6" w:semiHidden="1" w:unhideWhenUsed="1"/>
+    <w:lsdException w:name="index 7" w:semiHidden="1" w:unhideWhenUsed="1"/>
+    <w:lsdException w:name="index 8" w:semiHidden="1" w:unhideWhenUsed="1"/>
+    <w:lsdException w:name="index 9" w:semiHidden="1" w:unhideWhenUsed="1"/>
+    <w:lsdException w:name="toc 1" w:semiHidden="1" w:uiPriority="39" w:unhideWhenUsed="1"/>
+    <w:lsdException w:name="toc 2" w:semiHidden="1" w:uiPriority="39" w:unhideWhenUsed="1"/>
+    <w:lsdException w:name="toc 3" w:semiHidden="1" w:uiPriority="39" w:unhideWhenUsed="1"/>
+    <w:lsdException w:name="toc 4" w:semiHidden="1" w:uiPriority="39" w:unhideWhenUsed="1"/>
+    <w:lsdException w:name="toc 5" w:semiHidden="1" w:uiPriority="39" w:unhideWhenUsed="1"/>
+    <w:lsdException w:name="toc 6" w:semiHidden="1" w:uiPriority="39" w:unhideWhenUsed="1"/>
+    <w:lsdException w:name="toc 7" w:semiHidden="1" w:uiPriority="39" w:unhideWhenUsed="1"/>
+    <w:lsdException w:name="toc 8" w:semiHidden="1" w:uiPriority="39" w:unhideWhenUsed="1"/>
+    <w:lsdException w:name="toc 9" w:semiHidden="1" w:uiPriority="39" w:unhideWhenUsed="1"/>
+    <w:lsdException w:name="Normal Indent" w:semiHidden="1" w:unhideWhenUsed="1"/>
+    <w:lsdException w:name="footnote text" w:semiHidden="1" w:unhideWhenUsed="1"/>
+    <w:lsdException w:name="annotation text" w:semiHidden="1" w:unhideWhenUsed="1"/>
+    <w:lsdException w:name="header" w:semiHidden="1" w:unhideWhenUsed="1"/>
+    <w:lsdException w:name="footer" w:semiHidden="1" w:unhideWhenUsed="1"/>
+    <w:lsdException w:name="index heading" w:semiHidden="1" w:unhideWhenUsed="1"/>
+    <w:lsdException w:name="caption" w:semiHidden="1" w:uiPriority="35" w:unhideWhenUsed="1" w:qFormat="1"/>
+    <w:lsdException w:name="table of figures" w:semiHidden="1" w:unhideWhenUsed="1"/>
+    <w:lsdException w:name="envelope address" w:semiHidden="1" w:unhideWhenUsed="1"/>
+    <w:lsdException w:name="envelope return" w:semiHidden="1" w:unhideWhenUsed="1"/>
+    <w:lsdException w:name="footnote reference" w:semiHidden="1" w:unhideWhenUsed="1"/>
+    <w:lsdException w:name="annotation reference" w:semiHidden="1" w:unhideWhenUsed="1"/>
+    <w:lsdException w:name="line number" w:semiHidden="1" w:unhideWhenUsed="1"/>
+    <w:lsdException w:name="page number" w:semiHidden="1" w:unhideWhenUsed="1"/>
+    <w:lsdException w:name="endnote reference" w:semiHidden="1" w:unhideWhenUsed="1"/>
+    <w:lsdException w:name="endnote text" w:semiHidden="1" w:unhideWhenUsed="1"/>
+    <w:lsdException w:name="table of authorities" w:semiHidden="1" w:unhideWhenUsed="1"/>
+    <w:lsdException w:name="macro" w:semiHidden="1" w:unhideWhenUsed="1"/>
+    <w:lsdException w:name="toa heading" w:semiHidden="1" w:unhideWhenUsed="1"/>
+    <w:lsdException w:name="List" w:semiHidden="1" w:unhideWhenUsed="1"/>
+    <w:lsdException w:name="List Bullet" w:semiHidden="1" w:unhideWhenUsed="1"/>
+    <w:lsdException w:name="List Number" w:semiHidden="1" w:unhideWhenUsed="1"/>
+    <w:lsdException w:name="List 2" w:semiHidden="1" w:unhideWhenUsed="1"/>
+    <w:lsdException w:name="List 3" w:semiHidden="1" w:unhideWhenUsed="1"/>
+    <w:lsdException w:name="List 4" w:semiHidden="1" w:unhideWhenUsed="1"/>
+    <w:lsdException w:name="List 5" w:semiHidden="1" w:unhideWhenUsed="1"/>
+    <w:lsdException w:name="List Bullet 2" w:semiHidden="1" w:unhideWhenUsed="1"/>
+    <w:lsdException w:name="List Bullet 3" w:semiHidden="1" w:unhideWhenUsed="1"/>
+    <w:lsdException w:name="List Bullet 4" w:semiHidden="1" w:unhideWhenUsed="1"/>
+    <w:lsdException w:name="List Bullet 5" w:semiHidden="1" w:unhideWhenUsed="1"/>
+    <w:lsdException w:name="List Number 2" w:semiHidden="1" w:unhideWhenUsed="1"/>
+    <w:lsdException w:name="List Number 3" w:semiHidden="1" w:unhideWhenUsed="1"/>
+    <w:lsdException w:name="List Number 4" w:semiHidden="1" w:unhideWhenUsed="1"/>
+    <w:lsdException w:name="List Number 5" w:semiHidden="1" w:unhideWhenUsed="1"/>
+    <w:lsdException w:name="Title" w:uiPriority="10" w:qFormat="1"/>
+    <w:lsdException w:name="Closing" w:semiHidden="1" w:unhideWhenUsed="1"/>
+    <w:lsdException w:name="Signature" w:semiHidden="1" w:unhideWhenUsed="1"/>
+    <w:lsdException w:name="Default Paragraph Font" w:semiHidden="1" w:uiPriority="1" w:unhideWhenUsed="1"/>
+    <w:lsdException w:name="Body Text" w:semiHidden="1" w:unhideWhenUsed="1"/>
+    <w:lsdException w:name="Body Text Indent" w:semiHidden="1" w:unhideWhenUsed="1"/>
+    <w:lsdException w:name="List Continue" w:semiHidden="1" w:unhideWhenUsed="1"/>
+    <w:lsdException w:name="List Continue 2" w:semiHidden="1" w:unhideWhenUsed="1"/>
+    <w:lsdException w:name="List Continue 3" w:semiHidden="1" w:unhideWhenUsed="1"/>
+    <w:lsdException w:name="List Continue 4" w:semiHidden="1" w:unhideWhenUsed="1"/>
+    <w:lsdException w:name="List Continue 5" w:semiHidden="1" w:unhideWhenUsed="1"/>
+    <w:lsdException w:name="Message Header" w:semiHidden="1" w:unhideWhenUsed="1"/>
+    <w:lsdException w:name="Subtitle" w:uiPriority="11" w:qFormat="1"/>
+    <w:lsdException w:name="Salutation" w:semiHidden="1" w:unhideWhenUsed="1"/>
+    <w:lsdException w:name="Date" w:semiHidden="1" w:unhideWhenUsed="1"/>
+    <w:lsdException w:name="Body Text First Indent" w:semiHidden="1" w:unhideWhenUsed="1"/>
+    <w:lsdException w:name="Body Text First Indent 2" w:semiHidden="1" w:unhideWhenUsed="1"/>
+    <w:lsdException w:name="Note Heading" w:semiHidden="1" w:unhideWhenUsed="1"/>
+    <w:lsdException w:name="Body Text 2" w:semiHidden="1" w:unhideWhenUsed="1"/>
+    <w:lsdException w:name="Body Text 3" w:semiHidden="1" w:unhideWhenUsed="1"/>
+    <w:lsdException w:name="Body Text Indent 2" w:semiHidden="1" w:unhideWhenUsed="1"/>
+    <w:lsdException w:name="Body Text Indent 3" w:semiHidden="1" w:unhideWhenUsed="1"/>
+    <w:lsdException w:name="Block Text" w:semiHidden="1" w:unhideWhenUsed="1"/>
+    <w:lsdException w:name="Hyperlink" w:semiHidden="1" w:unhideWhenUsed="1"/>
+    <w:lsdException w:name="FollowedHyperlink" w:semiHidden="1" w:unhideWhenUsed="1"/>
+    <w:lsdException w:name="Strong" w:uiPriority="22" w:qFormat="1"/>
+    <w:lsdException w:name="Emphasis" w:uiPriority="20" w:qFormat="1"/>
+    <w:lsdException w:name="Document Map" w:semiHidden="1" w:unhideWhenUsed="1"/>
+    <w:lsdException w:name="Plain Text" w:semiHidden="1" w:unhideWhenUsed="1"/>
+    <w:lsdException w:name="E-mail Signature" w:semiHidden="1" w:unhideWhenUsed="1"/>
+    <w:lsdException w:name="HTML Top of Form" w:semiHidden="1" w:unhideWhenUsed="1"/>
+    <w:lsdException w:name="HTML Bottom of Form" w:semiHidden="1" w:unhideWhenUsed="1"/>
+    <w:lsdException w:name="Normal (Web)" w:semiHidden="1" w:unhideWhenUsed="1"/>
+    <w:lsdException w:name="HTML Acronym" w:semiHidden="1" w:unhideWhenUsed="1"/>
+    <w:lsdException w:name="HTML Address" w:semiHidden="1" w:unhideWhenUsed="1"/>
+    <w:lsdException w:name="HTML Cite" w:semiHidden="1" w:unhideWhenUsed="1"/>
+    <w:lsdException w:name="HTML Code" w:semiHidden="1" w:unhideWhenUsed="1"/>
+    <w:lsdException w:name="HTML Definition" w:semiHidden="1" w:unhideWhenUsed="1"/>
+    <w:lsdException w:name="HTML Keyboard" w:semiHidden="1" w:unhideWhenUsed="1"/>
+    <w:lsdException w:name="HTML Preformatted" w:semiHidden="1" w:unhideWhenUsed="1"/>
+    <w:lsdException w:name="HTML Sample" w:semiHidden="1" w:unhideWhenUsed="1"/>
+    <w:lsdException w:name="HTML Typewriter" w:semiHidden="1" w:unhideWhenUsed="1"/>
+    <w:lsdException w:name="HTML Variable" w:semiHidden="1" w:unhideWhenUsed="1"/>
+    <w:lsdException w:name="Normal Table" w:semiHidden="1" w:unhideWhenUsed="1"/>
+    <w:lsdException w:name="annotation subject" w:semiHidden="1" w:unhideWhenUsed="1"/>
+    <w:lsdException w:name="No List" w:semiHidden="1" w:unhideWhenUsed="1"/>
+    <w:lsdException w:name="Outline List 1" w:semiHidden="1" w:unhideWhenUsed="1"/>
+    <w:lsdException w:name="Outline List 2" w:semiHidden="1" w:unhideWhenUsed="1"/>
+    <w:lsdException w:name="Outline List 3" w:semiHidden="1" w:unhideWhenUsed="1"/>
+    <w:lsdException w:name="Table Simple 1" w:semiHidden="1" w:unhideWhenUsed="1"/>
+    <w:lsdException w:name="Table Simple 2" w:semiHidden="1" w:unhideWhenUsed="1"/>
+    <w:lsdException w:name="Table Simple 3" w:semiHidden="1" w:unhideWhenUsed="1"/>
+    <w:lsdException w:name="Table Classic 1" w:semiHidden="1" w:unhideWhenUsed="1"/>
+    <w:lsdException w:name="Table Classic 2" w:semiHidden="1" w:unhideWhenUsed="1"/>
+    <w:lsdException w:name="Table Classic 3" w:semiHidden="1" w:unhideWhenUsed="1"/>
+    <w:lsdException w:name="Table Classic 4" w:semiHidden="1" w:unhideWhenUsed="1"/>
+    <w:lsdException w:name="Table Colorful 1" w:semiHidden="1" w:unhideWhenUsed="1"/>
+    <w:lsdException w:name="Table Colorful 2" w:semiHidden="1" w:unhideWhenUsed="1"/>
+    <w:lsdException w:name="Table Colorful 3" w:semiHidden="1" w:unhideWhenUsed="1"/>
+    <w:lsdException w:name="Table Columns 1" w:semiHidden="1" w:unhideWhenUsed="1"/>
+    <w:lsdException w:name="Table Columns 2" w:semiHidden="1" w:unhideWhenUsed="1"/>
+    <w:lsdException w:name="Table Columns 3" w:semiHidden="1" w:unhideWhenUsed="1"/>
+    <w:lsdException w:name="Table Columns 4" w:semiHidden="1" w:unhideWhenUsed="1"/>
+    <w:lsdException w:name="Table Columns 5" w:semiHidden="1" w:unhideWhenUsed="1"/>
+    <w:lsdException w:name="Table Grid 1" w:semiHidden="1" w:unhideWhenUsed="1"/>
+    <w:lsdException w:name="Table Grid 2" w:semiHidden="1" w:unhideWhenUsed="1"/>
+    <w:lsdException w:name="Table Grid 3" w:semiHidden="1" w:unhideWhenUsed="1"/>
+    <w:lsdException w:name="Table Grid 4" w:semiHidden="1" w:unhideWhenUsed="1"/>
+    <w:lsdException w:name="Table Grid 5" w:semiHidden="1" w:unhideWhenUsed="1"/>
+    <w:lsdException w:name="Table Grid 6" w:semiHidden="1" w:unhideWhenUsed="1"/>
+    <w:lsdException w:name="Table Grid 7" w:semiHidden="1" w:unhideWhenUsed="1"/>
+    <w:lsdException w:name="Table Grid 8" w:semiHidden="1" w:unhideWhenUsed="1"/>
+    <w:lsdException w:name="Table List 1" w:semiHidden="1" w:unhideWhenUsed="1"/>
+    <w:lsdException w:name="Table List 2" w:semiHidden="1" w:unhideWhenUsed="1"/>
+    <w:lsdException w:name="Table List 3" w:semiHidden="1" w:unhideWhenUsed="1"/>
+    <w:lsdException w:name="Table List 4" w:semiHidden="1" w:unhideWhenUsed="1"/>
+    <w:lsdException w:name="Table List 5" w:semiHidden="1" w:unhideWhenUsed="1"/>
+    <w:lsdException w:name="Table List 6" w:semiHidden="1" w:unhideWhenUsed="1"/>
+    <w:lsdException w:name="Table List 7" w:semiHidden="1" w:unhideWhenUsed="1"/>
+    <w:lsdException w:name="Table List 8" w:semiHidden="1" w:unhideWhenUsed="1"/>
+    <w:lsdException w:name="Table 3D effects 1" w:semiHidden="1" w:unhideWhenUsed="1"/>
+    <w:lsdException w:name="Table 3D effects 2" w:semiHidden="1" w:unhideWhenUsed="1"/>
+    <w:lsdException w:name="Table 3D effects 3" w:semiHidden="1" w:unhideWhenUsed="1"/>
+    <w:lsdException w:name="Table Contemporary" w:semiHidden="1" w:unhideWhenUsed="1"/>
+    <w:lsdException w:name="Table Elegant" w:semiHidden="1" w:unhideWhenUsed="1"/>
+    <w:lsdException w:name="Table Professional" w:semiHidden="1" w:unhideWhenUsed="1"/>
+    <w:lsdException w:name="Table Subtle 1" w:semiHidden="1" w:unhideWhenUsed="1"/>
+    <w:lsdException w:name="Table Subtle 2" w:semiHidden="1" w:unhideWhenUsed="1"/>
+    <w:lsdException w:name="Table Web 1" w:semiHidden="1" w:unhideWhenUsed="1"/>
+    <w:lsdException w:name="Table Web 2" w:semiHidden="1" w:unhideWhenUsed="1"/>
+    <w:lsdException w:name="Table Web 3" w:semiHidden="1" w:unhideWhenUsed="1"/>
+    <w:lsdException w:name="Balloon Text" w:semiHidden="1" w:unhideWhenUsed="1"/>
+    <w:lsdException w:name="Table Grid" w:uiPriority="39"/>
+    <w:lsdException w:name="Table Theme" w:semiHidden="1" w:unhideWhenUsed="1"/>
+    <w:lsdException w:name="Placeholder Text" w:semiHidden="1"/>
+    <w:lsdException w:name="No Spacing" w:uiPriority="1" w:qFormat="1"/>
+    <w:lsdException w:name="Light Shading" w:uiPriority="60"/>
+    <w:lsdException w:name="Light List" w:uiPriority="61"/>
+    <w:lsdException w:name="Light Grid" w:uiPriority="62"/>
+    <w:lsdException w:name="Medium Shading 1" w:uiPriority="63"/>
+    <w:lsdException w:name="Medium Shading 2" w:uiPriority="64"/>
+    <w:lsdException w:name="Medium List 1" w:uiPriority="65"/>
+    <w:lsdException w:name="Medium List 2" w:uiPriority="66"/>
+    <w:lsdException w:name="Medium Grid 1" w:uiPriority="67"/>
+    <w:lsdException w:name="Medium Grid 2" w:uiPriority="68"/>
+    <w:lsdException w:name="Medium Grid 3" w:uiPriority="69"/>
+    <w:lsdException w:name="Dark List" w:uiPriority="70"/>
+    <w:lsdException w:name="Colorful Shading" w:uiPriority="71"/>
+    <w:lsdException w:name="Colorful List" w:uiPriority="72"/>
+    <w:lsdException w:name="Colorful Grid" w:uiPriority="73"/>
+    <w:lsdException w:name="Light Shading Accent 1" w:uiPriority="60"/>
+    <w:lsdException w:name="Light List Accent 1" w:uiPriority="61"/>
+    <w:lsdException w:name="Light Grid Accent 1" w:uiPriority="62"/>
+    <w:lsdException w:name="Medium Shading 1 Accent 1" w:uiPriority="63"/>
+    <w:lsdException w:name="Medium Shading 2 Accent 1" w:uiPriority="64"/>
+    <w:lsdException w:name="Medium List 1 Accent 1" w:uiPriority="65"/>
+    <w:lsdException w:name="Revision" w:semiHidden="1"/>
+    <w:lsdException w:name="List Paragraph" w:uiPriority="34" w:qFormat="1"/>
+    <w:lsdException w:name="Quote" w:uiPriority="29" w:qFormat="1"/>
+    <w:lsdException w:name="Intense Quote" w:uiPriority="30" w:qFormat="1"/>
+    <w:lsdException w:name="Medium List 2 Accent 1" w:uiPriority="66"/>
+    <w:lsdException w:name="Medium Grid 1 Accent 1" w:uiPriority="67"/>
+    <w:lsdException w:name="Medium Grid 2 Accent 1" w:uiPriority="68"/>
+    <w:lsdException w:name="Medium Grid 3 Accent 1" w:uiPriority="69"/>
+    <w:lsdException w:name="Dark List Accent 1" w:uiPriority="70"/>
+    <w:lsdException w:name="Colorful Shading Accent 1" w:uiPriority="71"/>
+    <w:lsdException w:name="Colorful List Accent 1" w:uiPriority="72"/>
+    <w:lsdException w:name="Colorful Grid Accent 1" w:uiPriority="73"/>
+    <w:lsdException w:name="Light Shading Accent 2" w:uiPriority="60"/>
+    <w:lsdException w:name="Light List Accent 2" w:uiPriority="61"/>
+    <w:lsdException w:name="Light Grid Accent 2" w:uiPriority="62"/>
+    <w:lsdException w:name="Medium Shading 1 Accent 2" w:uiPriority="63"/>
+    <w:lsdException w:name="Medium Shading 2 Accent 2" w:uiPriority="64"/>
+    <w:lsdException w:name="Medium List 1 Accent 2" w:uiPriority="65"/>
+    <w:lsdException w:name="Medium List 2 Accent 2" w:uiPriority="66"/>
+    <w:lsdException w:name="Medium Grid 1 Accent 2" w:uiPriority="67"/>
+    <w:lsdException w:name="Medium Grid 2 Accent 2" w:uiPriority="68"/>
+    <w:lsdException w:name="Medium Grid 3 Accent 2" w:uiPriority="69"/>
+    <w:lsdException w:name="Dark List Accent 2" w:uiPriority="70"/>
+    <w:lsdException w:name="Colorful Shading Accent 2" w:uiPriority="71"/>
+    <w:lsdException w:name="Colorful List Accent 2" w:uiPriority="72"/>
+    <w:lsdException w:name="Colorful Grid Accent 2" w:uiPriority="73"/>
+    <w:lsdException w:name="Light Shading Accent 3" w:uiPriority="60"/>
+    <w:lsdException w:name="Light List Accent 3" w:uiPriority="61"/>
+    <w:lsdException w:name="Light Grid Accent 3" w:uiPriority="62"/>
+    <w:lsdException w:name="Medium Shading 1 Accent 3" w:uiPriority="63"/>
+    <w:lsdException w:name="Medium Shading 2 Accent 3" w:uiPriority="64"/>
+    <w:lsdException w:name="Medium List 1 Accent 3" w:uiPriority="65"/>
+    <w:lsdException w:name="Medium List 2 Accent 3" w:uiPriority="66"/>
+    <w:lsdException w:name="Medium Grid 1 Accent 3" w:uiPriority="67"/>
+    <w:lsdException w:name="Medium Grid 2 Accent 3" w:uiPriority="68"/>
+    <w:lsdException w:name="Medium Grid 3 Accent 3" w:uiPriority="69"/>
+    <w:lsdException w:name="Dark List Accent 3" w:uiPriority="70"/>
+    <w:lsdException w:name="Colorful Shading Accent 3" w:uiPriority="71"/>
+    <w:lsdException w:name="Colorful List Accent 3" w:uiPriority="72"/>
+    <w:lsdException w:name="Colorful Grid Accent 3" w:uiPriority="73"/>
+    <w:lsdException w:name="Light Shading Accent 4" w:uiPriority="60"/>
+    <w:lsdException w:name="Light List Accent 4" w:uiPriority="61"/>
+    <w:lsdException w:name="Light Grid Accent 4" w:uiPriority="62"/>
+    <w:lsdException w:name="Medium Shading 1 Accent 4" w:uiPriority="63"/>
+    <w:lsdException w:name="Medium Shading 2 Accent 4" w:uiPriority="64"/>
+    <w:lsdException w:name="Medium List 1 Accent 4" w:uiPriority="65"/>
+    <w:lsdException w:name="Medium List 2 Accent 4" w:uiPriority="66"/>
+    <w:lsdException w:name="Medium Grid 1 Accent 4" w:uiPriority="67"/>
+    <w:lsdException w:name="Medium Grid 2 Accent 4" w:uiPriority="68"/>
+    <w:lsdException w:name="Medium Grid 3 Accent 4" w:uiPriority="69"/>
+    <w:lsdException w:name="Dark List Accent 4" w:uiPriority="70"/>
+    <w:lsdException w:name="Colorful Shading Accent 4" w:uiPriority="71"/>
+    <w:lsdException w:name="Colorful List Accent 4" w:uiPriority="72"/>
+    <w:lsdException w:name="Colorful Grid Accent 4" w:uiPriority="73"/>
+    <w:lsdException w:name="Light Shading Accent 5" w:uiPriority="60"/>
+    <w:lsdException w:name="Light List Accent 5" w:uiPriority="61"/>
+    <w:lsdException w:name="Light Grid Accent 5" w:uiPriority="62"/>
+    <w:lsdException w:name="Medium Shading 1 Accent 5" w:uiPriority="63"/>
+    <w:lsdException w:name="Medium Shading 2 Accent 5" w:uiPriority="64"/>
+    <w:lsdException w:name="Medium List 1 Accent 5" w:uiPriority="65"/>
+    <w:lsdException w:name="Medium List 2 Accent 5" w:uiPriority="66"/>
+    <w:lsdException w:name="Medium Grid 1 Accent 5" w:uiPriority="67"/>
+    <w:lsdException w:name="Medium Grid 2 Accent 5" w:uiPriority="68"/>
+    <w:lsdException w:name="Medium Grid 3 Accent 5" w:uiPriority="69"/>
+    <w:lsdException w:name="Dark List Accent 5" w:uiPriority="70"/>
+    <w:lsdException w:name="Colorful Shading Accent 5" w:uiPriority="71"/>
+    <w:lsdException w:name="Colorful List Accent 5" w:uiPriority="72"/>
+    <w:lsdException w:name="Colorful Grid Accent 5" w:uiPriority="73"/>
+    <w:lsdException w:name="Light Shading Accent 6" w:uiPriority="60"/>
+    <w:lsdException w:name="Light List Accent 6" w:uiPriority="61"/>
+    <w:lsdException w:name="Light Grid Accent 6" w:uiPriority="62"/>
+    <w:lsdException w:name="Medium Shading 1 Accent 6" w:uiPriority="63"/>
+    <w:lsdException w:name="Medium Shading 2 Accent 6" w:uiPriority="64"/>
+    <w:lsdException w:name="Medium List 1 Accent 6" w:uiPriority="65"/>
+    <w:lsdException w:name="Medium List 2 Accent 6" w:uiPriority="66"/>
+    <w:lsdException w:name="Medium Grid 1 Accent 6" w:uiPriority="67"/>
+    <w:lsdException w:name="Medium Grid 2 Accent 6" w:uiPriority="68"/>
+    <w:lsdException w:name="Medium Grid 3 Accent 6" w:uiPriority="69"/>
+    <w:lsdException w:name="Dark List Accent 6" w:uiPriority="70"/>
+    <w:lsdException w:name="Colorful Shading Accent 6" w:uiPriority="71"/>
+    <w:lsdException w:name="Colorful List Accent 6" w:uiPriority="72"/>
+    <w:lsdException w:name="Colorful Grid Accent 6" w:uiPriority="73"/>
+    <w:lsdException w:name="Subtle Emphasis" w:uiPriority="19" w:qFormat="1"/>
+    <w:lsdException w:name="Intense Emphasis" w:uiPriority="21" w:qFormat="1"/>
+    <w:lsdException w:name="Subtle Reference" w:uiPriority="31" w:qFormat="1"/>
+    <w:lsdException w:name="Intense Reference" w:uiPriority="32" w:qFormat="1"/>
+    <w:lsdException w:name="Book Title" w:uiPriority="33" w:qFormat="1"/>
+    <w:lsdException w:name="Bibliography" w:semiHidden="1" w:uiPriority="37" w:unhideWhenUsed="1"/>
+    <w:lsdException w:name="TOC Heading" w:semiHidden="1" w:uiPriority="39" w:unhideWhenUsed="1" w:qFormat="1"/>
+    <w:lsdException w:name="Plain Table 1" w:uiPriority="41"/>
+    <w:lsdException w:name="Plain Table 2" w:uiPriority="42"/>
+    <w:lsdException w:name="Plain Table 3" w:uiPriority="43"/>
+    <w:lsdException w:name="Plain Table 4" w:uiPriority="44"/>
+    <w:lsdException w:name="Plain Table 5" w:uiPriority="45"/>
+    <w:lsdException w:name="Grid Table Light" w:uiPriority="40"/>
+    <w:lsdException w:name="Grid Table 1 Light" w:uiPriority="46"/>
+    <w:lsdException w:name="Grid Table 2" w:uiPriority="47"/>
+    <w:lsdException w:name="Grid Table 3" w:uiPriority="48"/>
+    <w:lsdException w:name="Grid Table 4" w:uiPriority="49"/>
+    <w:lsdException w:name="Grid Table 5 Dark" w:uiPriority="50"/>
+    <w:lsdException w:name="Grid Table 6 Colorful" w:uiPriority="51"/>
+    <w:lsdException w:name="Grid Table 7 Colorful" w:uiPriority="52"/>
+    <w:lsdException w:name="Grid Table 1 Light Accent 1" w:uiPriority="46"/>
+    <w:lsdException w:name="Grid Table 2 Accent 1" w:uiPriority="47"/>
+    <w:lsdException w:name="Grid Table 3 Accent 1" w:uiPriority="48"/>
+    <w:lsdException w:name="Grid Table 4 Accent 1" w:uiPriority="49"/>
+    <w:lsdException w:name="Grid Table 5 Dark Accent 1" w:uiPriority="50"/>
+    <w:lsdException w:name="Grid Table 6 Colorful Accent 1" w:uiPriority="51"/>
+    <w:lsdException w:name="Grid Table 7 Colorful Accent 1" w:uiPriority="52"/>
+    <w:lsdException w:name="Grid Table 1 Light Accent 2" w:uiPriority="46"/>
+    <w:lsdException w:name="Grid Table 2 Accent 2" w:uiPriority="47"/>
+    <w:lsdException w:name="Grid Table 3 Accent 2" w:uiPriority="48"/>
+    <w:lsdException w:name="Grid Table 4 Accent 2" w:uiPriority="49"/>
+    <w:lsdException w:name="Grid Table 5 Dark Accent 2" w:uiPriority="50"/>
+    <w:lsdException w:name="Grid Table 6 Colorful Accent 2" w:uiPriority="51"/>
+    <w:lsdException w:name="Grid Table 7 Colorful Accent 2" w:uiPriority="52"/>
+    <w:lsdException w:name="Grid Table 1 Light Accent 3" w:uiPriority="46"/>
+    <w:lsdException w:name="Grid Table 2 Accent 3" w:uiPriority="47"/>
+    <w:lsdException w:name="Grid Table 3 Accent 3" w:uiPriority="48"/>
+    <w:lsdException w:name="Grid Table 4 Accent 3" w:uiPriority="49"/>
+    <w:lsdException w:name="Grid Table 5 Dark Accent 3" w:uiPriority="50"/>
+    <w:lsdException w:name="Grid Table 6 Colorful Accent 3" w:uiPriority="51"/>
+    <w:lsdException w:name="Grid Table 7 Colorful Accent 3" w:uiPriority="52"/>
+    <w:lsdException w:name="Grid Table 1 Light Accent 4" w:uiPriority="46"/>
+    <w:lsdException w:name="Grid Table 2 Accent 4" w:uiPriority="47"/>
+    <w:lsdException w:name="Grid Table 3 Accent 4" w:uiPriority="48"/>
+    <w:lsdException w:name="Grid Table 4 Accent 4" w:uiPriority="49"/>
+    <w:lsdException w:name="Grid Table 5 Dark Accent 4" w:uiPriority="50"/>
+    <w:lsdException w:name="Grid Table 6 Colorful Accent 4" w:uiPriority="51"/>
+    <w:lsdException w:name="Grid Table 7 Colorful Accent 4" w:uiPriority="52"/>
+    <w:lsdException w:name="Grid Table 1 Light Accent 5" w:uiPriority="46"/>
+    <w:lsdException w:name="Grid Table 2 Accent 5" w:uiPriority="47"/>
+    <w:lsdException w:name="Grid Table 3 Accent 5" w:uiPriority="48"/>
+    <w:lsdException w:name="Grid Table 4 Accent 5" w:uiPriority="49"/>
+    <w:lsdException w:name="Grid Table 5 Dark Accent 5" w:uiPriority="50"/>
+    <w:lsdException w:name="Grid Table 6 Colorful Accent 5" w:uiPriority="51"/>
+    <w:lsdException w:name="Grid Table 7 Colorful Accent 5" w:uiPriority="52"/>
+    <w:lsdException w:name="Grid Table 1 Light Accent 6" w:uiPriority="46"/>
+    <w:lsdException w:name="Grid Table 2 Accent 6" w:uiPriority="47"/>
+    <w:lsdException w:name="Grid Table 3 Accent 6" w:uiPriority="48"/>
+    <w:lsdException w:name="Grid Table 4 Accent 6" w:uiPriority="49"/>
+    <w:lsdException w:name="Grid Table 5 Dark Accent 6" w:uiPriority="50"/>
+    <w:lsdException w:name="Grid Table 6 Colorful Accent 6" w:uiPriority="51"/>
+    <w:lsdException w:name="Grid Table 7 Colorful Accent 6" w:uiPriority="52"/>
+    <w:lsdException w:name="List Table 1 Light" w:uiPriority="46"/>
+    <w:lsdException w:name="List Table 2" w:uiPriority="47"/>
+    <w:lsdException w:name="List Table 3" w:uiPriority="48"/>
+    <w:lsdException w:name="List Table 4" w:uiPriority="49"/>
+    <w:lsdException w:name="List Table 5 Dark" w:uiPriority="50"/>
+    <w:lsdException w:name="List Table 6 Colorful" w:uiPriority="51"/>
+    <w:lsdException w:name="List Table 7 Colorful" w:uiPriority="52"/>
+    <w:lsdException w:name="List Table 1 Light Accent 1" w:uiPriority="46"/>
+    <w:lsdException w:name="List Table 2 Accent 1" w:uiPriority="47"/>
+    <w:lsdException w:name="List Table 3 Accent 1" w:uiPriority="48"/>
+    <w:lsdException w:name="List Table 4 Accent 1" w:uiPriority="49"/>
+    <w:lsdException w:name="List Table 5 Dark Accent 1" w:uiPriority="50"/>
+    <w:lsdException w:name="List Table 6 Colorful Accent 1" w:uiPriority="51"/>
+    <w:lsdException w:name="List Table 7 Colorful Accent 1" w:uiPriority="52"/>
+    <w:lsdException w:name="List Table 1 Light Accent 2" w:uiPriority="46"/>
+    <w:lsdException w:name="List Table 2 Accent 2" w:uiPriority="47"/>
+    <w:lsdException w:name="List Table 3 Accent 2" w:uiPriority="48"/>
+    <w:lsdException w:name="List Table 4 Accent 2" w:uiPriority="49"/>
+    <w:lsdException w:name="List Table 5 Dark Accent 2" w:uiPriority="50"/>
+    <w:lsdException w:name="List Table 6 Colorful Accent 2" w:uiPriority="51"/>
+    <w:lsdException w:name="List Table 7 Colorful Accent 2" w:uiPriority="52"/>
+    <w:lsdException w:name="List Table 1 Light Accent 3" w:uiPriority="46"/>
+    <w:lsdException w:name="List Table 2 Accent 3" w:uiPriority="47"/>
+    <w:lsdException w:name="List Table 3 Accent 3" w:uiPriority="48"/>
+    <w:lsdException w:name="List Table 4 Accent 3" w:uiPriority="49"/>
+    <w:lsdException w:name="List Table 5 Dark Accent 3" w:uiPriority="50"/>
+    <w:lsdException w:name="List Table 6 Colorful Accent 3" w:uiPriority="51"/>
+    <w:lsdException w:name="List Table 7 Colorful Accent 3" w:uiPriority="52"/>
+    <w:lsdException w:name="List Table 1 Light Accent 4" w:uiPriority="46"/>
+    <w:lsdException w:name="List Table 2 Accent 4" w:uiPriority="47"/>
+    <w:lsdException w:name="List Table 3 Accent 4" w:uiPriority="48"/>
+    <w:lsdException w:name="List Table 4 Accent 4" w:uiPriority="49"/>
+    <w:lsdException w:name="List Table 5 Dark Accent 4" w:uiPriority="50"/>
+    <w:lsdException w:name="List Table 6 Colorful Accent 4" w:uiPriority="51"/>
+    <w:lsdException w:name="List Table 7 Colorful Accent 4" w:uiPriority="52"/>
+    <w:lsdException w:name="List Table 1 Light Accent 5" w:uiPriority="46"/>
+    <w:lsdException w:name="List Table 2 Accent 5" w:uiPriority="47"/>
+    <w:lsdException w:name="List Table 3 Accent 5" w:uiPriority="48"/>
+    <w:lsdException w:name="List Table 4 Accent 5" w:uiPriority="49"/>
+    <w:lsdException w:name="List Table 5 Dark Accent 5" w:uiPriority="50"/>
+    <w:lsdException w:name="List Table 6 Colorful Accent 5" w:uiPriority="51"/>
+    <w:lsdException w:name="List Table 7 Colorful Accent 5" w:uiPriority="52"/>
+    <w:lsdException w:name="List Table 1 Light Accent 6" w:uiPriority="46"/>
+    <w:lsdException w:name="List Table 2 Accent 6" w:uiPriority="47"/>
+    <w:lsdException w:name="List Table 3 Accent 6" w:uiPriority="48"/>
+    <w:lsdException w:name="List Table 4 Accent 6" w:uiPriority="49"/>
+    <w:lsdException w:name="List Table 5 Dark Accent 6" w:uiPriority="50"/>
+    <w:lsdException w:name="List Table 6 Colorful Accent 6" w:uiPriority="51"/>
+    <w:lsdException w:name="List Table 7 Colorful Accent 6" w:uiPriority="52"/>
+    <w:lsdException w:name="Mention" w:semiHidden="1" w:unhideWhenUsed="1"/>
+    <w:lsdException w:name="Smart Hyperlink" w:semiHidden="1" w:unhideWhenUsed="1"/>
+    <w:lsdException w:name="Hashtag" w:semiHidden="1" w:unhideWhenUsed="1"/>
+    <w:lsdException w:name="Unresolved Mention" w:semiHidden="1" w:unhideWhenUsed="1"/>
+    <w:lsdException w:name="Smart Link" w:semiHidden="1" w:unhideWhenUsed="1"/>
+  </w:latentStyles>
   <w:style w:type="paragraph" w:default="1" w:styleId="Normal">
     <w:name w:val="Normal"/>
-    <w:next w:val="Normal"/>
-    <w:pPr/>
+    <w:qFormat/>
     <w:rPr>
       <w:sz w:val="24"/>
       <w:szCs w:val="24"/>
-      <w:lang w:val="en-US" w:eastAsia="en-US" w:bidi="ar-SA"/>
     </w:rPr>
   </w:style>
-  <w:style w:type="character" w:default="1" w:styleId="Default Paragraph Font">
+  <w:style w:type="character" w:default="1" w:styleId="DefaultParagraphFont">
     <w:name w:val="Default Paragraph Font"/>
-    <w:next w:val="Default Paragraph Font"/>
+    <w:uiPriority w:val="1"/>
+    <w:unhideWhenUsed/>
+  </w:style>
+  <w:style w:type="table" w:default="1" w:styleId="TableNormal">
+    <w:name w:val="Normal Table"/>
+    <w:uiPriority w:val="99"/>
+    <w:semiHidden/>
+    <w:unhideWhenUsed/>
+    <w:tblPr>
+      <w:tblInd w:w="0" w:type="dxa"/>
+      <w:tblCellMar>
+        <w:top w:w="0" w:type="dxa"/>
+        <w:left w:w="108" w:type="dxa"/>
+        <w:bottom w:w="0" w:type="dxa"/>
+        <w:right w:w="108" w:type="dxa"/>
+      </w:tblCellMar>
+    </w:tblPr>
+  </w:style>
+  <w:style w:type="numbering" w:default="1" w:styleId="NoList">
+    <w:name w:val="No List"/>
+    <w:uiPriority w:val="99"/>
+    <w:semiHidden/>
+    <w:unhideWhenUsed/>
   </w:style>
   <w:style w:type="character" w:styleId="Hyperlink">
     <w:name w:val="Hyperlink"/>
@@ -2340,192 +2429,59 @@
       <w:u w:val="single"/>
     </w:rPr>
   </w:style>
-  <w:style w:type="table" w:default="1" w:styleId="Table Normal">
-    <w:name w:val="Table Normal"/>
-    <w:next w:val="Table Normal"/>
-    <w:pPr/>
-    <w:tblPr>
-      <w:tblInd w:w="0" w:type="dxa"/>
-    </w:tblPr>
-    <w:trPr/>
-    <w:tcPr/>
-    <w:tblStylePr w:type="firstRow"/>
-    <w:tblStylePr w:type="lastRow"/>
-    <w:tblStylePr w:type="firstCol"/>
-    <w:tblStylePr w:type="lastCol"/>
-    <w:tblStylePr w:type="band1Vert"/>
-    <w:tblStylePr w:type="band2Vert"/>
-    <w:tblStylePr w:type="band1Horz"/>
-    <w:tblStylePr w:type="band2Horz"/>
-    <w:tblStylePr w:type="neCell"/>
-    <w:tblStylePr w:type="nwCell"/>
-    <w:tblStylePr w:type="seCell"/>
-    <w:tblStylePr w:type="swCell"/>
-  </w:style>
-  <w:style w:type="numbering" w:default="1" w:styleId="No List">
-    <w:name w:val="No List"/>
-    <w:next w:val="No List"/>
-    <w:pPr/>
-  </w:style>
-  <w:style w:type="paragraph" w:styleId="Header &amp; Footer">
+  <w:style w:type="paragraph" w:customStyle="1" w:styleId="HeaderFooter">
     <w:name w:val="Header &amp; Footer"/>
-    <w:next w:val="Header &amp; Footer"/>
     <w:pPr>
-      <w:keepNext w:val="0"/>
-      <w:keepLines w:val="0"/>
-      <w:pageBreakBefore w:val="0"/>
-      <w:widowControl w:val="1"/>
-      <w:shd w:val="clear" w:color="auto" w:fill="auto"/>
       <w:tabs>
         <w:tab w:val="right" w:pos="9020"/>
       </w:tabs>
-      <w:suppressAutoHyphens w:val="0"/>
-      <w:bidi w:val="0"/>
-      <w:spacing w:before="0" w:after="0" w:line="240" w:lineRule="auto"/>
-      <w:ind w:left="0" w:right="0" w:firstLine="0"/>
-      <w:jc w:val="left"/>
-      <w:outlineLvl w:val="9"/>
     </w:pPr>
     <w:rPr>
-      <w:rFonts w:ascii="Helvetica Neue" w:cs="Arial Unicode MS" w:hAnsi="Helvetica Neue" w:eastAsia="Arial Unicode MS"/>
-      <w:b w:val="0"/>
-      <w:bCs w:val="0"/>
-      <w:i w:val="0"/>
-      <w:iCs w:val="0"/>
-      <w:caps w:val="0"/>
-      <w:smallCaps w:val="0"/>
-      <w:strike w:val="0"/>
-      <w:dstrike w:val="0"/>
-      <w:outline w:val="0"/>
+      <w:rFonts w:ascii="Helvetica Neue" w:hAnsi="Helvetica Neue" w:cs="Arial Unicode MS"/>
       <w:color w:val="000000"/>
-      <w:spacing w:val="0"/>
-      <w:kern w:val="0"/>
-      <w:position w:val="0"/>
       <w:sz w:val="24"/>
       <w:szCs w:val="24"/>
-      <w:u w:val="none"/>
-      <w:shd w:val="nil" w:color="auto" w:fill="auto"/>
-      <w:vertAlign w:val="baseline"/>
-      <w14:textOutline>
+      <w14:textOutline w14:w="0" w14:cap="flat" w14:cmpd="sng" w14:algn="ctr">
         <w14:noFill/>
+        <w14:prstDash w14:val="solid"/>
+        <w14:bevel/>
       </w14:textOutline>
-      <w14:textFill>
-        <w14:solidFill>
-          <w14:srgbClr w14:val="000000"/>
-        </w14:solidFill>
-      </w14:textFill>
     </w:rPr>
   </w:style>
-  <w:style w:type="paragraph" w:styleId="Body">
+  <w:style w:type="paragraph" w:customStyle="1" w:styleId="Body">
     <w:name w:val="Body"/>
-    <w:next w:val="Body"/>
-    <w:pPr>
-      <w:keepNext w:val="0"/>
-      <w:keepLines w:val="0"/>
-      <w:pageBreakBefore w:val="0"/>
-      <w:widowControl w:val="1"/>
-      <w:shd w:val="clear" w:color="auto" w:fill="auto"/>
-      <w:suppressAutoHyphens w:val="0"/>
-      <w:bidi w:val="0"/>
-      <w:spacing w:before="0" w:after="0" w:line="240" w:lineRule="auto"/>
-      <w:ind w:left="0" w:right="0" w:firstLine="0"/>
-      <w:jc w:val="left"/>
-      <w:outlineLvl w:val="9"/>
-    </w:pPr>
     <w:rPr>
-      <w:rFonts w:ascii="Arial" w:cs="Arial Unicode MS" w:hAnsi="Arial" w:eastAsia="Arial Unicode MS"/>
-      <w:b w:val="0"/>
-      <w:bCs w:val="0"/>
-      <w:i w:val="0"/>
-      <w:iCs w:val="0"/>
-      <w:caps w:val="0"/>
-      <w:smallCaps w:val="0"/>
-      <w:strike w:val="0"/>
-      <w:dstrike w:val="0"/>
-      <w:outline w:val="0"/>
+      <w:rFonts w:ascii="Arial" w:hAnsi="Arial" w:cs="Arial Unicode MS"/>
       <w:color w:val="000000"/>
-      <w:spacing w:val="0"/>
-      <w:kern w:val="0"/>
-      <w:position w:val="0"/>
-      <w:sz w:val="20"/>
-      <w:szCs w:val="20"/>
-      <w:u w:val="none" w:color="000000"/>
-      <w:shd w:val="nil" w:color="auto" w:fill="auto"/>
-      <w:vertAlign w:val="baseline"/>
-      <w:lang w:val="en-US"/>
-      <w14:textOutline>
+      <w:u w:color="000000"/>
+      <w14:textOutline w14:w="0" w14:cap="flat" w14:cmpd="sng" w14:algn="ctr">
         <w14:noFill/>
+        <w14:prstDash w14:val="solid"/>
+        <w14:bevel/>
       </w14:textOutline>
-      <w14:textFill>
-        <w14:solidFill>
-          <w14:srgbClr w14:val="000000"/>
-        </w14:solidFill>
-      </w14:textFill>
     </w:rPr>
   </w:style>
-  <w:style w:type="character" w:styleId="None">
+  <w:style w:type="character" w:customStyle="1" w:styleId="None">
     <w:name w:val="None"/>
   </w:style>
-  <w:style w:type="character" w:styleId="Hyperlink.0">
+  <w:style w:type="character" w:customStyle="1" w:styleId="Hyperlink0">
     <w:name w:val="Hyperlink.0"/>
     <w:basedOn w:val="None"/>
-    <w:next w:val="Hyperlink.0"/>
     <w:rPr>
       <w:outline w:val="0"/>
-      <w:color w:val="0563c1"/>
-      <w:u w:val="single" w:color="0563c1"/>
-      <w14:textFill>
-        <w14:solidFill>
-          <w14:srgbClr w14:val="0563C1"/>
-        </w14:solidFill>
-      </w14:textFill>
+      <w:color w:val="0563C1"/>
+      <w:u w:val="single" w:color="0563C1"/>
     </w:rPr>
   </w:style>
-  <w:style w:type="paragraph" w:styleId="List Paragraph">
+  <w:style w:type="paragraph" w:styleId="ListParagraph">
     <w:name w:val="List Paragraph"/>
-    <w:next w:val="List Paragraph"/>
-    <w:pPr>
-      <w:keepNext w:val="0"/>
-      <w:keepLines w:val="0"/>
-      <w:pageBreakBefore w:val="0"/>
-      <w:widowControl w:val="1"/>
-      <w:shd w:val="clear" w:color="auto" w:fill="auto"/>
-      <w:suppressAutoHyphens w:val="0"/>
-      <w:bidi w:val="0"/>
-      <w:spacing w:before="0" w:after="0" w:line="240" w:lineRule="auto"/>
-      <w:ind w:left="0" w:right="0" w:firstLine="0"/>
-      <w:jc w:val="left"/>
-      <w:outlineLvl w:val="9"/>
-    </w:pPr>
     <w:rPr>
-      <w:rFonts w:ascii="Arial" w:cs="Arial Unicode MS" w:hAnsi="Arial" w:eastAsia="Arial Unicode MS"/>
-      <w:b w:val="0"/>
-      <w:bCs w:val="0"/>
-      <w:i w:val="0"/>
-      <w:iCs w:val="0"/>
-      <w:caps w:val="0"/>
-      <w:smallCaps w:val="0"/>
-      <w:strike w:val="0"/>
-      <w:dstrike w:val="0"/>
-      <w:outline w:val="0"/>
+      <w:rFonts w:ascii="Arial" w:hAnsi="Arial" w:cs="Arial Unicode MS"/>
       <w:color w:val="000000"/>
-      <w:spacing w:val="0"/>
-      <w:kern w:val="0"/>
-      <w:position w:val="0"/>
-      <w:sz w:val="20"/>
-      <w:szCs w:val="20"/>
-      <w:u w:val="none" w:color="000000"/>
-      <w:shd w:val="nil" w:color="auto" w:fill="auto"/>
-      <w:vertAlign w:val="baseline"/>
-      <w:lang w:val="en-US"/>
-      <w14:textFill>
-        <w14:solidFill>
-          <w14:srgbClr w14:val="000000"/>
-        </w14:solidFill>
-      </w14:textFill>
+      <w:u w:color="000000"/>
     </w:rPr>
   </w:style>
-  <w:style w:type="numbering" w:styleId="Imported Style 1">
+  <w:style w:type="numbering" w:customStyle="1" w:styleId="ImportedStyle1">
     <w:name w:val="Imported Style 1"/>
     <w:pPr>
       <w:numPr>
@@ -2533,7 +2489,7 @@
       </w:numPr>
     </w:pPr>
   </w:style>
-  <w:style w:type="numbering" w:styleId="Imported Style 2">
+  <w:style w:type="numbering" w:customStyle="1" w:styleId="ImportedStyle2">
     <w:name w:val="Imported Style 2"/>
     <w:pPr>
       <w:numPr>
@@ -2541,11 +2497,55 @@
       </w:numPr>
     </w:pPr>
   </w:style>
+  <w:style w:type="paragraph" w:customStyle="1" w:styleId="flex">
+    <w:name w:val="flex"/>
+    <w:basedOn w:val="Normal"/>
+    <w:rsid w:val="00995C85"/>
+    <w:pPr>
+      <w:pBdr>
+        <w:top w:val="none" w:sz="0" w:space="0" w:color="auto"/>
+        <w:left w:val="none" w:sz="0" w:space="0" w:color="auto"/>
+        <w:bottom w:val="none" w:sz="0" w:space="0" w:color="auto"/>
+        <w:right w:val="none" w:sz="0" w:space="0" w:color="auto"/>
+        <w:between w:val="none" w:sz="0" w:space="0" w:color="auto"/>
+        <w:bar w:val="none" w:sz="0" w:color="auto"/>
+      </w:pBdr>
+      <w:spacing w:before="100" w:beforeAutospacing="1" w:after="100" w:afterAutospacing="1"/>
+    </w:pPr>
+    <w:rPr>
+      <w:rFonts w:eastAsia="Times New Roman"/>
+      <w:bdr w:val="none" w:sz="0" w:space="0" w:color="auto"/>
+    </w:rPr>
+  </w:style>
+  <w:style w:type="character" w:styleId="UnresolvedMention">
+    <w:name w:val="Unresolved Mention"/>
+    <w:basedOn w:val="DefaultParagraphFont"/>
+    <w:uiPriority w:val="99"/>
+    <w:semiHidden/>
+    <w:unhideWhenUsed/>
+    <w:rsid w:val="00A14A6D"/>
+    <w:rPr>
+      <w:color w:val="605E5C"/>
+      <w:shd w:val="clear" w:color="auto" w:fill="E1DFDD"/>
+    </w:rPr>
+  </w:style>
+  <w:style w:type="character" w:styleId="FollowedHyperlink">
+    <w:name w:val="FollowedHyperlink"/>
+    <w:basedOn w:val="DefaultParagraphFont"/>
+    <w:uiPriority w:val="99"/>
+    <w:semiHidden/>
+    <w:unhideWhenUsed/>
+    <w:rsid w:val="001632AC"/>
+    <w:rPr>
+      <w:color w:val="FF00FF" w:themeColor="followedHyperlink"/>
+      <w:u w:val="single"/>
+    </w:rPr>
+  </w:style>
 </w:styles>
 </file>
 
 <file path=word/theme/theme1.xml><?xml version="1.0" encoding="utf-8"?>
-<a:theme xmlns:a="http://schemas.openxmlformats.org/drawingml/2006/main" xmlns:r="http://schemas.openxmlformats.org/officeDocument/2006/relationships" name="Office Theme">
+<a:theme xmlns:a="http://schemas.openxmlformats.org/drawingml/2006/main" name="Office Theme">
   <a:themeElements>
     <a:clrScheme name="Office Theme">
       <a:dk1>
@@ -2747,7 +2747,7 @@
         <a:effectLst/>
         <a:sp3d/>
       </a:spPr>
-      <a:bodyPr rot="0" spcFirstLastPara="1" vertOverflow="overflow" horzOverflow="overflow" vert="horz" wrap="square" lIns="45719" tIns="45719" rIns="45719" bIns="45719" numCol="1" spcCol="38100" rtlCol="0" anchor="ctr" upright="0">
+      <a:bodyPr rot="0" spcFirstLastPara="1" vertOverflow="overflow" horzOverflow="overflow" vert="horz" wrap="square" lIns="45719" tIns="45719" rIns="45719" bIns="45719" numCol="1" spcCol="38100" rtlCol="0" anchor="ctr">
         <a:spAutoFit/>
       </a:bodyPr>
       <a:lstStyle>
@@ -2766,7 +2766,7 @@
           <a:buFontTx/>
           <a:buNone/>
           <a:tabLst/>
-          <a:defRPr b="0" baseline="0" cap="none" i="0" spc="0" strike="noStrike" sz="1800" u="none" kumimoji="0" normalizeH="0">
+          <a:defRPr kumimoji="0" sz="1800" b="0" i="0" u="none" strike="noStrike" cap="none" spc="0" normalizeH="0" baseline="0">
             <a:ln>
               <a:noFill/>
             </a:ln>
@@ -2796,7 +2796,7 @@
           <a:buFontTx/>
           <a:buNone/>
           <a:tabLst/>
-          <a:defRPr b="0" baseline="0" cap="none" i="0" spc="0" strike="noStrike" sz="1800" u="none" kumimoji="0" normalizeH="0">
+          <a:defRPr kumimoji="0" sz="1800" b="0" i="0" u="none" strike="noStrike" cap="none" spc="0" normalizeH="0" baseline="0">
             <a:ln>
               <a:noFill/>
             </a:ln>
@@ -2822,7 +2822,7 @@
           <a:buFontTx/>
           <a:buNone/>
           <a:tabLst/>
-          <a:defRPr b="0" baseline="0" cap="none" i="0" spc="0" strike="noStrike" sz="1800" u="none" kumimoji="0" normalizeH="0">
+          <a:defRPr kumimoji="0" sz="1800" b="0" i="0" u="none" strike="noStrike" cap="none" spc="0" normalizeH="0" baseline="0">
             <a:ln>
               <a:noFill/>
             </a:ln>
@@ -2848,7 +2848,7 @@
           <a:buFontTx/>
           <a:buNone/>
           <a:tabLst/>
-          <a:defRPr b="0" baseline="0" cap="none" i="0" spc="0" strike="noStrike" sz="1800" u="none" kumimoji="0" normalizeH="0">
+          <a:defRPr kumimoji="0" sz="1800" b="0" i="0" u="none" strike="noStrike" cap="none" spc="0" normalizeH="0" baseline="0">
             <a:ln>
               <a:noFill/>
             </a:ln>
@@ -2874,7 +2874,7 @@
           <a:buFontTx/>
           <a:buNone/>
           <a:tabLst/>
-          <a:defRPr b="0" baseline="0" cap="none" i="0" spc="0" strike="noStrike" sz="1800" u="none" kumimoji="0" normalizeH="0">
+          <a:defRPr kumimoji="0" sz="1800" b="0" i="0" u="none" strike="noStrike" cap="none" spc="0" normalizeH="0" baseline="0">
             <a:ln>
               <a:noFill/>
             </a:ln>
@@ -2900,7 +2900,7 @@
           <a:buFontTx/>
           <a:buNone/>
           <a:tabLst/>
-          <a:defRPr b="0" baseline="0" cap="none" i="0" spc="0" strike="noStrike" sz="1800" u="none" kumimoji="0" normalizeH="0">
+          <a:defRPr kumimoji="0" sz="1800" b="0" i="0" u="none" strike="noStrike" cap="none" spc="0" normalizeH="0" baseline="0">
             <a:ln>
               <a:noFill/>
             </a:ln>
@@ -2926,7 +2926,7 @@
           <a:buFontTx/>
           <a:buNone/>
           <a:tabLst/>
-          <a:defRPr b="0" baseline="0" cap="none" i="0" spc="0" strike="noStrike" sz="1800" u="none" kumimoji="0" normalizeH="0">
+          <a:defRPr kumimoji="0" sz="1800" b="0" i="0" u="none" strike="noStrike" cap="none" spc="0" normalizeH="0" baseline="0">
             <a:ln>
               <a:noFill/>
             </a:ln>
@@ -2952,7 +2952,7 @@
           <a:buFontTx/>
           <a:buNone/>
           <a:tabLst/>
-          <a:defRPr b="0" baseline="0" cap="none" i="0" spc="0" strike="noStrike" sz="1800" u="none" kumimoji="0" normalizeH="0">
+          <a:defRPr kumimoji="0" sz="1800" b="0" i="0" u="none" strike="noStrike" cap="none" spc="0" normalizeH="0" baseline="0">
             <a:ln>
               <a:noFill/>
             </a:ln>
@@ -2978,7 +2978,7 @@
           <a:buFontTx/>
           <a:buNone/>
           <a:tabLst/>
-          <a:defRPr b="0" baseline="0" cap="none" i="0" spc="0" strike="noStrike" sz="1800" u="none" kumimoji="0" normalizeH="0">
+          <a:defRPr kumimoji="0" sz="1800" b="0" i="0" u="none" strike="noStrike" cap="none" spc="0" normalizeH="0" baseline="0">
             <a:ln>
               <a:noFill/>
             </a:ln>
@@ -3004,7 +3004,7 @@
           <a:buFontTx/>
           <a:buNone/>
           <a:tabLst/>
-          <a:defRPr b="0" baseline="0" cap="none" i="0" spc="0" strike="noStrike" sz="1800" u="none" kumimoji="0" normalizeH="0">
+          <a:defRPr kumimoji="0" sz="1800" b="0" i="0" u="none" strike="noStrike" cap="none" spc="0" normalizeH="0" baseline="0">
             <a:ln>
               <a:noFill/>
             </a:ln>
@@ -3017,9 +3017,15 @@
         </a:lvl9pPr>
       </a:lstStyle>
       <a:style>
-        <a:lnRef idx="0"/>
-        <a:fillRef idx="0"/>
-        <a:effectRef idx="0"/>
+        <a:lnRef idx="0">
+          <a:scrgbClr r="0" g="0" b="0"/>
+        </a:lnRef>
+        <a:fillRef idx="0">
+          <a:scrgbClr r="0" g="0" b="0"/>
+        </a:fillRef>
+        <a:effectRef idx="0">
+          <a:scrgbClr r="0" g="0" b="0"/>
+        </a:effectRef>
         <a:fontRef idx="none"/>
       </a:style>
     </a:spDef>
@@ -3036,7 +3042,7 @@
         <a:effectLst/>
         <a:sp3d/>
       </a:spPr>
-      <a:bodyPr rot="0" spcFirstLastPara="1" vertOverflow="overflow" horzOverflow="overflow" vert="horz" wrap="square" lIns="91439" tIns="45719" rIns="91439" bIns="45719" numCol="1" spcCol="38100" rtlCol="0" anchor="t" upright="0">
+      <a:bodyPr rot="0" spcFirstLastPara="1" vertOverflow="overflow" horzOverflow="overflow" vert="horz" wrap="square" lIns="91439" tIns="45719" rIns="91439" bIns="45719" numCol="1" spcCol="38100" rtlCol="0" anchor="t">
         <a:noAutofit/>
       </a:bodyPr>
       <a:lstStyle>
@@ -3055,7 +3061,7 @@
           <a:buFontTx/>
           <a:buNone/>
           <a:tabLst/>
-          <a:defRPr b="0" baseline="0" cap="none" i="0" spc="0" strike="noStrike" sz="1800" u="none" kumimoji="0" normalizeH="0">
+          <a:defRPr kumimoji="0" sz="1800" b="0" i="0" u="none" strike="noStrike" cap="none" spc="0" normalizeH="0" baseline="0">
             <a:ln>
               <a:noFill/>
             </a:ln>
@@ -3081,7 +3087,7 @@
           <a:buFontTx/>
           <a:buNone/>
           <a:tabLst/>
-          <a:defRPr b="0" baseline="0" cap="none" i="0" spc="0" strike="noStrike" sz="1800" u="none" kumimoji="0" normalizeH="0">
+          <a:defRPr kumimoji="0" sz="1800" b="0" i="0" u="none" strike="noStrike" cap="none" spc="0" normalizeH="0" baseline="0">
             <a:ln>
               <a:noFill/>
             </a:ln>
@@ -3107,7 +3113,7 @@
           <a:buFontTx/>
           <a:buNone/>
           <a:tabLst/>
-          <a:defRPr b="0" baseline="0" cap="none" i="0" spc="0" strike="noStrike" sz="1800" u="none" kumimoji="0" normalizeH="0">
+          <a:defRPr kumimoji="0" sz="1800" b="0" i="0" u="none" strike="noStrike" cap="none" spc="0" normalizeH="0" baseline="0">
             <a:ln>
               <a:noFill/>
             </a:ln>
@@ -3133,7 +3139,7 @@
           <a:buFontTx/>
           <a:buNone/>
           <a:tabLst/>
-          <a:defRPr b="0" baseline="0" cap="none" i="0" spc="0" strike="noStrike" sz="1800" u="none" kumimoji="0" normalizeH="0">
+          <a:defRPr kumimoji="0" sz="1800" b="0" i="0" u="none" strike="noStrike" cap="none" spc="0" normalizeH="0" baseline="0">
             <a:ln>
               <a:noFill/>
             </a:ln>
@@ -3159,7 +3165,7 @@
           <a:buFontTx/>
           <a:buNone/>
           <a:tabLst/>
-          <a:defRPr b="0" baseline="0" cap="none" i="0" spc="0" strike="noStrike" sz="1800" u="none" kumimoji="0" normalizeH="0">
+          <a:defRPr kumimoji="0" sz="1800" b="0" i="0" u="none" strike="noStrike" cap="none" spc="0" normalizeH="0" baseline="0">
             <a:ln>
               <a:noFill/>
             </a:ln>
@@ -3185,7 +3191,7 @@
           <a:buFontTx/>
           <a:buNone/>
           <a:tabLst/>
-          <a:defRPr b="0" baseline="0" cap="none" i="0" spc="0" strike="noStrike" sz="1800" u="none" kumimoji="0" normalizeH="0">
+          <a:defRPr kumimoji="0" sz="1800" b="0" i="0" u="none" strike="noStrike" cap="none" spc="0" normalizeH="0" baseline="0">
             <a:ln>
               <a:noFill/>
             </a:ln>
@@ -3211,7 +3217,7 @@
           <a:buFontTx/>
           <a:buNone/>
           <a:tabLst/>
-          <a:defRPr b="0" baseline="0" cap="none" i="0" spc="0" strike="noStrike" sz="1800" u="none" kumimoji="0" normalizeH="0">
+          <a:defRPr kumimoji="0" sz="1800" b="0" i="0" u="none" strike="noStrike" cap="none" spc="0" normalizeH="0" baseline="0">
             <a:ln>
               <a:noFill/>
             </a:ln>
@@ -3237,7 +3243,7 @@
           <a:buFontTx/>
           <a:buNone/>
           <a:tabLst/>
-          <a:defRPr b="0" baseline="0" cap="none" i="0" spc="0" strike="noStrike" sz="1800" u="none" kumimoji="0" normalizeH="0">
+          <a:defRPr kumimoji="0" sz="1800" b="0" i="0" u="none" strike="noStrike" cap="none" spc="0" normalizeH="0" baseline="0">
             <a:ln>
               <a:noFill/>
             </a:ln>
@@ -3263,7 +3269,7 @@
           <a:buFontTx/>
           <a:buNone/>
           <a:tabLst/>
-          <a:defRPr b="0" baseline="0" cap="none" i="0" spc="0" strike="noStrike" sz="1800" u="none" kumimoji="0" normalizeH="0">
+          <a:defRPr kumimoji="0" sz="1800" b="0" i="0" u="none" strike="noStrike" cap="none" spc="0" normalizeH="0" baseline="0">
             <a:ln>
               <a:noFill/>
             </a:ln>
@@ -3289,7 +3295,7 @@
           <a:buFontTx/>
           <a:buNone/>
           <a:tabLst/>
-          <a:defRPr b="0" baseline="0" cap="none" i="0" spc="0" strike="noStrike" sz="1800" u="none" kumimoji="0" normalizeH="0">
+          <a:defRPr kumimoji="0" sz="1800" b="0" i="0" u="none" strike="noStrike" cap="none" spc="0" normalizeH="0" baseline="0">
             <a:ln>
               <a:noFill/>
             </a:ln>
@@ -3302,9 +3308,15 @@
         </a:lvl9pPr>
       </a:lstStyle>
       <a:style>
-        <a:lnRef idx="0"/>
-        <a:fillRef idx="0"/>
-        <a:effectRef idx="0"/>
+        <a:lnRef idx="0">
+          <a:scrgbClr r="0" g="0" b="0"/>
+        </a:lnRef>
+        <a:fillRef idx="0">
+          <a:scrgbClr r="0" g="0" b="0"/>
+        </a:fillRef>
+        <a:effectRef idx="0">
+          <a:scrgbClr r="0" g="0" b="0"/>
+        </a:effectRef>
         <a:fontRef idx="none"/>
       </a:style>
     </a:lnDef>
@@ -3318,7 +3330,7 @@
         <a:effectLst/>
         <a:sp3d/>
       </a:spPr>
-      <a:bodyPr rot="0" spcFirstLastPara="1" vertOverflow="overflow" horzOverflow="overflow" vert="horz" wrap="square" lIns="45719" tIns="45719" rIns="45719" bIns="45719" numCol="1" spcCol="38100" rtlCol="0" anchor="t" upright="0">
+      <a:bodyPr rot="0" spcFirstLastPara="1" vertOverflow="overflow" horzOverflow="overflow" vert="horz" wrap="square" lIns="45719" tIns="45719" rIns="45719" bIns="45719" numCol="1" spcCol="38100" rtlCol="0" anchor="t">
         <a:spAutoFit/>
       </a:bodyPr>
       <a:lstStyle>
@@ -3337,7 +3349,7 @@
           <a:buFontTx/>
           <a:buNone/>
           <a:tabLst/>
-          <a:defRPr b="0" baseline="0" cap="none" i="0" spc="0" strike="noStrike" sz="1800" u="none" kumimoji="0" normalizeH="0">
+          <a:defRPr kumimoji="0" sz="1800" b="0" i="0" u="none" strike="noStrike" cap="none" spc="0" normalizeH="0" baseline="0">
             <a:ln>
               <a:noFill/>
             </a:ln>
@@ -3367,7 +3379,7 @@
           <a:buFontTx/>
           <a:buNone/>
           <a:tabLst/>
-          <a:defRPr b="0" baseline="0" cap="none" i="0" spc="0" strike="noStrike" sz="1800" u="none" kumimoji="0" normalizeH="0">
+          <a:defRPr kumimoji="0" sz="1800" b="0" i="0" u="none" strike="noStrike" cap="none" spc="0" normalizeH="0" baseline="0">
             <a:ln>
               <a:noFill/>
             </a:ln>
@@ -3393,7 +3405,7 @@
           <a:buFontTx/>
           <a:buNone/>
           <a:tabLst/>
-          <a:defRPr b="0" baseline="0" cap="none" i="0" spc="0" strike="noStrike" sz="1800" u="none" kumimoji="0" normalizeH="0">
+          <a:defRPr kumimoji="0" sz="1800" b="0" i="0" u="none" strike="noStrike" cap="none" spc="0" normalizeH="0" baseline="0">
             <a:ln>
               <a:noFill/>
             </a:ln>
@@ -3419,7 +3431,7 @@
           <a:buFontTx/>
           <a:buNone/>
           <a:tabLst/>
-          <a:defRPr b="0" baseline="0" cap="none" i="0" spc="0" strike="noStrike" sz="1800" u="none" kumimoji="0" normalizeH="0">
+          <a:defRPr kumimoji="0" sz="1800" b="0" i="0" u="none" strike="noStrike" cap="none" spc="0" normalizeH="0" baseline="0">
             <a:ln>
               <a:noFill/>
             </a:ln>
@@ -3445,7 +3457,7 @@
           <a:buFontTx/>
           <a:buNone/>
           <a:tabLst/>
-          <a:defRPr b="0" baseline="0" cap="none" i="0" spc="0" strike="noStrike" sz="1800" u="none" kumimoji="0" normalizeH="0">
+          <a:defRPr kumimoji="0" sz="1800" b="0" i="0" u="none" strike="noStrike" cap="none" spc="0" normalizeH="0" baseline="0">
             <a:ln>
               <a:noFill/>
             </a:ln>
@@ -3471,7 +3483,7 @@
           <a:buFontTx/>
           <a:buNone/>
           <a:tabLst/>
-          <a:defRPr b="0" baseline="0" cap="none" i="0" spc="0" strike="noStrike" sz="1800" u="none" kumimoji="0" normalizeH="0">
+          <a:defRPr kumimoji="0" sz="1800" b="0" i="0" u="none" strike="noStrike" cap="none" spc="0" normalizeH="0" baseline="0">
             <a:ln>
               <a:noFill/>
             </a:ln>
@@ -3497,7 +3509,7 @@
           <a:buFontTx/>
           <a:buNone/>
           <a:tabLst/>
-          <a:defRPr b="0" baseline="0" cap="none" i="0" spc="0" strike="noStrike" sz="1800" u="none" kumimoji="0" normalizeH="0">
+          <a:defRPr kumimoji="0" sz="1800" b="0" i="0" u="none" strike="noStrike" cap="none" spc="0" normalizeH="0" baseline="0">
             <a:ln>
               <a:noFill/>
             </a:ln>
@@ -3523,7 +3535,7 @@
           <a:buFontTx/>
           <a:buNone/>
           <a:tabLst/>
-          <a:defRPr b="0" baseline="0" cap="none" i="0" spc="0" strike="noStrike" sz="1800" u="none" kumimoji="0" normalizeH="0">
+          <a:defRPr kumimoji="0" sz="1800" b="0" i="0" u="none" strike="noStrike" cap="none" spc="0" normalizeH="0" baseline="0">
             <a:ln>
               <a:noFill/>
             </a:ln>
@@ -3549,7 +3561,7 @@
           <a:buFontTx/>
           <a:buNone/>
           <a:tabLst/>
-          <a:defRPr b="0" baseline="0" cap="none" i="0" spc="0" strike="noStrike" sz="1800" u="none" kumimoji="0" normalizeH="0">
+          <a:defRPr kumimoji="0" sz="1800" b="0" i="0" u="none" strike="noStrike" cap="none" spc="0" normalizeH="0" baseline="0">
             <a:ln>
               <a:noFill/>
             </a:ln>
@@ -3575,7 +3587,7 @@
           <a:buFontTx/>
           <a:buNone/>
           <a:tabLst/>
-          <a:defRPr b="0" baseline="0" cap="none" i="0" spc="0" strike="noStrike" sz="1800" u="none" kumimoji="0" normalizeH="0">
+          <a:defRPr kumimoji="0" sz="1800" b="0" i="0" u="none" strike="noStrike" cap="none" spc="0" normalizeH="0" baseline="0">
             <a:ln>
               <a:noFill/>
             </a:ln>
@@ -3588,12 +3600,19 @@
         </a:lvl9pPr>
       </a:lstStyle>
       <a:style>
-        <a:lnRef idx="0"/>
-        <a:fillRef idx="0"/>
-        <a:effectRef idx="0"/>
+        <a:lnRef idx="0">
+          <a:scrgbClr r="0" g="0" b="0"/>
+        </a:lnRef>
+        <a:fillRef idx="0">
+          <a:scrgbClr r="0" g="0" b="0"/>
+        </a:fillRef>
+        <a:effectRef idx="0">
+          <a:scrgbClr r="0" g="0" b="0"/>
+        </a:effectRef>
         <a:fontRef idx="none"/>
       </a:style>
     </a:txDef>
   </a:objectDefaults>
+  <a:extraClrSchemeLst/>
 </a:theme>
 </file>
</xml_diff>